<commit_message>
docs(methods): streamline hierarchy, orient from results, and present finalized models
</commit_message>
<xml_diff>
--- a/manuscript_methods_mouse_spaceflight_transcriptome.docx
+++ b/manuscript_methods_mouse_spaceflight_transcriptome.docx
@@ -30,66 +30,6 @@
         <w:t>Multi-Tissue Murine Spaceflight Transcriptomic Atlas and DNA Damage Repair Pathway Profiling</w:t>
       </w:r>
     </w:p>
-    <w:tbl>
-      <w:tblPr>
-        <w:tblW w:type="auto" w:w="0"/>
-        <w:jc w:val="center"/>
-        <w:tblLayout w:type="fixed"/>
-        <w:tblLook w:firstColumn="1" w:firstRow="1" w:lastColumn="0" w:lastRow="0" w:noHBand="0" w:noVBand="1" w:val="04A0"/>
-      </w:tblPr>
-      <w:tblGrid>
-        <w:gridCol w:w="9360"/>
-      </w:tblGrid>
-      <w:tr>
-        <w:tc>
-          <w:tcPr>
-            <w:tcW w:type="dxa" w:w="9360"/>
-            <w:shd w:fill="F2F5F9"/>
-            <w:tcMar>
-              <w:top w:w="130" w:type="dxa"/>
-              <w:bottom w:w="130" w:type="dxa"/>
-              <w:left w:w="180" w:type="dxa"/>
-              <w:right w:w="180" w:type="dxa"/>
-            </w:tcMar>
-            <w:tcBorders>
-              <w:left w:val="single" w:sz="24" w:space="0" w:color="1F4E78"/>
-              <w:top w:val="none"/>
-              <w:right w:val="none"/>
-              <w:bottom w:val="none"/>
-            </w:tcBorders>
-          </w:tcPr>
-          <w:p>
-            <w:pPr>
-              <w:spacing w:line="276" w:lineRule="auto" w:after="40"/>
-            </w:pPr>
-            <w:r>
-              <w:rPr>
-                <w:rFonts w:ascii="Arial" w:hAnsi="Arial"/>
-                <w:b/>
-                <w:color w:val="1F4E78"/>
-                <w:sz w:val="19"/>
-              </w:rPr>
-              <w:t>[FIGURE-ALIGNED METHODS SPECIFICATION]</w:t>
-              <w:br/>
-            </w:r>
-            <w:r>
-              <w:rPr>
-                <w:rFonts w:ascii="Calibri" w:hAnsi="Calibri"/>
-                <w:i/>
-                <w:color w:val="333333"/>
-                <w:sz w:val="19"/>
-              </w:rPr>
-              <w:t>Organization &amp; Rigor Contract: This Methods section is structured strictly in the sequential order of publication figures (Figure 1b to Figure 6, Supplementary Figures S1 to S6, and statistical audit tables). The text faithfully mirrors the actual computational implementation in the verified repository code, including the formal renumbering of DNA repair linear boxplots into Fig. 4b–d (DSB pathways: NHEJ, HR, A-EJ) and Fig. 5b–e (SSB pathways: BER, NER, MMR, FA), followed by the respective meta-dotplots (Fig. 4e and Fig. 5f). All analyses adhere to immutable Ensembl Gene IDs (GRCm38/GRCm39) as computational primary keys and deterministic pseudo-random seed locking at seed = 25.</w:t>
-            </w:r>
-          </w:p>
-        </w:tc>
-      </w:tr>
-    </w:tbl>
-    <w:p>
-      <w:pPr>
-        <w:spacing w:before="0" w:after="60"/>
-      </w:pPr>
-    </w:p>
     <w:p>
       <w:pPr>
         <w:keepNext/>
@@ -116,7 +56,7 @@
           <w:color w:val="262626"/>
           <w:sz w:val="20"/>
         </w:rPr>
-        <w:t xml:space="preserve">Cohort Scope and Biospecimen Selection: </w:t>
+        <w:t xml:space="preserve">Cohort compilation and biospecimen curation. </w:t>
       </w:r>
       <w:r>
         <w:rPr>
@@ -124,7 +64,7 @@
           <w:color w:val="262626"/>
           <w:sz w:val="20"/>
         </w:rPr>
-        <w:t>To establish an organism-wide, multi-tissue atlas of transcriptional adaptations and DNA damage repair alterations under spaceflight environmental stressors, transcriptomic profiles and experimental metadata were curated from the NASA Open Science Data Repository (OSDR, formerly GeneLab; https://osdr.nasa.gov/). The analytical cohort encompasses 48 independent transcriptomic accessions (OSD datasets) across 59 primary analysis units, comprising 761 murine RNA-seq biospecimens spanning 26 distinct anatomical tissues (Figure 1b, Figure 6).</w:t>
+        <w:t>To establish an organism-wide, multi-tissue transcriptomic atlas of spaceflight adaptations and DNA damage repair (DDR) alterations under environmental stressors, transcriptomic profiles and experimental metadata were curated from the NASA Open Science Data Repository (OSDR, https://osdr.nasa.gov/). The analytical cohort encompasses 48 transcriptomic accessions (OSD datasets) across 59 primary analysis units, comprising 761 accession-scoped biospecimen records spanning 26 anatomical tissues (Figure 1b, Figure 6). Ensembl Gene IDs serve as stable, unique computational identifiers throughout all analytical workflows, with gene symbols retained solely for visual display.</w:t>
       </w:r>
     </w:p>
     <w:p>
@@ -138,7 +78,7 @@
           <w:color w:val="262626"/>
           <w:sz w:val="20"/>
         </w:rPr>
-        <w:t xml:space="preserve">Metadata Audit and Conflict Governance: </w:t>
+        <w:t xml:space="preserve">Multidimensional metadata standardization and cohort governance. </w:t>
       </w:r>
       <w:r>
         <w:rPr>
@@ -146,7 +86,7 @@
           <w:color w:val="262626"/>
           <w:sz w:val="20"/>
         </w:rPr>
-        <w:t>Biological and study metadata were programmatically extracted directly from the official NASA OSDR RESTful API and ISA-Tab archive ZIP files (R/data/01_refresh_osdr_mouse_metadata.R). The unified cohort includes 360 spaceflight mice (Flight / μG) and 401 ground-control mice (Ground control, Vivarium control, or Ground centrifuge / 1G baseline control). Exact donor animal identities (accession::Source Name), flight mission assignments across 13 mission clusters (SpaceX-4 to SpaceX-21, NG-11), biological sex (female and male), and donor chronological age (15 discrete age brackets, ranging from 8 to 32 weeks) were audited to resolve legacy ISA syntax discrepancies (such as confirming the current API mission assignment SpaceX-8 for OSD-162) without artificial age conversion or continuous imputation. Technical replicates were collapsed to ensure biological independence across all downstream tests.</w:t>
+        <w:t>Biological and study metadata were programmatically curated from the NASA OSDR RESTful API and ISA-Tab archive files. The finalized analytical dataset encompasses 360 spaceflight biospecimens and 401 ground control records (including vivarium and ground-centrifuge controls). To capture mission-specific environmental dynamics across spaceflight missions, the cohort comprises 13 distinct mission-level comparisons across 12 mission clusters (retaining SpaceX-8 and SpaceX-9 comparisons within OSD-162 as separate analytical units). Crucial biological attributes, including anatomical tissue (26 distinct tissues), biological sex (paired male and female cohorts), chronological age (15 discrete age brackets), and technical replicate designations, were harmonized into an audited reference matrix (Fig_6_mouse_sample_metadata_complete_audit.csv) with 54 structured attributes to ensure complete sample-to-study traceability.</w:t>
       </w:r>
     </w:p>
     <w:p>
@@ -160,7 +100,7 @@
           <w:color w:val="262626"/>
           <w:sz w:val="20"/>
         </w:rPr>
-        <w:t xml:space="preserve">Metadata Bubble Visualization and Complete Audit: </w:t>
+        <w:t xml:space="preserve">Stratified experimental atlas visualization. </w:t>
       </w:r>
       <w:r>
         <w:rPr>
@@ -168,7 +108,7 @@
           <w:color w:val="262626"/>
           <w:sz w:val="20"/>
         </w:rPr>
-        <w:t>Experimental design and animal allocation across 26 tissues were visualized using a stratified bubble plot (Figure 1b, Figure 6). The horizontal axis follows the canonical cross-tissue DNA damage response (DDR) activation rank. Vertically, each mission cluster is bifurcated into paired female and male tracks, with point area scaling with unique donor mouse counts. Age brackets are mapped to a fixed chronological 15-color palette (yellow -&gt; green -&gt; blue -&gt; purple) without continuous interpolation. The single-sample audit table Fig_6_mouse_sample_metadata_complete_audit.csv contains 761 rows and 54 audited attributes verifying complete sample-to-study traceability.</w:t>
+        <w:t>Animal allocation and experimental design across the 26 anatomical tissues were visualized using a multi-track stratified bubble plot (Figure 1b, Figure 6). Anatomical tissues are arranged along the horizontal axis in a standardized order matching the cross-tissue DDR profiling panel. For each mission cluster along the vertical axis, biospecimens are bifurcated into sex-stratified female and male tracks. Individual bubble areas scale proportionally with accession-scoped unique donor counts, and donor age groups are mapped to a discrete chronological color palette to represent cohort diversity without artificial interpolation.</w:t>
       </w:r>
     </w:p>
     <w:p>
@@ -197,7 +137,7 @@
           <w:color w:val="262626"/>
           <w:sz w:val="20"/>
         </w:rPr>
-        <w:t xml:space="preserve">Pre-Ranked fgsea Multilevel Modeling: </w:t>
+        <w:t xml:space="preserve">Pre-ranked gene set enrichment analysis. </w:t>
       </w:r>
       <w:r>
         <w:rPr>
@@ -205,7 +145,7 @@
           <w:color w:val="262626"/>
           <w:sz w:val="20"/>
         </w:rPr>
-        <w:t>Functional pathway enrichment was evaluated via pre-ranked Gene Set Enrichment Analysis using fgseaMultilevel (fgsea package; R 4.4.3), with pseudo-random seeds locked at seed = 25. Differential expression was modeled within each accession using negative binomial GLMs in DESeq2, with contrast orientation audited to ensure Spaceflight vs. Ground directionality. Genes within each comparison were ranked by signed differential Wald statistics: S = sign(log2FC) · (-log10 P_nominal).</w:t>
+        <w:t>To evaluate systemic pathway-level perturbations across anatomical systems under spaceflight environmental stressors, cross-tissue functional pathway enrichment was conducted using pre-ranked gene set enrichment analysis via fgseaMultilevel (fgsea package in R 4.4.3; random seed = 25). For each accession–tissue comparison, genes were ranked based on flight-versus-ground differential-expression statistics curated from OSDR. When available, repository test statistics were used directly; otherwise, signed standard normal deviates were computed from nominal two-sided P values and the sign of log2 fold change (log2FC). For duplicate Ensembl Gene IDs within a comparison, statistics were collapsed by median values, and ties were resolved deterministically by Ensembl ID. Gene set enrichment parameters were set to minSize = 5 for Gene Ontology terms and minSize = 10 for Hallmark terms, maxSize = 5,000, eps = 10^−10, with the standard score type.</w:t>
       </w:r>
     </w:p>
     <w:p>
@@ -219,7 +159,7 @@
           <w:color w:val="262626"/>
           <w:sz w:val="20"/>
         </w:rPr>
-        <w:t xml:space="preserve">Curated Pathway Repertoire: </w:t>
+        <w:t xml:space="preserve">Curated Gene Ontology terms and Hallmark collections. </w:t>
       </w:r>
       <w:r>
         <w:rPr>
@@ -227,7 +167,7 @@
           <w:color w:val="262626"/>
           <w:sz w:val="20"/>
         </w:rPr>
-        <w:t>Analyses queried the MSigDB Hallmark collection (2026.1.Mm; Supplementary Figure S1) and 15 curated Gene Ontology Biological Process (GO:BP) terms (Figure 1c). The GO panel incorporates the core root term for DNA damage response (GO:0006974), sub-pathway branches (DNA repair GO:0006281; DNA damage signal transduction GO:0042770; Intrinsic apoptotic signaling GO:0008630; DNA damage tolerance GO:0006301; Telomere maintenance in response to DNA damage GO:0043247; Chromosome telomeric region GO:0000781), physiological context terms (Cell cycle GO:0007049; DNA replication GO:0006260; Transcription GO:0006351; Translation GO:0006412; Mitochondrion GO:0005739; Cytoskeleton GO:0005856), and comparative mechanosensory processes (Sensory perception of mechanical stimulus GO:0050954; Cell death GO:0008219).</w:t>
+        <w:t>Enrichment profiling focused on 15 predefined Gene Ontology (GO) terms spanning 12 Biological Process and 3 Cellular Component terms relevant to genomic integrity and cellular stress: response to DNA damage stimulus (GO:0006974), DNA repair (GO:0006281), cellular response to DNA damage stimulus (GO:0042770), apoptotic process (GO:0008630), DNA repair-related cellular processes (GO:0006301, GO:0043247, GO:0000781, GO:0007049, GO:0006260, GO:0006351, GO:0006412), mitochondrion (GO:0005739), cytoskeleton (GO:0005856), sensory perception of mechanical stimulus (GO:0050954), and cell death (GO:0008219). Term memberships were constructed from the MGI MOD-GAF and go-basic ontology using relation-closure mapped to Ensembl release-116. In parallel, global transcriptional shifts were evaluated using the native mouse MSigDB Hallmark collection (MSigDB 2026.1.Mm; Supplementary Figure S1).</w:t>
       </w:r>
     </w:p>
     <w:p>
@@ -241,7 +181,7 @@
           <w:color w:val="262626"/>
           <w:sz w:val="20"/>
         </w:rPr>
-        <w:t xml:space="preserve">Mission-Equal NES and Exact Permutation Statistics: </w:t>
+        <w:t xml:space="preserve">Mission-equal NES and statistical meta-testing. </w:t>
       </w:r>
       <w:r>
         <w:rPr>
@@ -249,7 +189,7 @@
           <w:color w:val="262626"/>
           <w:sz w:val="20"/>
         </w:rPr>
-        <w:t>To prevent large missions from exerting disproportionate leverage, Normalized Enrichment Scores (NES) were aggregated via unweighted arithmetic averaging across contributing missions within each tissue. Empirical significance was verified via exact sign-flip two-sided permutation testing across all 2^m sign configurations, coupled with Stouffer meta-Z transformation and Benjamini-Hochberg False Discovery Rate (FDR) multiple testing correction. Figure 1c presents the complete 26 × 15 matrix with a fine blue–white–red continuous gradient.</w:t>
+        <w:t>To avoid dominance by missions with redundant sub-studies, unit-level normalized enrichment scores (NES) within each tissue were first aggregated within mission clusters and then averaged with equal mission weights. Statistical significance was evaluated using exact two-sided sign-flip permutation tests across mission-level NES values, complemented by signed Stouffer meta-Z P values. False discovery rates were controlled by applying the Benjamini–Hochberg procedure separately across the 390 tissue–term cells (26 tissues × 15 GO terms) for each P-value family. Figure 1c presents the complete 26 × 15 mission-equal NES matrix. Supplementary Figure S1 displays the top 12 Hallmark pathways exhibiting the highest global positive and negative enrichment across missions with complete cohort coverage.</w:t>
       </w:r>
     </w:p>
     <w:p>
@@ -264,7 +204,7 @@
           <w:color w:val="1F4E78"/>
           <w:sz w:val="24"/>
         </w:rPr>
-        <w:t>3. Sample-Level Pathway Co-Regulation and Cross-Tissue Fisher-z Integration (Figure 2, Supplementary Figure S6)</w:t>
+        <w:t>3. Sample-Level Pathway Association and Cross-Tissue Fisher-z Integration (Figure 2, Supplementary Figure S6)</w:t>
       </w:r>
     </w:p>
     <w:p>
@@ -278,7 +218,7 @@
           <w:color w:val="262626"/>
           <w:sz w:val="20"/>
         </w:rPr>
-        <w:t xml:space="preserve">Analytical Rationale: </w:t>
+        <w:t xml:space="preserve">Ground-referenced sample pathway scoring. </w:t>
       </w:r>
       <w:r>
         <w:rPr>
@@ -286,7 +226,7 @@
           <w:color w:val="262626"/>
           <w:sz w:val="20"/>
         </w:rPr>
-        <w:t>To capture coordinated biological regulation across the 15 GO processes without suffering from ecological aggregation fallacies, a sample-level correlation framework was executed (python/plot_log2fc_per_tissue_pathway_spearman_20260902.py; Figure 2, Supplementary Figure S6).</w:t>
+        <w:t>To quantify coordinated pathway co-regulation and evaluate whether DDR and metabolic pathways exhibit shared transcriptional trajectories across individual spaceflight animals, a ground-referenced pathway co-response framework was constructed. For each accession–tissue unit, flight specimen k was standardized against the baseline mean of matched ground control specimens: Sample_log2FC(g,k) = log2(x_flight(g,k)) − mean_j[log2(x_ground(g,j))], where x represents normalized source expression values. Sample-level pathway activity scores were computed as the arithmetic mean of log2FC values across all detected member Ensembl IDs for each of the 15 predefined GO terms.</w:t>
       </w:r>
     </w:p>
     <w:p>
@@ -300,7 +240,7 @@
           <w:color w:val="262626"/>
           <w:sz w:val="20"/>
         </w:rPr>
-        <w:t xml:space="preserve">Mathematical Formulation and Pooling Criteria: </w:t>
+        <w:t xml:space="preserve">Intra-tissue correlation and Fisher-z meta-integration. </w:t>
       </w:r>
       <w:r>
         <w:rPr>
@@ -308,25 +248,7 @@
           <w:color w:val="262626"/>
           <w:sz w:val="20"/>
         </w:rPr>
-        <w:t>1. Ground-Referenced Sample-Level log2FC: For each flight animal k within a given accession and tissue, sample-level expression was referenced against matched ground controls:</w:t>
-        <w:br/>
-        <w:t xml:space="preserve">        Sample_log2FC_k = log2(Expr_flight_k + 1) - &lt;log2(Expr_ground + 1)&gt;_accession, tissue</w:t>
-        <w:br/>
-        <w:t>The sample-level pathway activation score was defined as the mean log2FC of constituent member genes.</w:t>
-        <w:br/>
-        <w:t>2. Intra-Tissue Spearman Correlation: Within each of the 26 tissues, taking individual flight mice (n = 360) as independent observation units, pairwise non-parametric Spearman rank correlation coefficients (ρ_ij) were computed across the 15 GO terms, generating 26 distinct 15 × 15 correlation matrices (Supplementary Figure S6).</w:t>
-        <w:br/>
-        <w:t>3. Fisher-z Meta-Aggregation: Intra-tissue correlation coefficients were transformed into normally distributed z-scores:</w:t>
-        <w:br/>
-        <w:t xml:space="preserve">        z = arctanh(ρ) = 0.5 · ln[(1 + ρ) / (1 - ρ)]</w:t>
-        <w:br/>
-        <w:t>Correlations were bounded within [-1 + 10^(-12), 1 - 10^(-12)], and z-scores were capped at |z| ≤ 5.0.</w:t>
-        <w:br/>
-        <w:t>4. Cross-Tissue Pooling Criteria: An unweighted arithmetic mean z̄ was calculated across the 23 eligible tissues satisfying the sample-size threshold (n_flight ≥ 5; Colon [n = 4], Heart [n = 3], and Femoral skin [n = 2] were retained in individual panels but excluded from cross-tissue pooling). The pooled z̄ was back-transformed to derive the overall meta-analytic Spearman rank correlation:</w:t>
-        <w:br/>
-        <w:t xml:space="preserve">        ρ̄ = tanh(z̄) = [exp(2z̄) - 1] / [exp(2z̄) + 1]</w:t>
-        <w:br/>
-        <w:t>The resulting 15 × 15 consensus matrix is presented in Figure 2.</w:t>
+        <w:t>Within each of the 26 anatomical tissues, pairwise Spearman rank correlation coefficients (ρ) were calculated among the 15 pathway scores across individual flight specimens (Supplementary Figure S6). To synthesize a consensus cross-tissue co-response architecture, correlation coefficients were transformed using the Fisher-z transformation: z = arctanh(ρ), with bounded inputs within [-1 + 10^(-12), 1 − 10^(-12)] and |z| ≤ 5.0. Cross-tissue integration was performed by computing the equal-weight mean z̄ across the 23 tissues with sufficient flight sample sizes (n_flight ≥ 5). Three tissues with limited sample numbers—Colon (n = 4), Heart (n = 3), and Femoral skin (n = 2)—were examined in individual-tissue matrices (Supplementary Figure S6) and excluded from the cross-tissue pooled matrix. The consensus correlation matrix was obtained by back-transformation: ρ̄ = tanh(z̄), yielding the 15 × 15 cross-tissue pathway co-response matrix depicted in Figure 2.</w:t>
       </w:r>
     </w:p>
     <w:p>
@@ -341,7 +263,7 @@
           <w:color w:val="1F4E78"/>
           <w:sz w:val="24"/>
         </w:rPr>
-        <w:t>4. Organ-Specific Repertoires, UpSet Intersections, and Common-Direction DEG Prioritization (Figure 3a, 3b, Supplementary Figures S2–S4)</w:t>
+        <w:t>4. Organ-Specific DDR Member-Gene Repertoires and Common-Direction Prioritization (Figure 3, Supplementary Figures S2–S4)</w:t>
       </w:r>
     </w:p>
     <w:p>
@@ -355,7 +277,7 @@
           <w:color w:val="262626"/>
           <w:sz w:val="20"/>
         </w:rPr>
-        <w:t xml:space="preserve">Repertoire Overlap and UpSet Topology: </w:t>
+        <w:t xml:space="preserve">UpSet intersection topology of DDR member genes. </w:t>
       </w:r>
       <w:r>
         <w:rPr>
@@ -363,7 +285,7 @@
           <w:color w:val="262626"/>
           <w:sz w:val="20"/>
         </w:rPr>
-        <w:t>To examine shared and tissue-specific responsive elements within the core DDR machinery (GO:0006974), overlapping DEG repertoires were evaluated across multi-dataset organs, specifically Thymus (4 flight comparisons, Figure 3a) and Kidney (5 independent OSDR datasets, Supplementary Figure S2a) using ggVennDiagram. Organ-wide intersection topology across NES &gt; 1 tissues (excluding Kidney, Supplementary Figure S3a) and NES &lt; -1 tissues (excluding Lung and Thymus, Supplementary Figure S4a) was resolved using UpSet intersection geometry (R/figures/06_go_upsets.R).</w:t>
+        <w:t>To determine whether shared or tissue-specific gene repertoires drive spaceflight DDR perturbations, binary detection matrices of Ensembl IDs belonging to the core DDR term (GO:0006974) were evaluated. A member gene was defined as present when its normalized source expression was finite and greater than zero. UpSet intersection geometry was implemented to resolve the combinatorial overlap of expressed DDR genes across independent flight comparisons within Thymus (4 comparisons; Figure 3a), Kidney (5 accessions; Supplementary Figure S2a), as well as across tissues exhibiting pronounced positive enrichment (NES &gt; 1; Supplementary Figure S3a) and negative enrichment (NES &lt; −1; Supplementary Figure S4a).</w:t>
       </w:r>
     </w:p>
     <w:p>
@@ -377,7 +299,7 @@
           <w:color w:val="262626"/>
           <w:sz w:val="20"/>
         </w:rPr>
-        <w:t xml:space="preserve">Common-Direction Screening Formulation: </w:t>
+        <w:t xml:space="preserve">Common-direction concordance and candidate prioritization. </w:t>
       </w:r>
       <w:r>
         <w:rPr>
@@ -385,11 +307,7 @@
           <w:color w:val="262626"/>
           <w:sz w:val="20"/>
         </w:rPr>
-        <w:t>To prioritize core genes demonstrating conserved responsiveness independent of mission idiosyncrasies, common-direction filtering was executed (python/plot_common_direction_heatmaps.py; Figure 3b, Supplementary Figure S2b, S3b, S4b). Candidate DEGs were required to demonstrate uniform directional concordance (all log2FC &gt; 0 or all log2FC &lt; 0) across all parallel dataset comparisons at nominal P &lt; 0.05 (or P &lt; 0.10 for global NES-stratified cohorts). Qualifying genes were ranked by their minimum absolute fold change across comparisons:</w:t>
-        <w:br/>
-        <w:t xml:space="preserve">        Score_g = min_c |log2FC_{g, c}|</w:t>
-        <w:br/>
-        <w:t>The top 30 ranked common-direction genes were displayed as heatmaps with standardized blue–white–red color gradients and exact log2FC text overlays.</w:t>
+        <w:t>To identify core responsive genes exhibiting reproducible, unidirectional regulation under spaceflight stress across parallel studies, candidate genes were prioritized based on directional concordance. Mission-level differential expression statistics were corrected using Benjamini–Hochberg FDR (threshold FDR ≤ 0.05 for Thymus and Kidney; FDR ≤ 0.10 for the high- and low-NES tissue cohorts). Qualifying genes were required to display identical non-zero log2FC signs across all parallel comparisons within the cohort. Concordant genes were then ranked by their minimum effect magnitude across comparisons: Score_g = min_c |log2FC(g,c)|. This prioritization identified 30 top concordant genes in Thymus (Figure 3b), 12 in Kidney (Supplementary Figure S2b), 5 in high-NES tissues (Supplementary Figure S3b), and 11 in low-NES tissues (Supplementary Figure S4b), displayed with overlaid comparison-specific log2FC values.</w:t>
       </w:r>
     </w:p>
     <w:p>
@@ -404,22 +322,7 @@
           <w:color w:val="1F4E78"/>
           <w:sz w:val="24"/>
         </w:rPr>
-        <w:t>5. Double-Strand Break (DSB) Repair Architecture: Baseline Clustering, Individual Linear Boxplots, and Spaceflight Meta-Analysis (Figure 4a–e)</w:t>
-      </w:r>
-    </w:p>
-    <w:p>
-      <w:pPr>
-        <w:keepNext/>
-        <w:spacing w:before="180" w:after="60"/>
-      </w:pPr>
-      <w:r>
-        <w:rPr>
-          <w:rFonts w:ascii="Arial" w:hAnsi="Arial"/>
-          <w:b/>
-          <w:color w:val="2E75B6"/>
-          <w:sz w:val="22"/>
-        </w:rPr>
-        <w:t>5.1 Baseline Quantile Smoothing (YARN / qsmooth) and Hierarchical Clustering (Figure 4a)</w:t>
+        <w:t>5. Double-Strand Break Repair Architecture and Spaceflight Meta-Analysis (Figure 4)</w:t>
       </w:r>
     </w:p>
     <w:p>
@@ -433,7 +336,7 @@
           <w:color w:val="262626"/>
           <w:sz w:val="20"/>
         </w:rPr>
-        <w:t xml:space="preserve">Normalization and Dendrogram Clustering: </w:t>
+        <w:t xml:space="preserve">Tissue-aware normalization and pathway clustering. </w:t>
       </w:r>
       <w:r>
         <w:rPr>
@@ -441,22 +344,7 @@
           <w:color w:val="262626"/>
           <w:sz w:val="20"/>
         </w:rPr>
-        <w:t>To mitigate technical batch artifacts while preserving bona fide tissue-specific transcriptional baselines, cross-tissue expression normalization was performed using the YARN framework implementing tissue-aware quantile smoothing (qsmooth). For the DSB repair module, 29 curated components spanning NHEJ (7 components), HR (14 components), HR–A-EJ shared factors (3 components), and A-EJ (5 components) were assembled. Pairwise topological dissimilarity between tissues Ta and Tb was computed on baseline normalized expression (YARNNormalizedLog2) via Spearman rank distance: D(Ta, Tb) = 1 - ρ_Spearman(Ta, Tb). Hierarchical agglomerative clustering was executed using average linkage (hclust(as.dist(D), method = 'average')), defining the stable dendrogram order for Figure 4a.</w:t>
-      </w:r>
-    </w:p>
-    <w:p>
-      <w:pPr>
-        <w:keepNext/>
-        <w:spacing w:before="180" w:after="60"/>
-      </w:pPr>
-      <w:r>
-        <w:rPr>
-          <w:rFonts w:ascii="Arial" w:hAnsi="Arial"/>
-          <w:b/>
-          <w:color w:val="2E75B6"/>
-          <w:sz w:val="22"/>
-        </w:rPr>
-        <w:t>5.2 Tissue-Stratified Individual Linear Abundance Modeling and One-Way ANOVA (Figure 4b–d)</w:t>
+        <w:t>To characterize baseline expression patterns and tissue divergence in double-strand break (DSB) repair machinery, flight transcriptomic profiles were normalized using YARN tissue-aware quantile smoothing (yarn::normalizeTissueAware; groups = tissue, normalizationMethod = 'qsmooth', window = 0.05, log = TRUE). Normalization was conducted across a background universe of 12,462 Ensembl genes, 360 flight biospecimens, 59 analysis units, and 26 tissues. For DSB architecture analysis, 29 curated pathway components were compiled across non-homologous end joining (NHEJ, 7 genes), homologous recombination (HR, 14 genes), HR/A-EJ shared components (3 genes), and alternative end joining (A-EJ, 5 genes). Expression profiles were sequentially aggregated by biospecimen, analysis unit, mission, and tissue. Pairwise tissue dissimilarity was calculated as D(Ta, Tb) = 1 − ρ_Spearman on tissue-mean YARN normalized log2 profiles, followed by average-linkage hierarchical clustering to reconstruct anatomical relationships (Figure 4a).</w:t>
       </w:r>
     </w:p>
     <w:p>
@@ -470,7 +358,7 @@
           <w:color w:val="262626"/>
           <w:sz w:val="20"/>
         </w:rPr>
-        <w:t xml:space="preserve">Linear Scale Formulation, Boxplot Geometry, and ANOVA Testing: </w:t>
+        <w:t xml:space="preserve">Linear-scale baseline expression profiling of DSB machinery. </w:t>
       </w:r>
       <w:r>
         <w:rPr>
@@ -478,32 +366,100 @@
           <w:color w:val="262626"/>
           <w:sz w:val="20"/>
         </w:rPr>
-        <w:t>To assess physiological baseline expression and organ-level heterogeneity across the mammalian DSB repair machinery, key biological marker genes were selected and displayed on a linear expression scale (Expression_linear = 2^(YARNNormalizedLog2) - 1) across the 26 canonical tissues:</w:t>
-        <w:br/>
-        <w:t>• Figure 4b (NHEJ, 4 genes): Nhej1 / XLF (ENSMUSG00000026162), Paxx (ENSMUSG00000047617), Xrcc6 / Ku70 (ENSMUSG00000022471), Xrcc5 / Ku80 (ENSMUSG00000026187).</w:t>
-        <w:br/>
-        <w:t>• Figure 4c (HR, 4 genes): Brca1 (ENSMUSG00000017146), Bard1 (ENSMUSG00000026196), Blm (ENSMUSG00000030528), Rad51 (ENSMUSG00000027323).</w:t>
-        <w:br/>
-        <w:t>• Figure 4d (A-EJ, 4 genes): Parp1 (ENSMUSG00000026496), Polq (ENSMUSG00000034206), Lig1 (ENSMUSG00000056394), Lig3 (ENSMUSG00000020697).</w:t>
-        <w:br/>
-        <w:t>Boxplot Construction: The lower hinge represents Q1 (25%); the center solid line represents the sample mean (μ); the upper hinge represents Q3 (75%). Whiskers extend to the furthest observations within 1.5 × IQR. Individual flight mice biospecimens (n = 360) are overlaid as jittered points (dodge.width = 0.80, jitter.width = 0.11, seed = 25). Dashed lines connect tissue-level mean values for each gene.</w:t>
-        <w:br/>
-        <w:t>One-Way ANOVA: Tissue heterogeneity was evaluated via ordinary One-way ANOVA. Both gene-level tests (df_group = 25, df_residual = 334) and pathway-level tests (modeled on per-mouse mean pathway abundance) were conducted, with exact F-statistics and scientific P-values printed in figure subtitles: NHEJ (Pathway F = 47.99, P = 6.82 × 10^(-95)), HR (Pathway F = 39.53, P = 2.37 × 10^(-84)), and A-EJ (Pathway F = 42.60, P = 2.37 × 10^(-88)).</w:t>
+        <w:t>To quantify physiological expression distributions and tissue-specific abundance of key DSB repair machinery, representative marker genes were plotted on the back-transformed linear normalized expression scale (Expression_linear = 2^(YARNNormalizedLog2) − 1) across the 26 anatomical tissues:</w:t>
       </w:r>
     </w:p>
     <w:p>
       <w:pPr>
-        <w:keepNext/>
-        <w:spacing w:before="180" w:after="60"/>
+        <w:spacing w:line="283" w:lineRule="auto" w:before="0" w:after="50"/>
+        <w:ind w:left="360"/>
       </w:pPr>
       <w:r>
         <w:rPr>
-          <w:rFonts w:ascii="Arial" w:hAnsi="Arial"/>
+          <w:rFonts w:ascii="Calibri" w:hAnsi="Calibri"/>
+          <w:color w:val="1F4E78"/>
+          <w:sz w:val="20"/>
+        </w:rPr>
+        <w:t xml:space="preserve">• </w:t>
+      </w:r>
+      <w:r>
+        <w:rPr>
+          <w:rFonts w:ascii="Calibri" w:hAnsi="Calibri"/>
           <w:b/>
-          <w:color w:val="2E75B6"/>
-          <w:sz w:val="22"/>
+          <w:color w:val="262626"/>
+          <w:sz w:val="20"/>
         </w:rPr>
-        <w:t>5.3 Spaceflight-Induced Meta-Differential Expression Analysis (Figure 4e)</w:t>
+        <w:t xml:space="preserve">NHEJ (Figure 4b, 4 genes): </w:t>
+      </w:r>
+      <w:r>
+        <w:rPr>
+          <w:rFonts w:ascii="Calibri" w:hAnsi="Calibri"/>
+          <w:color w:val="262626"/>
+          <w:sz w:val="20"/>
+        </w:rPr>
+        <w:t>Nhej1 / XLF (ENSMUSG00000026162), Paxx (ENSMUSG00000047617), Xrcc6 / Ku70 (ENSMUSG00000022471), and Xrcc5 / Ku80 (ENSMUSG00000026187).</w:t>
+      </w:r>
+    </w:p>
+    <w:p>
+      <w:pPr>
+        <w:spacing w:line="283" w:lineRule="auto" w:before="0" w:after="50"/>
+        <w:ind w:left="360"/>
+      </w:pPr>
+      <w:r>
+        <w:rPr>
+          <w:rFonts w:ascii="Calibri" w:hAnsi="Calibri"/>
+          <w:color w:val="1F4E78"/>
+          <w:sz w:val="20"/>
+        </w:rPr>
+        <w:t xml:space="preserve">• </w:t>
+      </w:r>
+      <w:r>
+        <w:rPr>
+          <w:rFonts w:ascii="Calibri" w:hAnsi="Calibri"/>
+          <w:b/>
+          <w:color w:val="262626"/>
+          <w:sz w:val="20"/>
+        </w:rPr>
+        <w:t xml:space="preserve">HR (Figure 4c, 4 genes): </w:t>
+      </w:r>
+      <w:r>
+        <w:rPr>
+          <w:rFonts w:ascii="Calibri" w:hAnsi="Calibri"/>
+          <w:color w:val="262626"/>
+          <w:sz w:val="20"/>
+        </w:rPr>
+        <w:t>Brca1 (ENSMUSG00000017146), Bard1 (ENSMUSG00000026196), Blm (ENSMUSG00000030528), and Rad51 (ENSMUSG00000027323).</w:t>
+      </w:r>
+    </w:p>
+    <w:p>
+      <w:pPr>
+        <w:spacing w:line="283" w:lineRule="auto" w:before="0" w:after="50"/>
+        <w:ind w:left="360"/>
+      </w:pPr>
+      <w:r>
+        <w:rPr>
+          <w:rFonts w:ascii="Calibri" w:hAnsi="Calibri"/>
+          <w:color w:val="1F4E78"/>
+          <w:sz w:val="20"/>
+        </w:rPr>
+        <w:t xml:space="preserve">• </w:t>
+      </w:r>
+      <w:r>
+        <w:rPr>
+          <w:rFonts w:ascii="Calibri" w:hAnsi="Calibri"/>
+          <w:b/>
+          <w:color w:val="262626"/>
+          <w:sz w:val="20"/>
+        </w:rPr>
+        <w:t xml:space="preserve">A-EJ (Figure 4d, 4 genes): </w:t>
+      </w:r>
+      <w:r>
+        <w:rPr>
+          <w:rFonts w:ascii="Calibri" w:hAnsi="Calibri"/>
+          <w:color w:val="262626"/>
+          <w:sz w:val="20"/>
+        </w:rPr>
+        <w:t>Parp1 (ENSMUSG00000026496), Polq (ENSMUSG00000034206), Lig1 (ENSMUSG00000056394), and Lig3 (ENSMUSG00000020697).</w:t>
       </w:r>
     </w:p>
     <w:p>
@@ -517,7 +473,7 @@
           <w:color w:val="262626"/>
           <w:sz w:val="20"/>
         </w:rPr>
-        <w:t xml:space="preserve">Meta-Dotplot Construction: </w:t>
+        <w:t xml:space="preserve">Boxplot geometry and tissue variance. </w:t>
       </w:r>
       <w:r>
         <w:rPr>
@@ -525,7 +481,29 @@
           <w:color w:val="262626"/>
           <w:sz w:val="20"/>
         </w:rPr>
-        <w:t>To characterize spaceflight-induced perturbations across all 29 DSB components, multi-mission meta-analysis was performed (Figure 4e). Effect sizes are presented as the median of mission-level median log2FC values. Meta-significance across missions was integrated via signed Stouffer's Z-trend test: Z_meta = [∑ sign(log2FC_i) · Φ^(-1)(1 - P_i / 2)] / √m. Dot color reflects median log2FC and dot diameter scales with -log10(P_meta).</w:t>
+        <w:t>In the stratified boxplots, the central solid line denotes the sample mean (μ), the lower and upper box hinges represent the first (Q1, 25%) and third (Q3, 75%) quartiles, and whiskers extend to the furthest observations within 1.5 × IQR. Individual flight biospecimens (360 samples) are overlaid as jittered points (dodge width = 0.80, jitter width = 0.11, seed = 25), with dashed lines connecting tissue means. Tissue-specific expression heterogeneity was evaluated by one-way ANOVA across anatomical tissues.</w:t>
+      </w:r>
+    </w:p>
+    <w:p>
+      <w:pPr>
+        <w:spacing w:line="293" w:lineRule="auto" w:before="0" w:after="90"/>
+      </w:pPr>
+      <w:r>
+        <w:rPr>
+          <w:rFonts w:ascii="Calibri" w:hAnsi="Calibri"/>
+          <w:b/>
+          <w:color w:val="262626"/>
+          <w:sz w:val="20"/>
+        </w:rPr>
+        <w:t xml:space="preserve">Spaceflight-induced meta-differential expression analysis. </w:t>
+      </w:r>
+      <w:r>
+        <w:rPr>
+          <w:rFonts w:ascii="Calibri" w:hAnsi="Calibri"/>
+          <w:color w:val="262626"/>
+          <w:sz w:val="20"/>
+        </w:rPr>
+        <w:t>To assess spaceflight transcriptional shifts across the complete 29-component DSB repertoire, multi-mission meta-analysis was performed across all 26 tissues (Figure 4e). The overall spaceflight effect size was calculated as the median of mission-level median log2FC values. Meta-analytic significance across missions was determined using signed Stouffer's Z-trend tests. Significant perturbations with nominal tissue-meta P &lt; 0.05 are presented as meta-dotplots, wherein dot color reflects the direction of regulation (red, spaceflight-upregulated; blue, spaceflight-downregulated) and dot area scales with effect magnitude (|log2FC|).</w:t>
       </w:r>
     </w:p>
     <w:p>
@@ -540,22 +518,7 @@
           <w:color w:val="1F4E78"/>
           <w:sz w:val="24"/>
         </w:rPr>
-        <w:t>6. Single-Strand Break (SSB) Repair Architecture: Baseline Clustering, Individual Linear Boxplots, and Spaceflight Meta-Analysis (Figure 5a–f)</w:t>
-      </w:r>
-    </w:p>
-    <w:p>
-      <w:pPr>
-        <w:keepNext/>
-        <w:spacing w:before="180" w:after="60"/>
-      </w:pPr>
-      <w:r>
-        <w:rPr>
-          <w:rFonts w:ascii="Arial" w:hAnsi="Arial"/>
-          <w:b/>
-          <w:color w:val="2E75B6"/>
-          <w:sz w:val="22"/>
-        </w:rPr>
-        <w:t>6.1 Baseline Quantile Smoothing, Neil2 Exclusion Audit, and Hierarchical Clustering (Figure 5a)</w:t>
+        <w:t>6. Single-Strand Break Repair Architecture and Spaceflight Meta-Analysis (Figure 5)</w:t>
       </w:r>
     </w:p>
     <w:p>
@@ -569,7 +532,7 @@
           <w:color w:val="262626"/>
           <w:sz w:val="20"/>
         </w:rPr>
-        <w:t xml:space="preserve">Quality Exclusion Audit and Dendrogram Topology: </w:t>
+        <w:t xml:space="preserve">Pathway definition and tissue-aware clustering. </w:t>
       </w:r>
       <w:r>
         <w:rPr>
@@ -577,22 +540,7 @@
           <w:color w:val="262626"/>
           <w:sz w:val="20"/>
         </w:rPr>
-        <w:t>Cross-tissue baseline normalization for the single-strand break and base excision machinery encompassed 45 curated components spanning BER (6 components), NER (18 components), MMR (5 components), and FA (16 components). Data completeness audits across all flight biospecimens identified recurrent sequencing dropout and high zero-count sparsity for Neil2 (ENSMUSG00000035121); Neil2 was therefore systematically excluded from the 45-component SSB matrix and audited in 02_SSB_component_stable_id_mapping_without_Neil2.csv. Pairwise topological distance was computed on baseline YARNNormalizedLog2 via Spearman rank distance (D = 1 - ρ), followed by average-linkage hierarchical clustering to generate Figure 5a.</w:t>
-      </w:r>
-    </w:p>
-    <w:p>
-      <w:pPr>
-        <w:keepNext/>
-        <w:spacing w:before="180" w:after="60"/>
-      </w:pPr>
-      <w:r>
-        <w:rPr>
-          <w:rFonts w:ascii="Arial" w:hAnsi="Arial"/>
-          <w:b/>
-          <w:color w:val="2E75B6"/>
-          <w:sz w:val="22"/>
-        </w:rPr>
-        <w:t>6.2 Tissue-Stratified Individual Linear Abundance Modeling and One-Way ANOVA (Figure 5b–e)</w:t>
+        <w:t>To establish baseline expression architectures across single-strand break (SSB) repair mechanisms, a curated panel of 45 components was compiled across the four major SSB pathways: base excision repair (BER, 6 genes), nucleotide excision repair (NER, 18 genes), mismatch repair (MMR, 5 genes), and the Fanconi anemia pathway (FA, 16 genes) (Figure 5a, 5f). Biospecimen expression profiles were normalized using YARN tissue-aware quantile smoothing (qsmooth), followed by successive aggregation to tissue means. Pairwise tissue distances were computed as D(Ta, Tb) = 1 − ρ_Spearman and resolved using average-linkage hierarchical clustering to reveal cross-tissue organizational dendrograms (Figure 5a).</w:t>
       </w:r>
     </w:p>
     <w:p>
@@ -606,7 +554,7 @@
           <w:color w:val="262626"/>
           <w:sz w:val="20"/>
         </w:rPr>
-        <w:t xml:space="preserve">Marker Gene Selection, Glyphic Coding, and ANOVA Testing: </w:t>
+        <w:t xml:space="preserve">Linear-scale baseline expression profiling of SSB machinery. </w:t>
       </w:r>
       <w:r>
         <w:rPr>
@@ -614,34 +562,131 @@
           <w:color w:val="262626"/>
           <w:sz w:val="20"/>
         </w:rPr>
-        <w:t>Key marker genes across the four SSB pathways were evaluated on the linear expression scale (2^(log2) - 1) across 360 flight mice in 26 tissues:</w:t>
-        <w:br/>
-        <w:t>• Figure 5b (BER, 3 genes): Ung (ENSMUSG00000029591), Ogg1 (ENSMUSG00000030271), Neil1 (ENSMUSG00000032298).</w:t>
-        <w:br/>
-        <w:t>• Figure 5c (NER, 7 genes): Xpc (ENSMUSG00000030094), Rad23b (ENSMUSG00000028426), Cetn2 (ENSMUSG00000031347), Ddb1 (ENSMUSG00000024740), Ddb2 (ENSMUSG00000002109), Ercc6 (ENSMUSG00000054051), Ercc8 (ENSMUSG00000021694).</w:t>
-        <w:br/>
-        <w:t xml:space="preserve">  NER Glyphic Disambiguation: Recognition complexes are encoded by paired color-and-shape glyphs: XPC/RAD23B/CETN2 (amber; cross ✕, triangle ▲, circle ●); DDB1/DDB2 (teal; cross ✕, triangle ▲); ERCC6/ERCC8 (blue; cross ✕, triangle ▲).</w:t>
-        <w:br/>
-        <w:t>• Figure 5d (MMR, 2 genes): Msh2 (ENSMUSG00000024151), Msh3 (ENSMUSG00000014850).</w:t>
-        <w:br/>
-        <w:t>• Figure 5e (FA, 2 genes): Fancd2 (ENSMUSG00000034023), Fanci (ENSMUSG00000039187). (df_group = 25, df_residual = 330 due to 4 missing observations).</w:t>
-        <w:br/>
-        <w:t>One-Way ANOVA: Cross-tissue expression heterogeneity was highly significant across all pathways: BER (Pathway F = 32.44, P = 3.49 × 10^(-74)), NER (Pathway F = 89.47, P = 7.98 × 10^(-132)), MMR (Pathway F = 56.20, P = 7.71 × 10^(-104)), and FA (Pathway F = 31.47, P = 2.86 × 10^(-72)).</w:t>
+        <w:t>Tissue-specific expression levels of key SSB components were evaluated on the back-transformed linear scale (Expression_linear = 2^(YARNNormalizedLog2) − 1) across 360 flight biospecimens in 26 tissues (Figure 5b–e):</w:t>
       </w:r>
     </w:p>
     <w:p>
       <w:pPr>
-        <w:keepNext/>
-        <w:spacing w:before="180" w:after="60"/>
+        <w:spacing w:line="283" w:lineRule="auto" w:before="0" w:after="50"/>
+        <w:ind w:left="360"/>
       </w:pPr>
       <w:r>
         <w:rPr>
-          <w:rFonts w:ascii="Arial" w:hAnsi="Arial"/>
+          <w:rFonts w:ascii="Calibri" w:hAnsi="Calibri"/>
+          <w:color w:val="1F4E78"/>
+          <w:sz w:val="20"/>
+        </w:rPr>
+        <w:t xml:space="preserve">• </w:t>
+      </w:r>
+      <w:r>
+        <w:rPr>
+          <w:rFonts w:ascii="Calibri" w:hAnsi="Calibri"/>
           <w:b/>
-          <w:color w:val="2E75B6"/>
-          <w:sz w:val="22"/>
+          <w:color w:val="262626"/>
+          <w:sz w:val="20"/>
         </w:rPr>
-        <w:t>6.3 Spaceflight-Induced Meta-Differential Expression Analysis (Figure 5f)</w:t>
+        <w:t xml:space="preserve">BER (Figure 5b, 3 genes): </w:t>
+      </w:r>
+      <w:r>
+        <w:rPr>
+          <w:rFonts w:ascii="Calibri" w:hAnsi="Calibri"/>
+          <w:color w:val="262626"/>
+          <w:sz w:val="20"/>
+        </w:rPr>
+        <w:t>Ung (ENSMUSG00000029591), Ogg1 (ENSMUSG00000030271), and Neil1 (ENSMUSG00000032298).</w:t>
+      </w:r>
+    </w:p>
+    <w:p>
+      <w:pPr>
+        <w:spacing w:line="283" w:lineRule="auto" w:before="0" w:after="50"/>
+        <w:ind w:left="360"/>
+      </w:pPr>
+      <w:r>
+        <w:rPr>
+          <w:rFonts w:ascii="Calibri" w:hAnsi="Calibri"/>
+          <w:color w:val="1F4E78"/>
+          <w:sz w:val="20"/>
+        </w:rPr>
+        <w:t xml:space="preserve">• </w:t>
+      </w:r>
+      <w:r>
+        <w:rPr>
+          <w:rFonts w:ascii="Calibri" w:hAnsi="Calibri"/>
+          <w:b/>
+          <w:color w:val="262626"/>
+          <w:sz w:val="20"/>
+        </w:rPr>
+        <w:t xml:space="preserve">NER (Figure 5c, 7 genes): </w:t>
+      </w:r>
+      <w:r>
+        <w:rPr>
+          <w:rFonts w:ascii="Calibri" w:hAnsi="Calibri"/>
+          <w:color w:val="262626"/>
+          <w:sz w:val="20"/>
+        </w:rPr>
+        <w:t>Xpc (ENSMUSG00000030094), Rad23b (ENSMUSG00000028426), Cetn2 (ENSMUSG00000031347), Ddb1 (ENSMUSG00000024740), Ddb2 (ENSMUSG00000002109), Ercc6 (ENSMUSG00000054051), and Ercc8 (ENSMUSG00000021694). Recognition complexes are visually disambiguated using coordinated glyphs: XPC/RAD23B/CETN2 (amber; cross ✕, triangle ▲, circle ●), DDB1/DDB2 (teal; cross ✕, triangle ▲), and ERCC6/ERCC8 (blue; cross ✕, triangle ▲).</w:t>
+      </w:r>
+    </w:p>
+    <w:p>
+      <w:pPr>
+        <w:spacing w:line="283" w:lineRule="auto" w:before="0" w:after="50"/>
+        <w:ind w:left="360"/>
+      </w:pPr>
+      <w:r>
+        <w:rPr>
+          <w:rFonts w:ascii="Calibri" w:hAnsi="Calibri"/>
+          <w:color w:val="1F4E78"/>
+          <w:sz w:val="20"/>
+        </w:rPr>
+        <w:t xml:space="preserve">• </w:t>
+      </w:r>
+      <w:r>
+        <w:rPr>
+          <w:rFonts w:ascii="Calibri" w:hAnsi="Calibri"/>
+          <w:b/>
+          <w:color w:val="262626"/>
+          <w:sz w:val="20"/>
+        </w:rPr>
+        <w:t xml:space="preserve">MMR (Figure 5d, 2 genes): </w:t>
+      </w:r>
+      <w:r>
+        <w:rPr>
+          <w:rFonts w:ascii="Calibri" w:hAnsi="Calibri"/>
+          <w:color w:val="262626"/>
+          <w:sz w:val="20"/>
+        </w:rPr>
+        <w:t>Msh2 (ENSMUSG00000024151) and Msh3 (ENSMUSG00000014850).</w:t>
+      </w:r>
+    </w:p>
+    <w:p>
+      <w:pPr>
+        <w:spacing w:line="283" w:lineRule="auto" w:before="0" w:after="50"/>
+        <w:ind w:left="360"/>
+      </w:pPr>
+      <w:r>
+        <w:rPr>
+          <w:rFonts w:ascii="Calibri" w:hAnsi="Calibri"/>
+          <w:color w:val="1F4E78"/>
+          <w:sz w:val="20"/>
+        </w:rPr>
+        <w:t xml:space="preserve">• </w:t>
+      </w:r>
+      <w:r>
+        <w:rPr>
+          <w:rFonts w:ascii="Calibri" w:hAnsi="Calibri"/>
+          <w:b/>
+          <w:color w:val="262626"/>
+          <w:sz w:val="20"/>
+        </w:rPr>
+        <w:t xml:space="preserve">FA (Figure 5e, 2 genes): </w:t>
+      </w:r>
+      <w:r>
+        <w:rPr>
+          <w:rFonts w:ascii="Calibri" w:hAnsi="Calibri"/>
+          <w:color w:val="262626"/>
+          <w:sz w:val="20"/>
+        </w:rPr>
+        <w:t>Fancd2 (ENSMUSG00000034023) and Fanci (ENSMUSG00000039187).</w:t>
       </w:r>
     </w:p>
     <w:p>
@@ -655,7 +700,7 @@
           <w:color w:val="262626"/>
           <w:sz w:val="20"/>
         </w:rPr>
-        <w:t xml:space="preserve">Meta-Dotplot Construction: </w:t>
+        <w:t xml:space="preserve">Boxplot geometry and tissue variance. </w:t>
       </w:r>
       <w:r>
         <w:rPr>
@@ -663,7 +708,29 @@
           <w:color w:val="262626"/>
           <w:sz w:val="20"/>
         </w:rPr>
-        <w:t>To assess spaceflight transcriptional shifts across all 45 SSB components, multi-mission meta-analysis was performed (Figure 5f). Effect sizes represent the median of mission-level median log2FC values, and statistical significance was pooled using signed Stouffer's Z-trend integration, scaled by nominal P-value significance.</w:t>
+        <w:t>Boxplot geometry, sample jittering (seed = 25), and tissue-mean connectors followed the DSB specifications, with tissue expression heterogeneity evaluated by one-way ANOVA.</w:t>
+      </w:r>
+    </w:p>
+    <w:p>
+      <w:pPr>
+        <w:spacing w:line="293" w:lineRule="auto" w:before="0" w:after="90"/>
+      </w:pPr>
+      <w:r>
+        <w:rPr>
+          <w:rFonts w:ascii="Calibri" w:hAnsi="Calibri"/>
+          <w:b/>
+          <w:color w:val="262626"/>
+          <w:sz w:val="20"/>
+        </w:rPr>
+        <w:t xml:space="preserve">Spaceflight-induced meta-differential expression analysis. </w:t>
+      </w:r>
+      <w:r>
+        <w:rPr>
+          <w:rFonts w:ascii="Calibri" w:hAnsi="Calibri"/>
+          <w:color w:val="262626"/>
+          <w:sz w:val="20"/>
+        </w:rPr>
+        <w:t>To determine transcriptional perturbations across the 45 SSB components in spaceflight, multi-mission meta-analysis was conducted across all 26 tissues (Figure 5f). Meta-effect sizes were calculated as the median of mission-level median log2FC values, and statistical significance was evaluated using signed Stouffer's Z-trend tests. Associations meeting nominal tissue-meta P &lt; 0.05 are displayed, with dot color indicating regulation direction and dot size encoding effect magnitude (|log2FC|).</w:t>
       </w:r>
     </w:p>
     <w:p>
@@ -678,7 +745,7 @@
           <w:color w:val="1F4E78"/>
           <w:sz w:val="24"/>
         </w:rPr>
-        <w:t>7. Seven-Pathway Repertoire Library Representation and Gene Coverage Auditing (Supplementary Figure S5)</w:t>
+        <w:t>7. Multi-Pathway Member-Gene Detection Audit Across Tissues (Supplementary Figure S5)</w:t>
       </w:r>
     </w:p>
     <w:p>
@@ -692,7 +759,7 @@
           <w:color w:val="262626"/>
           <w:sz w:val="20"/>
         </w:rPr>
-        <w:t xml:space="preserve">Catalog Completeness and Library Representation: </w:t>
+        <w:t xml:space="preserve">Pathway coverage and biospecimen detection integrity. </w:t>
       </w:r>
       <w:r>
         <w:rPr>
@@ -700,7 +767,7 @@
           <w:color w:val="262626"/>
           <w:sz w:val="20"/>
         </w:rPr>
-        <w:t>To verify that pathway-level transcriptomic analyses were not compromised by library dropouts or incomplete capture across sequencing accessions, per-sample gene detection was audited against a master catalog of 335 DNA repair genes: BER (n = 54), NER (n = 53), MMR (n = 27), FA (n = 39), HR (n = 135), A-EJ (n = 9), and NHEJ (n = 18). Supplementary Figure S5 tracks the count of detected member genes across all 761 source samples (stratified by Ground and Flight), confirming comprehensive transcript coverage across all 26 anatomical tissues.</w:t>
+        <w:t>To confirm the detection coverage and analytical integrity of the DNA damage repair machinery across the entire spaceflight dataset, expression detection was audited for 257 non-redundant Ensembl Gene IDs comprising 335 pathway memberships across the seven curated repair modules: BER (54 memberships), NER (53), MMR (27), FA (39), HR (135), A-EJ (9), and NHEJ (18). A gene was classified as detected in a given biospecimen when its normalized source expression value was finite and greater than zero. Detection counts were calculated for each of the 761 biospecimens across the 26 anatomical tissues, stratified by flight and ground conditions, to verify robust transcriptomic coverage across experimental groups (Supplementary Figure S5).</w:t>
       </w:r>
     </w:p>
     <w:p>
@@ -715,7 +782,7 @@
           <w:color w:val="1F4E78"/>
           <w:sz w:val="24"/>
         </w:rPr>
-        <w:t>8. Computational Environment, Code Governance, and Reproducibility Standards</w:t>
+        <w:t>8. Statistical Analysis, Software Environment, and Computational Reproducibility</w:t>
       </w:r>
     </w:p>
     <w:p>
@@ -729,7 +796,7 @@
           <w:color w:val="262626"/>
           <w:sz w:val="20"/>
         </w:rPr>
-        <w:t xml:space="preserve">Software Architecture: </w:t>
+        <w:t xml:space="preserve">Statistical standards and computational environment. </w:t>
       </w:r>
       <w:r>
         <w:rPr>
@@ -737,7 +804,7 @@
           <w:color w:val="262626"/>
           <w:sz w:val="20"/>
         </w:rPr>
-        <w:t>All statistical modeling, data transformations, and figure generation were executed in R (version 4.4.3) and Python (version 3.13). Core R dependencies included data.table (v1.16.4), ggplot2 (v3.5.1), patchwork (v1.3.0), scales (v1.3.0), and ggVennDiagram (v1.5.2), managed via renv.lock. Python workflows utilized matplotlib (v3.10.0), pandas (v2.2.3), and numpy (v2.2.3).</w:t>
+        <w:t>All bioinformatics data processing, statistical meta-analyses, and visualization workflows were developed in R 4.4.3 and Python (v3.13/v3.14). Key pinned R packages include data.table (v1.18.2.1), ggplot2 (v4.0.2), patchwork (v1.3.2), scales (v1.4.0), and ggVennDiagram (v1.5.7). Python workflows utilized matplotlib (v3.10.8), numpy (v2.5.0), and pandas (v3.0.2). Multiple-testing adjustments throughout the study were performed using the Benjamini–Hochberg procedure to control the false discovery rate. Between-tissue expression heterogeneity for linear boxplot distributions was assessed via one-way ANOVA across anatomical tissues.</w:t>
       </w:r>
     </w:p>
     <w:p>
@@ -751,7 +818,7 @@
           <w:color w:val="262626"/>
           <w:sz w:val="20"/>
         </w:rPr>
-        <w:t xml:space="preserve">Seed Locking and Version Control: </w:t>
+        <w:t xml:space="preserve">Reproducibility protocols, seed locking, and version governance. </w:t>
       </w:r>
       <w:r>
         <w:rPr>
@@ -759,7 +826,7 @@
           <w:color w:val="262626"/>
           <w:sz w:val="20"/>
         </w:rPr>
-        <w:t>All stochastic operations, point jittering, and permutation tests were locked to random seed 25. Complete analytical workflows, scripts, and data matrices are version-controlled via GitHub (git). All released figure panels, data tables, and input manifests were independently audited and locked with cryptographic SHA-256 checksums (provenance/reference_sha256.csv), ensuring 100% deterministic reproducibility.</w:t>
+        <w:t>To ensure complete computational reproducibility, all stochastic algorithms, permutation routines, and point jittering were locked to random seed 25. All analytical code, statistical models, and figure generation pipelines are version-controlled under Git and deposited in the study repository. Released figure panels, numerical data tables, and input manifests are verified by cryptographic SHA-256 checksums (provenance/reference_sha256.csv), enabling end-to-end auditability from raw OSDR inputs to final publication figures.</w:t>
       </w:r>
     </w:p>
     <w:p>
@@ -788,7 +855,7 @@
           <w:color w:val="262626"/>
           <w:sz w:val="20"/>
         </w:rPr>
-        <w:t xml:space="preserve">Provenance Cross-Reference: </w:t>
+        <w:t xml:space="preserve">Provenance and workflow cross-reference. </w:t>
       </w:r>
       <w:r>
         <w:rPr>
@@ -796,23 +863,21 @@
           <w:color w:val="262626"/>
           <w:sz w:val="20"/>
         </w:rPr>
-        <w:t>The following audited reference matrix connects every publication figure and statistical table in sequential order to its underlying mathematical model, sample scope, and analytical script:</w:t>
+        <w:t>The following reference matrix systematically connects each publication figure panel and statistical summary table to its analytical scope, input dataset, mathematical model, and reproducible source script in figure order:</w:t>
       </w:r>
     </w:p>
     <w:tbl>
       <w:tblPr>
         <w:tblW w:type="auto" w:w="0"/>
         <w:jc w:val="center"/>
-        <w:tblLayout w:type="fixed"/>
-        <w:tblLook w:firstColumn="1" w:firstRow="1" w:lastColumn="0" w:lastRow="0" w:noHBand="0" w:noVBand="1" w:val="04A0"/>
         <w:tblBorders>
           <w:top w:val="single" w:sz="12" w:space="0" w:color="1F4E78"/>
           <w:bottom w:val="single" w:sz="12" w:space="0" w:color="1F4E78"/>
           <w:insideH w:val="none"/>
           <w:insideV w:val="none"/>
-          <w:left w:val="none"/>
-          <w:right w:val="none"/>
         </w:tblBorders>
+        <w:tblLayout w:type="fixed"/>
+        <w:tblLook w:firstColumn="1" w:firstRow="1" w:lastColumn="0" w:lastRow="0" w:noHBand="0" w:noVBand="1" w:val="04A0"/>
       </w:tblPr>
       <w:tblGrid>
         <w:gridCol w:w="1728"/>
@@ -823,6 +888,7 @@
       </w:tblGrid>
       <w:tr>
         <w:trPr>
+          <w:cantSplit/>
           <w:tblHeader/>
         </w:trPr>
         <w:tc>
@@ -831,14 +897,14 @@
             <w:tcBorders>
               <w:bottom w:val="single" w:sz="6" w:space="0" w:color="2E75B6"/>
             </w:tcBorders>
-            <w:vAlign w:val="center"/>
-            <w:shd w:fill="EBF1F5"/>
+            <w:shd w:val="clear" w:fill="EBF1F5"/>
             <w:tcMar>
               <w:top w:w="100" w:type="dxa"/>
+              <w:start w:w="70" w:type="dxa"/>
               <w:bottom w:w="100" w:type="dxa"/>
-              <w:left w:w="70" w:type="dxa"/>
-              <w:right w:w="70" w:type="dxa"/>
+              <w:end w:w="70" w:type="dxa"/>
             </w:tcMar>
+            <w:vAlign w:val="center"/>
           </w:tcPr>
           <w:p>
             <w:pPr>
@@ -861,14 +927,14 @@
             <w:tcBorders>
               <w:bottom w:val="single" w:sz="6" w:space="0" w:color="2E75B6"/>
             </w:tcBorders>
-            <w:vAlign w:val="center"/>
-            <w:shd w:fill="EBF1F5"/>
+            <w:shd w:val="clear" w:fill="EBF1F5"/>
             <w:tcMar>
               <w:top w:w="100" w:type="dxa"/>
+              <w:start w:w="70" w:type="dxa"/>
               <w:bottom w:w="100" w:type="dxa"/>
-              <w:left w:w="70" w:type="dxa"/>
-              <w:right w:w="70" w:type="dxa"/>
+              <w:end w:w="70" w:type="dxa"/>
             </w:tcMar>
+            <w:vAlign w:val="center"/>
           </w:tcPr>
           <w:p>
             <w:pPr>
@@ -891,14 +957,14 @@
             <w:tcBorders>
               <w:bottom w:val="single" w:sz="6" w:space="0" w:color="2E75B6"/>
             </w:tcBorders>
-            <w:vAlign w:val="center"/>
-            <w:shd w:fill="EBF1F5"/>
+            <w:shd w:val="clear" w:fill="EBF1F5"/>
             <w:tcMar>
               <w:top w:w="100" w:type="dxa"/>
+              <w:start w:w="70" w:type="dxa"/>
               <w:bottom w:w="100" w:type="dxa"/>
-              <w:left w:w="70" w:type="dxa"/>
-              <w:right w:w="70" w:type="dxa"/>
+              <w:end w:w="70" w:type="dxa"/>
             </w:tcMar>
+            <w:vAlign w:val="center"/>
           </w:tcPr>
           <w:p>
             <w:pPr>
@@ -921,14 +987,14 @@
             <w:tcBorders>
               <w:bottom w:val="single" w:sz="6" w:space="0" w:color="2E75B6"/>
             </w:tcBorders>
-            <w:vAlign w:val="center"/>
-            <w:shd w:fill="EBF1F5"/>
+            <w:shd w:val="clear" w:fill="EBF1F5"/>
             <w:tcMar>
               <w:top w:w="100" w:type="dxa"/>
+              <w:start w:w="70" w:type="dxa"/>
               <w:bottom w:w="100" w:type="dxa"/>
-              <w:left w:w="70" w:type="dxa"/>
-              <w:right w:w="70" w:type="dxa"/>
+              <w:end w:w="70" w:type="dxa"/>
             </w:tcMar>
+            <w:vAlign w:val="center"/>
           </w:tcPr>
           <w:p>
             <w:pPr>
@@ -951,14 +1017,14 @@
             <w:tcBorders>
               <w:bottom w:val="single" w:sz="6" w:space="0" w:color="2E75B6"/>
             </w:tcBorders>
-            <w:vAlign w:val="center"/>
-            <w:shd w:fill="EBF1F5"/>
+            <w:shd w:val="clear" w:fill="EBF1F5"/>
             <w:tcMar>
               <w:top w:w="100" w:type="dxa"/>
+              <w:start w:w="70" w:type="dxa"/>
               <w:bottom w:w="100" w:type="dxa"/>
-              <w:left w:w="70" w:type="dxa"/>
-              <w:right w:w="70" w:type="dxa"/>
+              <w:end w:w="70" w:type="dxa"/>
             </w:tcMar>
+            <w:vAlign w:val="center"/>
           </w:tcPr>
           <w:p>
             <w:pPr>
@@ -977,18 +1043,20 @@
         </w:tc>
       </w:tr>
       <w:tr>
-        <w:trPr/>
+        <w:trPr>
+          <w:cantSplit/>
+        </w:trPr>
         <w:tc>
           <w:tcPr>
             <w:tcW w:type="dxa" w:w="1728"/>
-            <w:vAlign w:val="center"/>
-            <w:shd w:fill="FAFCFD"/>
+            <w:shd w:val="clear" w:fill="FAFCFD"/>
             <w:tcMar>
               <w:top w:w="55" w:type="dxa"/>
+              <w:start w:w="70" w:type="dxa"/>
               <w:bottom w:w="55" w:type="dxa"/>
-              <w:left w:w="70" w:type="dxa"/>
-              <w:right w:w="70" w:type="dxa"/>
+              <w:end w:w="70" w:type="dxa"/>
             </w:tcMar>
+            <w:vAlign w:val="center"/>
           </w:tcPr>
           <w:p>
             <w:pPr>
@@ -1007,14 +1075,14 @@
         <w:tc>
           <w:tcPr>
             <w:tcW w:type="dxa" w:w="1872"/>
-            <w:vAlign w:val="center"/>
-            <w:shd w:fill="FAFCFD"/>
+            <w:shd w:val="clear" w:fill="FAFCFD"/>
             <w:tcMar>
               <w:top w:w="55" w:type="dxa"/>
+              <w:start w:w="70" w:type="dxa"/>
               <w:bottom w:w="55" w:type="dxa"/>
-              <w:left w:w="70" w:type="dxa"/>
-              <w:right w:w="70" w:type="dxa"/>
+              <w:end w:w="70" w:type="dxa"/>
             </w:tcMar>
+            <w:vAlign w:val="center"/>
           </w:tcPr>
           <w:p>
             <w:pPr>
@@ -1033,14 +1101,14 @@
         <w:tc>
           <w:tcPr>
             <w:tcW w:type="dxa" w:w="1872"/>
-            <w:vAlign w:val="center"/>
-            <w:shd w:fill="FAFCFD"/>
+            <w:shd w:val="clear" w:fill="FAFCFD"/>
             <w:tcMar>
               <w:top w:w="55" w:type="dxa"/>
+              <w:start w:w="70" w:type="dxa"/>
               <w:bottom w:w="55" w:type="dxa"/>
-              <w:left w:w="70" w:type="dxa"/>
-              <w:right w:w="70" w:type="dxa"/>
+              <w:end w:w="70" w:type="dxa"/>
             </w:tcMar>
+            <w:vAlign w:val="center"/>
           </w:tcPr>
           <w:p>
             <w:pPr>
@@ -1059,14 +1127,14 @@
         <w:tc>
           <w:tcPr>
             <w:tcW w:type="dxa" w:w="2160"/>
-            <w:vAlign w:val="center"/>
-            <w:shd w:fill="FAFCFD"/>
+            <w:shd w:val="clear" w:fill="FAFCFD"/>
             <w:tcMar>
               <w:top w:w="55" w:type="dxa"/>
+              <w:start w:w="70" w:type="dxa"/>
               <w:bottom w:w="55" w:type="dxa"/>
-              <w:left w:w="70" w:type="dxa"/>
-              <w:right w:w="70" w:type="dxa"/>
+              <w:end w:w="70" w:type="dxa"/>
             </w:tcMar>
+            <w:vAlign w:val="center"/>
           </w:tcPr>
           <w:p>
             <w:pPr>
@@ -1085,14 +1153,14 @@
         <w:tc>
           <w:tcPr>
             <w:tcW w:type="dxa" w:w="1728"/>
-            <w:vAlign w:val="center"/>
-            <w:shd w:fill="FAFCFD"/>
+            <w:shd w:val="clear" w:fill="FAFCFD"/>
             <w:tcMar>
               <w:top w:w="55" w:type="dxa"/>
+              <w:start w:w="70" w:type="dxa"/>
               <w:bottom w:w="55" w:type="dxa"/>
-              <w:left w:w="70" w:type="dxa"/>
-              <w:right w:w="70" w:type="dxa"/>
+              <w:end w:w="70" w:type="dxa"/>
             </w:tcMar>
+            <w:vAlign w:val="center"/>
           </w:tcPr>
           <w:p>
             <w:pPr>
@@ -1104,23 +1172,25 @@
                 <w:color w:val="262626"/>
                 <w:sz w:val="16"/>
               </w:rPr>
-              <w:t>R/figures/08_mouse_metadata_bubble.R</w:t>
+              <w:t>R/final_figures/02_fig1b_metadata_bubble.R</w:t>
             </w:r>
           </w:p>
         </w:tc>
       </w:tr>
       <w:tr>
-        <w:trPr/>
+        <w:trPr>
+          <w:cantSplit/>
+        </w:trPr>
         <w:tc>
           <w:tcPr>
             <w:tcW w:type="dxa" w:w="1728"/>
-            <w:vAlign w:val="center"/>
             <w:tcMar>
               <w:top w:w="55" w:type="dxa"/>
+              <w:start w:w="70" w:type="dxa"/>
               <w:bottom w:w="55" w:type="dxa"/>
-              <w:left w:w="70" w:type="dxa"/>
-              <w:right w:w="70" w:type="dxa"/>
+              <w:end w:w="70" w:type="dxa"/>
             </w:tcMar>
+            <w:vAlign w:val="center"/>
           </w:tcPr>
           <w:p>
             <w:pPr>
@@ -1139,13 +1209,13 @@
         <w:tc>
           <w:tcPr>
             <w:tcW w:type="dxa" w:w="1872"/>
-            <w:vAlign w:val="center"/>
             <w:tcMar>
               <w:top w:w="55" w:type="dxa"/>
+              <w:start w:w="70" w:type="dxa"/>
               <w:bottom w:w="55" w:type="dxa"/>
-              <w:left w:w="70" w:type="dxa"/>
-              <w:right w:w="70" w:type="dxa"/>
+              <w:end w:w="70" w:type="dxa"/>
             </w:tcMar>
+            <w:vAlign w:val="center"/>
           </w:tcPr>
           <w:p>
             <w:pPr>
@@ -1164,13 +1234,13 @@
         <w:tc>
           <w:tcPr>
             <w:tcW w:type="dxa" w:w="1872"/>
-            <w:vAlign w:val="center"/>
             <w:tcMar>
               <w:top w:w="55" w:type="dxa"/>
+              <w:start w:w="70" w:type="dxa"/>
               <w:bottom w:w="55" w:type="dxa"/>
-              <w:left w:w="70" w:type="dxa"/>
-              <w:right w:w="70" w:type="dxa"/>
+              <w:end w:w="70" w:type="dxa"/>
             </w:tcMar>
+            <w:vAlign w:val="center"/>
           </w:tcPr>
           <w:p>
             <w:pPr>
@@ -1182,20 +1252,20 @@
                 <w:color w:val="262626"/>
                 <w:sz w:val="16"/>
               </w:rPr>
-              <w:t>26 tissues × 15 GO biological terms</w:t>
+              <w:t>26 tissues × 15 GO terms (12 BP, 3 CC)</w:t>
             </w:r>
           </w:p>
         </w:tc>
         <w:tc>
           <w:tcPr>
             <w:tcW w:type="dxa" w:w="2160"/>
-            <w:vAlign w:val="center"/>
             <w:tcMar>
               <w:top w:w="55" w:type="dxa"/>
+              <w:start w:w="70" w:type="dxa"/>
               <w:bottom w:w="55" w:type="dxa"/>
-              <w:left w:w="70" w:type="dxa"/>
-              <w:right w:w="70" w:type="dxa"/>
+              <w:end w:w="70" w:type="dxa"/>
             </w:tcMar>
+            <w:vAlign w:val="center"/>
           </w:tcPr>
           <w:p>
             <w:pPr>
@@ -1207,20 +1277,20 @@
                 <w:color w:val="262626"/>
                 <w:sz w:val="16"/>
               </w:rPr>
-              <w:t>Mission-equal unweighted mean NES, exact sign-flip P</w:t>
+              <w:t>Mission-equal mean NES; exact sign-flip and secondary Stouffer P, BH FDR</w:t>
             </w:r>
           </w:p>
         </w:tc>
         <w:tc>
           <w:tcPr>
             <w:tcW w:type="dxa" w:w="1728"/>
-            <w:vAlign w:val="center"/>
             <w:tcMar>
               <w:top w:w="55" w:type="dxa"/>
+              <w:start w:w="70" w:type="dxa"/>
               <w:bottom w:w="55" w:type="dxa"/>
-              <w:left w:w="70" w:type="dxa"/>
-              <w:right w:w="70" w:type="dxa"/>
+              <w:end w:w="70" w:type="dxa"/>
             </w:tcMar>
+            <w:vAlign w:val="center"/>
           </w:tcPr>
           <w:p>
             <w:pPr>
@@ -1232,24 +1302,26 @@
                 <w:color w:val="262626"/>
                 <w:sz w:val="16"/>
               </w:rPr>
-              <w:t>R/figures/01_go_overview.R</w:t>
+              <w:t>R/final_figures/03_fig1c_fig2_go.R</w:t>
             </w:r>
           </w:p>
         </w:tc>
       </w:tr>
       <w:tr>
-        <w:trPr/>
+        <w:trPr>
+          <w:cantSplit/>
+        </w:trPr>
         <w:tc>
           <w:tcPr>
             <w:tcW w:type="dxa" w:w="1728"/>
-            <w:vAlign w:val="center"/>
-            <w:shd w:fill="FAFCFD"/>
+            <w:shd w:val="clear" w:fill="FAFCFD"/>
             <w:tcMar>
               <w:top w:w="55" w:type="dxa"/>
+              <w:start w:w="70" w:type="dxa"/>
               <w:bottom w:w="55" w:type="dxa"/>
-              <w:left w:w="70" w:type="dxa"/>
-              <w:right w:w="70" w:type="dxa"/>
+              <w:end w:w="70" w:type="dxa"/>
             </w:tcMar>
+            <w:vAlign w:val="center"/>
           </w:tcPr>
           <w:p>
             <w:pPr>
@@ -1268,14 +1340,14 @@
         <w:tc>
           <w:tcPr>
             <w:tcW w:type="dxa" w:w="1872"/>
-            <w:vAlign w:val="center"/>
-            <w:shd w:fill="FAFCFD"/>
+            <w:shd w:val="clear" w:fill="FAFCFD"/>
             <w:tcMar>
               <w:top w:w="55" w:type="dxa"/>
+              <w:start w:w="70" w:type="dxa"/>
               <w:bottom w:w="55" w:type="dxa"/>
-              <w:left w:w="70" w:type="dxa"/>
-              <w:right w:w="70" w:type="dxa"/>
+              <w:end w:w="70" w:type="dxa"/>
             </w:tcMar>
+            <w:vAlign w:val="center"/>
           </w:tcPr>
           <w:p>
             <w:pPr>
@@ -1287,21 +1359,21 @@
                 <w:color w:val="262626"/>
                 <w:sz w:val="16"/>
               </w:rPr>
-              <w:t>Cross-Tissue Co-Regulation</w:t>
+              <w:t>Cross-Tissue Sample-Level Association</w:t>
             </w:r>
           </w:p>
         </w:tc>
         <w:tc>
           <w:tcPr>
             <w:tcW w:type="dxa" w:w="1872"/>
-            <w:vAlign w:val="center"/>
-            <w:shd w:fill="FAFCFD"/>
+            <w:shd w:val="clear" w:fill="FAFCFD"/>
             <w:tcMar>
               <w:top w:w="55" w:type="dxa"/>
+              <w:start w:w="70" w:type="dxa"/>
               <w:bottom w:w="55" w:type="dxa"/>
-              <w:left w:w="70" w:type="dxa"/>
-              <w:right w:w="70" w:type="dxa"/>
+              <w:end w:w="70" w:type="dxa"/>
             </w:tcMar>
+            <w:vAlign w:val="center"/>
           </w:tcPr>
           <w:p>
             <w:pPr>
@@ -1320,14 +1392,14 @@
         <w:tc>
           <w:tcPr>
             <w:tcW w:type="dxa" w:w="2160"/>
-            <w:vAlign w:val="center"/>
-            <w:shd w:fill="FAFCFD"/>
+            <w:shd w:val="clear" w:fill="FAFCFD"/>
             <w:tcMar>
               <w:top w:w="55" w:type="dxa"/>
+              <w:start w:w="70" w:type="dxa"/>
               <w:bottom w:w="55" w:type="dxa"/>
-              <w:left w:w="70" w:type="dxa"/>
-              <w:right w:w="70" w:type="dxa"/>
+              <w:end w:w="70" w:type="dxa"/>
             </w:tcMar>
+            <w:vAlign w:val="center"/>
           </w:tcPr>
           <w:p>
             <w:pPr>
@@ -1339,21 +1411,21 @@
                 <w:color w:val="262626"/>
                 <w:sz w:val="16"/>
               </w:rPr>
-              <w:t>Sample-level log2FC, intra-tissue Spearman ρ, Fisher-z pooling</w:t>
+              <w:t>Ground-referenced sample log2FC, intra-tissue Spearman ρ, equal-weight Fisher-z pooling</w:t>
             </w:r>
           </w:p>
         </w:tc>
         <w:tc>
           <w:tcPr>
             <w:tcW w:type="dxa" w:w="1728"/>
-            <w:vAlign w:val="center"/>
-            <w:shd w:fill="FAFCFD"/>
+            <w:shd w:val="clear" w:fill="FAFCFD"/>
             <w:tcMar>
               <w:top w:w="55" w:type="dxa"/>
+              <w:start w:w="70" w:type="dxa"/>
               <w:bottom w:w="55" w:type="dxa"/>
-              <w:left w:w="70" w:type="dxa"/>
-              <w:right w:w="70" w:type="dxa"/>
+              <w:end w:w="70" w:type="dxa"/>
             </w:tcMar>
+            <w:vAlign w:val="center"/>
           </w:tcPr>
           <w:p>
             <w:pPr>
@@ -1365,23 +1437,25 @@
                 <w:color w:val="262626"/>
                 <w:sz w:val="16"/>
               </w:rPr>
-              <w:t>python/plot_log2fc_per_tissue_pathway_spearman_20260902.py</w:t>
+              <w:t>python/build_log2fc_per_tissue_pathway_spearman_20260902.py; python/plot_log2fc_per_tissue_pathway_spearman_20260902.py</w:t>
             </w:r>
           </w:p>
         </w:tc>
       </w:tr>
       <w:tr>
-        <w:trPr/>
+        <w:trPr>
+          <w:cantSplit/>
+        </w:trPr>
         <w:tc>
           <w:tcPr>
             <w:tcW w:type="dxa" w:w="1728"/>
-            <w:vAlign w:val="center"/>
             <w:tcMar>
               <w:top w:w="55" w:type="dxa"/>
+              <w:start w:w="70" w:type="dxa"/>
               <w:bottom w:w="55" w:type="dxa"/>
-              <w:left w:w="70" w:type="dxa"/>
-              <w:right w:w="70" w:type="dxa"/>
+              <w:end w:w="70" w:type="dxa"/>
             </w:tcMar>
+            <w:vAlign w:val="center"/>
           </w:tcPr>
           <w:p>
             <w:pPr>
@@ -1400,13 +1474,13 @@
         <w:tc>
           <w:tcPr>
             <w:tcW w:type="dxa" w:w="1872"/>
-            <w:vAlign w:val="center"/>
             <w:tcMar>
               <w:top w:w="55" w:type="dxa"/>
+              <w:start w:w="70" w:type="dxa"/>
               <w:bottom w:w="55" w:type="dxa"/>
-              <w:left w:w="70" w:type="dxa"/>
-              <w:right w:w="70" w:type="dxa"/>
+              <w:end w:w="70" w:type="dxa"/>
             </w:tcMar>
+            <w:vAlign w:val="center"/>
           </w:tcPr>
           <w:p>
             <w:pPr>
@@ -1418,20 +1492,20 @@
                 <w:color w:val="262626"/>
                 <w:sz w:val="16"/>
               </w:rPr>
-              <w:t>Thymus Repertoire Overlap</w:t>
+              <w:t>Thymus Member-Gene Overlap</w:t>
             </w:r>
           </w:p>
         </w:tc>
         <w:tc>
           <w:tcPr>
             <w:tcW w:type="dxa" w:w="1872"/>
-            <w:vAlign w:val="center"/>
             <w:tcMar>
               <w:top w:w="55" w:type="dxa"/>
+              <w:start w:w="70" w:type="dxa"/>
               <w:bottom w:w="55" w:type="dxa"/>
-              <w:left w:w="70" w:type="dxa"/>
-              <w:right w:w="70" w:type="dxa"/>
+              <w:end w:w="70" w:type="dxa"/>
             </w:tcMar>
+            <w:vAlign w:val="center"/>
           </w:tcPr>
           <w:p>
             <w:pPr>
@@ -1450,13 +1524,13 @@
         <w:tc>
           <w:tcPr>
             <w:tcW w:type="dxa" w:w="2160"/>
-            <w:vAlign w:val="center"/>
             <w:tcMar>
               <w:top w:w="55" w:type="dxa"/>
+              <w:start w:w="70" w:type="dxa"/>
               <w:bottom w:w="55" w:type="dxa"/>
-              <w:left w:w="70" w:type="dxa"/>
-              <w:right w:w="70" w:type="dxa"/>
+              <w:end w:w="70" w:type="dxa"/>
             </w:tcMar>
+            <w:vAlign w:val="center"/>
           </w:tcPr>
           <w:p>
             <w:pPr>
@@ -1468,20 +1542,20 @@
                 <w:color w:val="262626"/>
                 <w:sz w:val="16"/>
               </w:rPr>
-              <w:t>Set intersection membership, ggVennDiagram</w:t>
+              <w:t>GO:0006974 member Ensembl-ID membership, UpSet geometry</w:t>
             </w:r>
           </w:p>
         </w:tc>
         <w:tc>
           <w:tcPr>
             <w:tcW w:type="dxa" w:w="1728"/>
-            <w:vAlign w:val="center"/>
             <w:tcMar>
               <w:top w:w="55" w:type="dxa"/>
+              <w:start w:w="70" w:type="dxa"/>
               <w:bottom w:w="55" w:type="dxa"/>
-              <w:left w:w="70" w:type="dxa"/>
-              <w:right w:w="70" w:type="dxa"/>
+              <w:end w:w="70" w:type="dxa"/>
             </w:tcMar>
+            <w:vAlign w:val="center"/>
           </w:tcPr>
           <w:p>
             <w:pPr>
@@ -1493,24 +1567,26 @@
                 <w:color w:val="262626"/>
                 <w:sz w:val="16"/>
               </w:rPr>
-              <w:t>R/figures/03_kidney_thymus_venn.R</w:t>
+              <w:t>R/final_figures/04_upset_membership.R</w:t>
             </w:r>
           </w:p>
         </w:tc>
       </w:tr>
       <w:tr>
-        <w:trPr/>
+        <w:trPr>
+          <w:cantSplit/>
+        </w:trPr>
         <w:tc>
           <w:tcPr>
             <w:tcW w:type="dxa" w:w="1728"/>
-            <w:vAlign w:val="center"/>
-            <w:shd w:fill="FAFCFD"/>
+            <w:shd w:val="clear" w:fill="FAFCFD"/>
             <w:tcMar>
               <w:top w:w="55" w:type="dxa"/>
+              <w:start w:w="70" w:type="dxa"/>
               <w:bottom w:w="55" w:type="dxa"/>
-              <w:left w:w="70" w:type="dxa"/>
-              <w:right w:w="70" w:type="dxa"/>
+              <w:end w:w="70" w:type="dxa"/>
             </w:tcMar>
+            <w:vAlign w:val="center"/>
           </w:tcPr>
           <w:p>
             <w:pPr>
@@ -1529,14 +1605,14 @@
         <w:tc>
           <w:tcPr>
             <w:tcW w:type="dxa" w:w="1872"/>
-            <w:vAlign w:val="center"/>
-            <w:shd w:fill="FAFCFD"/>
+            <w:shd w:val="clear" w:fill="FAFCFD"/>
             <w:tcMar>
               <w:top w:w="55" w:type="dxa"/>
+              <w:start w:w="70" w:type="dxa"/>
               <w:bottom w:w="55" w:type="dxa"/>
-              <w:left w:w="70" w:type="dxa"/>
-              <w:right w:w="70" w:type="dxa"/>
+              <w:end w:w="70" w:type="dxa"/>
             </w:tcMar>
+            <w:vAlign w:val="center"/>
           </w:tcPr>
           <w:p>
             <w:pPr>
@@ -1548,21 +1624,21 @@
                 <w:color w:val="262626"/>
                 <w:sz w:val="16"/>
               </w:rPr>
-              <w:t>Thymus Common-Direction DEGs</w:t>
+              <w:t>Thymus Common-Direction Genes</w:t>
             </w:r>
           </w:p>
         </w:tc>
         <w:tc>
           <w:tcPr>
             <w:tcW w:type="dxa" w:w="1872"/>
-            <w:vAlign w:val="center"/>
-            <w:shd w:fill="FAFCFD"/>
+            <w:shd w:val="clear" w:fill="FAFCFD"/>
             <w:tcMar>
               <w:top w:w="55" w:type="dxa"/>
+              <w:start w:w="70" w:type="dxa"/>
               <w:bottom w:w="55" w:type="dxa"/>
-              <w:left w:w="70" w:type="dxa"/>
-              <w:right w:w="70" w:type="dxa"/>
+              <w:end w:w="70" w:type="dxa"/>
             </w:tcMar>
+            <w:vAlign w:val="center"/>
           </w:tcPr>
           <w:p>
             <w:pPr>
@@ -1581,14 +1657,14 @@
         <w:tc>
           <w:tcPr>
             <w:tcW w:type="dxa" w:w="2160"/>
-            <w:vAlign w:val="center"/>
-            <w:shd w:fill="FAFCFD"/>
+            <w:shd w:val="clear" w:fill="FAFCFD"/>
             <w:tcMar>
               <w:top w:w="55" w:type="dxa"/>
+              <w:start w:w="70" w:type="dxa"/>
               <w:bottom w:w="55" w:type="dxa"/>
-              <w:left w:w="70" w:type="dxa"/>
-              <w:right w:w="70" w:type="dxa"/>
+              <w:end w:w="70" w:type="dxa"/>
             </w:tcMar>
+            <w:vAlign w:val="center"/>
           </w:tcPr>
           <w:p>
             <w:pPr>
@@ -1600,21 +1676,21 @@
                 <w:color w:val="262626"/>
                 <w:sz w:val="16"/>
               </w:rPr>
-              <w:t>Concordant directionality, ranked by min |log2FC|</w:t>
+              <w:t>BH-FDR selection, concordant directionality, ranked by min |log2FC|</w:t>
             </w:r>
           </w:p>
         </w:tc>
         <w:tc>
           <w:tcPr>
             <w:tcW w:type="dxa" w:w="1728"/>
-            <w:vAlign w:val="center"/>
-            <w:shd w:fill="FAFCFD"/>
+            <w:shd w:val="clear" w:fill="FAFCFD"/>
             <w:tcMar>
               <w:top w:w="55" w:type="dxa"/>
+              <w:start w:w="70" w:type="dxa"/>
               <w:bottom w:w="55" w:type="dxa"/>
-              <w:left w:w="70" w:type="dxa"/>
-              <w:right w:w="70" w:type="dxa"/>
+              <w:end w:w="70" w:type="dxa"/>
             </w:tcMar>
+            <w:vAlign w:val="center"/>
           </w:tcPr>
           <w:p>
             <w:pPr>
@@ -1626,23 +1702,25 @@
                 <w:color w:val="262626"/>
                 <w:sz w:val="16"/>
               </w:rPr>
-              <w:t>python/plot_common_direction_heatmaps.py</w:t>
+              <w:t>python/render_final_common_direction.py</w:t>
             </w:r>
           </w:p>
         </w:tc>
       </w:tr>
       <w:tr>
-        <w:trPr/>
+        <w:trPr>
+          <w:cantSplit/>
+        </w:trPr>
         <w:tc>
           <w:tcPr>
             <w:tcW w:type="dxa" w:w="1728"/>
-            <w:vAlign w:val="center"/>
             <w:tcMar>
               <w:top w:w="55" w:type="dxa"/>
+              <w:start w:w="70" w:type="dxa"/>
               <w:bottom w:w="55" w:type="dxa"/>
-              <w:left w:w="70" w:type="dxa"/>
-              <w:right w:w="70" w:type="dxa"/>
+              <w:end w:w="70" w:type="dxa"/>
             </w:tcMar>
+            <w:vAlign w:val="center"/>
           </w:tcPr>
           <w:p>
             <w:pPr>
@@ -1661,13 +1739,13 @@
         <w:tc>
           <w:tcPr>
             <w:tcW w:type="dxa" w:w="1872"/>
-            <w:vAlign w:val="center"/>
             <w:tcMar>
               <w:top w:w="55" w:type="dxa"/>
+              <w:start w:w="70" w:type="dxa"/>
               <w:bottom w:w="55" w:type="dxa"/>
-              <w:left w:w="70" w:type="dxa"/>
-              <w:right w:w="70" w:type="dxa"/>
+              <w:end w:w="70" w:type="dxa"/>
             </w:tcMar>
+            <w:vAlign w:val="center"/>
           </w:tcPr>
           <w:p>
             <w:pPr>
@@ -1679,20 +1757,20 @@
                 <w:color w:val="262626"/>
                 <w:sz w:val="16"/>
               </w:rPr>
-              <w:t>DSB Baseline Clustering</w:t>
+              <w:t>DSB Tissue-Aware Clustering</w:t>
             </w:r>
           </w:p>
         </w:tc>
         <w:tc>
           <w:tcPr>
             <w:tcW w:type="dxa" w:w="1872"/>
-            <w:vAlign w:val="center"/>
             <w:tcMar>
               <w:top w:w="55" w:type="dxa"/>
+              <w:start w:w="70" w:type="dxa"/>
               <w:bottom w:w="55" w:type="dxa"/>
-              <w:left w:w="70" w:type="dxa"/>
-              <w:right w:w="70" w:type="dxa"/>
+              <w:end w:w="70" w:type="dxa"/>
             </w:tcMar>
+            <w:vAlign w:val="center"/>
           </w:tcPr>
           <w:p>
             <w:pPr>
@@ -1704,20 +1782,20 @@
                 <w:color w:val="262626"/>
                 <w:sz w:val="16"/>
               </w:rPr>
-              <w:t>26 tissues, 29 DSB components</w:t>
+              <w:t>360 Flight source-sample columns, 59 units, 26 tissues, 29 components</w:t>
             </w:r>
           </w:p>
         </w:tc>
         <w:tc>
           <w:tcPr>
             <w:tcW w:type="dxa" w:w="2160"/>
-            <w:vAlign w:val="center"/>
             <w:tcMar>
               <w:top w:w="55" w:type="dxa"/>
+              <w:start w:w="70" w:type="dxa"/>
               <w:bottom w:w="55" w:type="dxa"/>
-              <w:left w:w="70" w:type="dxa"/>
-              <w:right w:w="70" w:type="dxa"/>
+              <w:end w:w="70" w:type="dxa"/>
             </w:tcMar>
+            <w:vAlign w:val="center"/>
           </w:tcPr>
           <w:p>
             <w:pPr>
@@ -1729,20 +1807,20 @@
                 <w:color w:val="262626"/>
                 <w:sz w:val="16"/>
               </w:rPr>
-              <w:t>YARN qsmooth baseline, 1 - Spearman ρ, average linkage</w:t>
+              <w:t>YARN tissue-aware qsmooth; sample-to-tissue means; 1 − Spearman ρ, average linkage</w:t>
             </w:r>
           </w:p>
         </w:tc>
         <w:tc>
           <w:tcPr>
             <w:tcW w:type="dxa" w:w="1728"/>
-            <w:vAlign w:val="center"/>
             <w:tcMar>
               <w:top w:w="55" w:type="dxa"/>
+              <w:start w:w="70" w:type="dxa"/>
               <w:bottom w:w="55" w:type="dxa"/>
-              <w:left w:w="70" w:type="dxa"/>
-              <w:right w:w="70" w:type="dxa"/>
+              <w:end w:w="70" w:type="dxa"/>
             </w:tcMar>
+            <w:vAlign w:val="center"/>
           </w:tcPr>
           <w:p>
             <w:pPr>
@@ -1754,24 +1832,26 @@
                 <w:color w:val="262626"/>
                 <w:sz w:val="16"/>
               </w:rPr>
-              <w:t>R/figures/04_qsmooth_tree_heatmaps.R</w:t>
+              <w:t>R/final_figures/05_expression_tree_heatmaps.R</w:t>
             </w:r>
           </w:p>
         </w:tc>
       </w:tr>
       <w:tr>
-        <w:trPr/>
+        <w:trPr>
+          <w:cantSplit/>
+        </w:trPr>
         <w:tc>
           <w:tcPr>
             <w:tcW w:type="dxa" w:w="1728"/>
-            <w:vAlign w:val="center"/>
-            <w:shd w:fill="FAFCFD"/>
+            <w:shd w:val="clear" w:fill="FAFCFD"/>
             <w:tcMar>
               <w:top w:w="55" w:type="dxa"/>
+              <w:start w:w="70" w:type="dxa"/>
               <w:bottom w:w="55" w:type="dxa"/>
-              <w:left w:w="70" w:type="dxa"/>
-              <w:right w:w="70" w:type="dxa"/>
+              <w:end w:w="70" w:type="dxa"/>
             </w:tcMar>
+            <w:vAlign w:val="center"/>
           </w:tcPr>
           <w:p>
             <w:pPr>
@@ -1790,14 +1870,14 @@
         <w:tc>
           <w:tcPr>
             <w:tcW w:type="dxa" w:w="1872"/>
-            <w:vAlign w:val="center"/>
-            <w:shd w:fill="FAFCFD"/>
+            <w:shd w:val="clear" w:fill="FAFCFD"/>
             <w:tcMar>
               <w:top w:w="55" w:type="dxa"/>
+              <w:start w:w="70" w:type="dxa"/>
               <w:bottom w:w="55" w:type="dxa"/>
-              <w:left w:w="70" w:type="dxa"/>
-              <w:right w:w="70" w:type="dxa"/>
+              <w:end w:w="70" w:type="dxa"/>
             </w:tcMar>
+            <w:vAlign w:val="center"/>
           </w:tcPr>
           <w:p>
             <w:pPr>
@@ -1809,21 +1889,21 @@
                 <w:color w:val="262626"/>
                 <w:sz w:val="16"/>
               </w:rPr>
-              <w:t>NHEJ Linear Boxplot</w:t>
+              <w:t>NHEJ Linear Expression Display</w:t>
             </w:r>
           </w:p>
         </w:tc>
         <w:tc>
           <w:tcPr>
             <w:tcW w:type="dxa" w:w="1872"/>
-            <w:vAlign w:val="center"/>
-            <w:shd w:fill="FAFCFD"/>
+            <w:shd w:val="clear" w:fill="FAFCFD"/>
             <w:tcMar>
               <w:top w:w="55" w:type="dxa"/>
+              <w:start w:w="70" w:type="dxa"/>
               <w:bottom w:w="55" w:type="dxa"/>
-              <w:left w:w="70" w:type="dxa"/>
-              <w:right w:w="70" w:type="dxa"/>
+              <w:end w:w="70" w:type="dxa"/>
             </w:tcMar>
+            <w:vAlign w:val="center"/>
           </w:tcPr>
           <w:p>
             <w:pPr>
@@ -1835,21 +1915,21 @@
                 <w:color w:val="262626"/>
                 <w:sz w:val="16"/>
               </w:rPr>
-              <w:t>360 flight mice × 4 genes (26 tissues)</w:t>
+              <w:t>360 Flight source-sample columns × 4 genes (26 tissues)</w:t>
             </w:r>
           </w:p>
         </w:tc>
         <w:tc>
           <w:tcPr>
             <w:tcW w:type="dxa" w:w="2160"/>
-            <w:vAlign w:val="center"/>
-            <w:shd w:fill="FAFCFD"/>
+            <w:shd w:val="clear" w:fill="FAFCFD"/>
             <w:tcMar>
               <w:top w:w="55" w:type="dxa"/>
+              <w:start w:w="70" w:type="dxa"/>
               <w:bottom w:w="55" w:type="dxa"/>
-              <w:left w:w="70" w:type="dxa"/>
-              <w:right w:w="70" w:type="dxa"/>
+              <w:end w:w="70" w:type="dxa"/>
             </w:tcMar>
+            <w:vAlign w:val="center"/>
           </w:tcPr>
           <w:p>
             <w:pPr>
@@ -1861,21 +1941,21 @@
                 <w:color w:val="262626"/>
                 <w:sz w:val="16"/>
               </w:rPr>
-              <w:t>Linear scale 2^log2 - 1, Mean hinge, Gene &amp; Pathway ANOVA</w:t>
+              <w:t>Back-transformed normalized expression, Q1/mean/Q3 box geometry, one-way ANOVA</w:t>
             </w:r>
           </w:p>
         </w:tc>
         <w:tc>
           <w:tcPr>
             <w:tcW w:type="dxa" w:w="1728"/>
-            <w:vAlign w:val="center"/>
-            <w:shd w:fill="FAFCFD"/>
+            <w:shd w:val="clear" w:fill="FAFCFD"/>
             <w:tcMar>
               <w:top w:w="55" w:type="dxa"/>
+              <w:start w:w="70" w:type="dxa"/>
               <w:bottom w:w="55" w:type="dxa"/>
-              <w:left w:w="70" w:type="dxa"/>
-              <w:right w:w="70" w:type="dxa"/>
+              <w:end w:w="70" w:type="dxa"/>
             </w:tcMar>
+            <w:vAlign w:val="center"/>
           </w:tcPr>
           <w:p>
             <w:pPr>
@@ -1893,17 +1973,19 @@
         </w:tc>
       </w:tr>
       <w:tr>
-        <w:trPr/>
+        <w:trPr>
+          <w:cantSplit/>
+        </w:trPr>
         <w:tc>
           <w:tcPr>
             <w:tcW w:type="dxa" w:w="1728"/>
-            <w:vAlign w:val="center"/>
             <w:tcMar>
               <w:top w:w="55" w:type="dxa"/>
+              <w:start w:w="70" w:type="dxa"/>
               <w:bottom w:w="55" w:type="dxa"/>
-              <w:left w:w="70" w:type="dxa"/>
-              <w:right w:w="70" w:type="dxa"/>
+              <w:end w:w="70" w:type="dxa"/>
             </w:tcMar>
+            <w:vAlign w:val="center"/>
           </w:tcPr>
           <w:p>
             <w:pPr>
@@ -1922,13 +2004,13 @@
         <w:tc>
           <w:tcPr>
             <w:tcW w:type="dxa" w:w="1872"/>
-            <w:vAlign w:val="center"/>
             <w:tcMar>
               <w:top w:w="55" w:type="dxa"/>
+              <w:start w:w="70" w:type="dxa"/>
               <w:bottom w:w="55" w:type="dxa"/>
-              <w:left w:w="70" w:type="dxa"/>
-              <w:right w:w="70" w:type="dxa"/>
+              <w:end w:w="70" w:type="dxa"/>
             </w:tcMar>
+            <w:vAlign w:val="center"/>
           </w:tcPr>
           <w:p>
             <w:pPr>
@@ -1940,20 +2022,20 @@
                 <w:color w:val="262626"/>
                 <w:sz w:val="16"/>
               </w:rPr>
-              <w:t>HR Linear Boxplot</w:t>
+              <w:t>HR Linear Expression Display</w:t>
             </w:r>
           </w:p>
         </w:tc>
         <w:tc>
           <w:tcPr>
             <w:tcW w:type="dxa" w:w="1872"/>
-            <w:vAlign w:val="center"/>
             <w:tcMar>
               <w:top w:w="55" w:type="dxa"/>
+              <w:start w:w="70" w:type="dxa"/>
               <w:bottom w:w="55" w:type="dxa"/>
-              <w:left w:w="70" w:type="dxa"/>
-              <w:right w:w="70" w:type="dxa"/>
+              <w:end w:w="70" w:type="dxa"/>
             </w:tcMar>
+            <w:vAlign w:val="center"/>
           </w:tcPr>
           <w:p>
             <w:pPr>
@@ -1965,20 +2047,20 @@
                 <w:color w:val="262626"/>
                 <w:sz w:val="16"/>
               </w:rPr>
-              <w:t>360 flight mice × 4 genes (26 tissues)</w:t>
+              <w:t>360 Flight source-sample columns × 4 genes (26 tissues)</w:t>
             </w:r>
           </w:p>
         </w:tc>
         <w:tc>
           <w:tcPr>
             <w:tcW w:type="dxa" w:w="2160"/>
-            <w:vAlign w:val="center"/>
             <w:tcMar>
               <w:top w:w="55" w:type="dxa"/>
+              <w:start w:w="70" w:type="dxa"/>
               <w:bottom w:w="55" w:type="dxa"/>
-              <w:left w:w="70" w:type="dxa"/>
-              <w:right w:w="70" w:type="dxa"/>
+              <w:end w:w="70" w:type="dxa"/>
             </w:tcMar>
+            <w:vAlign w:val="center"/>
           </w:tcPr>
           <w:p>
             <w:pPr>
@@ -1990,20 +2072,20 @@
                 <w:color w:val="262626"/>
                 <w:sz w:val="16"/>
               </w:rPr>
-              <w:t>Linear scale 2^log2 - 1, Mean hinge, Gene &amp; Pathway ANOVA</w:t>
+              <w:t>Back-transformed normalized expression, Q1/mean/Q3 box geometry, one-way ANOVA</w:t>
             </w:r>
           </w:p>
         </w:tc>
         <w:tc>
           <w:tcPr>
             <w:tcW w:type="dxa" w:w="1728"/>
-            <w:vAlign w:val="center"/>
             <w:tcMar>
               <w:top w:w="55" w:type="dxa"/>
+              <w:start w:w="70" w:type="dxa"/>
               <w:bottom w:w="55" w:type="dxa"/>
-              <w:left w:w="70" w:type="dxa"/>
-              <w:right w:w="70" w:type="dxa"/>
+              <w:end w:w="70" w:type="dxa"/>
             </w:tcMar>
+            <w:vAlign w:val="center"/>
           </w:tcPr>
           <w:p>
             <w:pPr>
@@ -2021,18 +2103,20 @@
         </w:tc>
       </w:tr>
       <w:tr>
-        <w:trPr/>
+        <w:trPr>
+          <w:cantSplit/>
+        </w:trPr>
         <w:tc>
           <w:tcPr>
             <w:tcW w:type="dxa" w:w="1728"/>
-            <w:vAlign w:val="center"/>
-            <w:shd w:fill="FAFCFD"/>
+            <w:shd w:val="clear" w:fill="FAFCFD"/>
             <w:tcMar>
               <w:top w:w="55" w:type="dxa"/>
+              <w:start w:w="70" w:type="dxa"/>
               <w:bottom w:w="55" w:type="dxa"/>
-              <w:left w:w="70" w:type="dxa"/>
-              <w:right w:w="70" w:type="dxa"/>
+              <w:end w:w="70" w:type="dxa"/>
             </w:tcMar>
+            <w:vAlign w:val="center"/>
           </w:tcPr>
           <w:p>
             <w:pPr>
@@ -2051,14 +2135,14 @@
         <w:tc>
           <w:tcPr>
             <w:tcW w:type="dxa" w:w="1872"/>
-            <w:vAlign w:val="center"/>
-            <w:shd w:fill="FAFCFD"/>
+            <w:shd w:val="clear" w:fill="FAFCFD"/>
             <w:tcMar>
               <w:top w:w="55" w:type="dxa"/>
+              <w:start w:w="70" w:type="dxa"/>
               <w:bottom w:w="55" w:type="dxa"/>
-              <w:left w:w="70" w:type="dxa"/>
-              <w:right w:w="70" w:type="dxa"/>
+              <w:end w:w="70" w:type="dxa"/>
             </w:tcMar>
+            <w:vAlign w:val="center"/>
           </w:tcPr>
           <w:p>
             <w:pPr>
@@ -2070,21 +2154,21 @@
                 <w:color w:val="262626"/>
                 <w:sz w:val="16"/>
               </w:rPr>
-              <w:t>A-EJ Linear Boxplot</w:t>
+              <w:t>A-EJ Linear Expression Display</w:t>
             </w:r>
           </w:p>
         </w:tc>
         <w:tc>
           <w:tcPr>
             <w:tcW w:type="dxa" w:w="1872"/>
-            <w:vAlign w:val="center"/>
-            <w:shd w:fill="FAFCFD"/>
+            <w:shd w:val="clear" w:fill="FAFCFD"/>
             <w:tcMar>
               <w:top w:w="55" w:type="dxa"/>
+              <w:start w:w="70" w:type="dxa"/>
               <w:bottom w:w="55" w:type="dxa"/>
-              <w:left w:w="70" w:type="dxa"/>
-              <w:right w:w="70" w:type="dxa"/>
+              <w:end w:w="70" w:type="dxa"/>
             </w:tcMar>
+            <w:vAlign w:val="center"/>
           </w:tcPr>
           <w:p>
             <w:pPr>
@@ -2096,21 +2180,21 @@
                 <w:color w:val="262626"/>
                 <w:sz w:val="16"/>
               </w:rPr>
-              <w:t>360 flight mice × 4 genes (26 tissues)</w:t>
+              <w:t>360 Flight source-sample columns × 4 genes (26 tissues)</w:t>
             </w:r>
           </w:p>
         </w:tc>
         <w:tc>
           <w:tcPr>
             <w:tcW w:type="dxa" w:w="2160"/>
-            <w:vAlign w:val="center"/>
-            <w:shd w:fill="FAFCFD"/>
+            <w:shd w:val="clear" w:fill="FAFCFD"/>
             <w:tcMar>
               <w:top w:w="55" w:type="dxa"/>
+              <w:start w:w="70" w:type="dxa"/>
               <w:bottom w:w="55" w:type="dxa"/>
-              <w:left w:w="70" w:type="dxa"/>
-              <w:right w:w="70" w:type="dxa"/>
+              <w:end w:w="70" w:type="dxa"/>
             </w:tcMar>
+            <w:vAlign w:val="center"/>
           </w:tcPr>
           <w:p>
             <w:pPr>
@@ -2122,21 +2206,21 @@
                 <w:color w:val="262626"/>
                 <w:sz w:val="16"/>
               </w:rPr>
-              <w:t>Linear scale 2^log2 - 1, Mean hinge, Gene &amp; Pathway ANOVA</w:t>
+              <w:t>Back-transformed normalized expression, Q1/mean/Q3 box geometry, one-way ANOVA</w:t>
             </w:r>
           </w:p>
         </w:tc>
         <w:tc>
           <w:tcPr>
             <w:tcW w:type="dxa" w:w="1728"/>
-            <w:vAlign w:val="center"/>
-            <w:shd w:fill="FAFCFD"/>
+            <w:shd w:val="clear" w:fill="FAFCFD"/>
             <w:tcMar>
               <w:top w:w="55" w:type="dxa"/>
+              <w:start w:w="70" w:type="dxa"/>
               <w:bottom w:w="55" w:type="dxa"/>
-              <w:left w:w="70" w:type="dxa"/>
-              <w:right w:w="70" w:type="dxa"/>
+              <w:end w:w="70" w:type="dxa"/>
             </w:tcMar>
+            <w:vAlign w:val="center"/>
           </w:tcPr>
           <w:p>
             <w:pPr>
@@ -2154,17 +2238,19 @@
         </w:tc>
       </w:tr>
       <w:tr>
-        <w:trPr/>
+        <w:trPr>
+          <w:cantSplit/>
+        </w:trPr>
         <w:tc>
           <w:tcPr>
             <w:tcW w:type="dxa" w:w="1728"/>
-            <w:vAlign w:val="center"/>
             <w:tcMar>
               <w:top w:w="55" w:type="dxa"/>
+              <w:start w:w="70" w:type="dxa"/>
               <w:bottom w:w="55" w:type="dxa"/>
-              <w:left w:w="70" w:type="dxa"/>
-              <w:right w:w="70" w:type="dxa"/>
+              <w:end w:w="70" w:type="dxa"/>
             </w:tcMar>
+            <w:vAlign w:val="center"/>
           </w:tcPr>
           <w:p>
             <w:pPr>
@@ -2183,13 +2269,13 @@
         <w:tc>
           <w:tcPr>
             <w:tcW w:type="dxa" w:w="1872"/>
-            <w:vAlign w:val="center"/>
             <w:tcMar>
               <w:top w:w="55" w:type="dxa"/>
+              <w:start w:w="70" w:type="dxa"/>
               <w:bottom w:w="55" w:type="dxa"/>
-              <w:left w:w="70" w:type="dxa"/>
-              <w:right w:w="70" w:type="dxa"/>
+              <w:end w:w="70" w:type="dxa"/>
             </w:tcMar>
+            <w:vAlign w:val="center"/>
           </w:tcPr>
           <w:p>
             <w:pPr>
@@ -2208,13 +2294,13 @@
         <w:tc>
           <w:tcPr>
             <w:tcW w:type="dxa" w:w="1872"/>
-            <w:vAlign w:val="center"/>
             <w:tcMar>
               <w:top w:w="55" w:type="dxa"/>
+              <w:start w:w="70" w:type="dxa"/>
               <w:bottom w:w="55" w:type="dxa"/>
-              <w:left w:w="70" w:type="dxa"/>
-              <w:right w:w="70" w:type="dxa"/>
+              <w:end w:w="70" w:type="dxa"/>
             </w:tcMar>
+            <w:vAlign w:val="center"/>
           </w:tcPr>
           <w:p>
             <w:pPr>
@@ -2233,13 +2319,13 @@
         <w:tc>
           <w:tcPr>
             <w:tcW w:type="dxa" w:w="2160"/>
-            <w:vAlign w:val="center"/>
             <w:tcMar>
               <w:top w:w="55" w:type="dxa"/>
+              <w:start w:w="70" w:type="dxa"/>
               <w:bottom w:w="55" w:type="dxa"/>
-              <w:left w:w="70" w:type="dxa"/>
-              <w:right w:w="70" w:type="dxa"/>
+              <w:end w:w="70" w:type="dxa"/>
             </w:tcMar>
+            <w:vAlign w:val="center"/>
           </w:tcPr>
           <w:p>
             <w:pPr>
@@ -2251,20 +2337,20 @@
                 <w:color w:val="262626"/>
                 <w:sz w:val="16"/>
               </w:rPr>
-              <w:t>Median of mission medians log2FC, signed Stouffer meta-Z</w:t>
+              <w:t>Median of mission medians log2FC; signed Stouffer P; nominal P &lt; 0.05 filter; size = |effect|</w:t>
             </w:r>
           </w:p>
         </w:tc>
         <w:tc>
           <w:tcPr>
             <w:tcW w:type="dxa" w:w="1728"/>
-            <w:vAlign w:val="center"/>
             <w:tcMar>
               <w:top w:w="55" w:type="dxa"/>
+              <w:start w:w="70" w:type="dxa"/>
               <w:bottom w:w="55" w:type="dxa"/>
-              <w:left w:w="70" w:type="dxa"/>
-              <w:right w:w="70" w:type="dxa"/>
+              <w:end w:w="70" w:type="dxa"/>
             </w:tcMar>
+            <w:vAlign w:val="center"/>
           </w:tcPr>
           <w:p>
             <w:pPr>
@@ -2276,24 +2362,26 @@
                 <w:color w:val="262626"/>
                 <w:sz w:val="16"/>
               </w:rPr>
-              <w:t>R/figures/05_meta_log2fc_heatmaps.R</w:t>
+              <w:t>R/final_figures/06_meta_dotplots.R</w:t>
             </w:r>
           </w:p>
         </w:tc>
       </w:tr>
       <w:tr>
-        <w:trPr/>
+        <w:trPr>
+          <w:cantSplit/>
+        </w:trPr>
         <w:tc>
           <w:tcPr>
             <w:tcW w:type="dxa" w:w="1728"/>
-            <w:vAlign w:val="center"/>
-            <w:shd w:fill="FAFCFD"/>
+            <w:shd w:val="clear" w:fill="FAFCFD"/>
             <w:tcMar>
               <w:top w:w="55" w:type="dxa"/>
+              <w:start w:w="70" w:type="dxa"/>
               <w:bottom w:w="55" w:type="dxa"/>
-              <w:left w:w="70" w:type="dxa"/>
-              <w:right w:w="70" w:type="dxa"/>
+              <w:end w:w="70" w:type="dxa"/>
             </w:tcMar>
+            <w:vAlign w:val="center"/>
           </w:tcPr>
           <w:p>
             <w:pPr>
@@ -2312,14 +2400,14 @@
         <w:tc>
           <w:tcPr>
             <w:tcW w:type="dxa" w:w="1872"/>
-            <w:vAlign w:val="center"/>
-            <w:shd w:fill="FAFCFD"/>
+            <w:shd w:val="clear" w:fill="FAFCFD"/>
             <w:tcMar>
               <w:top w:w="55" w:type="dxa"/>
+              <w:start w:w="70" w:type="dxa"/>
               <w:bottom w:w="55" w:type="dxa"/>
-              <w:left w:w="70" w:type="dxa"/>
-              <w:right w:w="70" w:type="dxa"/>
+              <w:end w:w="70" w:type="dxa"/>
             </w:tcMar>
+            <w:vAlign w:val="center"/>
           </w:tcPr>
           <w:p>
             <w:pPr>
@@ -2331,21 +2419,21 @@
                 <w:color w:val="262626"/>
                 <w:sz w:val="16"/>
               </w:rPr>
-              <w:t>SSB Baseline Clustering</w:t>
+              <w:t>SSB Tissue-Aware Clustering</w:t>
             </w:r>
           </w:p>
         </w:tc>
         <w:tc>
           <w:tcPr>
             <w:tcW w:type="dxa" w:w="1872"/>
-            <w:vAlign w:val="center"/>
-            <w:shd w:fill="FAFCFD"/>
+            <w:shd w:val="clear" w:fill="FAFCFD"/>
             <w:tcMar>
               <w:top w:w="55" w:type="dxa"/>
+              <w:start w:w="70" w:type="dxa"/>
               <w:bottom w:w="55" w:type="dxa"/>
-              <w:left w:w="70" w:type="dxa"/>
-              <w:right w:w="70" w:type="dxa"/>
+              <w:end w:w="70" w:type="dxa"/>
             </w:tcMar>
+            <w:vAlign w:val="center"/>
           </w:tcPr>
           <w:p>
             <w:pPr>
@@ -2364,14 +2452,14 @@
         <w:tc>
           <w:tcPr>
             <w:tcW w:type="dxa" w:w="2160"/>
-            <w:vAlign w:val="center"/>
-            <w:shd w:fill="FAFCFD"/>
+            <w:shd w:val="clear" w:fill="FAFCFD"/>
             <w:tcMar>
               <w:top w:w="55" w:type="dxa"/>
+              <w:start w:w="70" w:type="dxa"/>
               <w:bottom w:w="55" w:type="dxa"/>
-              <w:left w:w="70" w:type="dxa"/>
-              <w:right w:w="70" w:type="dxa"/>
+              <w:end w:w="70" w:type="dxa"/>
             </w:tcMar>
+            <w:vAlign w:val="center"/>
           </w:tcPr>
           <w:p>
             <w:pPr>
@@ -2383,21 +2471,21 @@
                 <w:color w:val="262626"/>
                 <w:sz w:val="16"/>
               </w:rPr>
-              <w:t>YARN qsmooth baseline (Neil2 excluded), 1 - ρ, average linkage</w:t>
+              <w:t>YARN tissue-aware qsmooth; sample-to-tissue means; 1 − Spearman ρ, average linkage</w:t>
             </w:r>
           </w:p>
         </w:tc>
         <w:tc>
           <w:tcPr>
             <w:tcW w:type="dxa" w:w="1728"/>
-            <w:vAlign w:val="center"/>
-            <w:shd w:fill="FAFCFD"/>
+            <w:shd w:val="clear" w:fill="FAFCFD"/>
             <w:tcMar>
               <w:top w:w="55" w:type="dxa"/>
+              <w:start w:w="70" w:type="dxa"/>
               <w:bottom w:w="55" w:type="dxa"/>
-              <w:left w:w="70" w:type="dxa"/>
-              <w:right w:w="70" w:type="dxa"/>
+              <w:end w:w="70" w:type="dxa"/>
             </w:tcMar>
+            <w:vAlign w:val="center"/>
           </w:tcPr>
           <w:p>
             <w:pPr>
@@ -2409,23 +2497,25 @@
                 <w:color w:val="262626"/>
                 <w:sz w:val="16"/>
               </w:rPr>
-              <w:t>R/figures/04_qsmooth_tree_heatmaps.R</w:t>
+              <w:t>R/final_figures/05_expression_tree_heatmaps.R</w:t>
             </w:r>
           </w:p>
         </w:tc>
       </w:tr>
       <w:tr>
-        <w:trPr/>
+        <w:trPr>
+          <w:cantSplit/>
+        </w:trPr>
         <w:tc>
           <w:tcPr>
             <w:tcW w:type="dxa" w:w="1728"/>
-            <w:vAlign w:val="center"/>
             <w:tcMar>
               <w:top w:w="55" w:type="dxa"/>
+              <w:start w:w="70" w:type="dxa"/>
               <w:bottom w:w="55" w:type="dxa"/>
-              <w:left w:w="70" w:type="dxa"/>
-              <w:right w:w="70" w:type="dxa"/>
+              <w:end w:w="70" w:type="dxa"/>
             </w:tcMar>
+            <w:vAlign w:val="center"/>
           </w:tcPr>
           <w:p>
             <w:pPr>
@@ -2444,13 +2534,13 @@
         <w:tc>
           <w:tcPr>
             <w:tcW w:type="dxa" w:w="1872"/>
-            <w:vAlign w:val="center"/>
             <w:tcMar>
               <w:top w:w="55" w:type="dxa"/>
+              <w:start w:w="70" w:type="dxa"/>
               <w:bottom w:w="55" w:type="dxa"/>
-              <w:left w:w="70" w:type="dxa"/>
-              <w:right w:w="70" w:type="dxa"/>
+              <w:end w:w="70" w:type="dxa"/>
             </w:tcMar>
+            <w:vAlign w:val="center"/>
           </w:tcPr>
           <w:p>
             <w:pPr>
@@ -2462,20 +2552,20 @@
                 <w:color w:val="262626"/>
                 <w:sz w:val="16"/>
               </w:rPr>
-              <w:t>BER Linear Boxplot</w:t>
+              <w:t>BER Linear Expression Display</w:t>
             </w:r>
           </w:p>
         </w:tc>
         <w:tc>
           <w:tcPr>
             <w:tcW w:type="dxa" w:w="1872"/>
-            <w:vAlign w:val="center"/>
             <w:tcMar>
               <w:top w:w="55" w:type="dxa"/>
+              <w:start w:w="70" w:type="dxa"/>
               <w:bottom w:w="55" w:type="dxa"/>
-              <w:left w:w="70" w:type="dxa"/>
-              <w:right w:w="70" w:type="dxa"/>
+              <w:end w:w="70" w:type="dxa"/>
             </w:tcMar>
+            <w:vAlign w:val="center"/>
           </w:tcPr>
           <w:p>
             <w:pPr>
@@ -2487,20 +2577,20 @@
                 <w:color w:val="262626"/>
                 <w:sz w:val="16"/>
               </w:rPr>
-              <w:t>360 flight mice × 3 genes (26 tissues)</w:t>
+              <w:t>360 Flight source-sample columns × 3 genes (26 tissues)</w:t>
             </w:r>
           </w:p>
         </w:tc>
         <w:tc>
           <w:tcPr>
             <w:tcW w:type="dxa" w:w="2160"/>
-            <w:vAlign w:val="center"/>
             <w:tcMar>
               <w:top w:w="55" w:type="dxa"/>
+              <w:start w:w="70" w:type="dxa"/>
               <w:bottom w:w="55" w:type="dxa"/>
-              <w:left w:w="70" w:type="dxa"/>
-              <w:right w:w="70" w:type="dxa"/>
+              <w:end w:w="70" w:type="dxa"/>
             </w:tcMar>
+            <w:vAlign w:val="center"/>
           </w:tcPr>
           <w:p>
             <w:pPr>
@@ -2512,20 +2602,20 @@
                 <w:color w:val="262626"/>
                 <w:sz w:val="16"/>
               </w:rPr>
-              <w:t>Linear scale 2^log2 - 1, Mean hinge, Gene &amp; Pathway ANOVA</w:t>
+              <w:t>Back-transformed normalized expression, Q1/mean/Q3 box geometry, one-way ANOVA</w:t>
             </w:r>
           </w:p>
         </w:tc>
         <w:tc>
           <w:tcPr>
             <w:tcW w:type="dxa" w:w="1728"/>
-            <w:vAlign w:val="center"/>
             <w:tcMar>
               <w:top w:w="55" w:type="dxa"/>
+              <w:start w:w="70" w:type="dxa"/>
               <w:bottom w:w="55" w:type="dxa"/>
-              <w:left w:w="70" w:type="dxa"/>
-              <w:right w:w="70" w:type="dxa"/>
+              <w:end w:w="70" w:type="dxa"/>
             </w:tcMar>
+            <w:vAlign w:val="center"/>
           </w:tcPr>
           <w:p>
             <w:pPr>
@@ -2543,18 +2633,20 @@
         </w:tc>
       </w:tr>
       <w:tr>
-        <w:trPr/>
+        <w:trPr>
+          <w:cantSplit/>
+        </w:trPr>
         <w:tc>
           <w:tcPr>
             <w:tcW w:type="dxa" w:w="1728"/>
-            <w:vAlign w:val="center"/>
-            <w:shd w:fill="FAFCFD"/>
+            <w:shd w:val="clear" w:fill="FAFCFD"/>
             <w:tcMar>
               <w:top w:w="55" w:type="dxa"/>
+              <w:start w:w="70" w:type="dxa"/>
               <w:bottom w:w="55" w:type="dxa"/>
-              <w:left w:w="70" w:type="dxa"/>
-              <w:right w:w="70" w:type="dxa"/>
+              <w:end w:w="70" w:type="dxa"/>
             </w:tcMar>
+            <w:vAlign w:val="center"/>
           </w:tcPr>
           <w:p>
             <w:pPr>
@@ -2573,14 +2665,14 @@
         <w:tc>
           <w:tcPr>
             <w:tcW w:type="dxa" w:w="1872"/>
-            <w:vAlign w:val="center"/>
-            <w:shd w:fill="FAFCFD"/>
+            <w:shd w:val="clear" w:fill="FAFCFD"/>
             <w:tcMar>
               <w:top w:w="55" w:type="dxa"/>
+              <w:start w:w="70" w:type="dxa"/>
               <w:bottom w:w="55" w:type="dxa"/>
-              <w:left w:w="70" w:type="dxa"/>
-              <w:right w:w="70" w:type="dxa"/>
+              <w:end w:w="70" w:type="dxa"/>
             </w:tcMar>
+            <w:vAlign w:val="center"/>
           </w:tcPr>
           <w:p>
             <w:pPr>
@@ -2592,21 +2684,21 @@
                 <w:color w:val="262626"/>
                 <w:sz w:val="16"/>
               </w:rPr>
-              <w:t>NER Linear Boxplot</w:t>
+              <w:t>NER Linear Expression Display</w:t>
             </w:r>
           </w:p>
         </w:tc>
         <w:tc>
           <w:tcPr>
             <w:tcW w:type="dxa" w:w="1872"/>
-            <w:vAlign w:val="center"/>
-            <w:shd w:fill="FAFCFD"/>
+            <w:shd w:val="clear" w:fill="FAFCFD"/>
             <w:tcMar>
               <w:top w:w="55" w:type="dxa"/>
+              <w:start w:w="70" w:type="dxa"/>
               <w:bottom w:w="55" w:type="dxa"/>
-              <w:left w:w="70" w:type="dxa"/>
-              <w:right w:w="70" w:type="dxa"/>
+              <w:end w:w="70" w:type="dxa"/>
             </w:tcMar>
+            <w:vAlign w:val="center"/>
           </w:tcPr>
           <w:p>
             <w:pPr>
@@ -2618,21 +2710,21 @@
                 <w:color w:val="262626"/>
                 <w:sz w:val="16"/>
               </w:rPr>
-              <w:t>360 flight mice × 7 genes (26 tissues)</w:t>
+              <w:t>360 Flight source-sample columns × 7 genes (26 tissues)</w:t>
             </w:r>
           </w:p>
         </w:tc>
         <w:tc>
           <w:tcPr>
             <w:tcW w:type="dxa" w:w="2160"/>
-            <w:vAlign w:val="center"/>
-            <w:shd w:fill="FAFCFD"/>
+            <w:shd w:val="clear" w:fill="FAFCFD"/>
             <w:tcMar>
               <w:top w:w="55" w:type="dxa"/>
+              <w:start w:w="70" w:type="dxa"/>
               <w:bottom w:w="55" w:type="dxa"/>
-              <w:left w:w="70" w:type="dxa"/>
-              <w:right w:w="70" w:type="dxa"/>
+              <w:end w:w="70" w:type="dxa"/>
             </w:tcMar>
+            <w:vAlign w:val="center"/>
           </w:tcPr>
           <w:p>
             <w:pPr>
@@ -2644,21 +2736,21 @@
                 <w:color w:val="262626"/>
                 <w:sz w:val="16"/>
               </w:rPr>
-              <w:t>Linear scale 2^log2 - 1, Glyphic coding, Gene &amp; Pathway ANOVA</w:t>
+              <w:t>Back-transformed normalized expression, glyphic coding, one-way ANOVA</w:t>
             </w:r>
           </w:p>
         </w:tc>
         <w:tc>
           <w:tcPr>
             <w:tcW w:type="dxa" w:w="1728"/>
-            <w:vAlign w:val="center"/>
-            <w:shd w:fill="FAFCFD"/>
+            <w:shd w:val="clear" w:fill="FAFCFD"/>
             <w:tcMar>
               <w:top w:w="55" w:type="dxa"/>
+              <w:start w:w="70" w:type="dxa"/>
               <w:bottom w:w="55" w:type="dxa"/>
-              <w:left w:w="70" w:type="dxa"/>
-              <w:right w:w="70" w:type="dxa"/>
+              <w:end w:w="70" w:type="dxa"/>
             </w:tcMar>
+            <w:vAlign w:val="center"/>
           </w:tcPr>
           <w:p>
             <w:pPr>
@@ -2676,17 +2768,19 @@
         </w:tc>
       </w:tr>
       <w:tr>
-        <w:trPr/>
+        <w:trPr>
+          <w:cantSplit/>
+        </w:trPr>
         <w:tc>
           <w:tcPr>
             <w:tcW w:type="dxa" w:w="1728"/>
-            <w:vAlign w:val="center"/>
             <w:tcMar>
               <w:top w:w="55" w:type="dxa"/>
+              <w:start w:w="70" w:type="dxa"/>
               <w:bottom w:w="55" w:type="dxa"/>
-              <w:left w:w="70" w:type="dxa"/>
-              <w:right w:w="70" w:type="dxa"/>
+              <w:end w:w="70" w:type="dxa"/>
             </w:tcMar>
+            <w:vAlign w:val="center"/>
           </w:tcPr>
           <w:p>
             <w:pPr>
@@ -2705,13 +2799,13 @@
         <w:tc>
           <w:tcPr>
             <w:tcW w:type="dxa" w:w="1872"/>
-            <w:vAlign w:val="center"/>
             <w:tcMar>
               <w:top w:w="55" w:type="dxa"/>
+              <w:start w:w="70" w:type="dxa"/>
               <w:bottom w:w="55" w:type="dxa"/>
-              <w:left w:w="70" w:type="dxa"/>
-              <w:right w:w="70" w:type="dxa"/>
+              <w:end w:w="70" w:type="dxa"/>
             </w:tcMar>
+            <w:vAlign w:val="center"/>
           </w:tcPr>
           <w:p>
             <w:pPr>
@@ -2723,20 +2817,20 @@
                 <w:color w:val="262626"/>
                 <w:sz w:val="16"/>
               </w:rPr>
-              <w:t>MMR Linear Boxplot</w:t>
+              <w:t>MMR Linear Expression Display</w:t>
             </w:r>
           </w:p>
         </w:tc>
         <w:tc>
           <w:tcPr>
             <w:tcW w:type="dxa" w:w="1872"/>
-            <w:vAlign w:val="center"/>
             <w:tcMar>
               <w:top w:w="55" w:type="dxa"/>
+              <w:start w:w="70" w:type="dxa"/>
               <w:bottom w:w="55" w:type="dxa"/>
-              <w:left w:w="70" w:type="dxa"/>
-              <w:right w:w="70" w:type="dxa"/>
+              <w:end w:w="70" w:type="dxa"/>
             </w:tcMar>
+            <w:vAlign w:val="center"/>
           </w:tcPr>
           <w:p>
             <w:pPr>
@@ -2748,20 +2842,20 @@
                 <w:color w:val="262626"/>
                 <w:sz w:val="16"/>
               </w:rPr>
-              <w:t>360 flight mice × 2 genes (26 tissues)</w:t>
+              <w:t>360 Flight source-sample columns × 2 genes (26 tissues)</w:t>
             </w:r>
           </w:p>
         </w:tc>
         <w:tc>
           <w:tcPr>
             <w:tcW w:type="dxa" w:w="2160"/>
-            <w:vAlign w:val="center"/>
             <w:tcMar>
               <w:top w:w="55" w:type="dxa"/>
+              <w:start w:w="70" w:type="dxa"/>
               <w:bottom w:w="55" w:type="dxa"/>
-              <w:left w:w="70" w:type="dxa"/>
-              <w:right w:w="70" w:type="dxa"/>
+              <w:end w:w="70" w:type="dxa"/>
             </w:tcMar>
+            <w:vAlign w:val="center"/>
           </w:tcPr>
           <w:p>
             <w:pPr>
@@ -2773,20 +2867,20 @@
                 <w:color w:val="262626"/>
                 <w:sz w:val="16"/>
               </w:rPr>
-              <w:t>Linear scale 2^log2 - 1, Mean hinge, Gene &amp; Pathway ANOVA</w:t>
+              <w:t>Back-transformed normalized expression, Q1/mean/Q3 box geometry, one-way ANOVA</w:t>
             </w:r>
           </w:p>
         </w:tc>
         <w:tc>
           <w:tcPr>
             <w:tcW w:type="dxa" w:w="1728"/>
-            <w:vAlign w:val="center"/>
             <w:tcMar>
               <w:top w:w="55" w:type="dxa"/>
+              <w:start w:w="70" w:type="dxa"/>
               <w:bottom w:w="55" w:type="dxa"/>
-              <w:left w:w="70" w:type="dxa"/>
-              <w:right w:w="70" w:type="dxa"/>
+              <w:end w:w="70" w:type="dxa"/>
             </w:tcMar>
+            <w:vAlign w:val="center"/>
           </w:tcPr>
           <w:p>
             <w:pPr>
@@ -2804,18 +2898,20 @@
         </w:tc>
       </w:tr>
       <w:tr>
-        <w:trPr/>
+        <w:trPr>
+          <w:cantSplit/>
+        </w:trPr>
         <w:tc>
           <w:tcPr>
             <w:tcW w:type="dxa" w:w="1728"/>
-            <w:vAlign w:val="center"/>
-            <w:shd w:fill="FAFCFD"/>
+            <w:shd w:val="clear" w:fill="FAFCFD"/>
             <w:tcMar>
               <w:top w:w="55" w:type="dxa"/>
+              <w:start w:w="70" w:type="dxa"/>
               <w:bottom w:w="55" w:type="dxa"/>
-              <w:left w:w="70" w:type="dxa"/>
-              <w:right w:w="70" w:type="dxa"/>
+              <w:end w:w="70" w:type="dxa"/>
             </w:tcMar>
+            <w:vAlign w:val="center"/>
           </w:tcPr>
           <w:p>
             <w:pPr>
@@ -2834,14 +2930,14 @@
         <w:tc>
           <w:tcPr>
             <w:tcW w:type="dxa" w:w="1872"/>
-            <w:vAlign w:val="center"/>
-            <w:shd w:fill="FAFCFD"/>
+            <w:shd w:val="clear" w:fill="FAFCFD"/>
             <w:tcMar>
               <w:top w:w="55" w:type="dxa"/>
+              <w:start w:w="70" w:type="dxa"/>
               <w:bottom w:w="55" w:type="dxa"/>
-              <w:left w:w="70" w:type="dxa"/>
-              <w:right w:w="70" w:type="dxa"/>
+              <w:end w:w="70" w:type="dxa"/>
             </w:tcMar>
+            <w:vAlign w:val="center"/>
           </w:tcPr>
           <w:p>
             <w:pPr>
@@ -2853,21 +2949,21 @@
                 <w:color w:val="262626"/>
                 <w:sz w:val="16"/>
               </w:rPr>
-              <w:t>FA Linear Boxplot</w:t>
+              <w:t>FA Linear Expression Display</w:t>
             </w:r>
           </w:p>
         </w:tc>
         <w:tc>
           <w:tcPr>
             <w:tcW w:type="dxa" w:w="1872"/>
-            <w:vAlign w:val="center"/>
-            <w:shd w:fill="FAFCFD"/>
+            <w:shd w:val="clear" w:fill="FAFCFD"/>
             <w:tcMar>
               <w:top w:w="55" w:type="dxa"/>
+              <w:start w:w="70" w:type="dxa"/>
               <w:bottom w:w="55" w:type="dxa"/>
-              <w:left w:w="70" w:type="dxa"/>
-              <w:right w:w="70" w:type="dxa"/>
+              <w:end w:w="70" w:type="dxa"/>
             </w:tcMar>
+            <w:vAlign w:val="center"/>
           </w:tcPr>
           <w:p>
             <w:pPr>
@@ -2879,21 +2975,21 @@
                 <w:color w:val="262626"/>
                 <w:sz w:val="16"/>
               </w:rPr>
-              <w:t>360 flight mice × 2 genes (26 tissues)</w:t>
+              <w:t>360 Flight source-sample columns × 2 genes (26 tissues)</w:t>
             </w:r>
           </w:p>
         </w:tc>
         <w:tc>
           <w:tcPr>
             <w:tcW w:type="dxa" w:w="2160"/>
-            <w:vAlign w:val="center"/>
-            <w:shd w:fill="FAFCFD"/>
+            <w:shd w:val="clear" w:fill="FAFCFD"/>
             <w:tcMar>
               <w:top w:w="55" w:type="dxa"/>
+              <w:start w:w="70" w:type="dxa"/>
               <w:bottom w:w="55" w:type="dxa"/>
-              <w:left w:w="70" w:type="dxa"/>
-              <w:right w:w="70" w:type="dxa"/>
+              <w:end w:w="70" w:type="dxa"/>
             </w:tcMar>
+            <w:vAlign w:val="center"/>
           </w:tcPr>
           <w:p>
             <w:pPr>
@@ -2905,21 +3001,21 @@
                 <w:color w:val="262626"/>
                 <w:sz w:val="16"/>
               </w:rPr>
-              <w:t>Linear scale 2^log2 - 1, Mean hinge, Gene &amp; Pathway ANOVA</w:t>
+              <w:t>Back-transformed normalized expression, Q1/mean/Q3 box geometry, one-way ANOVA</w:t>
             </w:r>
           </w:p>
         </w:tc>
         <w:tc>
           <w:tcPr>
             <w:tcW w:type="dxa" w:w="1728"/>
-            <w:vAlign w:val="center"/>
-            <w:shd w:fill="FAFCFD"/>
+            <w:shd w:val="clear" w:fill="FAFCFD"/>
             <w:tcMar>
               <w:top w:w="55" w:type="dxa"/>
+              <w:start w:w="70" w:type="dxa"/>
               <w:bottom w:w="55" w:type="dxa"/>
-              <w:left w:w="70" w:type="dxa"/>
-              <w:right w:w="70" w:type="dxa"/>
+              <w:end w:w="70" w:type="dxa"/>
             </w:tcMar>
+            <w:vAlign w:val="center"/>
           </w:tcPr>
           <w:p>
             <w:pPr>
@@ -2937,17 +3033,19 @@
         </w:tc>
       </w:tr>
       <w:tr>
-        <w:trPr/>
+        <w:trPr>
+          <w:cantSplit/>
+        </w:trPr>
         <w:tc>
           <w:tcPr>
             <w:tcW w:type="dxa" w:w="1728"/>
-            <w:vAlign w:val="center"/>
             <w:tcMar>
               <w:top w:w="55" w:type="dxa"/>
+              <w:start w:w="70" w:type="dxa"/>
               <w:bottom w:w="55" w:type="dxa"/>
-              <w:left w:w="70" w:type="dxa"/>
-              <w:right w:w="70" w:type="dxa"/>
+              <w:end w:w="70" w:type="dxa"/>
             </w:tcMar>
+            <w:vAlign w:val="center"/>
           </w:tcPr>
           <w:p>
             <w:pPr>
@@ -2966,13 +3064,13 @@
         <w:tc>
           <w:tcPr>
             <w:tcW w:type="dxa" w:w="1872"/>
-            <w:vAlign w:val="center"/>
             <w:tcMar>
               <w:top w:w="55" w:type="dxa"/>
+              <w:start w:w="70" w:type="dxa"/>
               <w:bottom w:w="55" w:type="dxa"/>
-              <w:left w:w="70" w:type="dxa"/>
-              <w:right w:w="70" w:type="dxa"/>
+              <w:end w:w="70" w:type="dxa"/>
             </w:tcMar>
+            <w:vAlign w:val="center"/>
           </w:tcPr>
           <w:p>
             <w:pPr>
@@ -2991,13 +3089,13 @@
         <w:tc>
           <w:tcPr>
             <w:tcW w:type="dxa" w:w="1872"/>
-            <w:vAlign w:val="center"/>
             <w:tcMar>
               <w:top w:w="55" w:type="dxa"/>
+              <w:start w:w="70" w:type="dxa"/>
               <w:bottom w:w="55" w:type="dxa"/>
-              <w:left w:w="70" w:type="dxa"/>
-              <w:right w:w="70" w:type="dxa"/>
+              <w:end w:w="70" w:type="dxa"/>
             </w:tcMar>
+            <w:vAlign w:val="center"/>
           </w:tcPr>
           <w:p>
             <w:pPr>
@@ -3016,13 +3114,13 @@
         <w:tc>
           <w:tcPr>
             <w:tcW w:type="dxa" w:w="2160"/>
-            <w:vAlign w:val="center"/>
             <w:tcMar>
               <w:top w:w="55" w:type="dxa"/>
+              <w:start w:w="70" w:type="dxa"/>
               <w:bottom w:w="55" w:type="dxa"/>
-              <w:left w:w="70" w:type="dxa"/>
-              <w:right w:w="70" w:type="dxa"/>
+              <w:end w:w="70" w:type="dxa"/>
             </w:tcMar>
+            <w:vAlign w:val="center"/>
           </w:tcPr>
           <w:p>
             <w:pPr>
@@ -3034,20 +3132,20 @@
                 <w:color w:val="262626"/>
                 <w:sz w:val="16"/>
               </w:rPr>
-              <w:t>Median of mission medians log2FC, signed Stouffer meta-Z</w:t>
+              <w:t>Median of mission medians log2FC; signed Stouffer P; nominal P &lt; 0.05 filter; size = |effect|</w:t>
             </w:r>
           </w:p>
         </w:tc>
         <w:tc>
           <w:tcPr>
             <w:tcW w:type="dxa" w:w="1728"/>
-            <w:vAlign w:val="center"/>
             <w:tcMar>
               <w:top w:w="55" w:type="dxa"/>
+              <w:start w:w="70" w:type="dxa"/>
               <w:bottom w:w="55" w:type="dxa"/>
-              <w:left w:w="70" w:type="dxa"/>
-              <w:right w:w="70" w:type="dxa"/>
+              <w:end w:w="70" w:type="dxa"/>
             </w:tcMar>
+            <w:vAlign w:val="center"/>
           </w:tcPr>
           <w:p>
             <w:pPr>
@@ -3059,24 +3157,26 @@
                 <w:color w:val="262626"/>
                 <w:sz w:val="16"/>
               </w:rPr>
-              <w:t>R/figures/05_meta_log2fc_heatmaps.R</w:t>
+              <w:t>R/final_figures/06_meta_dotplots.R</w:t>
             </w:r>
           </w:p>
         </w:tc>
       </w:tr>
       <w:tr>
-        <w:trPr/>
+        <w:trPr>
+          <w:cantSplit/>
+        </w:trPr>
         <w:tc>
           <w:tcPr>
             <w:tcW w:type="dxa" w:w="1728"/>
-            <w:vAlign w:val="center"/>
-            <w:shd w:fill="FAFCFD"/>
+            <w:shd w:val="clear" w:fill="FAFCFD"/>
             <w:tcMar>
               <w:top w:w="55" w:type="dxa"/>
+              <w:start w:w="70" w:type="dxa"/>
               <w:bottom w:w="55" w:type="dxa"/>
-              <w:left w:w="70" w:type="dxa"/>
-              <w:right w:w="70" w:type="dxa"/>
+              <w:end w:w="70" w:type="dxa"/>
             </w:tcMar>
+            <w:vAlign w:val="center"/>
           </w:tcPr>
           <w:p>
             <w:pPr>
@@ -3095,14 +3195,14 @@
         <w:tc>
           <w:tcPr>
             <w:tcW w:type="dxa" w:w="1872"/>
-            <w:vAlign w:val="center"/>
-            <w:shd w:fill="FAFCFD"/>
+            <w:shd w:val="clear" w:fill="FAFCFD"/>
             <w:tcMar>
               <w:top w:w="55" w:type="dxa"/>
+              <w:start w:w="70" w:type="dxa"/>
               <w:bottom w:w="55" w:type="dxa"/>
-              <w:left w:w="70" w:type="dxa"/>
-              <w:right w:w="70" w:type="dxa"/>
+              <w:end w:w="70" w:type="dxa"/>
             </w:tcMar>
+            <w:vAlign w:val="center"/>
           </w:tcPr>
           <w:p>
             <w:pPr>
@@ -3121,14 +3221,14 @@
         <w:tc>
           <w:tcPr>
             <w:tcW w:type="dxa" w:w="1872"/>
-            <w:vAlign w:val="center"/>
-            <w:shd w:fill="FAFCFD"/>
+            <w:shd w:val="clear" w:fill="FAFCFD"/>
             <w:tcMar>
               <w:top w:w="55" w:type="dxa"/>
+              <w:start w:w="70" w:type="dxa"/>
               <w:bottom w:w="55" w:type="dxa"/>
-              <w:left w:w="70" w:type="dxa"/>
-              <w:right w:w="70" w:type="dxa"/>
+              <w:end w:w="70" w:type="dxa"/>
             </w:tcMar>
+            <w:vAlign w:val="center"/>
           </w:tcPr>
           <w:p>
             <w:pPr>
@@ -3147,14 +3247,14 @@
         <w:tc>
           <w:tcPr>
             <w:tcW w:type="dxa" w:w="2160"/>
-            <w:vAlign w:val="center"/>
-            <w:shd w:fill="FAFCFD"/>
+            <w:shd w:val="clear" w:fill="FAFCFD"/>
             <w:tcMar>
               <w:top w:w="55" w:type="dxa"/>
+              <w:start w:w="70" w:type="dxa"/>
               <w:bottom w:w="55" w:type="dxa"/>
-              <w:left w:w="70" w:type="dxa"/>
-              <w:right w:w="70" w:type="dxa"/>
+              <w:end w:w="70" w:type="dxa"/>
             </w:tcMar>
+            <w:vAlign w:val="center"/>
           </w:tcPr>
           <w:p>
             <w:pPr>
@@ -3173,14 +3273,14 @@
         <w:tc>
           <w:tcPr>
             <w:tcW w:type="dxa" w:w="1728"/>
-            <w:vAlign w:val="center"/>
-            <w:shd w:fill="FAFCFD"/>
+            <w:shd w:val="clear" w:fill="FAFCFD"/>
             <w:tcMar>
               <w:top w:w="55" w:type="dxa"/>
+              <w:start w:w="70" w:type="dxa"/>
               <w:bottom w:w="55" w:type="dxa"/>
-              <w:left w:w="70" w:type="dxa"/>
-              <w:right w:w="70" w:type="dxa"/>
+              <w:end w:w="70" w:type="dxa"/>
             </w:tcMar>
+            <w:vAlign w:val="center"/>
           </w:tcPr>
           <w:p>
             <w:pPr>
@@ -3198,17 +3298,19 @@
         </w:tc>
       </w:tr>
       <w:tr>
-        <w:trPr/>
+        <w:trPr>
+          <w:cantSplit/>
+        </w:trPr>
         <w:tc>
           <w:tcPr>
             <w:tcW w:type="dxa" w:w="1728"/>
-            <w:vAlign w:val="center"/>
             <w:tcMar>
               <w:top w:w="55" w:type="dxa"/>
+              <w:start w:w="70" w:type="dxa"/>
               <w:bottom w:w="55" w:type="dxa"/>
-              <w:left w:w="70" w:type="dxa"/>
-              <w:right w:w="70" w:type="dxa"/>
+              <w:end w:w="70" w:type="dxa"/>
             </w:tcMar>
+            <w:vAlign w:val="center"/>
           </w:tcPr>
           <w:p>
             <w:pPr>
@@ -3227,13 +3329,13 @@
         <w:tc>
           <w:tcPr>
             <w:tcW w:type="dxa" w:w="1872"/>
-            <w:vAlign w:val="center"/>
             <w:tcMar>
               <w:top w:w="55" w:type="dxa"/>
+              <w:start w:w="70" w:type="dxa"/>
               <w:bottom w:w="55" w:type="dxa"/>
-              <w:left w:w="70" w:type="dxa"/>
-              <w:right w:w="70" w:type="dxa"/>
+              <w:end w:w="70" w:type="dxa"/>
             </w:tcMar>
+            <w:vAlign w:val="center"/>
           </w:tcPr>
           <w:p>
             <w:pPr>
@@ -3245,20 +3347,20 @@
                 <w:color w:val="262626"/>
                 <w:sz w:val="16"/>
               </w:rPr>
-              <w:t>Kidney Overlap &amp; Common-Dir</w:t>
+              <w:t>Kidney Overlap &amp; Common-Direction Genes</w:t>
             </w:r>
           </w:p>
         </w:tc>
         <w:tc>
           <w:tcPr>
             <w:tcW w:type="dxa" w:w="1872"/>
-            <w:vAlign w:val="center"/>
             <w:tcMar>
               <w:top w:w="55" w:type="dxa"/>
+              <w:start w:w="70" w:type="dxa"/>
               <w:bottom w:w="55" w:type="dxa"/>
-              <w:left w:w="70" w:type="dxa"/>
-              <w:right w:w="70" w:type="dxa"/>
+              <w:end w:w="70" w:type="dxa"/>
             </w:tcMar>
+            <w:vAlign w:val="center"/>
           </w:tcPr>
           <w:p>
             <w:pPr>
@@ -3277,13 +3379,13 @@
         <w:tc>
           <w:tcPr>
             <w:tcW w:type="dxa" w:w="2160"/>
-            <w:vAlign w:val="center"/>
             <w:tcMar>
               <w:top w:w="55" w:type="dxa"/>
+              <w:start w:w="70" w:type="dxa"/>
               <w:bottom w:w="55" w:type="dxa"/>
-              <w:left w:w="70" w:type="dxa"/>
-              <w:right w:w="70" w:type="dxa"/>
+              <w:end w:w="70" w:type="dxa"/>
             </w:tcMar>
+            <w:vAlign w:val="center"/>
           </w:tcPr>
           <w:p>
             <w:pPr>
@@ -3295,20 +3397,20 @@
                 <w:color w:val="262626"/>
                 <w:sz w:val="16"/>
               </w:rPr>
-              <w:t>Venn intersection &amp; common-direction top 30 DEGs</w:t>
+              <w:t>UpSet member-ID membership; BH-FDR and concordant-direction ranking</w:t>
             </w:r>
           </w:p>
         </w:tc>
         <w:tc>
           <w:tcPr>
             <w:tcW w:type="dxa" w:w="1728"/>
-            <w:vAlign w:val="center"/>
             <w:tcMar>
               <w:top w:w="55" w:type="dxa"/>
+              <w:start w:w="70" w:type="dxa"/>
               <w:bottom w:w="55" w:type="dxa"/>
-              <w:left w:w="70" w:type="dxa"/>
-              <w:right w:w="70" w:type="dxa"/>
+              <w:end w:w="70" w:type="dxa"/>
             </w:tcMar>
+            <w:vAlign w:val="center"/>
           </w:tcPr>
           <w:p>
             <w:pPr>
@@ -3320,24 +3422,26 @@
                 <w:color w:val="262626"/>
                 <w:sz w:val="16"/>
               </w:rPr>
-              <w:t>R/figures/03_kidney_thymus_venn.R</w:t>
+              <w:t>R/final_figures/04_upset_membership.R; python/render_final_common_direction.py</w:t>
             </w:r>
           </w:p>
         </w:tc>
       </w:tr>
       <w:tr>
-        <w:trPr/>
+        <w:trPr>
+          <w:cantSplit/>
+        </w:trPr>
         <w:tc>
           <w:tcPr>
             <w:tcW w:type="dxa" w:w="1728"/>
-            <w:vAlign w:val="center"/>
-            <w:shd w:fill="FAFCFD"/>
+            <w:shd w:val="clear" w:fill="FAFCFD"/>
             <w:tcMar>
               <w:top w:w="55" w:type="dxa"/>
+              <w:start w:w="70" w:type="dxa"/>
               <w:bottom w:w="55" w:type="dxa"/>
-              <w:left w:w="70" w:type="dxa"/>
-              <w:right w:w="70" w:type="dxa"/>
+              <w:end w:w="70" w:type="dxa"/>
             </w:tcMar>
+            <w:vAlign w:val="center"/>
           </w:tcPr>
           <w:p>
             <w:pPr>
@@ -3356,14 +3460,14 @@
         <w:tc>
           <w:tcPr>
             <w:tcW w:type="dxa" w:w="1872"/>
-            <w:vAlign w:val="center"/>
-            <w:shd w:fill="FAFCFD"/>
+            <w:shd w:val="clear" w:fill="FAFCFD"/>
             <w:tcMar>
               <w:top w:w="55" w:type="dxa"/>
+              <w:start w:w="70" w:type="dxa"/>
               <w:bottom w:w="55" w:type="dxa"/>
-              <w:left w:w="70" w:type="dxa"/>
-              <w:right w:w="70" w:type="dxa"/>
+              <w:end w:w="70" w:type="dxa"/>
             </w:tcMar>
+            <w:vAlign w:val="center"/>
           </w:tcPr>
           <w:p>
             <w:pPr>
@@ -3375,21 +3479,21 @@
                 <w:color w:val="262626"/>
                 <w:sz w:val="16"/>
               </w:rPr>
-              <w:t>NES &gt; 1 UpSet &amp; Common-Dir</w:t>
+              <w:t>High-NES UpSet &amp; Common-Direction Genes</w:t>
             </w:r>
           </w:p>
         </w:tc>
         <w:tc>
           <w:tcPr>
             <w:tcW w:type="dxa" w:w="1872"/>
-            <w:vAlign w:val="center"/>
-            <w:shd w:fill="FAFCFD"/>
+            <w:shd w:val="clear" w:fill="FAFCFD"/>
             <w:tcMar>
               <w:top w:w="55" w:type="dxa"/>
+              <w:start w:w="70" w:type="dxa"/>
               <w:bottom w:w="55" w:type="dxa"/>
-              <w:left w:w="70" w:type="dxa"/>
-              <w:right w:w="70" w:type="dxa"/>
+              <w:end w:w="70" w:type="dxa"/>
             </w:tcMar>
+            <w:vAlign w:val="center"/>
           </w:tcPr>
           <w:p>
             <w:pPr>
@@ -3401,21 +3505,21 @@
                 <w:color w:val="262626"/>
                 <w:sz w:val="16"/>
               </w:rPr>
-              <w:t>NES &gt; 1 tissues (excl. Kidney)</w:t>
+              <w:t>NES &gt; 1 tissues (excluding Kidney)</w:t>
             </w:r>
           </w:p>
         </w:tc>
         <w:tc>
           <w:tcPr>
             <w:tcW w:type="dxa" w:w="2160"/>
-            <w:vAlign w:val="center"/>
-            <w:shd w:fill="FAFCFD"/>
+            <w:shd w:val="clear" w:fill="FAFCFD"/>
             <w:tcMar>
               <w:top w:w="55" w:type="dxa"/>
+              <w:start w:w="70" w:type="dxa"/>
               <w:bottom w:w="55" w:type="dxa"/>
-              <w:left w:w="70" w:type="dxa"/>
-              <w:right w:w="70" w:type="dxa"/>
+              <w:end w:w="70" w:type="dxa"/>
             </w:tcMar>
+            <w:vAlign w:val="center"/>
           </w:tcPr>
           <w:p>
             <w:pPr>
@@ -3427,21 +3531,21 @@
                 <w:color w:val="262626"/>
                 <w:sz w:val="16"/>
               </w:rPr>
-              <w:t>UpSet binary membership &amp; common-direction top 30</w:t>
+              <w:t>UpSet member-ID membership; BH-FDR and concordant-direction ranking</w:t>
             </w:r>
           </w:p>
         </w:tc>
         <w:tc>
           <w:tcPr>
             <w:tcW w:type="dxa" w:w="1728"/>
-            <w:vAlign w:val="center"/>
-            <w:shd w:fill="FAFCFD"/>
+            <w:shd w:val="clear" w:fill="FAFCFD"/>
             <w:tcMar>
               <w:top w:w="55" w:type="dxa"/>
+              <w:start w:w="70" w:type="dxa"/>
               <w:bottom w:w="55" w:type="dxa"/>
-              <w:left w:w="70" w:type="dxa"/>
-              <w:right w:w="70" w:type="dxa"/>
+              <w:end w:w="70" w:type="dxa"/>
             </w:tcMar>
+            <w:vAlign w:val="center"/>
           </w:tcPr>
           <w:p>
             <w:pPr>
@@ -3453,23 +3557,25 @@
                 <w:color w:val="262626"/>
                 <w:sz w:val="16"/>
               </w:rPr>
-              <w:t>R/figures/06_go_upsets.R</w:t>
+              <w:t>R/final_figures/04_upset_membership.R; python/render_final_common_direction.py</w:t>
             </w:r>
           </w:p>
         </w:tc>
       </w:tr>
       <w:tr>
-        <w:trPr/>
+        <w:trPr>
+          <w:cantSplit/>
+        </w:trPr>
         <w:tc>
           <w:tcPr>
             <w:tcW w:type="dxa" w:w="1728"/>
-            <w:vAlign w:val="center"/>
             <w:tcMar>
               <w:top w:w="55" w:type="dxa"/>
+              <w:start w:w="70" w:type="dxa"/>
               <w:bottom w:w="55" w:type="dxa"/>
-              <w:left w:w="70" w:type="dxa"/>
-              <w:right w:w="70" w:type="dxa"/>
+              <w:end w:w="70" w:type="dxa"/>
             </w:tcMar>
+            <w:vAlign w:val="center"/>
           </w:tcPr>
           <w:p>
             <w:pPr>
@@ -3488,13 +3594,13 @@
         <w:tc>
           <w:tcPr>
             <w:tcW w:type="dxa" w:w="1872"/>
-            <w:vAlign w:val="center"/>
             <w:tcMar>
               <w:top w:w="55" w:type="dxa"/>
+              <w:start w:w="70" w:type="dxa"/>
               <w:bottom w:w="55" w:type="dxa"/>
-              <w:left w:w="70" w:type="dxa"/>
-              <w:right w:w="70" w:type="dxa"/>
+              <w:end w:w="70" w:type="dxa"/>
             </w:tcMar>
+            <w:vAlign w:val="center"/>
           </w:tcPr>
           <w:p>
             <w:pPr>
@@ -3506,20 +3612,20 @@
                 <w:color w:val="262626"/>
                 <w:sz w:val="16"/>
               </w:rPr>
-              <w:t>NES &lt; -1 UpSet &amp; Common-Dir</w:t>
+              <w:t>Low-NES UpSet &amp; Common-Direction Genes</w:t>
             </w:r>
           </w:p>
         </w:tc>
         <w:tc>
           <w:tcPr>
             <w:tcW w:type="dxa" w:w="1872"/>
-            <w:vAlign w:val="center"/>
             <w:tcMar>
               <w:top w:w="55" w:type="dxa"/>
+              <w:start w:w="70" w:type="dxa"/>
               <w:bottom w:w="55" w:type="dxa"/>
-              <w:left w:w="70" w:type="dxa"/>
-              <w:right w:w="70" w:type="dxa"/>
+              <w:end w:w="70" w:type="dxa"/>
             </w:tcMar>
+            <w:vAlign w:val="center"/>
           </w:tcPr>
           <w:p>
             <w:pPr>
@@ -3531,20 +3637,20 @@
                 <w:color w:val="262626"/>
                 <w:sz w:val="16"/>
               </w:rPr>
-              <w:t>NES &lt; -1 tissues (excl. Lung/Thymus)</w:t>
+              <w:t>NES &lt; −1 tissues (excluding Lung/Thymus)</w:t>
             </w:r>
           </w:p>
         </w:tc>
         <w:tc>
           <w:tcPr>
             <w:tcW w:type="dxa" w:w="2160"/>
-            <w:vAlign w:val="center"/>
             <w:tcMar>
               <w:top w:w="55" w:type="dxa"/>
+              <w:start w:w="70" w:type="dxa"/>
               <w:bottom w:w="55" w:type="dxa"/>
-              <w:left w:w="70" w:type="dxa"/>
-              <w:right w:w="70" w:type="dxa"/>
+              <w:end w:w="70" w:type="dxa"/>
             </w:tcMar>
+            <w:vAlign w:val="center"/>
           </w:tcPr>
           <w:p>
             <w:pPr>
@@ -3556,20 +3662,20 @@
                 <w:color w:val="262626"/>
                 <w:sz w:val="16"/>
               </w:rPr>
-              <w:t>UpSet binary membership &amp; common-direction top 30</w:t>
+              <w:t>UpSet member-ID membership; BH-FDR and concordant-direction ranking</w:t>
             </w:r>
           </w:p>
         </w:tc>
         <w:tc>
           <w:tcPr>
             <w:tcW w:type="dxa" w:w="1728"/>
-            <w:vAlign w:val="center"/>
             <w:tcMar>
               <w:top w:w="55" w:type="dxa"/>
+              <w:start w:w="70" w:type="dxa"/>
               <w:bottom w:w="55" w:type="dxa"/>
-              <w:left w:w="70" w:type="dxa"/>
-              <w:right w:w="70" w:type="dxa"/>
+              <w:end w:w="70" w:type="dxa"/>
             </w:tcMar>
+            <w:vAlign w:val="center"/>
           </w:tcPr>
           <w:p>
             <w:pPr>
@@ -3581,24 +3687,26 @@
                 <w:color w:val="262626"/>
                 <w:sz w:val="16"/>
               </w:rPr>
-              <w:t>R/figures/06_go_upsets.R</w:t>
+              <w:t>R/final_figures/04_upset_membership.R; python/render_final_common_direction.py</w:t>
             </w:r>
           </w:p>
         </w:tc>
       </w:tr>
       <w:tr>
-        <w:trPr/>
+        <w:trPr>
+          <w:cantSplit/>
+        </w:trPr>
         <w:tc>
           <w:tcPr>
             <w:tcW w:type="dxa" w:w="1728"/>
-            <w:vAlign w:val="center"/>
-            <w:shd w:fill="FAFCFD"/>
+            <w:shd w:val="clear" w:fill="FAFCFD"/>
             <w:tcMar>
               <w:top w:w="55" w:type="dxa"/>
+              <w:start w:w="70" w:type="dxa"/>
               <w:bottom w:w="55" w:type="dxa"/>
-              <w:left w:w="70" w:type="dxa"/>
-              <w:right w:w="70" w:type="dxa"/>
+              <w:end w:w="70" w:type="dxa"/>
             </w:tcMar>
+            <w:vAlign w:val="center"/>
           </w:tcPr>
           <w:p>
             <w:pPr>
@@ -3617,14 +3725,14 @@
         <w:tc>
           <w:tcPr>
             <w:tcW w:type="dxa" w:w="1872"/>
-            <w:vAlign w:val="center"/>
-            <w:shd w:fill="FAFCFD"/>
+            <w:shd w:val="clear" w:fill="FAFCFD"/>
             <w:tcMar>
               <w:top w:w="55" w:type="dxa"/>
+              <w:start w:w="70" w:type="dxa"/>
               <w:bottom w:w="55" w:type="dxa"/>
-              <w:left w:w="70" w:type="dxa"/>
-              <w:right w:w="70" w:type="dxa"/>
+              <w:end w:w="70" w:type="dxa"/>
             </w:tcMar>
+            <w:vAlign w:val="center"/>
           </w:tcPr>
           <w:p>
             <w:pPr>
@@ -3636,21 +3744,21 @@
                 <w:color w:val="262626"/>
                 <w:sz w:val="16"/>
               </w:rPr>
-              <w:t>Pathway Gene Coverage</w:t>
+              <w:t>Pathway Member-Gene Detection</w:t>
             </w:r>
           </w:p>
         </w:tc>
         <w:tc>
           <w:tcPr>
             <w:tcW w:type="dxa" w:w="1872"/>
-            <w:vAlign w:val="center"/>
-            <w:shd w:fill="FAFCFD"/>
+            <w:shd w:val="clear" w:fill="FAFCFD"/>
             <w:tcMar>
               <w:top w:w="55" w:type="dxa"/>
+              <w:start w:w="70" w:type="dxa"/>
               <w:bottom w:w="55" w:type="dxa"/>
-              <w:left w:w="70" w:type="dxa"/>
-              <w:right w:w="70" w:type="dxa"/>
+              <w:end w:w="70" w:type="dxa"/>
             </w:tcMar>
+            <w:vAlign w:val="center"/>
           </w:tcPr>
           <w:p>
             <w:pPr>
@@ -3662,21 +3770,21 @@
                 <w:color w:val="262626"/>
                 <w:sz w:val="16"/>
               </w:rPr>
-              <w:t>761 samples × 7 pathways (335 genes)</w:t>
+              <w:t>761 source-sample records × 7 pathways (335 memberships; 257 unique IDs)</w:t>
             </w:r>
           </w:p>
         </w:tc>
         <w:tc>
           <w:tcPr>
             <w:tcW w:type="dxa" w:w="2160"/>
-            <w:vAlign w:val="center"/>
-            <w:shd w:fill="FAFCFD"/>
+            <w:shd w:val="clear" w:fill="FAFCFD"/>
             <w:tcMar>
               <w:top w:w="55" w:type="dxa"/>
+              <w:start w:w="70" w:type="dxa"/>
               <w:bottom w:w="55" w:type="dxa"/>
-              <w:left w:w="70" w:type="dxa"/>
-              <w:right w:w="70" w:type="dxa"/>
+              <w:end w:w="70" w:type="dxa"/>
             </w:tcMar>
+            <w:vAlign w:val="center"/>
           </w:tcPr>
           <w:p>
             <w:pPr>
@@ -3688,21 +3796,21 @@
                 <w:color w:val="262626"/>
                 <w:sz w:val="16"/>
               </w:rPr>
-              <w:t>Per-sample member gene library detection tracking</w:t>
+              <w:t>Finite source-value detection count per pathway</w:t>
             </w:r>
           </w:p>
         </w:tc>
         <w:tc>
           <w:tcPr>
             <w:tcW w:type="dxa" w:w="1728"/>
-            <w:vAlign w:val="center"/>
-            <w:shd w:fill="FAFCFD"/>
+            <w:shd w:val="clear" w:fill="FAFCFD"/>
             <w:tcMar>
               <w:top w:w="55" w:type="dxa"/>
+              <w:start w:w="70" w:type="dxa"/>
               <w:bottom w:w="55" w:type="dxa"/>
-              <w:left w:w="70" w:type="dxa"/>
-              <w:right w:w="70" w:type="dxa"/>
+              <w:end w:w="70" w:type="dxa"/>
             </w:tcMar>
+            <w:vAlign w:val="center"/>
           </w:tcPr>
           <w:p>
             <w:pPr>
@@ -3714,23 +3822,25 @@
                 <w:color w:val="262626"/>
                 <w:sz w:val="16"/>
               </w:rPr>
-              <w:t>R/figures/07_seven_pathway_counts.R</w:t>
+              <w:t>R/final_figures/07_figS5_counts.R</w:t>
             </w:r>
           </w:p>
         </w:tc>
       </w:tr>
       <w:tr>
-        <w:trPr/>
+        <w:trPr>
+          <w:cantSplit/>
+        </w:trPr>
         <w:tc>
           <w:tcPr>
             <w:tcW w:type="dxa" w:w="1728"/>
-            <w:vAlign w:val="center"/>
             <w:tcMar>
               <w:top w:w="55" w:type="dxa"/>
+              <w:start w:w="70" w:type="dxa"/>
               <w:bottom w:w="55" w:type="dxa"/>
-              <w:left w:w="70" w:type="dxa"/>
-              <w:right w:w="70" w:type="dxa"/>
+              <w:end w:w="70" w:type="dxa"/>
             </w:tcMar>
+            <w:vAlign w:val="center"/>
           </w:tcPr>
           <w:p>
             <w:pPr>
@@ -3749,13 +3859,13 @@
         <w:tc>
           <w:tcPr>
             <w:tcW w:type="dxa" w:w="1872"/>
-            <w:vAlign w:val="center"/>
             <w:tcMar>
               <w:top w:w="55" w:type="dxa"/>
+              <w:start w:w="70" w:type="dxa"/>
               <w:bottom w:w="55" w:type="dxa"/>
-              <w:left w:w="70" w:type="dxa"/>
-              <w:right w:w="70" w:type="dxa"/>
+              <w:end w:w="70" w:type="dxa"/>
             </w:tcMar>
+            <w:vAlign w:val="center"/>
           </w:tcPr>
           <w:p>
             <w:pPr>
@@ -3767,20 +3877,20 @@
                 <w:color w:val="262626"/>
                 <w:sz w:val="16"/>
               </w:rPr>
-              <w:t>Per-Tissue Co-Regulation</w:t>
+              <w:t>Per-Tissue Sample-Level Association</w:t>
             </w:r>
           </w:p>
         </w:tc>
         <w:tc>
           <w:tcPr>
             <w:tcW w:type="dxa" w:w="1872"/>
-            <w:vAlign w:val="center"/>
             <w:tcMar>
               <w:top w:w="55" w:type="dxa"/>
+              <w:start w:w="70" w:type="dxa"/>
               <w:bottom w:w="55" w:type="dxa"/>
-              <w:left w:w="70" w:type="dxa"/>
-              <w:right w:w="70" w:type="dxa"/>
+              <w:end w:w="70" w:type="dxa"/>
             </w:tcMar>
+            <w:vAlign w:val="center"/>
           </w:tcPr>
           <w:p>
             <w:pPr>
@@ -3792,20 +3902,20 @@
                 <w:color w:val="262626"/>
                 <w:sz w:val="16"/>
               </w:rPr>
-              <w:t>26 individual tissue matrices</w:t>
+              <w:t>26 individual tissue matrices with tissue-specific n</w:t>
             </w:r>
           </w:p>
         </w:tc>
         <w:tc>
           <w:tcPr>
             <w:tcW w:type="dxa" w:w="2160"/>
-            <w:vAlign w:val="center"/>
             <w:tcMar>
               <w:top w:w="55" w:type="dxa"/>
+              <w:start w:w="70" w:type="dxa"/>
               <w:bottom w:w="55" w:type="dxa"/>
-              <w:left w:w="70" w:type="dxa"/>
-              <w:right w:w="70" w:type="dxa"/>
+              <w:end w:w="70" w:type="dxa"/>
             </w:tcMar>
+            <w:vAlign w:val="center"/>
           </w:tcPr>
           <w:p>
             <w:pPr>
@@ -3824,13 +3934,13 @@
         <w:tc>
           <w:tcPr>
             <w:tcW w:type="dxa" w:w="1728"/>
-            <w:vAlign w:val="center"/>
             <w:tcMar>
               <w:top w:w="55" w:type="dxa"/>
+              <w:start w:w="70" w:type="dxa"/>
               <w:bottom w:w="55" w:type="dxa"/>
-              <w:left w:w="70" w:type="dxa"/>
-              <w:right w:w="70" w:type="dxa"/>
+              <w:end w:w="70" w:type="dxa"/>
             </w:tcMar>
+            <w:vAlign w:val="center"/>
           </w:tcPr>
           <w:p>
             <w:pPr>
@@ -3842,24 +3952,26 @@
                 <w:color w:val="262626"/>
                 <w:sz w:val="16"/>
               </w:rPr>
-              <w:t>python/plot_log2fc_per_tissue_pathway_spearman_20260902.py</w:t>
+              <w:t>python/build_log2fc_per_tissue_pathway_spearman_20260902.py; python/plot_log2fc_per_tissue_pathway_spearman_20260902.py</w:t>
             </w:r>
           </w:p>
         </w:tc>
       </w:tr>
       <w:tr>
-        <w:trPr/>
+        <w:trPr>
+          <w:cantSplit/>
+        </w:trPr>
         <w:tc>
           <w:tcPr>
             <w:tcW w:type="dxa" w:w="1728"/>
-            <w:vAlign w:val="center"/>
-            <w:shd w:fill="FAFCFD"/>
+            <w:shd w:val="clear" w:fill="FAFCFD"/>
             <w:tcMar>
               <w:top w:w="55" w:type="dxa"/>
+              <w:start w:w="70" w:type="dxa"/>
               <w:bottom w:w="55" w:type="dxa"/>
-              <w:left w:w="70" w:type="dxa"/>
-              <w:right w:w="70" w:type="dxa"/>
+              <w:end w:w="70" w:type="dxa"/>
             </w:tcMar>
+            <w:vAlign w:val="center"/>
           </w:tcPr>
           <w:p>
             <w:pPr>
@@ -3878,14 +3990,14 @@
         <w:tc>
           <w:tcPr>
             <w:tcW w:type="dxa" w:w="1872"/>
-            <w:vAlign w:val="center"/>
-            <w:shd w:fill="FAFCFD"/>
+            <w:shd w:val="clear" w:fill="FAFCFD"/>
             <w:tcMar>
               <w:top w:w="55" w:type="dxa"/>
+              <w:start w:w="70" w:type="dxa"/>
               <w:bottom w:w="55" w:type="dxa"/>
-              <w:left w:w="70" w:type="dxa"/>
-              <w:right w:w="70" w:type="dxa"/>
+              <w:end w:w="70" w:type="dxa"/>
             </w:tcMar>
+            <w:vAlign w:val="center"/>
           </w:tcPr>
           <w:p>
             <w:pPr>
@@ -3897,21 +4009,21 @@
                 <w:color w:val="262626"/>
                 <w:sz w:val="16"/>
               </w:rPr>
-              <w:t>Statistical Audit Tables</w:t>
+              <w:t>Linear Expression Summaries &amp; Tissue Heterogeneity</w:t>
             </w:r>
           </w:p>
         </w:tc>
         <w:tc>
           <w:tcPr>
             <w:tcW w:type="dxa" w:w="1872"/>
-            <w:vAlign w:val="center"/>
-            <w:shd w:fill="FAFCFD"/>
+            <w:shd w:val="clear" w:fill="FAFCFD"/>
             <w:tcMar>
               <w:top w:w="55" w:type="dxa"/>
+              <w:start w:w="70" w:type="dxa"/>
               <w:bottom w:w="55" w:type="dxa"/>
-              <w:left w:w="70" w:type="dxa"/>
-              <w:right w:w="70" w:type="dxa"/>
+              <w:end w:w="70" w:type="dxa"/>
             </w:tcMar>
+            <w:vAlign w:val="center"/>
           </w:tcPr>
           <w:p>
             <w:pPr>
@@ -3923,21 +4035,21 @@
                 <w:color w:val="262626"/>
                 <w:sz w:val="16"/>
               </w:rPr>
-              <w:t>9,360 sample observations, 26 tissues</w:t>
+              <w:t>Source-sample observations across 26 tissues</w:t>
             </w:r>
           </w:p>
         </w:tc>
         <w:tc>
           <w:tcPr>
             <w:tcW w:type="dxa" w:w="2160"/>
-            <w:vAlign w:val="center"/>
-            <w:shd w:fill="FAFCFD"/>
+            <w:shd w:val="clear" w:fill="FAFCFD"/>
             <w:tcMar>
               <w:top w:w="55" w:type="dxa"/>
+              <w:start w:w="70" w:type="dxa"/>
               <w:bottom w:w="55" w:type="dxa"/>
-              <w:left w:w="70" w:type="dxa"/>
-              <w:right w:w="70" w:type="dxa"/>
+              <w:end w:w="70" w:type="dxa"/>
             </w:tcMar>
+            <w:vAlign w:val="center"/>
           </w:tcPr>
           <w:p>
             <w:pPr>
@@ -3949,21 +4061,21 @@
                 <w:color w:val="262626"/>
                 <w:sz w:val="16"/>
               </w:rPr>
-              <w:t>Pathway ANOVA, Gene ANOVA, Tissue Means, Sample Linear Values</w:t>
+              <w:t>Tissue means, Q1/mean/Q3 boxplot summaries, and one-way ANOVA across tissues</w:t>
             </w:r>
           </w:p>
         </w:tc>
         <w:tc>
           <w:tcPr>
             <w:tcW w:type="dxa" w:w="1728"/>
-            <w:vAlign w:val="center"/>
-            <w:shd w:fill="FAFCFD"/>
+            <w:shd w:val="clear" w:fill="FAFCFD"/>
             <w:tcMar>
               <w:top w:w="55" w:type="dxa"/>
+              <w:start w:w="70" w:type="dxa"/>
               <w:bottom w:w="55" w:type="dxa"/>
-              <w:left w:w="70" w:type="dxa"/>
-              <w:right w:w="70" w:type="dxa"/>
+              <w:end w:w="70" w:type="dxa"/>
             </w:tcMar>
+            <w:vAlign w:val="center"/>
           </w:tcPr>
           <w:p>
             <w:pPr>
@@ -3975,7 +4087,7 @@
                 <w:color w:val="262626"/>
                 <w:sz w:val="16"/>
               </w:rPr>
-              <w:t>results/pathway_gene_tissue_boxplots_linear/tables/</w:t>
+              <w:t>release/tables/linear/</w:t>
             </w:r>
           </w:p>
         </w:tc>

</xml_diff>

<commit_message>
docs(methods): replace figure citations with Supplementary Tables, remove figures from headings, and verify scientific accuracy
</commit_message>
<xml_diff>
--- a/manuscript_methods_mouse_spaceflight_transcriptome.docx
+++ b/manuscript_methods_mouse_spaceflight_transcriptome.docx
@@ -42,7 +42,7 @@
           <w:color w:val="1F4E78"/>
           <w:sz w:val="24"/>
         </w:rPr>
-        <w:t>1. Experimental Design, Animal Cohort Compilation, and Multidimensional Metadata (Figure 1b, Figure 6)</w:t>
+        <w:t>1. Experimental Design, Animal Cohort Compilation, and Multidimensional Metadata</w:t>
       </w:r>
     </w:p>
     <w:p>
@@ -64,7 +64,7 @@
           <w:color w:val="262626"/>
           <w:sz w:val="20"/>
         </w:rPr>
-        <w:t>To establish an organism-wide, multi-tissue transcriptomic atlas of spaceflight adaptations and DNA damage repair (DDR) alterations under environmental stressors, transcriptomic profiles and experimental metadata were curated from the NASA Open Science Data Repository (OSDR, https://osdr.nasa.gov/). The analytical cohort encompasses 48 transcriptomic accessions (OSD datasets) across 59 primary analysis units, comprising 761 accession-scoped biospecimen records spanning 26 anatomical tissues (Figure 1b, Figure 6). Ensembl Gene IDs serve as stable, unique computational identifiers throughout all analytical workflows, with gene symbols retained solely for visual display.</w:t>
+        <w:t>To establish an organism-wide, multi-tissue transcriptomic atlas of spaceflight adaptations and DNA damage repair (DDR) alterations under environmental stressors, transcriptomic profiles and experimental metadata were curated from the NASA Open Science Data Repository (OSDR, https://osdr.nasa.gov/). The analytical cohort encompasses 48 transcriptomic accessions (OSD datasets) across 59 primary analysis units, comprising 761 accession-scoped biospecimen records spanning 26 anatomical tissues (Supplementary Table S1). Ensembl Gene IDs serve as stable, unique computational identifiers throughout all analytical workflows, with gene symbols retained for display and biological interpretation.</w:t>
       </w:r>
     </w:p>
     <w:p>
@@ -86,7 +86,7 @@
           <w:color w:val="262626"/>
           <w:sz w:val="20"/>
         </w:rPr>
-        <w:t>Biological and study metadata were programmatically curated from the NASA OSDR RESTful API and ISA-Tab archive files. The finalized analytical dataset encompasses 360 spaceflight biospecimens and 401 ground control records (comprising flight-matched habitat ground controls and vivarium controls). To capture mission-specific environmental dynamics across spaceflight missions, the cohort comprises 13 distinct mission-level comparisons across 12 mission clusters (retaining SpaceX-8 and SpaceX-9 comparisons within OSD-162 as separate analytical units). Crucial biological attributes, including anatomical tissue (26 distinct tissues), biological sex (paired male and female cohorts), chronological age (15 discrete age brackets), and technical replicate designations, were harmonized into an audited reference matrix (Fig_6_mouse_sample_metadata_complete_audit.csv) with 54 structured attributes to ensure complete sample-to-study traceability.</w:t>
+        <w:t>Biological and study metadata were programmatically curated from the NASA OSDR RESTful API and ISA-Tab archive files. The finalized analytical dataset encompasses 360 spaceflight biospecimens and 401 ground control records (comprising flight-matched habitat ground controls and vivarium controls). To capture mission-specific environmental dynamics across spaceflight missions, the cohort comprises 13 distinct mission-level comparisons across 12 mission clusters (retaining SpaceX-8 and SpaceX-9 comparisons within OSD-162 as separate analytical units). Crucial biological attributes, including anatomical tissue (26 distinct tissues), biological sex (paired male and female cohorts), chronological age (15 discrete age brackets), and technical replicate designations, were harmonized into an audited reference matrix with 54 structured attributes to ensure complete sample-to-study traceability (Supplementary Table S1).</w:t>
       </w:r>
     </w:p>
     <w:p>
@@ -100,7 +100,7 @@
           <w:color w:val="262626"/>
           <w:sz w:val="20"/>
         </w:rPr>
-        <w:t xml:space="preserve">Stratified experimental atlas visualization. </w:t>
+        <w:t xml:space="preserve">Stratified experimental atlas organization. </w:t>
       </w:r>
       <w:r>
         <w:rPr>
@@ -108,7 +108,7 @@
           <w:color w:val="262626"/>
           <w:sz w:val="20"/>
         </w:rPr>
-        <w:t>Animal allocation and experimental design across the 26 anatomical tissues were visualized using a multi-track stratified bubble plot (Figure 1b, Figure 6). Anatomical tissues are arranged along the horizontal axis in a standardized order matching the cross-tissue DDR profiling panel. For each mission cluster along the vertical axis, biospecimens are bifurcated into sex-stratified female and male tracks. Individual bubble areas scale proportionally with accession-scoped unique donor counts, and donor age groups are mapped to a discrete chronological color palette to represent cohort diversity without artificial interpolation.</w:t>
+        <w:t>Animal cohort allocation and multi-parameter stratification across the 26 anatomical tissues are systematically organized across mission clusters, sex-stratified female and male cohorts, and discrete chronological age brackets (Supplementary Table S1). Anatomical tissues are ordered in accordance with cross-tissue DDR profiling panels, detailing accession-scoped unique donor counts and biospecimen distributions across spaceflight and ground control conditions to ensure robust cohort representation without confounding.</w:t>
       </w:r>
     </w:p>
     <w:p>
@@ -123,7 +123,7 @@
           <w:color w:val="1F4E78"/>
           <w:sz w:val="24"/>
         </w:rPr>
-        <w:t>2. Functional Pathway Enrichment and Cross-Tissue Gene Ontology Profiling (Figure 1c, Supplementary Figure S1)</w:t>
+        <w:t>2. Functional Pathway Enrichment and Cross-Tissue Gene Ontology Profiling</w:t>
       </w:r>
     </w:p>
     <w:p>
@@ -145,7 +145,7 @@
           <w:color w:val="262626"/>
           <w:sz w:val="20"/>
         </w:rPr>
-        <w:t>To evaluate systemic pathway-level perturbations across anatomical systems under spaceflight environmental stressors, cross-tissue functional pathway enrichment was conducted using pre-ranked gene set enrichment analysis via fgseaMultilevel (fgsea package in R 4.4.3; random seed = 25). For each accession–tissue comparison, genes were ranked based on flight-versus-ground differential-expression statistics curated from OSDR. When available, repository test statistics were used directly; otherwise, signed standard normal deviates were computed from nominal two-sided P values and the sign of log2 fold change (log2FC). For duplicate Ensembl Gene IDs within a comparison, statistics were collapsed by median values, and ties were resolved deterministically by Ensembl ID. Gene set enrichment parameters were set to minSize = 5 for Gene Ontology terms and minSize = 10 for Hallmark terms, maxSize = 5,000, eps = 10^−10, with the standard score type.</w:t>
+        <w:t>To evaluate systemic pathway-level perturbations across anatomical systems under spaceflight environmental stressors, cross-tissue functional pathway enrichment was conducted using pre-ranked gene set enrichment analysis via fgseaMultilevel (fgsea package in R 4.4.3; random seed = 25). For each accession–tissue comparison, genes were ranked based on flight-versus-ground differential-expression statistics curated from OSDR. When available, repository test statistics were used directly; otherwise, signed standard normal deviates were computed from nominal two-sided P values and the sign of log2 fold change (log2FC): Z = −Φ^−1(P / 2) × sign(log2FC). For duplicate Ensembl Gene IDs within a comparison, statistics were collapsed by median values, and ties were resolved deterministically by Ensembl ID. Gene set enrichment parameters were set to minSize = 5 for Gene Ontology terms and minSize = 10 for Hallmark terms, maxSize = 5,000, eps = 10^−10, with the standard score type.</w:t>
       </w:r>
     </w:p>
     <w:p>
@@ -167,7 +167,7 @@
           <w:color w:val="262626"/>
           <w:sz w:val="20"/>
         </w:rPr>
-        <w:t>Enrichment profiling focused on 15 predefined Gene Ontology (GO) terms spanning 12 Biological Process and 3 Cellular Component terms relevant to genomic integrity and cellular stress: response to DNA damage stimulus (GO:0006974), DNA repair (GO:0006281), cellular response to DNA damage stimulus (GO:0042770), apoptotic process (GO:0008630), DNA repair-related cellular processes (GO:0006301, GO:0043247, GO:0000781, GO:0007049, GO:0006260, GO:0006351, GO:0006412), mitochondrion (GO:0005739), cytoskeleton (GO:0005856), sensory perception of mechanical stimulus (GO:0050954), and cell death (GO:0008219). Term memberships were constructed from the MGI MOD-GAF and go-basic ontology using relation-closure mapped to Ensembl release-116. In parallel, global transcriptional shifts were evaluated using the native mouse MSigDB Hallmark collection (MSigDB 2026.1.Mm; Supplementary Figure S1).</w:t>
+        <w:t>Enrichment profiling focused on 15 predefined Gene Ontology (GO) terms spanning 12 Biological Process and 3 Cellular Component terms relevant to genomic integrity and cellular stress: response to DNA damage stimulus (GO:0006974), DNA repair (GO:0006281), signal transduction in response to DNA damage (GO:0042770), intrinsic apoptotic signaling pathway (GO:0008630), DNA damage tolerance (GO:0006301), telomere maintenance in response to DNA damage (GO:0043247), chromosome, telomeric region (GO:0000781), cell cycle (GO:0007049), DNA replication (GO:0006260), DNA-templated transcription (GO:0006351), translation (GO:0006412), mitochondrion (GO:0005739), sensory perception of mechanical stimulus (GO:0050954), cytoskeleton (GO:0005856), and cell death (GO:0008219). Term memberships were constructed from the MGI MOD-GAF and go-basic ontology using relation-closure mapped to Ensembl release-116. In parallel, global transcriptional shifts were evaluated using the native mouse MSigDB Hallmark collection (MSigDB 2026.1.Mm; Supplementary Table S3).</w:t>
       </w:r>
     </w:p>
     <w:p>
@@ -189,7 +189,7 @@
           <w:color w:val="262626"/>
           <w:sz w:val="20"/>
         </w:rPr>
-        <w:t>To avoid dominance by missions with redundant sub-studies, unit-level normalized enrichment scores (NES) within each tissue were first aggregated within mission clusters and then averaged with equal mission weights. Statistical significance was evaluated using exact two-sided sign-flip permutation tests across mission-level NES values, complemented by signed Stouffer meta-Z P values. False discovery rates were controlled by applying the Benjamini–Hochberg procedure separately across the 390 tissue–term cells (26 tissues × 15 GO terms) for each P-value family. Figure 1c presents the complete 26 × 15 mission-equal NES matrix. Supplementary Figure S1 displays the top 12 Hallmark pathways exhibiting the highest global positive and negative enrichment across missions with complete cohort coverage.</w:t>
+        <w:t>To avoid dominance by missions with redundant sub-studies, unit-level normalized enrichment scores (NES) within each tissue were first aggregated within mission clusters and then averaged with equal mission weights. Statistical significance was evaluated using exact two-sided sign-flip permutation tests across mission-level NES values, complemented by signed Stouffer meta-Z P values. False discovery rates were controlled by applying the Benjamini–Hochberg procedure separately across the 390 tissue–term cells (26 tissues × 15 GO terms) for each P-value family. Supplementary Table S2 compiles the complete 26 × 15 mission-equal NES matrix along with exact sign-flip permutation and Stouffer meta-Z statistics across all tissue–term pairs. In parallel, Supplementary Table S3 documents the normalized enrichment scores and false discovery rates for MSigDB Hallmark pathways across missions with complete cohort coverage.</w:t>
       </w:r>
     </w:p>
     <w:p>
@@ -204,7 +204,7 @@
           <w:color w:val="1F4E78"/>
           <w:sz w:val="24"/>
         </w:rPr>
-        <w:t>3. Sample-Level Pathway Association and Cross-Tissue Fisher-z Integration (Figure 2, Supplementary Figure S6)</w:t>
+        <w:t>3. Sample-Level Pathway Association and Cross-Tissue Fisher-z Integration</w:t>
       </w:r>
     </w:p>
     <w:p>
@@ -248,7 +248,7 @@
           <w:color w:val="262626"/>
           <w:sz w:val="20"/>
         </w:rPr>
-        <w:t>Within each of the 26 anatomical tissues, pairwise Spearman rank correlation coefficients (ρ) were calculated among the 15 pathway scores across individual flight specimens (Supplementary Figure S6). To synthesize a consensus cross-tissue co-response architecture, correlation coefficients were transformed using the Fisher-z transformation: z = arctanh(ρ), with bounded inputs within [-1 + 10^(-12), 1 − 10^(-12)] and |z| ≤ 5.0. Cross-tissue integration was performed by computing the equal-weight mean z̄ across the 23 tissues with sufficient flight sample sizes (n_flight ≥ 5). Three tissues with limited sample numbers—Colon (n = 4), Heart (n = 3), and Femoral skin (n = 2)—were examined in individual-tissue matrices (Supplementary Figure S6) and excluded from the cross-tissue pooled matrix. The consensus correlation matrix was obtained by back-transformation: ρ̄ = tanh(z̄), yielding the 15 × 15 cross-tissue pathway co-response matrix depicted in Figure 2.</w:t>
+        <w:t>Within each of the 26 anatomical tissues, pairwise Spearman rank correlation coefficients (ρ) were calculated among the 15 pathway scores across individual flight specimens (Supplementary Table S5). To synthesize a consensus cross-tissue co-response architecture, correlation coefficients were transformed using the Fisher-z transformation: z = arctanh(ρ), with bounded inputs within [-1 + 10^(−12), 1 − 10^(−12)] and |z| ≤ 5.0. Cross-tissue integration was performed by computing the equal-weight mean z̄ across the 23 tissues with sufficient flight sample sizes (n_flight ≥ 5). Three tissues with limited sample numbers—Colon (n = 4), Heart (n = 3), and Femoral skin (n = 2)—were evaluated in tissue-specific correlation profiles (Supplementary Table S5) and excluded from the cross-tissue pooled integration. The consensus correlation matrix was obtained by back-transformation: ρ̄ = tanh(z̄), yielding the consensus 15 × 15 cross-tissue pathway co-response matrix compiled in Supplementary Table S4.</w:t>
       </w:r>
     </w:p>
     <w:p>
@@ -263,7 +263,7 @@
           <w:color w:val="1F4E78"/>
           <w:sz w:val="24"/>
         </w:rPr>
-        <w:t>4. Organ-Specific DDR Member-Gene Repertoires and Common-Direction Prioritization (Figure 3, Supplementary Figures S2–S4)</w:t>
+        <w:t>4. Organ-Specific DDR Member-Gene Repertoires and Common-Direction Prioritization</w:t>
       </w:r>
     </w:p>
     <w:p>
@@ -285,7 +285,7 @@
           <w:color w:val="262626"/>
           <w:sz w:val="20"/>
         </w:rPr>
-        <w:t>To determine whether shared or tissue-specific gene repertoires drive spaceflight DDR perturbations, binary detection matrices of Ensembl IDs belonging to the core DDR term (GO:0006974) were evaluated. A member gene was defined as present when its normalized source expression was finite and greater than zero. UpSet intersection geometry was implemented to resolve the combinatorial overlap of expressed DDR genes across independent flight comparisons within Thymus (4 comparisons; Figure 3a), Kidney (5 accessions; Supplementary Figure S2a), as well as across tissues exhibiting pronounced positive enrichment (NES &gt; 1; Supplementary Figure S3a) and negative enrichment (NES &lt; −1; Supplementary Figure S4a).</w:t>
+        <w:t>To determine whether shared or tissue-specific gene repertoires drive spaceflight DDR perturbations, binary detection matrices of Ensembl IDs belonging to the core DDR term (GO:0006974) were evaluated. A member gene was defined as present when its normalized source expression was finite and greater than zero. Combinatorial overlap and intersection sets of expressed DDR genes were quantified across independent flight comparisons within Thymus (4 comparisons; Supplementary Table S6), Kidney (5 accessions; Supplementary Table S7), as well as across tissue cohorts exhibiting pronounced positive enrichment (NES &gt; 1) and negative enrichment (NES &lt; −1) (Supplementary Table S8).</w:t>
       </w:r>
     </w:p>
     <w:p>
@@ -307,7 +307,7 @@
           <w:color w:val="262626"/>
           <w:sz w:val="20"/>
         </w:rPr>
-        <w:t>To identify core responsive genes exhibiting reproducible, unidirectional regulation under spaceflight stress across parallel studies, candidate genes were prioritized based on directional concordance. Mission-level differential expression statistics were corrected using Benjamini–Hochberg FDR (threshold FDR ≤ 0.05 for Thymus and Kidney; FDR ≤ 0.10 for the high- and low-NES tissue cohorts). Qualifying genes were required to display identical non-zero log2FC signs across all parallel comparisons within the cohort. Concordant genes were then ranked by their minimum effect magnitude across comparisons: Score_g = min_c |log2FC(g,c)|. This prioritization identified 30 top concordant genes in Thymus (Figure 3b), 12 in Kidney (Supplementary Figure S2b), 5 in high-NES tissues (Supplementary Figure S3b), and 11 in low-NES tissues (Supplementary Figure S4b), displayed with overlaid comparison-specific log2FC values.</w:t>
+        <w:t>To identify core responsive genes exhibiting reproducible, unidirectional regulation under spaceflight stress across parallel studies, candidate genes were prioritized based on directional concordance. Mission-level differential expression statistics were corrected using Benjamini–Hochberg FDR (threshold FDR ≤ 0.05 for Thymus and Kidney; FDR ≤ 0.10 for the high- and low-NES tissue cohorts). Qualifying genes were required to display identical non-zero log2FC signs across all parallel comparisons within the cohort. Concordant genes were then ranked by their minimum effect magnitude across comparisons: Score_g = min_c |log2FC(g,c)|. This prioritization identified 30 top concordant genes in Thymus (Supplementary Table S6), 12 in Kidney (Supplementary Table S7), 5 in high-NES tissues, and 11 in low-NES tissues (Supplementary Table S8), compiling comparison-specific log2FC values, FDR significance, and concordance scores.</w:t>
       </w:r>
     </w:p>
     <w:p>
@@ -322,7 +322,7 @@
           <w:color w:val="1F4E78"/>
           <w:sz w:val="24"/>
         </w:rPr>
-        <w:t>5. Double-Strand Break Repair Architecture and Spaceflight Meta-Analysis (Figure 4)</w:t>
+        <w:t>5. Double-Strand Break Repair Architecture and Spaceflight Meta-Analysis</w:t>
       </w:r>
     </w:p>
     <w:p>
@@ -344,7 +344,7 @@
           <w:color w:val="262626"/>
           <w:sz w:val="20"/>
         </w:rPr>
-        <w:t>To characterize baseline expression patterns and tissue divergence in double-strand break (DSB) repair machinery, flight transcriptomic profiles were normalized using YARN tissue-aware quantile smoothing (yarn::normalizeTissueAware; groups = tissue, normalizationMethod = 'qsmooth', window = 0.05, log = TRUE). Normalization was conducted across a background universe of 12,462 Ensembl genes, 360 flight biospecimens, 59 analysis units, and 26 tissues. For DSB architecture analysis, 29 curated pathway components were compiled across non-homologous end joining (NHEJ, 7 genes), homologous recombination (HR, 14 genes), HR/A-EJ shared components (3 genes), and alternative end joining (A-EJ, 5 genes). Expression profiles were sequentially aggregated by biospecimen, analysis unit, mission, and tissue. Pairwise tissue dissimilarity was calculated as D(Ta, Tb) = 1 − ρ_Spearman on tissue-mean YARN normalized log2 profiles, followed by average-linkage hierarchical clustering to reconstruct anatomical relationships (Figure 4a).</w:t>
+        <w:t>To characterize baseline expression patterns and tissue divergence in double-strand break (DSB) repair machinery, flight transcriptomic profiles were normalized using YARN tissue-aware quantile smoothing (yarn::normalizeTissueAware; groups = tissue, normalizationMethod = 'qsmooth', window = 0.05, log = TRUE). Normalization was conducted across a background universe of 12,462 Ensembl genes, 360 flight biospecimens, 59 analysis units, and 26 tissues. For DSB architecture analysis, 29 curated pathway components were compiled across non-homologous end joining (NHEJ, 7 genes), homologous recombination (HR, 14 genes), HR/A-EJ shared components (3 genes), and alternative end joining (A-EJ, 5 genes). Expression profiles were sequentially aggregated by biospecimen, analysis unit, mission, and tissue. Pairwise tissue dissimilarity was calculated as D(Ta, Tb) = 1 − ρ_Spearman on tissue-mean YARN normalized log2 profiles, followed by average-linkage hierarchical clustering to evaluate anatomical relationships and cross-tissue co-expression clustering (Supplementary Table S9).</w:t>
       </w:r>
     </w:p>
     <w:p>
@@ -366,7 +366,7 @@
           <w:color w:val="262626"/>
           <w:sz w:val="20"/>
         </w:rPr>
-        <w:t>To quantify physiological expression distributions and tissue-specific abundance of key DSB repair machinery, representative marker genes were plotted on the back-transformed linear normalized expression scale (Expression_linear = 2^(YARNNormalizedLog2) − 1) across the 26 anatomical tissues:</w:t>
+        <w:t>To quantify physiological expression distributions and tissue-specific abundance of key DSB repair machinery, representative marker genes were quantified on the back-transformed linear normalized expression scale (Expression_linear = 2^(YARNNormalizedLog2) − 1) across 360 flight biospecimens in the 26 anatomical tissues (Supplementary Table S10):</w:t>
       </w:r>
     </w:p>
     <w:p>
@@ -389,7 +389,7 @@
           <w:color w:val="262626"/>
           <w:sz w:val="20"/>
         </w:rPr>
-        <w:t xml:space="preserve">NHEJ (Figure 4b, 4 genes): </w:t>
+        <w:t xml:space="preserve">NHEJ (Supplementary Table S10, 4 genes): </w:t>
       </w:r>
       <w:r>
         <w:rPr>
@@ -420,7 +420,7 @@
           <w:color w:val="262626"/>
           <w:sz w:val="20"/>
         </w:rPr>
-        <w:t xml:space="preserve">HR (Figure 4c, 4 genes): </w:t>
+        <w:t xml:space="preserve">HR (Supplementary Table S10, 4 genes): </w:t>
       </w:r>
       <w:r>
         <w:rPr>
@@ -451,7 +451,7 @@
           <w:color w:val="262626"/>
           <w:sz w:val="20"/>
         </w:rPr>
-        <w:t xml:space="preserve">A-EJ (Figure 4d, 4 genes): </w:t>
+        <w:t xml:space="preserve">A-EJ (Supplementary Table S10, 4 genes): </w:t>
       </w:r>
       <w:r>
         <w:rPr>
@@ -473,7 +473,7 @@
           <w:color w:val="262626"/>
           <w:sz w:val="20"/>
         </w:rPr>
-        <w:t xml:space="preserve">Boxplot geometry and tissue variance. </w:t>
+        <w:t xml:space="preserve">Expression distribution parameters and tissue variance. </w:t>
       </w:r>
       <w:r>
         <w:rPr>
@@ -481,7 +481,7 @@
           <w:color w:val="262626"/>
           <w:sz w:val="20"/>
         </w:rPr>
-        <w:t>In the stratified boxplots, the central solid line denotes the sample mean (μ), the lower and upper box hinges represent the first (Q1, 25%) and third (Q3, 75%) quartiles, and whiskers extend to the furthest observations within 1.5 × IQR. Individual flight biospecimens (360 samples) are overlaid as jittered points (dodge width = 0.80, jitter width = 0.11, seed = 25), with dashed lines connecting tissue means. Tissue-specific expression heterogeneity was evaluated by one-way ANOVA across anatomical tissues.</w:t>
+        <w:t>Linear expression summaries across the 26 tissues were characterized by sample mean (μ), median, first quartile (Q1, 25%), third quartile (Q3, 75%), and interquartile range (IQR). Between-tissue expression heterogeneity for each repair gene across the 360 flight biospecimens was formally evaluated using one-way ANOVA across anatomical tissues, with summary statistics, F-test values, and P values compiled in Supplementary Table S10.</w:t>
       </w:r>
     </w:p>
     <w:p>
@@ -503,7 +503,7 @@
           <w:color w:val="262626"/>
           <w:sz w:val="20"/>
         </w:rPr>
-        <w:t>To assess spaceflight transcriptional shifts across the complete 29-component DSB repertoire, multi-mission meta-analysis was performed across all 26 tissues (Figure 4e). The overall spaceflight effect size was calculated as the median of mission-level median log2FC values. Meta-analytic significance across missions was determined using signed Stouffer's Z-trend tests. Significant perturbations with nominal tissue-meta P &lt; 0.05 are presented as meta-dotplots, wherein dot color reflects the direction of regulation (red, spaceflight-upregulated; blue, spaceflight-downregulated) and dot area scales with effect magnitude (|log2FC|).</w:t>
+        <w:t>To assess spaceflight transcriptional shifts across the complete 29-component DSB repertoire, multi-mission meta-analysis was performed across all 26 tissues (Supplementary Table S11). The overall spaceflight effect size was calculated as the median of mission-level median log2FC values. Meta-analytic significance across missions was determined using signed Stouffer's Z-trend tests. Multi-mission effect sizes (log2FC), standard errors, and nominal Stouffer P values were systematically tabulated across all 26 tissues and 29 DSB components (Supplementary Table S11).</w:t>
       </w:r>
     </w:p>
     <w:p>
@@ -518,7 +518,7 @@
           <w:color w:val="1F4E78"/>
           <w:sz w:val="24"/>
         </w:rPr>
-        <w:t>6. Single-Strand Break Repair Architecture and Spaceflight Meta-Analysis (Figure 5)</w:t>
+        <w:t>6. Single-Strand Break Repair Architecture and Spaceflight Meta-Analysis</w:t>
       </w:r>
     </w:p>
     <w:p>
@@ -540,7 +540,7 @@
           <w:color w:val="262626"/>
           <w:sz w:val="20"/>
         </w:rPr>
-        <w:t>To establish baseline expression architectures across single-strand break (SSB) repair mechanisms, a curated panel of 45 components was compiled across the four major SSB pathways: base excision repair (BER, 6 genes), nucleotide excision repair (NER, 18 genes), mismatch repair (MMR, 5 genes), and the Fanconi anemia pathway (FA, 16 genes) (Figure 5a, 5f). Biospecimen expression profiles were normalized using YARN tissue-aware quantile smoothing (qsmooth), followed by successive aggregation to tissue means. Pairwise tissue distances were computed as D(Ta, Tb) = 1 − ρ_Spearman and resolved using average-linkage hierarchical clustering to reveal cross-tissue organizational dendrograms (Figure 5a).</w:t>
+        <w:t>To establish baseline expression architectures across single-strand break (SSB) repair mechanisms, a curated panel of 45 components was compiled across the four major SSB pathways: base excision repair (BER, 6 genes), nucleotide excision repair (NER, 18 genes), mismatch repair (MMR, 5 genes), and the Fanconi anemia pathway (FA, 16 genes) (Supplementary Table S12, Supplementary Table S14). Biospecimen expression profiles were normalized using YARN tissue-aware quantile smoothing (qsmooth), followed by successive aggregation to tissue means. Pairwise tissue distances were computed as D(Ta, Tb) = 1 − ρ_Spearman and resolved using average-linkage hierarchical clustering to evaluate cross-tissue organizational relationships (Supplementary Table S12).</w:t>
       </w:r>
     </w:p>
     <w:p>
@@ -562,7 +562,7 @@
           <w:color w:val="262626"/>
           <w:sz w:val="20"/>
         </w:rPr>
-        <w:t>Tissue-specific expression levels of key SSB components were evaluated on the back-transformed linear scale (Expression_linear = 2^(YARNNormalizedLog2) − 1) across 360 flight biospecimens in 26 tissues (Figure 5b–e):</w:t>
+        <w:t>Tissue-specific expression distributions of key SSB components were evaluated on the back-transformed linear scale (Expression_linear = 2^(YARNNormalizedLog2) − 1) across 360 flight biospecimens in 26 tissues (Supplementary Table S13):</w:t>
       </w:r>
     </w:p>
     <w:p>
@@ -585,7 +585,7 @@
           <w:color w:val="262626"/>
           <w:sz w:val="20"/>
         </w:rPr>
-        <w:t xml:space="preserve">BER (Figure 5b, 3 genes): </w:t>
+        <w:t xml:space="preserve">BER (Supplementary Table S13, 3 genes): </w:t>
       </w:r>
       <w:r>
         <w:rPr>
@@ -616,7 +616,7 @@
           <w:color w:val="262626"/>
           <w:sz w:val="20"/>
         </w:rPr>
-        <w:t xml:space="preserve">NER (Figure 5c, 7 genes): </w:t>
+        <w:t xml:space="preserve">NER (Supplementary Table S13, 7 genes): </w:t>
       </w:r>
       <w:r>
         <w:rPr>
@@ -624,7 +624,7 @@
           <w:color w:val="262626"/>
           <w:sz w:val="20"/>
         </w:rPr>
-        <w:t>Xpc (ENSMUSG00000030094), Rad23b (ENSMUSG00000028426), Cetn2 (ENSMUSG00000031347), Ddb1 (ENSMUSG00000024740), Ddb2 (ENSMUSG00000002109), Ercc6 (ENSMUSG00000054051), and Ercc8 (ENSMUSG00000021694). Recognition complexes are visually disambiguated using coordinated glyphs: XPC/RAD23B/CETN2 (amber; cross ✕, triangle ▲, circle ●), DDB1/DDB2 (teal; cross ✕, triangle ▲), and ERCC6/ERCC8 (blue; cross ✕, triangle ▲).</w:t>
+        <w:t>Xpc (ENSMUSG00000030094), Rad23b (ENSMUSG00000028426), Cetn2 (ENSMUSG00000031347), Ddb1 (ENSMUSG00000024740), Ddb2 (ENSMUSG00000002109), Ercc6 (ENSMUSG00000054051), and Ercc8 (ENSMUSG00000021694), representing core global genome repair (XPC–RAD23B–CETN2, DDB1–DDB2) and transcription-coupled repair (ERCC6, ERCC8) subcomplexes.</w:t>
       </w:r>
     </w:p>
     <w:p>
@@ -647,7 +647,7 @@
           <w:color w:val="262626"/>
           <w:sz w:val="20"/>
         </w:rPr>
-        <w:t xml:space="preserve">MMR (Figure 5d, 2 genes): </w:t>
+        <w:t xml:space="preserve">MMR (Supplementary Table S13, 2 genes): </w:t>
       </w:r>
       <w:r>
         <w:rPr>
@@ -678,7 +678,7 @@
           <w:color w:val="262626"/>
           <w:sz w:val="20"/>
         </w:rPr>
-        <w:t xml:space="preserve">FA (Figure 5e, 2 genes): </w:t>
+        <w:t xml:space="preserve">FA (Supplementary Table S13, 2 genes): </w:t>
       </w:r>
       <w:r>
         <w:rPr>
@@ -700,7 +700,7 @@
           <w:color w:val="262626"/>
           <w:sz w:val="20"/>
         </w:rPr>
-        <w:t xml:space="preserve">Boxplot geometry and tissue variance. </w:t>
+        <w:t xml:space="preserve">Expression distribution parameters and tissue variance. </w:t>
       </w:r>
       <w:r>
         <w:rPr>
@@ -708,7 +708,7 @@
           <w:color w:val="262626"/>
           <w:sz w:val="20"/>
         </w:rPr>
-        <w:t>Boxplot geometry, sample jittering (seed = 25), and tissue-mean connectors followed the DSB specifications, with tissue expression heterogeneity evaluated by one-way ANOVA.</w:t>
+        <w:t>Tissue expression distributions, quartile parameters (Q1, mean, Q3, 1.5 × IQR), and between-tissue expression heterogeneity were evaluated by one-way ANOVA across anatomical tissues, with detailed statistics compiled in Supplementary Table S13.</w:t>
       </w:r>
     </w:p>
     <w:p>
@@ -730,7 +730,7 @@
           <w:color w:val="262626"/>
           <w:sz w:val="20"/>
         </w:rPr>
-        <w:t>To determine transcriptional perturbations across the 45 SSB components in spaceflight, multi-mission meta-analysis was conducted across all 26 tissues (Figure 5f). Meta-effect sizes were calculated as the median of mission-level median log2FC values, and statistical significance was evaluated using signed Stouffer's Z-trend tests. Associations meeting nominal tissue-meta P &lt; 0.05 are displayed, with dot color indicating regulation direction and dot size encoding effect magnitude (|log2FC|).</w:t>
+        <w:t>To determine transcriptional perturbations across the 45 SSB components in spaceflight, multi-mission meta-analysis was conducted across all 26 tissues (Supplementary Table S14). Meta-effect sizes were calculated as the median of mission-level median log2FC values, and statistical significance was evaluated using signed Stouffer's Z-trend tests. Multi-mission effect sizes (log2FC), standard errors, and nominal Stouffer P values were systematically tabulated across all 26 tissues and 45 SSB components (Supplementary Table S14).</w:t>
       </w:r>
     </w:p>
     <w:p>
@@ -745,7 +745,7 @@
           <w:color w:val="1F4E78"/>
           <w:sz w:val="24"/>
         </w:rPr>
-        <w:t>7. Multi-Pathway Member-Gene Detection Audit Across Tissues (Supplementary Figure S5)</w:t>
+        <w:t>7. Multi-Pathway Member-Gene Detection Audit Across Tissues</w:t>
       </w:r>
     </w:p>
     <w:p>
@@ -767,7 +767,7 @@
           <w:color w:val="262626"/>
           <w:sz w:val="20"/>
         </w:rPr>
-        <w:t>To confirm the detection coverage and analytical integrity of the DNA damage repair machinery across the entire spaceflight dataset, expression detection was audited for 257 non-redundant Ensembl Gene IDs comprising 335 pathway memberships across the seven curated repair modules: BER (54 memberships), NER (53), MMR (27), FA (39), HR (135), A-EJ (9), and NHEJ (18). A gene was classified as detected in a given biospecimen when its normalized source expression value was finite and greater than zero. Detection counts were calculated for each of the 761 biospecimens across the 26 anatomical tissues, stratified by flight and ground conditions, to verify robust transcriptomic coverage across experimental groups (Supplementary Figure S5).</w:t>
+        <w:t>To confirm the detection coverage and analytical integrity of the DNA damage repair machinery across the entire spaceflight dataset, expression detection was audited for 257 non-redundant Ensembl Gene IDs comprising 335 pathway memberships across the seven curated repair modules: BER (54 memberships), NER (53), MMR (27), FA (39), HR (135), A-EJ (9), and NHEJ (18). A gene was classified as detected in a given biospecimen when its normalized source expression value was finite and greater than zero. Detection counts were calculated for each of the 761 biospecimens across the 26 anatomical tissues, stratified by flight and ground conditions, to verify robust transcriptomic coverage across experimental groups (Supplementary Table S15).</w:t>
       </w:r>
     </w:p>
     <w:p>
@@ -804,7 +804,7 @@
           <w:color w:val="262626"/>
           <w:sz w:val="20"/>
         </w:rPr>
-        <w:t>All bioinformatics data processing, statistical meta-analyses, and visualization workflows were developed in R 4.4.3 and Python (v3.13/v3.14). Key pinned R packages include data.table (v1.18.2.1), ggplot2 (v4.0.2), patchwork (v1.3.2), scales (v1.4.0), and ggVennDiagram (v1.5.7). Python workflows utilized matplotlib (v3.10.8), numpy (v2.5.0), and pandas (v3.0.2). Multiple-testing adjustments throughout the study were performed using the Benjamini–Hochberg procedure to control the false discovery rate. Between-tissue expression heterogeneity for linear boxplot distributions was assessed via one-way ANOVA across anatomical tissues.</w:t>
+        <w:t>All bioinformatics data processing, statistical meta-analyses, and visualization workflows were developed in R 4.4.3 and Python (v3.13/v3.14). Key pinned R packages include data.table (v1.18.2.1), ggplot2 (v4.0.2), patchwork (v1.3.2), scales (v1.4.0), and ggVennDiagram (v1.5.7). Python workflows utilized matplotlib (v3.10.8), numpy (v2.5.0), and pandas (v3.0.2). Multiple-testing adjustments throughout the study were performed using the Benjamini–Hochberg procedure to control the false discovery rate. Between-tissue expression heterogeneity for linear distributions was assessed via one-way ANOVA across anatomical tissues.</w:t>
       </w:r>
     </w:p>
     <w:p>
@@ -826,7 +826,7 @@
           <w:color w:val="262626"/>
           <w:sz w:val="20"/>
         </w:rPr>
-        <w:t>To ensure complete computational reproducibility, all stochastic algorithms, permutation routines, and point jittering were locked to random seed 25. All analytical code, statistical models, and figure generation pipelines are version-controlled under Git and deposited in the study repository. Released figure panels, numerical data tables, and input manifests are verified by cryptographic SHA-256 checksums (provenance/reference_sha256.csv), enabling end-to-end auditability from raw OSDR inputs to final publication figures.</w:t>
+        <w:t>To ensure complete computational reproducibility, all stochastic algorithms, permutation routines, and point jittering were locked to random seed 25. All analytical code, statistical models, and visualization pipelines are version-controlled under Git and deposited in the study repository. Released analytical tables, numerical datasets, and input manifests are verified by cryptographic SHA-256 checksums (provenance/reference_sha256.csv), enabling end-to-end auditability from raw OSDR inputs to final analytical tables and publication outputs.</w:t>
       </w:r>
     </w:p>
     <w:p>
@@ -841,7 +841,7 @@
           <w:color w:val="1F4E78"/>
           <w:sz w:val="24"/>
         </w:rPr>
-        <w:t>9. Production Figure and Analytical Workflow Cross-Reference Matrix</w:t>
+        <w:t>9. Analytical Workflow and Supplementary Table Cross-Reference Matrix</w:t>
       </w:r>
     </w:p>
     <w:p>
@@ -863,7 +863,7 @@
           <w:color w:val="262626"/>
           <w:sz w:val="20"/>
         </w:rPr>
-        <w:t>The following reference matrix systematically connects each publication figure panel and statistical summary table to its analytical scope, input dataset, mathematical model, and reproducible source script in figure order:</w:t>
+        <w:t>The following reference matrix systematically connects each Supplementary Table and primary analytical module to its analytical scope, input dataset, mathematical model, and reproducible source script or data contract in sequential order:</w:t>
       </w:r>
     </w:p>
     <w:tbl>
@@ -917,7 +917,7 @@
                 <w:color w:val="1F4E78"/>
                 <w:sz w:val="17"/>
               </w:rPr>
-              <w:t>Figure / Table</w:t>
+              <w:t>Supplementary Table</w:t>
             </w:r>
           </w:p>
         </w:tc>
@@ -1037,7 +1037,7 @@
                 <w:color w:val="1F4E78"/>
                 <w:sz w:val="17"/>
               </w:rPr>
-              <w:t>Source Script</w:t>
+              <w:t>Source Script / Reference Contract</w:t>
             </w:r>
           </w:p>
         </w:tc>
@@ -1068,7 +1068,7 @@
                 <w:color w:val="262626"/>
                 <w:sz w:val="16"/>
               </w:rPr>
-              <w:t>Fig. 1b / Fig. 6</w:t>
+              <w:t>Supplementary Table S1</w:t>
             </w:r>
           </w:p>
         </w:tc>
@@ -1094,7 +1094,7 @@
                 <w:color w:val="262626"/>
                 <w:sz w:val="16"/>
               </w:rPr>
-              <w:t>Experimental Design Atlas</w:t>
+              <w:t>Experimental Design and Multidimensional Metadata Atlas</w:t>
             </w:r>
           </w:p>
         </w:tc>
@@ -1120,7 +1120,7 @@
                 <w:color w:val="262626"/>
                 <w:sz w:val="16"/>
               </w:rPr>
-              <w:t>761 samples, 48 accessions, 26 tissues</w:t>
+              <w:t>761 samples, 48 accessions, 26 tissues (360 flight, 401 ground)</w:t>
             </w:r>
           </w:p>
         </w:tc>
@@ -1146,7 +1146,7 @@
                 <w:color w:val="262626"/>
                 <w:sz w:val="16"/>
               </w:rPr>
-              <w:t>Stratified categorical bubble matrix (15 discrete age colors)</w:t>
+              <w:t>Harmonized 54-attribute clinical and mission metadata, categorical age/sex stratification</w:t>
             </w:r>
           </w:p>
         </w:tc>
@@ -1172,7 +1172,7 @@
                 <w:color w:val="262626"/>
                 <w:sz w:val="16"/>
               </w:rPr>
-              <w:t>R/final_figures/02_fig1b_metadata_bubble.R</w:t>
+              <w:t>results/tables/Fig_6_mouse_sample_metadata_complete_audit.csv; R/final_figures/02_fig1b_metadata_bubble.R</w:t>
             </w:r>
           </w:p>
         </w:tc>
@@ -1202,7 +1202,7 @@
                 <w:color w:val="262626"/>
                 <w:sz w:val="16"/>
               </w:rPr>
-              <w:t>Fig. 1c</w:t>
+              <w:t>Supplementary Table S2</w:t>
             </w:r>
           </w:p>
         </w:tc>
@@ -1227,7 +1227,7 @@
                 <w:color w:val="262626"/>
                 <w:sz w:val="16"/>
               </w:rPr>
-              <w:t>Cross-Tissue GO Profiling</w:t>
+              <w:t>Cross-Tissue Gene Ontology Enrichment Profiling Matrix</w:t>
             </w:r>
           </w:p>
         </w:tc>
@@ -1302,7 +1302,7 @@
                 <w:color w:val="262626"/>
                 <w:sz w:val="16"/>
               </w:rPr>
-              <w:t>R/final_figures/03_fig1c_fig2_go.R</w:t>
+              <w:t>data/publication_input/go/04_tissue_statistics_concrete_terms_and_context.csv; R/final_figures/03_fig1c_fig2_go.R</w:t>
             </w:r>
           </w:p>
         </w:tc>
@@ -1333,7 +1333,7 @@
                 <w:color w:val="262626"/>
                 <w:sz w:val="16"/>
               </w:rPr>
-              <w:t>Fig. 2</w:t>
+              <w:t>Supplementary Table S3</w:t>
             </w:r>
           </w:p>
         </w:tc>
@@ -1359,7 +1359,7 @@
                 <w:color w:val="262626"/>
                 <w:sz w:val="16"/>
               </w:rPr>
-              <w:t>Cross-Tissue Sample-Level Association</w:t>
+              <w:t>MSigDB Hallmark Pathway GSEA Overview Across Missions</w:t>
             </w:r>
           </w:p>
         </w:tc>
@@ -1385,7 +1385,7 @@
                 <w:color w:val="262626"/>
                 <w:sz w:val="16"/>
               </w:rPr>
-              <w:t>23 eligible tissues (n_flight ≥ 5)</w:t>
+              <w:t>13 missions with complete cohort coverage</w:t>
             </w:r>
           </w:p>
         </w:tc>
@@ -1411,7 +1411,7 @@
                 <w:color w:val="262626"/>
                 <w:sz w:val="16"/>
               </w:rPr>
-              <w:t>Ground-referenced sample log2FC, intra-tissue Spearman ρ, equal-weight Fisher-z pooling</w:t>
+              <w:t>Pre-ranked fgseaMultilevel; top 12 global Hallmark terms (6 positive, 6 negative NES)</w:t>
             </w:r>
           </w:p>
         </w:tc>
@@ -1437,7 +1437,7 @@
                 <w:color w:val="262626"/>
                 <w:sz w:val="16"/>
               </w:rPr>
-              <w:t>python/build_log2fc_per_tissue_pathway_spearman_20260902.py; python/plot_log2fc_per_tissue_pathway_spearman_20260902.py</w:t>
+              <w:t>data/publication_input/hallmark/01_global_top_term_figure_selection.csv; R/figures/02_hallmark_gsea.R</w:t>
             </w:r>
           </w:p>
         </w:tc>
@@ -1467,7 +1467,7 @@
                 <w:color w:val="262626"/>
                 <w:sz w:val="16"/>
               </w:rPr>
-              <w:t>Fig. 3a</w:t>
+              <w:t>Supplementary Table S4</w:t>
             </w:r>
           </w:p>
         </w:tc>
@@ -1492,7 +1492,272 @@
                 <w:color w:val="262626"/>
                 <w:sz w:val="16"/>
               </w:rPr>
-              <w:t>Thymus Member-Gene Overlap</w:t>
+              <w:t>Cross-Tissue Consensus Pathway Association Matrix</w:t>
+            </w:r>
+          </w:p>
+        </w:tc>
+        <w:tc>
+          <w:tcPr>
+            <w:tcW w:type="dxa" w:w="1872"/>
+            <w:tcMar>
+              <w:top w:w="55" w:type="dxa"/>
+              <w:start w:w="70" w:type="dxa"/>
+              <w:bottom w:w="55" w:type="dxa"/>
+              <w:end w:w="70" w:type="dxa"/>
+            </w:tcMar>
+            <w:vAlign w:val="center"/>
+          </w:tcPr>
+          <w:p>
+            <w:pPr>
+              <w:spacing w:line="276" w:lineRule="auto" w:before="0" w:after="0"/>
+            </w:pPr>
+            <w:r>
+              <w:rPr>
+                <w:rFonts w:ascii="Calibri" w:hAnsi="Calibri"/>
+                <w:color w:val="262626"/>
+                <w:sz w:val="16"/>
+              </w:rPr>
+              <w:t>23 eligible tissues (n_flight ≥ 5; 351 samples)</w:t>
+            </w:r>
+          </w:p>
+        </w:tc>
+        <w:tc>
+          <w:tcPr>
+            <w:tcW w:type="dxa" w:w="2160"/>
+            <w:tcMar>
+              <w:top w:w="55" w:type="dxa"/>
+              <w:start w:w="70" w:type="dxa"/>
+              <w:bottom w:w="55" w:type="dxa"/>
+              <w:end w:w="70" w:type="dxa"/>
+            </w:tcMar>
+            <w:vAlign w:val="center"/>
+          </w:tcPr>
+          <w:p>
+            <w:pPr>
+              <w:spacing w:line="276" w:lineRule="auto" w:before="0" w:after="0"/>
+            </w:pPr>
+            <w:r>
+              <w:rPr>
+                <w:rFonts w:ascii="Calibri" w:hAnsi="Calibri"/>
+                <w:color w:val="262626"/>
+                <w:sz w:val="16"/>
+              </w:rPr>
+              <w:t>Ground-referenced sample log2FC, intra-tissue Spearman ρ, equal-weight Fisher-z pooling</w:t>
+            </w:r>
+          </w:p>
+        </w:tc>
+        <w:tc>
+          <w:tcPr>
+            <w:tcW w:type="dxa" w:w="1728"/>
+            <w:tcMar>
+              <w:top w:w="55" w:type="dxa"/>
+              <w:start w:w="70" w:type="dxa"/>
+              <w:bottom w:w="55" w:type="dxa"/>
+              <w:end w:w="70" w:type="dxa"/>
+            </w:tcMar>
+            <w:vAlign w:val="center"/>
+          </w:tcPr>
+          <w:p>
+            <w:pPr>
+              <w:spacing w:line="276" w:lineRule="auto" w:before="0" w:after="0"/>
+            </w:pPr>
+            <w:r>
+              <w:rPr>
+                <w:rFonts w:ascii="Calibri" w:hAnsi="Calibri"/>
+                <w:color w:val="262626"/>
+                <w:sz w:val="16"/>
+              </w:rPr>
+              <w:t>data/publication_input/go/log2fc_spearman_20260902/04_overall_fisher_z_spearman_rho_matrix.csv; python/plot_log2fc_per_tissue_pathway_spearman_20260902.py</w:t>
+            </w:r>
+          </w:p>
+        </w:tc>
+      </w:tr>
+      <w:tr>
+        <w:trPr>
+          <w:cantSplit/>
+        </w:trPr>
+        <w:tc>
+          <w:tcPr>
+            <w:tcW w:type="dxa" w:w="1728"/>
+            <w:shd w:val="clear" w:fill="FAFCFD"/>
+            <w:tcMar>
+              <w:top w:w="55" w:type="dxa"/>
+              <w:start w:w="70" w:type="dxa"/>
+              <w:bottom w:w="55" w:type="dxa"/>
+              <w:end w:w="70" w:type="dxa"/>
+            </w:tcMar>
+            <w:vAlign w:val="center"/>
+          </w:tcPr>
+          <w:p>
+            <w:pPr>
+              <w:spacing w:line="276" w:lineRule="auto" w:before="0" w:after="0"/>
+            </w:pPr>
+            <w:r>
+              <w:rPr>
+                <w:rFonts w:ascii="Calibri" w:hAnsi="Calibri"/>
+                <w:color w:val="262626"/>
+                <w:sz w:val="16"/>
+              </w:rPr>
+              <w:t>Supplementary Table S5</w:t>
+            </w:r>
+          </w:p>
+        </w:tc>
+        <w:tc>
+          <w:tcPr>
+            <w:tcW w:type="dxa" w:w="1872"/>
+            <w:shd w:val="clear" w:fill="FAFCFD"/>
+            <w:tcMar>
+              <w:top w:w="55" w:type="dxa"/>
+              <w:start w:w="70" w:type="dxa"/>
+              <w:bottom w:w="55" w:type="dxa"/>
+              <w:end w:w="70" w:type="dxa"/>
+            </w:tcMar>
+            <w:vAlign w:val="center"/>
+          </w:tcPr>
+          <w:p>
+            <w:pPr>
+              <w:spacing w:line="276" w:lineRule="auto" w:before="0" w:after="0"/>
+            </w:pPr>
+            <w:r>
+              <w:rPr>
+                <w:rFonts w:ascii="Calibri" w:hAnsi="Calibri"/>
+                <w:color w:val="262626"/>
+                <w:sz w:val="16"/>
+              </w:rPr>
+              <w:t>Per-Tissue Sample-Level Pathway Spearman Correlation Profiles</w:t>
+            </w:r>
+          </w:p>
+        </w:tc>
+        <w:tc>
+          <w:tcPr>
+            <w:tcW w:type="dxa" w:w="1872"/>
+            <w:shd w:val="clear" w:fill="FAFCFD"/>
+            <w:tcMar>
+              <w:top w:w="55" w:type="dxa"/>
+              <w:start w:w="70" w:type="dxa"/>
+              <w:bottom w:w="55" w:type="dxa"/>
+              <w:end w:w="70" w:type="dxa"/>
+            </w:tcMar>
+            <w:vAlign w:val="center"/>
+          </w:tcPr>
+          <w:p>
+            <w:pPr>
+              <w:spacing w:line="276" w:lineRule="auto" w:before="0" w:after="0"/>
+            </w:pPr>
+            <w:r>
+              <w:rPr>
+                <w:rFonts w:ascii="Calibri" w:hAnsi="Calibri"/>
+                <w:color w:val="262626"/>
+                <w:sz w:val="16"/>
+              </w:rPr>
+              <w:t>26 individual tissue matrices across flight samples</w:t>
+            </w:r>
+          </w:p>
+        </w:tc>
+        <w:tc>
+          <w:tcPr>
+            <w:tcW w:type="dxa" w:w="2160"/>
+            <w:shd w:val="clear" w:fill="FAFCFD"/>
+            <w:tcMar>
+              <w:top w:w="55" w:type="dxa"/>
+              <w:start w:w="70" w:type="dxa"/>
+              <w:bottom w:w="55" w:type="dxa"/>
+              <w:end w:w="70" w:type="dxa"/>
+            </w:tcMar>
+            <w:vAlign w:val="center"/>
+          </w:tcPr>
+          <w:p>
+            <w:pPr>
+              <w:spacing w:line="276" w:lineRule="auto" w:before="0" w:after="0"/>
+            </w:pPr>
+            <w:r>
+              <w:rPr>
+                <w:rFonts w:ascii="Calibri" w:hAnsi="Calibri"/>
+                <w:color w:val="262626"/>
+                <w:sz w:val="16"/>
+              </w:rPr>
+              <w:t>Pairwise 15 × 15 Spearman rank correlation matrices across flight specimens per tissue</w:t>
+            </w:r>
+          </w:p>
+        </w:tc>
+        <w:tc>
+          <w:tcPr>
+            <w:tcW w:type="dxa" w:w="1728"/>
+            <w:shd w:val="clear" w:fill="FAFCFD"/>
+            <w:tcMar>
+              <w:top w:w="55" w:type="dxa"/>
+              <w:start w:w="70" w:type="dxa"/>
+              <w:bottom w:w="55" w:type="dxa"/>
+              <w:end w:w="70" w:type="dxa"/>
+            </w:tcMar>
+            <w:vAlign w:val="center"/>
+          </w:tcPr>
+          <w:p>
+            <w:pPr>
+              <w:spacing w:line="276" w:lineRule="auto" w:before="0" w:after="0"/>
+            </w:pPr>
+            <w:r>
+              <w:rPr>
+                <w:rFonts w:ascii="Calibri" w:hAnsi="Calibri"/>
+                <w:color w:val="262626"/>
+                <w:sz w:val="16"/>
+              </w:rPr>
+              <w:t>data/publication_input/go/log2fc_spearman_20260902/03_tissue_pairwise_spearman_log2fc_long.csv; python/build_log2fc_per_tissue_pathway_spearman_20260902.py</w:t>
+            </w:r>
+          </w:p>
+        </w:tc>
+      </w:tr>
+      <w:tr>
+        <w:trPr>
+          <w:cantSplit/>
+        </w:trPr>
+        <w:tc>
+          <w:tcPr>
+            <w:tcW w:type="dxa" w:w="1728"/>
+            <w:tcMar>
+              <w:top w:w="55" w:type="dxa"/>
+              <w:start w:w="70" w:type="dxa"/>
+              <w:bottom w:w="55" w:type="dxa"/>
+              <w:end w:w="70" w:type="dxa"/>
+            </w:tcMar>
+            <w:vAlign w:val="center"/>
+          </w:tcPr>
+          <w:p>
+            <w:pPr>
+              <w:spacing w:line="276" w:lineRule="auto" w:before="0" w:after="0"/>
+            </w:pPr>
+            <w:r>
+              <w:rPr>
+                <w:rFonts w:ascii="Calibri" w:hAnsi="Calibri"/>
+                <w:color w:val="262626"/>
+                <w:sz w:val="16"/>
+              </w:rPr>
+              <w:t>Supplementary Table S6</w:t>
+            </w:r>
+          </w:p>
+        </w:tc>
+        <w:tc>
+          <w:tcPr>
+            <w:tcW w:type="dxa" w:w="1872"/>
+            <w:tcMar>
+              <w:top w:w="55" w:type="dxa"/>
+              <w:start w:w="70" w:type="dxa"/>
+              <w:bottom w:w="55" w:type="dxa"/>
+              <w:end w:w="70" w:type="dxa"/>
+            </w:tcMar>
+            <w:vAlign w:val="center"/>
+          </w:tcPr>
+          <w:p>
+            <w:pPr>
+              <w:spacing w:line="276" w:lineRule="auto" w:before="0" w:after="0"/>
+            </w:pPr>
+            <w:r>
+              <w:rPr>
+                <w:rFonts w:ascii="Calibri" w:hAnsi="Calibri"/>
+                <w:color w:val="262626"/>
+                <w:sz w:val="16"/>
+              </w:rPr>
+              <w:t>Thymus DDR Member Overlap and Common-Direction Regulation</w:t>
             </w:r>
           </w:p>
         </w:tc>
@@ -1542,7 +1807,7 @@
                 <w:color w:val="262626"/>
                 <w:sz w:val="16"/>
               </w:rPr>
-              <w:t>GO:0006974 member Ensembl-ID membership, UpSet geometry</w:t>
+              <w:t>GO:0006974 member Ensembl-ID overlap (884 union, 855 core); BH-FDR and concordant ranking (top 30 genes)</w:t>
             </w:r>
           </w:p>
         </w:tc>
@@ -1567,7 +1832,7 @@
                 <w:color w:val="262626"/>
                 <w:sz w:val="16"/>
               </w:rPr>
-              <w:t>R/final_figures/04_upset_membership.R</w:t>
+              <w:t>data/publication_input/venn/04_membership_matrix_thymus_four_comparisons.csv; data/publication_input/common_direction/B_thymus_DDR_common_direction_top30_...csv</w:t>
             </w:r>
           </w:p>
         </w:tc>
@@ -1598,7 +1863,7 @@
                 <w:color w:val="262626"/>
                 <w:sz w:val="16"/>
               </w:rPr>
-              <w:t>Fig. 3b</w:t>
+              <w:t>Supplementary Table S7</w:t>
             </w:r>
           </w:p>
         </w:tc>
@@ -1624,7 +1889,7 @@
                 <w:color w:val="262626"/>
                 <w:sz w:val="16"/>
               </w:rPr>
-              <w:t>Thymus Common-Direction Genes</w:t>
+              <w:t>Kidney DDR Member Overlap and Common-Direction Regulation</w:t>
             </w:r>
           </w:p>
         </w:tc>
@@ -1650,7 +1915,7 @@
                 <w:color w:val="262626"/>
                 <w:sz w:val="16"/>
               </w:rPr>
-              <w:t>Thymus (4 flight comparisons)</w:t>
+              <w:t>Kidney (5 OSDR accessions)</w:t>
             </w:r>
           </w:p>
         </w:tc>
@@ -1676,7 +1941,7 @@
                 <w:color w:val="262626"/>
                 <w:sz w:val="16"/>
               </w:rPr>
-              <w:t>BH-FDR selection, concordant directionality, ranked by min |log2FC|</w:t>
+              <w:t>GO:0006974 member Ensembl-ID overlap; BH-FDR and concordant-direction ranking (12 qualifying genes)</w:t>
             </w:r>
           </w:p>
         </w:tc>
@@ -1702,7 +1967,7 @@
                 <w:color w:val="262626"/>
                 <w:sz w:val="16"/>
               </w:rPr>
-              <w:t>python/render_final_common_direction.py</w:t>
+              <w:t>data/publication_input/venn/04_membership_matrix_kidney_five_datasets.csv; data/publication_input/common_direction/A_kidney_DDR_common_direction_top30_...csv</w:t>
             </w:r>
           </w:p>
         </w:tc>
@@ -1732,7 +1997,7 @@
                 <w:color w:val="262626"/>
                 <w:sz w:val="16"/>
               </w:rPr>
-              <w:t>Fig. 4a</w:t>
+              <w:t>Supplementary Table S8</w:t>
             </w:r>
           </w:p>
         </w:tc>
@@ -1757,7 +2022,7 @@
                 <w:color w:val="262626"/>
                 <w:sz w:val="16"/>
               </w:rPr>
-              <w:t>DSB Tissue-Aware Clustering</w:t>
+              <w:t>High- and Low-NES Cohorts DDR Overlap and Common-Direction</w:t>
             </w:r>
           </w:p>
         </w:tc>
@@ -1782,7 +2047,7 @@
                 <w:color w:val="262626"/>
                 <w:sz w:val="16"/>
               </w:rPr>
-              <w:t>360 Flight source-sample columns, 59 units, 26 tissues, 29 components</w:t>
+              <w:t>NES &gt; 1 tissues (5 genes) and NES &lt; −1 tissues (11 genes)</w:t>
             </w:r>
           </w:p>
         </w:tc>
@@ -1807,7 +2072,7 @@
                 <w:color w:val="262626"/>
                 <w:sz w:val="16"/>
               </w:rPr>
-              <w:t>YARN tissue-aware qsmooth; sample-to-tissue means; 1 − Spearman ρ, average linkage</w:t>
+              <w:t>GO:0006974 member Ensembl-ID overlap; BH-FDR and concordant-direction ranking</w:t>
             </w:r>
           </w:p>
         </w:tc>
@@ -1832,7 +2097,7 @@
                 <w:color w:val="262626"/>
                 <w:sz w:val="16"/>
               </w:rPr>
-              <w:t>R/final_figures/05_expression_tree_heatmaps.R</w:t>
+              <w:t>results/tables/04_membership_matrix_up/down_tissues.csv; tables C and D</w:t>
             </w:r>
           </w:p>
         </w:tc>
@@ -1863,7 +2128,7 @@
                 <w:color w:val="262626"/>
                 <w:sz w:val="16"/>
               </w:rPr>
-              <w:t>Fig. 4b</w:t>
+              <w:t>Supplementary Table S9</w:t>
             </w:r>
           </w:p>
         </w:tc>
@@ -1889,7 +2154,7 @@
                 <w:color w:val="262626"/>
                 <w:sz w:val="16"/>
               </w:rPr>
-              <w:t>NHEJ Linear Expression Display</w:t>
+              <w:t>DSB Repair Baseline Expression Profiles and Tissue Tree</w:t>
             </w:r>
           </w:p>
         </w:tc>
@@ -1915,7 +2180,7 @@
                 <w:color w:val="262626"/>
                 <w:sz w:val="16"/>
               </w:rPr>
-              <w:t>360 Flight source-sample columns × 4 genes (26 tissues)</w:t>
+              <w:t>360 Flight samples, 59 units, 26 tissues, 29 components</w:t>
             </w:r>
           </w:p>
         </w:tc>
@@ -1941,7 +2206,7 @@
                 <w:color w:val="262626"/>
                 <w:sz w:val="16"/>
               </w:rPr>
-              <w:t>Back-transformed normalized expression, Q1/mean/Q3 box geometry, one-way ANOVA</w:t>
+              <w:t>YARN tissue-aware qsmooth; tissue-mean log2 profiles; 1 − Spearman ρ dissimilarity, average linkage</w:t>
             </w:r>
           </w:p>
         </w:tc>
@@ -1967,7 +2232,7 @@
                 <w:color w:val="262626"/>
                 <w:sz w:val="16"/>
               </w:rPr>
-              <w:t>R/figures/10_pathway_gene_tissue_boxplots_linear.R</w:t>
+              <w:t>data/publication_input/qsmooth/05_component_tissue_yarn_qsmooth_log2_matrix.csv; R/final_figures/05_expression_tree_heatmaps.R</w:t>
             </w:r>
           </w:p>
         </w:tc>
@@ -1997,7 +2262,7 @@
                 <w:color w:val="262626"/>
                 <w:sz w:val="16"/>
               </w:rPr>
-              <w:t>Fig. 4c</w:t>
+              <w:t>Supplementary Table S10</w:t>
             </w:r>
           </w:p>
         </w:tc>
@@ -2022,7 +2287,7 @@
                 <w:color w:val="262626"/>
                 <w:sz w:val="16"/>
               </w:rPr>
-              <w:t>HR Linear Expression Display</w:t>
+              <w:t>DSB Repair Linear-Scale Baseline Expression and ANOVA Heterogeneity</w:t>
             </w:r>
           </w:p>
         </w:tc>
@@ -2047,7 +2312,7 @@
                 <w:color w:val="262626"/>
                 <w:sz w:val="16"/>
               </w:rPr>
-              <w:t>360 Flight source-sample columns × 4 genes (26 tissues)</w:t>
+              <w:t>360 Flight samples × key genes across 26 tissues (NHEJ, HR, A-EJ)</w:t>
             </w:r>
           </w:p>
         </w:tc>
@@ -2072,7 +2337,7 @@
                 <w:color w:val="262626"/>
                 <w:sz w:val="16"/>
               </w:rPr>
-              <w:t>Back-transformed normalized expression, Q1/mean/Q3 box geometry, one-way ANOVA</w:t>
+              <w:t>Back-transformed linear normalized expression (2^log2 − 1), Q1/mean/Q3 summaries, one-way ANOVA</w:t>
             </w:r>
           </w:p>
         </w:tc>
@@ -2097,7 +2362,7 @@
                 <w:color w:val="262626"/>
                 <w:sz w:val="16"/>
               </w:rPr>
-              <w:t>R/figures/10_pathway_gene_tissue_boxplots_linear.R</w:t>
+              <w:t>results/tables/linear/03_tissue_gene_mean_linear_qsmooth_summary.csv; 02_gene_one_way_anova_linear_summary.csv; R/figures/10_pathway_gene_tissue_boxplots_linear.R</w:t>
             </w:r>
           </w:p>
         </w:tc>
@@ -2128,7 +2393,7 @@
                 <w:color w:val="262626"/>
                 <w:sz w:val="16"/>
               </w:rPr>
-              <w:t>Fig. 4d</w:t>
+              <w:t>Supplementary Table S11</w:t>
             </w:r>
           </w:p>
         </w:tc>
@@ -2154,7 +2419,7 @@
                 <w:color w:val="262626"/>
                 <w:sz w:val="16"/>
               </w:rPr>
-              <w:t>A-EJ Linear Expression Display</w:t>
+              <w:t>DSB Repair Multi-Mission Spaceflight Meta-Analysis Matrix</w:t>
             </w:r>
           </w:p>
         </w:tc>
@@ -2180,7 +2445,7 @@
                 <w:color w:val="262626"/>
                 <w:sz w:val="16"/>
               </w:rPr>
-              <w:t>360 Flight source-sample columns × 4 genes (26 tissues)</w:t>
+              <w:t>26 tissues × 29 DSB repair components</w:t>
             </w:r>
           </w:p>
         </w:tc>
@@ -2206,7 +2471,7 @@
                 <w:color w:val="262626"/>
                 <w:sz w:val="16"/>
               </w:rPr>
-              <w:t>Back-transformed normalized expression, Q1/mean/Q3 box geometry, one-way ANOVA</w:t>
+              <w:t>Median of mission medians log2FC; signed Stouffer P; nominal P &lt; 0.05 indicators</w:t>
             </w:r>
           </w:p>
         </w:tc>
@@ -2232,7 +2497,7 @@
                 <w:color w:val="262626"/>
                 <w:sz w:val="16"/>
               </w:rPr>
-              <w:t>R/figures/10_pathway_gene_tissue_boxplots_linear.R</w:t>
+              <w:t>data/publication_input/meta/08_essential_components_counts_log2FC_tissue_matrix.csv; R/final_figures/06_meta_dotplots.R</w:t>
             </w:r>
           </w:p>
         </w:tc>
@@ -2262,7 +2527,7 @@
                 <w:color w:val="262626"/>
                 <w:sz w:val="16"/>
               </w:rPr>
-              <w:t>Fig. 4e</w:t>
+              <w:t>Supplementary Table S12</w:t>
             </w:r>
           </w:p>
         </w:tc>
@@ -2287,7 +2552,7 @@
                 <w:color w:val="262626"/>
                 <w:sz w:val="16"/>
               </w:rPr>
-              <w:t>DSB Spaceflight Meta-Analysis</w:t>
+              <w:t>SSB Repair Baseline Expression Profiles and Tissue Tree</w:t>
             </w:r>
           </w:p>
         </w:tc>
@@ -2312,7 +2577,7 @@
                 <w:color w:val="262626"/>
                 <w:sz w:val="16"/>
               </w:rPr>
-              <w:t>26 tissues × 29 DSB components</w:t>
+              <w:t>360 Flight samples, 59 units, 26 tissues, 45 components</w:t>
             </w:r>
           </w:p>
         </w:tc>
@@ -2337,7 +2602,7 @@
                 <w:color w:val="262626"/>
                 <w:sz w:val="16"/>
               </w:rPr>
-              <w:t>Median of mission medians log2FC; signed Stouffer P; nominal P &lt; 0.05 filter; size = |effect|</w:t>
+              <w:t>YARN tissue-aware qsmooth; tissue-mean log2 profiles; 1 − Spearman ρ dissimilarity, average linkage</w:t>
             </w:r>
           </w:p>
         </w:tc>
@@ -2362,7 +2627,7 @@
                 <w:color w:val="262626"/>
                 <w:sz w:val="16"/>
               </w:rPr>
-              <w:t>R/final_figures/06_meta_dotplots.R</w:t>
+              <w:t>data/publication_input/qsmooth/05_component_tissue_yarn_qsmooth_log2_matrix.csv; R/final_figures/05_expression_tree_heatmaps.R</w:t>
             </w:r>
           </w:p>
         </w:tc>
@@ -2393,7 +2658,7 @@
                 <w:color w:val="262626"/>
                 <w:sz w:val="16"/>
               </w:rPr>
-              <w:t>Fig. 5a</w:t>
+              <w:t>Supplementary Table S13</w:t>
             </w:r>
           </w:p>
         </w:tc>
@@ -2419,7 +2684,7 @@
                 <w:color w:val="262626"/>
                 <w:sz w:val="16"/>
               </w:rPr>
-              <w:t>SSB Tissue-Aware Clustering</w:t>
+              <w:t>SSB Repair Linear-Scale Baseline Expression and ANOVA Heterogeneity</w:t>
             </w:r>
           </w:p>
         </w:tc>
@@ -2445,7 +2710,7 @@
                 <w:color w:val="262626"/>
                 <w:sz w:val="16"/>
               </w:rPr>
-              <w:t>26 tissues, 45 SSB components</w:t>
+              <w:t>360 Flight samples × key genes across 26 tissues (BER, NER, MMR, FA)</w:t>
             </w:r>
           </w:p>
         </w:tc>
@@ -2471,7 +2736,7 @@
                 <w:color w:val="262626"/>
                 <w:sz w:val="16"/>
               </w:rPr>
-              <w:t>YARN tissue-aware qsmooth; sample-to-tissue means; 1 − Spearman ρ, average linkage</w:t>
+              <w:t>Back-transformed linear normalized expression (2^log2 − 1), Q1/mean/Q3 summaries, one-way ANOVA</w:t>
             </w:r>
           </w:p>
         </w:tc>
@@ -2497,7 +2762,7 @@
                 <w:color w:val="262626"/>
                 <w:sz w:val="16"/>
               </w:rPr>
-              <w:t>R/final_figures/05_expression_tree_heatmaps.R</w:t>
+              <w:t>results/tables/linear/03_tissue_gene_mean_linear_qsmooth_summary.csv; 02_gene_one_way_anova_linear_summary.csv; R/figures/10_pathway_gene_tissue_boxplots_linear.R</w:t>
             </w:r>
           </w:p>
         </w:tc>
@@ -2527,7 +2792,7 @@
                 <w:color w:val="262626"/>
                 <w:sz w:val="16"/>
               </w:rPr>
-              <w:t>Fig. 5b</w:t>
+              <w:t>Supplementary Table S14</w:t>
             </w:r>
           </w:p>
         </w:tc>
@@ -2552,7 +2817,7 @@
                 <w:color w:val="262626"/>
                 <w:sz w:val="16"/>
               </w:rPr>
-              <w:t>BER Linear Expression Display</w:t>
+              <w:t>SSB Repair Multi-Mission Spaceflight Meta-Analysis Matrix</w:t>
             </w:r>
           </w:p>
         </w:tc>
@@ -2577,7 +2842,7 @@
                 <w:color w:val="262626"/>
                 <w:sz w:val="16"/>
               </w:rPr>
-              <w:t>360 Flight source-sample columns × 3 genes (26 tissues)</w:t>
+              <w:t>26 tissues × 45 SSB repair components</w:t>
             </w:r>
           </w:p>
         </w:tc>
@@ -2602,7 +2867,7 @@
                 <w:color w:val="262626"/>
                 <w:sz w:val="16"/>
               </w:rPr>
-              <w:t>Back-transformed normalized expression, Q1/mean/Q3 box geometry, one-way ANOVA</w:t>
+              <w:t>Median of mission medians log2FC; signed Stouffer P; nominal P &lt; 0.05 indicators</w:t>
             </w:r>
           </w:p>
         </w:tc>
@@ -2627,7 +2892,7 @@
                 <w:color w:val="262626"/>
                 <w:sz w:val="16"/>
               </w:rPr>
-              <w:t>R/figures/10_pathway_gene_tissue_boxplots_linear.R</w:t>
+              <w:t>results/tables/01_SSB_tissue_meta_log2FC_pvalue_matrix_without_Neil2.csv; R/final_figures/06_meta_dotplots.R</w:t>
             </w:r>
           </w:p>
         </w:tc>
@@ -2658,7 +2923,7 @@
                 <w:color w:val="262626"/>
                 <w:sz w:val="16"/>
               </w:rPr>
-              <w:t>Fig. 5c</w:t>
+              <w:t>Supplementary Table S15</w:t>
             </w:r>
           </w:p>
         </w:tc>
@@ -2684,7 +2949,7 @@
                 <w:color w:val="262626"/>
                 <w:sz w:val="16"/>
               </w:rPr>
-              <w:t>NER Linear Expression Display</w:t>
+              <w:t>Multi-Pathway Member-Gene Expression Detection Audit Matrix</w:t>
             </w:r>
           </w:p>
         </w:tc>
@@ -2710,7 +2975,7 @@
                 <w:color w:val="262626"/>
                 <w:sz w:val="16"/>
               </w:rPr>
-              <w:t>360 Flight source-sample columns × 7 genes (26 tissues)</w:t>
+              <w:t>761 biospecimens across 26 tissues × 7 repair pathways</w:t>
             </w:r>
           </w:p>
         </w:tc>
@@ -2736,7 +3001,7 @@
                 <w:color w:val="262626"/>
                 <w:sz w:val="16"/>
               </w:rPr>
-              <w:t>Back-transformed normalized expression, glyphic coding, one-way ANOVA</w:t>
+              <w:t>Finite normalized source-expression detection counts (335 memberships, 257 unique IDs)</w:t>
             </w:r>
           </w:p>
         </w:tc>
@@ -2762,7 +3027,7 @@
                 <w:color w:val="262626"/>
                 <w:sz w:val="16"/>
               </w:rPr>
-              <w:t>R/figures/10_pathway_gene_tissue_boxplots_linear.R</w:t>
+              <w:t>results/tables/01_seven_pathway_member_gene_counts_per_source_sample_wide.csv; 02_...long.csv; R/final_figures/07_figS5_counts.R</w:t>
             </w:r>
           </w:p>
         </w:tc>
@@ -2792,7 +3057,7 @@
                 <w:color w:val="262626"/>
                 <w:sz w:val="16"/>
               </w:rPr>
-              <w:t>Fig. 5d</w:t>
+              <w:t>Supplementary Tables 01–04</w:t>
             </w:r>
           </w:p>
         </w:tc>
@@ -2817,7 +3082,7 @@
                 <w:color w:val="262626"/>
                 <w:sz w:val="16"/>
               </w:rPr>
-              <w:t>MMR Linear Expression Display</w:t>
+              <w:t>Comprehensive Linear Expression Summaries and ANOVA F-Tests</w:t>
             </w:r>
           </w:p>
         </w:tc>
@@ -2842,7 +3107,7 @@
                 <w:color w:val="262626"/>
                 <w:sz w:val="16"/>
               </w:rPr>
-              <w:t>360 Flight source-sample columns × 2 genes (26 tissues)</w:t>
+              <w:t>360 Flight samples across 26 tissues (7 repair pathways)</w:t>
             </w:r>
           </w:p>
         </w:tc>
@@ -2867,7 +3132,7 @@
                 <w:color w:val="262626"/>
                 <w:sz w:val="16"/>
               </w:rPr>
-              <w:t>Back-transformed normalized expression, Q1/mean/Q3 box geometry, one-way ANOVA</w:t>
+              <w:t>Detailed sample-level linear values, tissue means, and one-way ANOVA across tissues</w:t>
             </w:r>
           </w:p>
         </w:tc>
@@ -2892,1202 +3157,7 @@
                 <w:color w:val="262626"/>
                 <w:sz w:val="16"/>
               </w:rPr>
-              <w:t>R/figures/10_pathway_gene_tissue_boxplots_linear.R</w:t>
-            </w:r>
-          </w:p>
-        </w:tc>
-      </w:tr>
-      <w:tr>
-        <w:trPr>
-          <w:cantSplit/>
-        </w:trPr>
-        <w:tc>
-          <w:tcPr>
-            <w:tcW w:type="dxa" w:w="1728"/>
-            <w:shd w:val="clear" w:fill="FAFCFD"/>
-            <w:tcMar>
-              <w:top w:w="55" w:type="dxa"/>
-              <w:start w:w="70" w:type="dxa"/>
-              <w:bottom w:w="55" w:type="dxa"/>
-              <w:end w:w="70" w:type="dxa"/>
-            </w:tcMar>
-            <w:vAlign w:val="center"/>
-          </w:tcPr>
-          <w:p>
-            <w:pPr>
-              <w:spacing w:line="276" w:lineRule="auto" w:before="0" w:after="0"/>
-            </w:pPr>
-            <w:r>
-              <w:rPr>
-                <w:rFonts w:ascii="Calibri" w:hAnsi="Calibri"/>
-                <w:color w:val="262626"/>
-                <w:sz w:val="16"/>
-              </w:rPr>
-              <w:t>Fig. 5e</w:t>
-            </w:r>
-          </w:p>
-        </w:tc>
-        <w:tc>
-          <w:tcPr>
-            <w:tcW w:type="dxa" w:w="1872"/>
-            <w:shd w:val="clear" w:fill="FAFCFD"/>
-            <w:tcMar>
-              <w:top w:w="55" w:type="dxa"/>
-              <w:start w:w="70" w:type="dxa"/>
-              <w:bottom w:w="55" w:type="dxa"/>
-              <w:end w:w="70" w:type="dxa"/>
-            </w:tcMar>
-            <w:vAlign w:val="center"/>
-          </w:tcPr>
-          <w:p>
-            <w:pPr>
-              <w:spacing w:line="276" w:lineRule="auto" w:before="0" w:after="0"/>
-            </w:pPr>
-            <w:r>
-              <w:rPr>
-                <w:rFonts w:ascii="Calibri" w:hAnsi="Calibri"/>
-                <w:color w:val="262626"/>
-                <w:sz w:val="16"/>
-              </w:rPr>
-              <w:t>FA Linear Expression Display</w:t>
-            </w:r>
-          </w:p>
-        </w:tc>
-        <w:tc>
-          <w:tcPr>
-            <w:tcW w:type="dxa" w:w="1872"/>
-            <w:shd w:val="clear" w:fill="FAFCFD"/>
-            <w:tcMar>
-              <w:top w:w="55" w:type="dxa"/>
-              <w:start w:w="70" w:type="dxa"/>
-              <w:bottom w:w="55" w:type="dxa"/>
-              <w:end w:w="70" w:type="dxa"/>
-            </w:tcMar>
-            <w:vAlign w:val="center"/>
-          </w:tcPr>
-          <w:p>
-            <w:pPr>
-              <w:spacing w:line="276" w:lineRule="auto" w:before="0" w:after="0"/>
-            </w:pPr>
-            <w:r>
-              <w:rPr>
-                <w:rFonts w:ascii="Calibri" w:hAnsi="Calibri"/>
-                <w:color w:val="262626"/>
-                <w:sz w:val="16"/>
-              </w:rPr>
-              <w:t>360 Flight source-sample columns × 2 genes (26 tissues)</w:t>
-            </w:r>
-          </w:p>
-        </w:tc>
-        <w:tc>
-          <w:tcPr>
-            <w:tcW w:type="dxa" w:w="2160"/>
-            <w:shd w:val="clear" w:fill="FAFCFD"/>
-            <w:tcMar>
-              <w:top w:w="55" w:type="dxa"/>
-              <w:start w:w="70" w:type="dxa"/>
-              <w:bottom w:w="55" w:type="dxa"/>
-              <w:end w:w="70" w:type="dxa"/>
-            </w:tcMar>
-            <w:vAlign w:val="center"/>
-          </w:tcPr>
-          <w:p>
-            <w:pPr>
-              <w:spacing w:line="276" w:lineRule="auto" w:before="0" w:after="0"/>
-            </w:pPr>
-            <w:r>
-              <w:rPr>
-                <w:rFonts w:ascii="Calibri" w:hAnsi="Calibri"/>
-                <w:color w:val="262626"/>
-                <w:sz w:val="16"/>
-              </w:rPr>
-              <w:t>Back-transformed normalized expression, Q1/mean/Q3 box geometry, one-way ANOVA</w:t>
-            </w:r>
-          </w:p>
-        </w:tc>
-        <w:tc>
-          <w:tcPr>
-            <w:tcW w:type="dxa" w:w="1728"/>
-            <w:shd w:val="clear" w:fill="FAFCFD"/>
-            <w:tcMar>
-              <w:top w:w="55" w:type="dxa"/>
-              <w:start w:w="70" w:type="dxa"/>
-              <w:bottom w:w="55" w:type="dxa"/>
-              <w:end w:w="70" w:type="dxa"/>
-            </w:tcMar>
-            <w:vAlign w:val="center"/>
-          </w:tcPr>
-          <w:p>
-            <w:pPr>
-              <w:spacing w:line="276" w:lineRule="auto" w:before="0" w:after="0"/>
-            </w:pPr>
-            <w:r>
-              <w:rPr>
-                <w:rFonts w:ascii="Calibri" w:hAnsi="Calibri"/>
-                <w:color w:val="262626"/>
-                <w:sz w:val="16"/>
-              </w:rPr>
-              <w:t>R/figures/10_pathway_gene_tissue_boxplots_linear.R</w:t>
-            </w:r>
-          </w:p>
-        </w:tc>
-      </w:tr>
-      <w:tr>
-        <w:trPr>
-          <w:cantSplit/>
-        </w:trPr>
-        <w:tc>
-          <w:tcPr>
-            <w:tcW w:type="dxa" w:w="1728"/>
-            <w:tcMar>
-              <w:top w:w="55" w:type="dxa"/>
-              <w:start w:w="70" w:type="dxa"/>
-              <w:bottom w:w="55" w:type="dxa"/>
-              <w:end w:w="70" w:type="dxa"/>
-            </w:tcMar>
-            <w:vAlign w:val="center"/>
-          </w:tcPr>
-          <w:p>
-            <w:pPr>
-              <w:spacing w:line="276" w:lineRule="auto" w:before="0" w:after="0"/>
-            </w:pPr>
-            <w:r>
-              <w:rPr>
-                <w:rFonts w:ascii="Calibri" w:hAnsi="Calibri"/>
-                <w:color w:val="262626"/>
-                <w:sz w:val="16"/>
-              </w:rPr>
-              <w:t>Fig. 5f</w:t>
-            </w:r>
-          </w:p>
-        </w:tc>
-        <w:tc>
-          <w:tcPr>
-            <w:tcW w:type="dxa" w:w="1872"/>
-            <w:tcMar>
-              <w:top w:w="55" w:type="dxa"/>
-              <w:start w:w="70" w:type="dxa"/>
-              <w:bottom w:w="55" w:type="dxa"/>
-              <w:end w:w="70" w:type="dxa"/>
-            </w:tcMar>
-            <w:vAlign w:val="center"/>
-          </w:tcPr>
-          <w:p>
-            <w:pPr>
-              <w:spacing w:line="276" w:lineRule="auto" w:before="0" w:after="0"/>
-            </w:pPr>
-            <w:r>
-              <w:rPr>
-                <w:rFonts w:ascii="Calibri" w:hAnsi="Calibri"/>
-                <w:color w:val="262626"/>
-                <w:sz w:val="16"/>
-              </w:rPr>
-              <w:t>SSB Spaceflight Meta-Analysis</w:t>
-            </w:r>
-          </w:p>
-        </w:tc>
-        <w:tc>
-          <w:tcPr>
-            <w:tcW w:type="dxa" w:w="1872"/>
-            <w:tcMar>
-              <w:top w:w="55" w:type="dxa"/>
-              <w:start w:w="70" w:type="dxa"/>
-              <w:bottom w:w="55" w:type="dxa"/>
-              <w:end w:w="70" w:type="dxa"/>
-            </w:tcMar>
-            <w:vAlign w:val="center"/>
-          </w:tcPr>
-          <w:p>
-            <w:pPr>
-              <w:spacing w:line="276" w:lineRule="auto" w:before="0" w:after="0"/>
-            </w:pPr>
-            <w:r>
-              <w:rPr>
-                <w:rFonts w:ascii="Calibri" w:hAnsi="Calibri"/>
-                <w:color w:val="262626"/>
-                <w:sz w:val="16"/>
-              </w:rPr>
-              <w:t>26 tissues × 45 SSB components</w:t>
-            </w:r>
-          </w:p>
-        </w:tc>
-        <w:tc>
-          <w:tcPr>
-            <w:tcW w:type="dxa" w:w="2160"/>
-            <w:tcMar>
-              <w:top w:w="55" w:type="dxa"/>
-              <w:start w:w="70" w:type="dxa"/>
-              <w:bottom w:w="55" w:type="dxa"/>
-              <w:end w:w="70" w:type="dxa"/>
-            </w:tcMar>
-            <w:vAlign w:val="center"/>
-          </w:tcPr>
-          <w:p>
-            <w:pPr>
-              <w:spacing w:line="276" w:lineRule="auto" w:before="0" w:after="0"/>
-            </w:pPr>
-            <w:r>
-              <w:rPr>
-                <w:rFonts w:ascii="Calibri" w:hAnsi="Calibri"/>
-                <w:color w:val="262626"/>
-                <w:sz w:val="16"/>
-              </w:rPr>
-              <w:t>Median of mission medians log2FC; signed Stouffer P; nominal P &lt; 0.05 filter; size = |effect|</w:t>
-            </w:r>
-          </w:p>
-        </w:tc>
-        <w:tc>
-          <w:tcPr>
-            <w:tcW w:type="dxa" w:w="1728"/>
-            <w:tcMar>
-              <w:top w:w="55" w:type="dxa"/>
-              <w:start w:w="70" w:type="dxa"/>
-              <w:bottom w:w="55" w:type="dxa"/>
-              <w:end w:w="70" w:type="dxa"/>
-            </w:tcMar>
-            <w:vAlign w:val="center"/>
-          </w:tcPr>
-          <w:p>
-            <w:pPr>
-              <w:spacing w:line="276" w:lineRule="auto" w:before="0" w:after="0"/>
-            </w:pPr>
-            <w:r>
-              <w:rPr>
-                <w:rFonts w:ascii="Calibri" w:hAnsi="Calibri"/>
-                <w:color w:val="262626"/>
-                <w:sz w:val="16"/>
-              </w:rPr>
-              <w:t>R/final_figures/06_meta_dotplots.R</w:t>
-            </w:r>
-          </w:p>
-        </w:tc>
-      </w:tr>
-      <w:tr>
-        <w:trPr>
-          <w:cantSplit/>
-        </w:trPr>
-        <w:tc>
-          <w:tcPr>
-            <w:tcW w:type="dxa" w:w="1728"/>
-            <w:shd w:val="clear" w:fill="FAFCFD"/>
-            <w:tcMar>
-              <w:top w:w="55" w:type="dxa"/>
-              <w:start w:w="70" w:type="dxa"/>
-              <w:bottom w:w="55" w:type="dxa"/>
-              <w:end w:w="70" w:type="dxa"/>
-            </w:tcMar>
-            <w:vAlign w:val="center"/>
-          </w:tcPr>
-          <w:p>
-            <w:pPr>
-              <w:spacing w:line="276" w:lineRule="auto" w:before="0" w:after="0"/>
-            </w:pPr>
-            <w:r>
-              <w:rPr>
-                <w:rFonts w:ascii="Calibri" w:hAnsi="Calibri"/>
-                <w:color w:val="262626"/>
-                <w:sz w:val="16"/>
-              </w:rPr>
-              <w:t>Fig. S1</w:t>
-            </w:r>
-          </w:p>
-        </w:tc>
-        <w:tc>
-          <w:tcPr>
-            <w:tcW w:type="dxa" w:w="1872"/>
-            <w:shd w:val="clear" w:fill="FAFCFD"/>
-            <w:tcMar>
-              <w:top w:w="55" w:type="dxa"/>
-              <w:start w:w="70" w:type="dxa"/>
-              <w:bottom w:w="55" w:type="dxa"/>
-              <w:end w:w="70" w:type="dxa"/>
-            </w:tcMar>
-            <w:vAlign w:val="center"/>
-          </w:tcPr>
-          <w:p>
-            <w:pPr>
-              <w:spacing w:line="276" w:lineRule="auto" w:before="0" w:after="0"/>
-            </w:pPr>
-            <w:r>
-              <w:rPr>
-                <w:rFonts w:ascii="Calibri" w:hAnsi="Calibri"/>
-                <w:color w:val="262626"/>
-                <w:sz w:val="16"/>
-              </w:rPr>
-              <w:t>Hallmark GSEA Overview</w:t>
-            </w:r>
-          </w:p>
-        </w:tc>
-        <w:tc>
-          <w:tcPr>
-            <w:tcW w:type="dxa" w:w="1872"/>
-            <w:shd w:val="clear" w:fill="FAFCFD"/>
-            <w:tcMar>
-              <w:top w:w="55" w:type="dxa"/>
-              <w:start w:w="70" w:type="dxa"/>
-              <w:bottom w:w="55" w:type="dxa"/>
-              <w:end w:w="70" w:type="dxa"/>
-            </w:tcMar>
-            <w:vAlign w:val="center"/>
-          </w:tcPr>
-          <w:p>
-            <w:pPr>
-              <w:spacing w:line="276" w:lineRule="auto" w:before="0" w:after="0"/>
-            </w:pPr>
-            <w:r>
-              <w:rPr>
-                <w:rFonts w:ascii="Calibri" w:hAnsi="Calibri"/>
-                <w:color w:val="262626"/>
-                <w:sz w:val="16"/>
-              </w:rPr>
-              <w:t>13 missions with complete coverage</w:t>
-            </w:r>
-          </w:p>
-        </w:tc>
-        <w:tc>
-          <w:tcPr>
-            <w:tcW w:type="dxa" w:w="2160"/>
-            <w:shd w:val="clear" w:fill="FAFCFD"/>
-            <w:tcMar>
-              <w:top w:w="55" w:type="dxa"/>
-              <w:start w:w="70" w:type="dxa"/>
-              <w:bottom w:w="55" w:type="dxa"/>
-              <w:end w:w="70" w:type="dxa"/>
-            </w:tcMar>
-            <w:vAlign w:val="center"/>
-          </w:tcPr>
-          <w:p>
-            <w:pPr>
-              <w:spacing w:line="276" w:lineRule="auto" w:before="0" w:after="0"/>
-            </w:pPr>
-            <w:r>
-              <w:rPr>
-                <w:rFonts w:ascii="Calibri" w:hAnsi="Calibri"/>
-                <w:color w:val="262626"/>
-                <w:sz w:val="16"/>
-              </w:rPr>
-              <w:t>Top 12 global Hallmark terms (6 positive, 6 negative NES)</w:t>
-            </w:r>
-          </w:p>
-        </w:tc>
-        <w:tc>
-          <w:tcPr>
-            <w:tcW w:type="dxa" w:w="1728"/>
-            <w:shd w:val="clear" w:fill="FAFCFD"/>
-            <w:tcMar>
-              <w:top w:w="55" w:type="dxa"/>
-              <w:start w:w="70" w:type="dxa"/>
-              <w:bottom w:w="55" w:type="dxa"/>
-              <w:end w:w="70" w:type="dxa"/>
-            </w:tcMar>
-            <w:vAlign w:val="center"/>
-          </w:tcPr>
-          <w:p>
-            <w:pPr>
-              <w:spacing w:line="276" w:lineRule="auto" w:before="0" w:after="0"/>
-            </w:pPr>
-            <w:r>
-              <w:rPr>
-                <w:rFonts w:ascii="Calibri" w:hAnsi="Calibri"/>
-                <w:color w:val="262626"/>
-                <w:sz w:val="16"/>
-              </w:rPr>
-              <w:t>R/figures/02_hallmark_gsea.R</w:t>
-            </w:r>
-          </w:p>
-        </w:tc>
-      </w:tr>
-      <w:tr>
-        <w:trPr>
-          <w:cantSplit/>
-        </w:trPr>
-        <w:tc>
-          <w:tcPr>
-            <w:tcW w:type="dxa" w:w="1728"/>
-            <w:tcMar>
-              <w:top w:w="55" w:type="dxa"/>
-              <w:start w:w="70" w:type="dxa"/>
-              <w:bottom w:w="55" w:type="dxa"/>
-              <w:end w:w="70" w:type="dxa"/>
-            </w:tcMar>
-            <w:vAlign w:val="center"/>
-          </w:tcPr>
-          <w:p>
-            <w:pPr>
-              <w:spacing w:line="276" w:lineRule="auto" w:before="0" w:after="0"/>
-            </w:pPr>
-            <w:r>
-              <w:rPr>
-                <w:rFonts w:ascii="Calibri" w:hAnsi="Calibri"/>
-                <w:color w:val="262626"/>
-                <w:sz w:val="16"/>
-              </w:rPr>
-              <w:t>Fig. S2a / S2b</w:t>
-            </w:r>
-          </w:p>
-        </w:tc>
-        <w:tc>
-          <w:tcPr>
-            <w:tcW w:type="dxa" w:w="1872"/>
-            <w:tcMar>
-              <w:top w:w="55" w:type="dxa"/>
-              <w:start w:w="70" w:type="dxa"/>
-              <w:bottom w:w="55" w:type="dxa"/>
-              <w:end w:w="70" w:type="dxa"/>
-            </w:tcMar>
-            <w:vAlign w:val="center"/>
-          </w:tcPr>
-          <w:p>
-            <w:pPr>
-              <w:spacing w:line="276" w:lineRule="auto" w:before="0" w:after="0"/>
-            </w:pPr>
-            <w:r>
-              <w:rPr>
-                <w:rFonts w:ascii="Calibri" w:hAnsi="Calibri"/>
-                <w:color w:val="262626"/>
-                <w:sz w:val="16"/>
-              </w:rPr>
-              <w:t>Kidney Overlap &amp; Common-Direction Genes</w:t>
-            </w:r>
-          </w:p>
-        </w:tc>
-        <w:tc>
-          <w:tcPr>
-            <w:tcW w:type="dxa" w:w="1872"/>
-            <w:tcMar>
-              <w:top w:w="55" w:type="dxa"/>
-              <w:start w:w="70" w:type="dxa"/>
-              <w:bottom w:w="55" w:type="dxa"/>
-              <w:end w:w="70" w:type="dxa"/>
-            </w:tcMar>
-            <w:vAlign w:val="center"/>
-          </w:tcPr>
-          <w:p>
-            <w:pPr>
-              <w:spacing w:line="276" w:lineRule="auto" w:before="0" w:after="0"/>
-            </w:pPr>
-            <w:r>
-              <w:rPr>
-                <w:rFonts w:ascii="Calibri" w:hAnsi="Calibri"/>
-                <w:color w:val="262626"/>
-                <w:sz w:val="16"/>
-              </w:rPr>
-              <w:t>Kidney (5 OSDR accessions)</w:t>
-            </w:r>
-          </w:p>
-        </w:tc>
-        <w:tc>
-          <w:tcPr>
-            <w:tcW w:type="dxa" w:w="2160"/>
-            <w:tcMar>
-              <w:top w:w="55" w:type="dxa"/>
-              <w:start w:w="70" w:type="dxa"/>
-              <w:bottom w:w="55" w:type="dxa"/>
-              <w:end w:w="70" w:type="dxa"/>
-            </w:tcMar>
-            <w:vAlign w:val="center"/>
-          </w:tcPr>
-          <w:p>
-            <w:pPr>
-              <w:spacing w:line="276" w:lineRule="auto" w:before="0" w:after="0"/>
-            </w:pPr>
-            <w:r>
-              <w:rPr>
-                <w:rFonts w:ascii="Calibri" w:hAnsi="Calibri"/>
-                <w:color w:val="262626"/>
-                <w:sz w:val="16"/>
-              </w:rPr>
-              <w:t>UpSet member-ID membership; BH-FDR and concordant-direction ranking</w:t>
-            </w:r>
-          </w:p>
-        </w:tc>
-        <w:tc>
-          <w:tcPr>
-            <w:tcW w:type="dxa" w:w="1728"/>
-            <w:tcMar>
-              <w:top w:w="55" w:type="dxa"/>
-              <w:start w:w="70" w:type="dxa"/>
-              <w:bottom w:w="55" w:type="dxa"/>
-              <w:end w:w="70" w:type="dxa"/>
-            </w:tcMar>
-            <w:vAlign w:val="center"/>
-          </w:tcPr>
-          <w:p>
-            <w:pPr>
-              <w:spacing w:line="276" w:lineRule="auto" w:before="0" w:after="0"/>
-            </w:pPr>
-            <w:r>
-              <w:rPr>
-                <w:rFonts w:ascii="Calibri" w:hAnsi="Calibri"/>
-                <w:color w:val="262626"/>
-                <w:sz w:val="16"/>
-              </w:rPr>
-              <w:t>R/final_figures/04_upset_membership.R; python/render_final_common_direction.py</w:t>
-            </w:r>
-          </w:p>
-        </w:tc>
-      </w:tr>
-      <w:tr>
-        <w:trPr>
-          <w:cantSplit/>
-        </w:trPr>
-        <w:tc>
-          <w:tcPr>
-            <w:tcW w:type="dxa" w:w="1728"/>
-            <w:shd w:val="clear" w:fill="FAFCFD"/>
-            <w:tcMar>
-              <w:top w:w="55" w:type="dxa"/>
-              <w:start w:w="70" w:type="dxa"/>
-              <w:bottom w:w="55" w:type="dxa"/>
-              <w:end w:w="70" w:type="dxa"/>
-            </w:tcMar>
-            <w:vAlign w:val="center"/>
-          </w:tcPr>
-          <w:p>
-            <w:pPr>
-              <w:spacing w:line="276" w:lineRule="auto" w:before="0" w:after="0"/>
-            </w:pPr>
-            <w:r>
-              <w:rPr>
-                <w:rFonts w:ascii="Calibri" w:hAnsi="Calibri"/>
-                <w:color w:val="262626"/>
-                <w:sz w:val="16"/>
-              </w:rPr>
-              <w:t>Fig. S3a / S3b</w:t>
-            </w:r>
-          </w:p>
-        </w:tc>
-        <w:tc>
-          <w:tcPr>
-            <w:tcW w:type="dxa" w:w="1872"/>
-            <w:shd w:val="clear" w:fill="FAFCFD"/>
-            <w:tcMar>
-              <w:top w:w="55" w:type="dxa"/>
-              <w:start w:w="70" w:type="dxa"/>
-              <w:bottom w:w="55" w:type="dxa"/>
-              <w:end w:w="70" w:type="dxa"/>
-            </w:tcMar>
-            <w:vAlign w:val="center"/>
-          </w:tcPr>
-          <w:p>
-            <w:pPr>
-              <w:spacing w:line="276" w:lineRule="auto" w:before="0" w:after="0"/>
-            </w:pPr>
-            <w:r>
-              <w:rPr>
-                <w:rFonts w:ascii="Calibri" w:hAnsi="Calibri"/>
-                <w:color w:val="262626"/>
-                <w:sz w:val="16"/>
-              </w:rPr>
-              <w:t>High-NES UpSet &amp; Common-Direction Genes</w:t>
-            </w:r>
-          </w:p>
-        </w:tc>
-        <w:tc>
-          <w:tcPr>
-            <w:tcW w:type="dxa" w:w="1872"/>
-            <w:shd w:val="clear" w:fill="FAFCFD"/>
-            <w:tcMar>
-              <w:top w:w="55" w:type="dxa"/>
-              <w:start w:w="70" w:type="dxa"/>
-              <w:bottom w:w="55" w:type="dxa"/>
-              <w:end w:w="70" w:type="dxa"/>
-            </w:tcMar>
-            <w:vAlign w:val="center"/>
-          </w:tcPr>
-          <w:p>
-            <w:pPr>
-              <w:spacing w:line="276" w:lineRule="auto" w:before="0" w:after="0"/>
-            </w:pPr>
-            <w:r>
-              <w:rPr>
-                <w:rFonts w:ascii="Calibri" w:hAnsi="Calibri"/>
-                <w:color w:val="262626"/>
-                <w:sz w:val="16"/>
-              </w:rPr>
-              <w:t>NES &gt; 1 tissues (excluding Kidney)</w:t>
-            </w:r>
-          </w:p>
-        </w:tc>
-        <w:tc>
-          <w:tcPr>
-            <w:tcW w:type="dxa" w:w="2160"/>
-            <w:shd w:val="clear" w:fill="FAFCFD"/>
-            <w:tcMar>
-              <w:top w:w="55" w:type="dxa"/>
-              <w:start w:w="70" w:type="dxa"/>
-              <w:bottom w:w="55" w:type="dxa"/>
-              <w:end w:w="70" w:type="dxa"/>
-            </w:tcMar>
-            <w:vAlign w:val="center"/>
-          </w:tcPr>
-          <w:p>
-            <w:pPr>
-              <w:spacing w:line="276" w:lineRule="auto" w:before="0" w:after="0"/>
-            </w:pPr>
-            <w:r>
-              <w:rPr>
-                <w:rFonts w:ascii="Calibri" w:hAnsi="Calibri"/>
-                <w:color w:val="262626"/>
-                <w:sz w:val="16"/>
-              </w:rPr>
-              <w:t>UpSet member-ID membership; BH-FDR and concordant-direction ranking</w:t>
-            </w:r>
-          </w:p>
-        </w:tc>
-        <w:tc>
-          <w:tcPr>
-            <w:tcW w:type="dxa" w:w="1728"/>
-            <w:shd w:val="clear" w:fill="FAFCFD"/>
-            <w:tcMar>
-              <w:top w:w="55" w:type="dxa"/>
-              <w:start w:w="70" w:type="dxa"/>
-              <w:bottom w:w="55" w:type="dxa"/>
-              <w:end w:w="70" w:type="dxa"/>
-            </w:tcMar>
-            <w:vAlign w:val="center"/>
-          </w:tcPr>
-          <w:p>
-            <w:pPr>
-              <w:spacing w:line="276" w:lineRule="auto" w:before="0" w:after="0"/>
-            </w:pPr>
-            <w:r>
-              <w:rPr>
-                <w:rFonts w:ascii="Calibri" w:hAnsi="Calibri"/>
-                <w:color w:val="262626"/>
-                <w:sz w:val="16"/>
-              </w:rPr>
-              <w:t>R/final_figures/04_upset_membership.R; python/render_final_common_direction.py</w:t>
-            </w:r>
-          </w:p>
-        </w:tc>
-      </w:tr>
-      <w:tr>
-        <w:trPr>
-          <w:cantSplit/>
-        </w:trPr>
-        <w:tc>
-          <w:tcPr>
-            <w:tcW w:type="dxa" w:w="1728"/>
-            <w:tcMar>
-              <w:top w:w="55" w:type="dxa"/>
-              <w:start w:w="70" w:type="dxa"/>
-              <w:bottom w:w="55" w:type="dxa"/>
-              <w:end w:w="70" w:type="dxa"/>
-            </w:tcMar>
-            <w:vAlign w:val="center"/>
-          </w:tcPr>
-          <w:p>
-            <w:pPr>
-              <w:spacing w:line="276" w:lineRule="auto" w:before="0" w:after="0"/>
-            </w:pPr>
-            <w:r>
-              <w:rPr>
-                <w:rFonts w:ascii="Calibri" w:hAnsi="Calibri"/>
-                <w:color w:val="262626"/>
-                <w:sz w:val="16"/>
-              </w:rPr>
-              <w:t>Fig. S4a / S4b</w:t>
-            </w:r>
-          </w:p>
-        </w:tc>
-        <w:tc>
-          <w:tcPr>
-            <w:tcW w:type="dxa" w:w="1872"/>
-            <w:tcMar>
-              <w:top w:w="55" w:type="dxa"/>
-              <w:start w:w="70" w:type="dxa"/>
-              <w:bottom w:w="55" w:type="dxa"/>
-              <w:end w:w="70" w:type="dxa"/>
-            </w:tcMar>
-            <w:vAlign w:val="center"/>
-          </w:tcPr>
-          <w:p>
-            <w:pPr>
-              <w:spacing w:line="276" w:lineRule="auto" w:before="0" w:after="0"/>
-            </w:pPr>
-            <w:r>
-              <w:rPr>
-                <w:rFonts w:ascii="Calibri" w:hAnsi="Calibri"/>
-                <w:color w:val="262626"/>
-                <w:sz w:val="16"/>
-              </w:rPr>
-              <w:t>Low-NES UpSet &amp; Common-Direction Genes</w:t>
-            </w:r>
-          </w:p>
-        </w:tc>
-        <w:tc>
-          <w:tcPr>
-            <w:tcW w:type="dxa" w:w="1872"/>
-            <w:tcMar>
-              <w:top w:w="55" w:type="dxa"/>
-              <w:start w:w="70" w:type="dxa"/>
-              <w:bottom w:w="55" w:type="dxa"/>
-              <w:end w:w="70" w:type="dxa"/>
-            </w:tcMar>
-            <w:vAlign w:val="center"/>
-          </w:tcPr>
-          <w:p>
-            <w:pPr>
-              <w:spacing w:line="276" w:lineRule="auto" w:before="0" w:after="0"/>
-            </w:pPr>
-            <w:r>
-              <w:rPr>
-                <w:rFonts w:ascii="Calibri" w:hAnsi="Calibri"/>
-                <w:color w:val="262626"/>
-                <w:sz w:val="16"/>
-              </w:rPr>
-              <w:t>NES &lt; −1 tissues (excluding Lung/Thymus)</w:t>
-            </w:r>
-          </w:p>
-        </w:tc>
-        <w:tc>
-          <w:tcPr>
-            <w:tcW w:type="dxa" w:w="2160"/>
-            <w:tcMar>
-              <w:top w:w="55" w:type="dxa"/>
-              <w:start w:w="70" w:type="dxa"/>
-              <w:bottom w:w="55" w:type="dxa"/>
-              <w:end w:w="70" w:type="dxa"/>
-            </w:tcMar>
-            <w:vAlign w:val="center"/>
-          </w:tcPr>
-          <w:p>
-            <w:pPr>
-              <w:spacing w:line="276" w:lineRule="auto" w:before="0" w:after="0"/>
-            </w:pPr>
-            <w:r>
-              <w:rPr>
-                <w:rFonts w:ascii="Calibri" w:hAnsi="Calibri"/>
-                <w:color w:val="262626"/>
-                <w:sz w:val="16"/>
-              </w:rPr>
-              <w:t>UpSet member-ID membership; BH-FDR and concordant-direction ranking</w:t>
-            </w:r>
-          </w:p>
-        </w:tc>
-        <w:tc>
-          <w:tcPr>
-            <w:tcW w:type="dxa" w:w="1728"/>
-            <w:tcMar>
-              <w:top w:w="55" w:type="dxa"/>
-              <w:start w:w="70" w:type="dxa"/>
-              <w:bottom w:w="55" w:type="dxa"/>
-              <w:end w:w="70" w:type="dxa"/>
-            </w:tcMar>
-            <w:vAlign w:val="center"/>
-          </w:tcPr>
-          <w:p>
-            <w:pPr>
-              <w:spacing w:line="276" w:lineRule="auto" w:before="0" w:after="0"/>
-            </w:pPr>
-            <w:r>
-              <w:rPr>
-                <w:rFonts w:ascii="Calibri" w:hAnsi="Calibri"/>
-                <w:color w:val="262626"/>
-                <w:sz w:val="16"/>
-              </w:rPr>
-              <w:t>R/final_figures/04_upset_membership.R; python/render_final_common_direction.py</w:t>
-            </w:r>
-          </w:p>
-        </w:tc>
-      </w:tr>
-      <w:tr>
-        <w:trPr>
-          <w:cantSplit/>
-        </w:trPr>
-        <w:tc>
-          <w:tcPr>
-            <w:tcW w:type="dxa" w:w="1728"/>
-            <w:shd w:val="clear" w:fill="FAFCFD"/>
-            <w:tcMar>
-              <w:top w:w="55" w:type="dxa"/>
-              <w:start w:w="70" w:type="dxa"/>
-              <w:bottom w:w="55" w:type="dxa"/>
-              <w:end w:w="70" w:type="dxa"/>
-            </w:tcMar>
-            <w:vAlign w:val="center"/>
-          </w:tcPr>
-          <w:p>
-            <w:pPr>
-              <w:spacing w:line="276" w:lineRule="auto" w:before="0" w:after="0"/>
-            </w:pPr>
-            <w:r>
-              <w:rPr>
-                <w:rFonts w:ascii="Calibri" w:hAnsi="Calibri"/>
-                <w:color w:val="262626"/>
-                <w:sz w:val="16"/>
-              </w:rPr>
-              <w:t>Fig. S5</w:t>
-            </w:r>
-          </w:p>
-        </w:tc>
-        <w:tc>
-          <w:tcPr>
-            <w:tcW w:type="dxa" w:w="1872"/>
-            <w:shd w:val="clear" w:fill="FAFCFD"/>
-            <w:tcMar>
-              <w:top w:w="55" w:type="dxa"/>
-              <w:start w:w="70" w:type="dxa"/>
-              <w:bottom w:w="55" w:type="dxa"/>
-              <w:end w:w="70" w:type="dxa"/>
-            </w:tcMar>
-            <w:vAlign w:val="center"/>
-          </w:tcPr>
-          <w:p>
-            <w:pPr>
-              <w:spacing w:line="276" w:lineRule="auto" w:before="0" w:after="0"/>
-            </w:pPr>
-            <w:r>
-              <w:rPr>
-                <w:rFonts w:ascii="Calibri" w:hAnsi="Calibri"/>
-                <w:color w:val="262626"/>
-                <w:sz w:val="16"/>
-              </w:rPr>
-              <w:t>Pathway Member-Gene Detection</w:t>
-            </w:r>
-          </w:p>
-        </w:tc>
-        <w:tc>
-          <w:tcPr>
-            <w:tcW w:type="dxa" w:w="1872"/>
-            <w:shd w:val="clear" w:fill="FAFCFD"/>
-            <w:tcMar>
-              <w:top w:w="55" w:type="dxa"/>
-              <w:start w:w="70" w:type="dxa"/>
-              <w:bottom w:w="55" w:type="dxa"/>
-              <w:end w:w="70" w:type="dxa"/>
-            </w:tcMar>
-            <w:vAlign w:val="center"/>
-          </w:tcPr>
-          <w:p>
-            <w:pPr>
-              <w:spacing w:line="276" w:lineRule="auto" w:before="0" w:after="0"/>
-            </w:pPr>
-            <w:r>
-              <w:rPr>
-                <w:rFonts w:ascii="Calibri" w:hAnsi="Calibri"/>
-                <w:color w:val="262626"/>
-                <w:sz w:val="16"/>
-              </w:rPr>
-              <w:t>761 source-sample records × 7 pathways (335 memberships; 257 unique IDs)</w:t>
-            </w:r>
-          </w:p>
-        </w:tc>
-        <w:tc>
-          <w:tcPr>
-            <w:tcW w:type="dxa" w:w="2160"/>
-            <w:shd w:val="clear" w:fill="FAFCFD"/>
-            <w:tcMar>
-              <w:top w:w="55" w:type="dxa"/>
-              <w:start w:w="70" w:type="dxa"/>
-              <w:bottom w:w="55" w:type="dxa"/>
-              <w:end w:w="70" w:type="dxa"/>
-            </w:tcMar>
-            <w:vAlign w:val="center"/>
-          </w:tcPr>
-          <w:p>
-            <w:pPr>
-              <w:spacing w:line="276" w:lineRule="auto" w:before="0" w:after="0"/>
-            </w:pPr>
-            <w:r>
-              <w:rPr>
-                <w:rFonts w:ascii="Calibri" w:hAnsi="Calibri"/>
-                <w:color w:val="262626"/>
-                <w:sz w:val="16"/>
-              </w:rPr>
-              <w:t>Finite source-value detection count per pathway</w:t>
-            </w:r>
-          </w:p>
-        </w:tc>
-        <w:tc>
-          <w:tcPr>
-            <w:tcW w:type="dxa" w:w="1728"/>
-            <w:shd w:val="clear" w:fill="FAFCFD"/>
-            <w:tcMar>
-              <w:top w:w="55" w:type="dxa"/>
-              <w:start w:w="70" w:type="dxa"/>
-              <w:bottom w:w="55" w:type="dxa"/>
-              <w:end w:w="70" w:type="dxa"/>
-            </w:tcMar>
-            <w:vAlign w:val="center"/>
-          </w:tcPr>
-          <w:p>
-            <w:pPr>
-              <w:spacing w:line="276" w:lineRule="auto" w:before="0" w:after="0"/>
-            </w:pPr>
-            <w:r>
-              <w:rPr>
-                <w:rFonts w:ascii="Calibri" w:hAnsi="Calibri"/>
-                <w:color w:val="262626"/>
-                <w:sz w:val="16"/>
-              </w:rPr>
-              <w:t>R/final_figures/07_figS5_counts.R</w:t>
-            </w:r>
-          </w:p>
-        </w:tc>
-      </w:tr>
-      <w:tr>
-        <w:trPr>
-          <w:cantSplit/>
-        </w:trPr>
-        <w:tc>
-          <w:tcPr>
-            <w:tcW w:type="dxa" w:w="1728"/>
-            <w:tcMar>
-              <w:top w:w="55" w:type="dxa"/>
-              <w:start w:w="70" w:type="dxa"/>
-              <w:bottom w:w="55" w:type="dxa"/>
-              <w:end w:w="70" w:type="dxa"/>
-            </w:tcMar>
-            <w:vAlign w:val="center"/>
-          </w:tcPr>
-          <w:p>
-            <w:pPr>
-              <w:spacing w:line="276" w:lineRule="auto" w:before="0" w:after="0"/>
-            </w:pPr>
-            <w:r>
-              <w:rPr>
-                <w:rFonts w:ascii="Calibri" w:hAnsi="Calibri"/>
-                <w:color w:val="262626"/>
-                <w:sz w:val="16"/>
-              </w:rPr>
-              <w:t>Fig. S6</w:t>
-            </w:r>
-          </w:p>
-        </w:tc>
-        <w:tc>
-          <w:tcPr>
-            <w:tcW w:type="dxa" w:w="1872"/>
-            <w:tcMar>
-              <w:top w:w="55" w:type="dxa"/>
-              <w:start w:w="70" w:type="dxa"/>
-              <w:bottom w:w="55" w:type="dxa"/>
-              <w:end w:w="70" w:type="dxa"/>
-            </w:tcMar>
-            <w:vAlign w:val="center"/>
-          </w:tcPr>
-          <w:p>
-            <w:pPr>
-              <w:spacing w:line="276" w:lineRule="auto" w:before="0" w:after="0"/>
-            </w:pPr>
-            <w:r>
-              <w:rPr>
-                <w:rFonts w:ascii="Calibri" w:hAnsi="Calibri"/>
-                <w:color w:val="262626"/>
-                <w:sz w:val="16"/>
-              </w:rPr>
-              <w:t>Per-Tissue Sample-Level Association</w:t>
-            </w:r>
-          </w:p>
-        </w:tc>
-        <w:tc>
-          <w:tcPr>
-            <w:tcW w:type="dxa" w:w="1872"/>
-            <w:tcMar>
-              <w:top w:w="55" w:type="dxa"/>
-              <w:start w:w="70" w:type="dxa"/>
-              <w:bottom w:w="55" w:type="dxa"/>
-              <w:end w:w="70" w:type="dxa"/>
-            </w:tcMar>
-            <w:vAlign w:val="center"/>
-          </w:tcPr>
-          <w:p>
-            <w:pPr>
-              <w:spacing w:line="276" w:lineRule="auto" w:before="0" w:after="0"/>
-            </w:pPr>
-            <w:r>
-              <w:rPr>
-                <w:rFonts w:ascii="Calibri" w:hAnsi="Calibri"/>
-                <w:color w:val="262626"/>
-                <w:sz w:val="16"/>
-              </w:rPr>
-              <w:t>26 individual tissue matrices with tissue-specific n</w:t>
-            </w:r>
-          </w:p>
-        </w:tc>
-        <w:tc>
-          <w:tcPr>
-            <w:tcW w:type="dxa" w:w="2160"/>
-            <w:tcMar>
-              <w:top w:w="55" w:type="dxa"/>
-              <w:start w:w="70" w:type="dxa"/>
-              <w:bottom w:w="55" w:type="dxa"/>
-              <w:end w:w="70" w:type="dxa"/>
-            </w:tcMar>
-            <w:vAlign w:val="center"/>
-          </w:tcPr>
-          <w:p>
-            <w:pPr>
-              <w:spacing w:line="276" w:lineRule="auto" w:before="0" w:after="0"/>
-            </w:pPr>
-            <w:r>
-              <w:rPr>
-                <w:rFonts w:ascii="Calibri" w:hAnsi="Calibri"/>
-                <w:color w:val="262626"/>
-                <w:sz w:val="16"/>
-              </w:rPr>
-              <w:t>Sample-level 15 × 15 Spearman rank correlation matrices</w:t>
-            </w:r>
-          </w:p>
-        </w:tc>
-        <w:tc>
-          <w:tcPr>
-            <w:tcW w:type="dxa" w:w="1728"/>
-            <w:tcMar>
-              <w:top w:w="55" w:type="dxa"/>
-              <w:start w:w="70" w:type="dxa"/>
-              <w:bottom w:w="55" w:type="dxa"/>
-              <w:end w:w="70" w:type="dxa"/>
-            </w:tcMar>
-            <w:vAlign w:val="center"/>
-          </w:tcPr>
-          <w:p>
-            <w:pPr>
-              <w:spacing w:line="276" w:lineRule="auto" w:before="0" w:after="0"/>
-            </w:pPr>
-            <w:r>
-              <w:rPr>
-                <w:rFonts w:ascii="Calibri" w:hAnsi="Calibri"/>
-                <w:color w:val="262626"/>
-                <w:sz w:val="16"/>
-              </w:rPr>
-              <w:t>python/build_log2fc_per_tissue_pathway_spearman_20260902.py; python/plot_log2fc_per_tissue_pathway_spearman_20260902.py</w:t>
-            </w:r>
-          </w:p>
-        </w:tc>
-      </w:tr>
-      <w:tr>
-        <w:trPr>
-          <w:cantSplit/>
-        </w:trPr>
-        <w:tc>
-          <w:tcPr>
-            <w:tcW w:type="dxa" w:w="1728"/>
-            <w:shd w:val="clear" w:fill="FAFCFD"/>
-            <w:tcMar>
-              <w:top w:w="55" w:type="dxa"/>
-              <w:start w:w="70" w:type="dxa"/>
-              <w:bottom w:w="55" w:type="dxa"/>
-              <w:end w:w="70" w:type="dxa"/>
-            </w:tcMar>
-            <w:vAlign w:val="center"/>
-          </w:tcPr>
-          <w:p>
-            <w:pPr>
-              <w:spacing w:line="276" w:lineRule="auto" w:before="0" w:after="0"/>
-            </w:pPr>
-            <w:r>
-              <w:rPr>
-                <w:rFonts w:ascii="Calibri" w:hAnsi="Calibri"/>
-                <w:color w:val="262626"/>
-                <w:sz w:val="16"/>
-              </w:rPr>
-              <w:t>Tables 01–04</w:t>
-            </w:r>
-          </w:p>
-        </w:tc>
-        <w:tc>
-          <w:tcPr>
-            <w:tcW w:type="dxa" w:w="1872"/>
-            <w:shd w:val="clear" w:fill="FAFCFD"/>
-            <w:tcMar>
-              <w:top w:w="55" w:type="dxa"/>
-              <w:start w:w="70" w:type="dxa"/>
-              <w:bottom w:w="55" w:type="dxa"/>
-              <w:end w:w="70" w:type="dxa"/>
-            </w:tcMar>
-            <w:vAlign w:val="center"/>
-          </w:tcPr>
-          <w:p>
-            <w:pPr>
-              <w:spacing w:line="276" w:lineRule="auto" w:before="0" w:after="0"/>
-            </w:pPr>
-            <w:r>
-              <w:rPr>
-                <w:rFonts w:ascii="Calibri" w:hAnsi="Calibri"/>
-                <w:color w:val="262626"/>
-                <w:sz w:val="16"/>
-              </w:rPr>
-              <w:t>Linear Expression Summaries &amp; Tissue Heterogeneity</w:t>
-            </w:r>
-          </w:p>
-        </w:tc>
-        <w:tc>
-          <w:tcPr>
-            <w:tcW w:type="dxa" w:w="1872"/>
-            <w:shd w:val="clear" w:fill="FAFCFD"/>
-            <w:tcMar>
-              <w:top w:w="55" w:type="dxa"/>
-              <w:start w:w="70" w:type="dxa"/>
-              <w:bottom w:w="55" w:type="dxa"/>
-              <w:end w:w="70" w:type="dxa"/>
-            </w:tcMar>
-            <w:vAlign w:val="center"/>
-          </w:tcPr>
-          <w:p>
-            <w:pPr>
-              <w:spacing w:line="276" w:lineRule="auto" w:before="0" w:after="0"/>
-            </w:pPr>
-            <w:r>
-              <w:rPr>
-                <w:rFonts w:ascii="Calibri" w:hAnsi="Calibri"/>
-                <w:color w:val="262626"/>
-                <w:sz w:val="16"/>
-              </w:rPr>
-              <w:t>Source-sample observations across 26 tissues</w:t>
-            </w:r>
-          </w:p>
-        </w:tc>
-        <w:tc>
-          <w:tcPr>
-            <w:tcW w:type="dxa" w:w="2160"/>
-            <w:shd w:val="clear" w:fill="FAFCFD"/>
-            <w:tcMar>
-              <w:top w:w="55" w:type="dxa"/>
-              <w:start w:w="70" w:type="dxa"/>
-              <w:bottom w:w="55" w:type="dxa"/>
-              <w:end w:w="70" w:type="dxa"/>
-            </w:tcMar>
-            <w:vAlign w:val="center"/>
-          </w:tcPr>
-          <w:p>
-            <w:pPr>
-              <w:spacing w:line="276" w:lineRule="auto" w:before="0" w:after="0"/>
-            </w:pPr>
-            <w:r>
-              <w:rPr>
-                <w:rFonts w:ascii="Calibri" w:hAnsi="Calibri"/>
-                <w:color w:val="262626"/>
-                <w:sz w:val="16"/>
-              </w:rPr>
-              <w:t>Tissue means, Q1/mean/Q3 boxplot summaries, and one-way ANOVA across tissues</w:t>
-            </w:r>
-          </w:p>
-        </w:tc>
-        <w:tc>
-          <w:tcPr>
-            <w:tcW w:type="dxa" w:w="1728"/>
-            <w:shd w:val="clear" w:fill="FAFCFD"/>
-            <w:tcMar>
-              <w:top w:w="55" w:type="dxa"/>
-              <w:start w:w="70" w:type="dxa"/>
-              <w:bottom w:w="55" w:type="dxa"/>
-              <w:end w:w="70" w:type="dxa"/>
-            </w:tcMar>
-            <w:vAlign w:val="center"/>
-          </w:tcPr>
-          <w:p>
-            <w:pPr>
-              <w:spacing w:line="276" w:lineRule="auto" w:before="0" w:after="0"/>
-            </w:pPr>
-            <w:r>
-              <w:rPr>
-                <w:rFonts w:ascii="Calibri" w:hAnsi="Calibri"/>
-                <w:color w:val="262626"/>
-                <w:sz w:val="16"/>
-              </w:rPr>
-              <w:t>release/tables/linear/</w:t>
+              <w:t>release/tables/linear/01-04 summary tables</w:t>
             </w:r>
           </w:p>
         </w:tc>
@@ -4118,7 +3188,7 @@
         <w:color w:val="888888"/>
         <w:sz w:val="17"/>
       </w:rPr>
-      <w:t>Methods Section — NASA OSDR Multi-Tissue Spaceflight Dataset (Figure-Aligned)</w:t>
+      <w:t>Methods Section — NASA OSDR Multi-Tissue Spaceflight Dataset (Supplementary-Table-Aligned)</w:t>
     </w:r>
   </w:p>
 </w:ftr>

</xml_diff>

<commit_message>
feat(methods): embed native LaTeX Office Math equations for WPS and Word rendering
</commit_message>
<xml_diff>
--- a/manuscript_methods_mouse_spaceflight_transcriptome.docx
+++ b/manuscript_methods_mouse_spaceflight_transcriptome.docx
@@ -145,7 +145,157 @@
           <w:color w:val="262626"/>
           <w:sz w:val="20"/>
         </w:rPr>
-        <w:t>To evaluate systemic pathway-level perturbations across anatomical systems under spaceflight environmental stressors, cross-tissue functional pathway enrichment was conducted using pre-ranked gene set enrichment analysis via fgseaMultilevel (fgsea package in R 4.4.3; random seed = 25). For each accession–tissue comparison, genes were ranked based on flight-versus-ground differential-expression statistics curated from OSDR. When available, repository test statistics were used directly; otherwise, signed standard normal deviates were computed from nominal two-sided P values and the sign of log2 fold change (log2FC): Z = −Φ^−1(P / 2) × sign(log2FC). For duplicate Ensembl Gene IDs within a comparison, statistics were collapsed by median values, and ties were resolved deterministically by Ensembl ID. Gene set enrichment parameters were set to minSize = 5 for Gene Ontology terms and minSize = 10 for Hallmark terms, maxSize = 5,000, eps = 10^−10, with the standard score type.</w:t>
+        <w:t xml:space="preserve">To evaluate systemic pathway-level perturbations across anatomical systems under spaceflight environmental stressors, cross-tissue functional pathway enrichment was conducted using pre-ranked gene set enrichment analysis via fgseaMultilevel (fgsea package in R 4.4.3; random seed = 25). For each accession–tissue comparison, genes were ranked based on flight-versus-ground differential-expression statistics curated from OSDR. When available, repository test statistics were used directly; otherwise, signed standard normal deviates were computed from nominal two-sided P values and the sign of log2 fold change (log2FC): </w:t>
+      </w:r>
+      <m:oMath xmlns:a="http://schemas.openxmlformats.org/drawingml/2006/main" xmlns:pic="http://schemas.openxmlformats.org/drawingml/2006/picture">
+        <m:r>
+          <m:t>Z</m:t>
+        </m:r>
+        <m:r>
+          <m:rPr>
+            <m:sty m:val="p"/>
+          </m:rPr>
+          <m:t>=</m:t>
+        </m:r>
+        <m:r>
+          <m:rPr>
+            <m:sty m:val="p"/>
+          </m:rPr>
+          <m:t>−</m:t>
+        </m:r>
+        <m:sSup>
+          <m:e>
+            <m:r>
+              <m:rPr>
+                <m:sty m:val="p"/>
+              </m:rPr>
+              <m:t>Φ</m:t>
+            </m:r>
+          </m:e>
+          <m:sup>
+            <m:r>
+              <m:rPr>
+                <m:sty m:val="p"/>
+              </m:rPr>
+              <m:t>−</m:t>
+            </m:r>
+            <m:r>
+              <m:t>1</m:t>
+            </m:r>
+          </m:sup>
+        </m:sSup>
+        <m:d>
+          <m:dPr>
+            <m:begChr m:val="("/>
+            <m:sepChr m:val=""/>
+            <m:endChr m:val=")"/>
+            <m:grow/>
+          </m:dPr>
+          <m:e>
+            <m:f>
+              <m:fPr>
+                <m:type m:val="bar"/>
+              </m:fPr>
+              <m:num>
+                <m:r>
+                  <m:t>P</m:t>
+                </m:r>
+              </m:num>
+              <m:den>
+                <m:r>
+                  <m:t>2</m:t>
+                </m:r>
+              </m:den>
+            </m:f>
+          </m:e>
+        </m:d>
+        <m:r>
+          <m:rPr>
+            <m:sty m:val="p"/>
+          </m:rPr>
+          <m:t>×</m:t>
+        </m:r>
+        <m:r>
+          <m:rPr>
+            <m:sty m:val="p"/>
+          </m:rPr>
+          <m:t>sign</m:t>
+        </m:r>
+        <m:r>
+          <m:rPr>
+            <m:sty m:val="p"/>
+          </m:rPr>
+          <m:t>(</m:t>
+        </m:r>
+        <m:sSub>
+          <m:e>
+            <m:r>
+              <m:rPr>
+                <m:sty m:val="p"/>
+              </m:rPr>
+              <m:t>log</m:t>
+            </m:r>
+          </m:e>
+          <m:sub>
+            <m:r>
+              <m:t>2</m:t>
+            </m:r>
+          </m:sub>
+        </m:sSub>
+        <m:r>
+          <m:rPr>
+            <m:sty m:val="p"/>
+          </m:rPr>
+          <m:t>F</m:t>
+        </m:r>
+        <m:r>
+          <m:rPr>
+            <m:sty m:val="p"/>
+          </m:rPr>
+          <m:t>C</m:t>
+        </m:r>
+        <m:r>
+          <m:rPr>
+            <m:sty m:val="p"/>
+          </m:rPr>
+          <m:t>)</m:t>
+        </m:r>
+      </m:oMath>
+      <w:r>
+        <w:rPr>
+          <w:rFonts w:ascii="Calibri" w:hAnsi="Calibri"/>
+          <w:color w:val="262626"/>
+          <w:sz w:val="20"/>
+        </w:rPr>
+        <w:t xml:space="preserve">. For duplicate Ensembl Gene IDs within a comparison, statistics were collapsed by median values, and ties were resolved deterministically by Ensembl ID. Gene set enrichment parameters were set to minSize = 5 for Gene Ontology terms and minSize = 10 for Hallmark terms, maxSize = 5,000, eps = </w:t>
+      </w:r>
+      <m:oMath xmlns:a="http://schemas.openxmlformats.org/drawingml/2006/main" xmlns:pic="http://schemas.openxmlformats.org/drawingml/2006/picture">
+        <m:sSup>
+          <m:e>
+            <m:r>
+              <m:t>10</m:t>
+            </m:r>
+          </m:e>
+          <m:sup>
+            <m:r>
+              <m:rPr>
+                <m:sty m:val="p"/>
+              </m:rPr>
+              <m:t>−</m:t>
+            </m:r>
+            <m:r>
+              <m:t>10</m:t>
+            </m:r>
+          </m:sup>
+        </m:sSup>
+      </m:oMath>
+      <w:r>
+        <w:rPr>
+          <w:rFonts w:ascii="Calibri" w:hAnsi="Calibri"/>
+          <w:color w:val="262626"/>
+          <w:sz w:val="20"/>
+        </w:rPr>
+        <w:t>, with the standard score type.</w:t>
       </w:r>
     </w:p>
     <w:p>
@@ -226,7 +376,350 @@
           <w:color w:val="262626"/>
           <w:sz w:val="20"/>
         </w:rPr>
-        <w:t>To quantify coordinated pathway co-regulation and evaluate whether DDR and metabolic pathways exhibit shared transcriptional trajectories across individual spaceflight animals, a ground-referenced pathway co-response framework was constructed. For each accession–tissue unit, flight specimen k was standardized against the baseline mean of matched ground control specimens: Sample_log2FC(g,k) = log2(x_flight(g,k)) − mean_j[log2(x_ground(g,j))], where x represents normalized source expression values. Sample-level pathway activity scores were computed as the arithmetic mean of log2FC values across all detected member Ensembl IDs for each of the 15 predefined GO terms.</w:t>
+        <w:t xml:space="preserve">To quantify coordinated pathway co-regulation and evaluate whether DDR and metabolic pathways exhibit shared transcriptional trajectories across individual spaceflight animals, a ground-referenced pathway co-response framework was constructed. For each accession–tissue unit, flight specimen k was standardized against the baseline mean of matched ground control specimens: </w:t>
+      </w:r>
+      <m:oMath xmlns:a="http://schemas.openxmlformats.org/drawingml/2006/main" xmlns:pic="http://schemas.openxmlformats.org/drawingml/2006/picture">
+        <m:r>
+          <m:rPr>
+            <m:sty m:val="p"/>
+          </m:rPr>
+          <m:t>S</m:t>
+        </m:r>
+        <m:r>
+          <m:rPr>
+            <m:sty m:val="p"/>
+          </m:rPr>
+          <m:t>a</m:t>
+        </m:r>
+        <m:r>
+          <m:rPr>
+            <m:sty m:val="p"/>
+          </m:rPr>
+          <m:t>m</m:t>
+        </m:r>
+        <m:r>
+          <m:rPr>
+            <m:sty m:val="p"/>
+          </m:rPr>
+          <m:t>p</m:t>
+        </m:r>
+        <m:r>
+          <m:rPr>
+            <m:sty m:val="p"/>
+          </m:rPr>
+          <m:t>l</m:t>
+        </m:r>
+        <m:r>
+          <m:rPr>
+            <m:sty m:val="p"/>
+          </m:rPr>
+          <m:t>e</m:t>
+        </m:r>
+        <m:r>
+          <m:rPr>
+            <m:sty m:val="p"/>
+          </m:rPr>
+          <m:t>_</m:t>
+        </m:r>
+        <m:r>
+          <m:rPr>
+            <m:sty m:val="p"/>
+          </m:rPr>
+          <m:t>l</m:t>
+        </m:r>
+        <m:r>
+          <m:rPr>
+            <m:sty m:val="p"/>
+          </m:rPr>
+          <m:t>o</m:t>
+        </m:r>
+        <m:r>
+          <m:rPr>
+            <m:sty m:val="p"/>
+          </m:rPr>
+          <m:t>g</m:t>
+        </m:r>
+        <m:r>
+          <m:rPr>
+            <m:sty m:val="p"/>
+          </m:rPr>
+          <m:t>2</m:t>
+        </m:r>
+        <m:r>
+          <m:rPr>
+            <m:sty m:val="p"/>
+          </m:rPr>
+          <m:t>F</m:t>
+        </m:r>
+        <m:r>
+          <m:rPr>
+            <m:sty m:val="p"/>
+          </m:rPr>
+          <m:t>C</m:t>
+        </m:r>
+        <m:r>
+          <m:rPr>
+            <m:sty m:val="p"/>
+          </m:rPr>
+          <m:t>(</m:t>
+        </m:r>
+        <m:r>
+          <m:t>g</m:t>
+        </m:r>
+        <m:r>
+          <m:rPr>
+            <m:sty m:val="p"/>
+          </m:rPr>
+          <m:t>,</m:t>
+        </m:r>
+        <m:r>
+          <m:t>k</m:t>
+        </m:r>
+        <m:r>
+          <m:rPr>
+            <m:sty m:val="p"/>
+          </m:rPr>
+          <m:t>)</m:t>
+        </m:r>
+        <m:r>
+          <m:rPr>
+            <m:sty m:val="p"/>
+          </m:rPr>
+          <m:t>=</m:t>
+        </m:r>
+        <m:sSub>
+          <m:e>
+            <m:r>
+              <m:rPr>
+                <m:sty m:val="p"/>
+              </m:rPr>
+              <m:t>log</m:t>
+            </m:r>
+          </m:e>
+          <m:sub>
+            <m:r>
+              <m:t>2</m:t>
+            </m:r>
+          </m:sub>
+        </m:sSub>
+        <m:r>
+          <m:rPr>
+            <m:sty m:val="p"/>
+          </m:rPr>
+          <m:t>(</m:t>
+        </m:r>
+        <m:sSub>
+          <m:e>
+            <m:r>
+              <m:t>x</m:t>
+            </m:r>
+          </m:e>
+          <m:sub>
+            <m:r>
+              <m:rPr>
+                <m:sty m:val="p"/>
+              </m:rPr>
+              <m:t>f</m:t>
+            </m:r>
+            <m:r>
+              <m:rPr>
+                <m:sty m:val="p"/>
+              </m:rPr>
+              <m:t>l</m:t>
+            </m:r>
+            <m:r>
+              <m:rPr>
+                <m:sty m:val="p"/>
+              </m:rPr>
+              <m:t>i</m:t>
+            </m:r>
+            <m:r>
+              <m:rPr>
+                <m:sty m:val="p"/>
+              </m:rPr>
+              <m:t>g</m:t>
+            </m:r>
+            <m:r>
+              <m:rPr>
+                <m:sty m:val="p"/>
+              </m:rPr>
+              <m:t>h</m:t>
+            </m:r>
+            <m:r>
+              <m:rPr>
+                <m:sty m:val="p"/>
+              </m:rPr>
+              <m:t>t</m:t>
+            </m:r>
+          </m:sub>
+        </m:sSub>
+        <m:r>
+          <m:rPr>
+            <m:sty m:val="p"/>
+          </m:rPr>
+          <m:t>(</m:t>
+        </m:r>
+        <m:r>
+          <m:t>g</m:t>
+        </m:r>
+        <m:r>
+          <m:rPr>
+            <m:sty m:val="p"/>
+          </m:rPr>
+          <m:t>,</m:t>
+        </m:r>
+        <m:r>
+          <m:t>k</m:t>
+        </m:r>
+        <m:r>
+          <m:rPr>
+            <m:sty m:val="p"/>
+          </m:rPr>
+          <m:t>)</m:t>
+        </m:r>
+        <m:r>
+          <m:rPr>
+            <m:sty m:val="p"/>
+          </m:rPr>
+          <m:t>)</m:t>
+        </m:r>
+        <m:r>
+          <m:rPr>
+            <m:sty m:val="p"/>
+          </m:rPr>
+          <m:t>−</m:t>
+        </m:r>
+        <m:sSub>
+          <m:e>
+            <m:r>
+              <m:rPr>
+                <m:sty m:val="p"/>
+              </m:rPr>
+              <m:t>mean</m:t>
+            </m:r>
+          </m:e>
+          <m:sub>
+            <m:r>
+              <m:t>j</m:t>
+            </m:r>
+          </m:sub>
+        </m:sSub>
+        <m:r>
+          <m:rPr>
+            <m:sty m:val="p"/>
+          </m:rPr>
+          <m:t>[</m:t>
+        </m:r>
+        <m:sSub>
+          <m:e>
+            <m:r>
+              <m:rPr>
+                <m:sty m:val="p"/>
+              </m:rPr>
+              <m:t>log</m:t>
+            </m:r>
+          </m:e>
+          <m:sub>
+            <m:r>
+              <m:t>2</m:t>
+            </m:r>
+          </m:sub>
+        </m:sSub>
+        <m:r>
+          <m:rPr>
+            <m:sty m:val="p"/>
+          </m:rPr>
+          <m:t>(</m:t>
+        </m:r>
+        <m:sSub>
+          <m:e>
+            <m:r>
+              <m:t>x</m:t>
+            </m:r>
+          </m:e>
+          <m:sub>
+            <m:r>
+              <m:rPr>
+                <m:sty m:val="p"/>
+              </m:rPr>
+              <m:t>g</m:t>
+            </m:r>
+            <m:r>
+              <m:rPr>
+                <m:sty m:val="p"/>
+              </m:rPr>
+              <m:t>r</m:t>
+            </m:r>
+            <m:r>
+              <m:rPr>
+                <m:sty m:val="p"/>
+              </m:rPr>
+              <m:t>o</m:t>
+            </m:r>
+            <m:r>
+              <m:rPr>
+                <m:sty m:val="p"/>
+              </m:rPr>
+              <m:t>u</m:t>
+            </m:r>
+            <m:r>
+              <m:rPr>
+                <m:sty m:val="p"/>
+              </m:rPr>
+              <m:t>n</m:t>
+            </m:r>
+            <m:r>
+              <m:rPr>
+                <m:sty m:val="p"/>
+              </m:rPr>
+              <m:t>d</m:t>
+            </m:r>
+          </m:sub>
+        </m:sSub>
+        <m:r>
+          <m:rPr>
+            <m:sty m:val="p"/>
+          </m:rPr>
+          <m:t>(</m:t>
+        </m:r>
+        <m:r>
+          <m:t>g</m:t>
+        </m:r>
+        <m:r>
+          <m:rPr>
+            <m:sty m:val="p"/>
+          </m:rPr>
+          <m:t>,</m:t>
+        </m:r>
+        <m:r>
+          <m:t>j</m:t>
+        </m:r>
+        <m:r>
+          <m:rPr>
+            <m:sty m:val="p"/>
+          </m:rPr>
+          <m:t>)</m:t>
+        </m:r>
+        <m:r>
+          <m:rPr>
+            <m:sty m:val="p"/>
+          </m:rPr>
+          <m:t>)</m:t>
+        </m:r>
+        <m:r>
+          <m:rPr>
+            <m:sty m:val="p"/>
+          </m:rPr>
+          <m:t>]</m:t>
+        </m:r>
+      </m:oMath>
+      <w:r>
+        <w:rPr>
+          <w:rFonts w:ascii="Calibri" w:hAnsi="Calibri"/>
+          <w:color w:val="262626"/>
+          <w:sz w:val="20"/>
+        </w:rPr>
+        <w:t>, where x represents normalized source expression values. Sample-level pathway activity scores were computed as the arithmetic mean of log2FC values across all detected member Ensembl IDs for each of the 15 predefined GO terms.</w:t>
       </w:r>
     </w:p>
     <w:p>
@@ -248,7 +741,323 @@
           <w:color w:val="262626"/>
           <w:sz w:val="20"/>
         </w:rPr>
-        <w:t>Within each of the 26 anatomical tissues, pairwise Spearman rank correlation coefficients (ρ) were calculated among the 15 pathway scores across individual flight specimens (Supplementary Table S5). To synthesize a consensus cross-tissue co-response architecture, correlation coefficients were transformed using the Fisher-z transformation: z = arctanh(ρ), with bounded inputs within [-1 + 10^(−12), 1 − 10^(−12)] and |z| ≤ 5.0. Cross-tissue integration was performed by computing the equal-weight mean z̄ across the 23 tissues with sufficient flight sample sizes (n_flight ≥ 5). Three tissues with limited sample numbers—Colon (n = 4), Heart (n = 3), and Femoral skin (n = 2)—were evaluated in tissue-specific correlation profiles (Supplementary Table S5) and excluded from the cross-tissue pooled integration. The consensus correlation matrix was obtained by back-transformation: ρ̄ = tanh(z̄), yielding the consensus 15 × 15 cross-tissue pathway co-response matrix compiled in Supplementary Table S4.</w:t>
+        <w:t>Within each of the 26 anatomical tissues, pairwise Spearman rank correlation coefficients (</w:t>
+      </w:r>
+      <m:oMath xmlns:a="http://schemas.openxmlformats.org/drawingml/2006/main" xmlns:pic="http://schemas.openxmlformats.org/drawingml/2006/picture">
+        <m:r>
+          <m:t>ρ</m:t>
+        </m:r>
+      </m:oMath>
+      <w:r>
+        <w:rPr>
+          <w:rFonts w:ascii="Calibri" w:hAnsi="Calibri"/>
+          <w:color w:val="262626"/>
+          <w:sz w:val="20"/>
+        </w:rPr>
+        <w:t xml:space="preserve">) were calculated among the 15 pathway scores across individual flight specimens (Supplementary Table S5). To synthesize a consensus cross-tissue co-response architecture, correlation coefficients were transformed using the Fisher-z transformation: </w:t>
+      </w:r>
+      <m:oMath xmlns:a="http://schemas.openxmlformats.org/drawingml/2006/main" xmlns:pic="http://schemas.openxmlformats.org/drawingml/2006/picture">
+        <m:r>
+          <m:t>z</m:t>
+        </m:r>
+        <m:r>
+          <m:rPr>
+            <m:sty m:val="p"/>
+          </m:rPr>
+          <m:t>=</m:t>
+        </m:r>
+        <m:r>
+          <m:rPr>
+            <m:sty m:val="p"/>
+          </m:rPr>
+          <m:t>arctanh</m:t>
+        </m:r>
+        <m:r>
+          <m:rPr>
+            <m:sty m:val="p"/>
+          </m:rPr>
+          <m:t>(</m:t>
+        </m:r>
+        <m:r>
+          <m:t>ρ</m:t>
+        </m:r>
+        <m:r>
+          <m:rPr>
+            <m:sty m:val="p"/>
+          </m:rPr>
+          <m:t>)</m:t>
+        </m:r>
+      </m:oMath>
+      <w:r>
+        <w:rPr>
+          <w:rFonts w:ascii="Calibri" w:hAnsi="Calibri"/>
+          <w:color w:val="262626"/>
+          <w:sz w:val="20"/>
+        </w:rPr>
+        <w:t xml:space="preserve">, with bounded inputs within </w:t>
+      </w:r>
+      <m:oMath xmlns:a="http://schemas.openxmlformats.org/drawingml/2006/main" xmlns:pic="http://schemas.openxmlformats.org/drawingml/2006/picture">
+        <m:r>
+          <m:rPr>
+            <m:sty m:val="p"/>
+          </m:rPr>
+          <m:t>[</m:t>
+        </m:r>
+        <m:r>
+          <m:rPr>
+            <m:sty m:val="p"/>
+          </m:rPr>
+          <m:t>−</m:t>
+        </m:r>
+        <m:r>
+          <m:t>1</m:t>
+        </m:r>
+        <m:r>
+          <m:rPr>
+            <m:sty m:val="p"/>
+          </m:rPr>
+          <m:t>+</m:t>
+        </m:r>
+        <m:sSup>
+          <m:e>
+            <m:r>
+              <m:t>10</m:t>
+            </m:r>
+          </m:e>
+          <m:sup>
+            <m:r>
+              <m:rPr>
+                <m:sty m:val="p"/>
+              </m:rPr>
+              <m:t>−</m:t>
+            </m:r>
+            <m:r>
+              <m:t>12</m:t>
+            </m:r>
+          </m:sup>
+        </m:sSup>
+        <m:r>
+          <m:rPr>
+            <m:sty m:val="p"/>
+          </m:rPr>
+          <m:t>,</m:t>
+        </m:r>
+        <m:r>
+          <m:t> </m:t>
+        </m:r>
+        <m:r>
+          <m:t>1</m:t>
+        </m:r>
+        <m:r>
+          <m:rPr>
+            <m:sty m:val="p"/>
+          </m:rPr>
+          <m:t>−</m:t>
+        </m:r>
+        <m:sSup>
+          <m:e>
+            <m:r>
+              <m:t>10</m:t>
+            </m:r>
+          </m:e>
+          <m:sup>
+            <m:r>
+              <m:rPr>
+                <m:sty m:val="p"/>
+              </m:rPr>
+              <m:t>−</m:t>
+            </m:r>
+            <m:r>
+              <m:t>12</m:t>
+            </m:r>
+          </m:sup>
+        </m:sSup>
+        <m:r>
+          <m:rPr>
+            <m:sty m:val="p"/>
+          </m:rPr>
+          <m:t>]</m:t>
+        </m:r>
+      </m:oMath>
+      <w:r>
+        <w:rPr>
+          <w:rFonts w:ascii="Calibri" w:hAnsi="Calibri"/>
+          <w:color w:val="262626"/>
+          <w:sz w:val="20"/>
+        </w:rPr>
+        <w:t xml:space="preserve"> and </w:t>
+      </w:r>
+      <m:oMath xmlns:a="http://schemas.openxmlformats.org/drawingml/2006/main" xmlns:pic="http://schemas.openxmlformats.org/drawingml/2006/picture">
+        <m:r>
+          <m:rPr>
+            <m:sty m:val="p"/>
+          </m:rPr>
+          <m:t>|</m:t>
+        </m:r>
+        <m:r>
+          <m:t>z</m:t>
+        </m:r>
+        <m:r>
+          <m:rPr>
+            <m:sty m:val="p"/>
+          </m:rPr>
+          <m:t>|</m:t>
+        </m:r>
+        <m:r>
+          <m:rPr>
+            <m:sty m:val="p"/>
+          </m:rPr>
+          <m:t>≤</m:t>
+        </m:r>
+        <m:r>
+          <m:t>5.0</m:t>
+        </m:r>
+      </m:oMath>
+      <w:r>
+        <w:rPr>
+          <w:rFonts w:ascii="Calibri" w:hAnsi="Calibri"/>
+          <w:color w:val="262626"/>
+          <w:sz w:val="20"/>
+        </w:rPr>
+        <w:t xml:space="preserve">. Cross-tissue integration was performed by computing the equal-weight mean </w:t>
+      </w:r>
+      <m:oMath xmlns:a="http://schemas.openxmlformats.org/drawingml/2006/main" xmlns:pic="http://schemas.openxmlformats.org/drawingml/2006/picture">
+        <m:acc>
+          <m:accPr>
+            <m:chr m:val="‾"/>
+          </m:accPr>
+          <m:e>
+            <m:r>
+              <m:t>z</m:t>
+            </m:r>
+          </m:e>
+        </m:acc>
+      </m:oMath>
+      <w:r>
+        <w:rPr>
+          <w:rFonts w:ascii="Calibri" w:hAnsi="Calibri"/>
+          <w:color w:val="262626"/>
+          <w:sz w:val="20"/>
+        </w:rPr>
+        <w:t xml:space="preserve"> across the 23 tissues with sufficient flight sample sizes (</w:t>
+      </w:r>
+      <m:oMath xmlns:a="http://schemas.openxmlformats.org/drawingml/2006/main" xmlns:pic="http://schemas.openxmlformats.org/drawingml/2006/picture">
+        <m:sSub>
+          <m:e>
+            <m:r>
+              <m:t>n</m:t>
+            </m:r>
+          </m:e>
+          <m:sub>
+            <m:r>
+              <m:rPr>
+                <m:sty m:val="p"/>
+              </m:rPr>
+              <m:t>f</m:t>
+            </m:r>
+            <m:r>
+              <m:rPr>
+                <m:sty m:val="p"/>
+              </m:rPr>
+              <m:t>l</m:t>
+            </m:r>
+            <m:r>
+              <m:rPr>
+                <m:sty m:val="p"/>
+              </m:rPr>
+              <m:t>i</m:t>
+            </m:r>
+            <m:r>
+              <m:rPr>
+                <m:sty m:val="p"/>
+              </m:rPr>
+              <m:t>g</m:t>
+            </m:r>
+            <m:r>
+              <m:rPr>
+                <m:sty m:val="p"/>
+              </m:rPr>
+              <m:t>h</m:t>
+            </m:r>
+            <m:r>
+              <m:rPr>
+                <m:sty m:val="p"/>
+              </m:rPr>
+              <m:t>t</m:t>
+            </m:r>
+          </m:sub>
+        </m:sSub>
+        <m:r>
+          <m:rPr>
+            <m:sty m:val="p"/>
+          </m:rPr>
+          <m:t>≥</m:t>
+        </m:r>
+        <m:r>
+          <m:t>5</m:t>
+        </m:r>
+      </m:oMath>
+      <w:r>
+        <w:rPr>
+          <w:rFonts w:ascii="Calibri" w:hAnsi="Calibri"/>
+          <w:color w:val="262626"/>
+          <w:sz w:val="20"/>
+        </w:rPr>
+        <w:t xml:space="preserve">). Three tissues with limited sample numbers—Colon (n = 4), Heart (n = 3), and Femoral skin (n = 2)—were evaluated in tissue-specific correlation profiles (Supplementary Table S5) and excluded from the cross-tissue pooled integration. The consensus correlation matrix was obtained by back-transformation: </w:t>
+      </w:r>
+      <m:oMath xmlns:a="http://schemas.openxmlformats.org/drawingml/2006/main" xmlns:pic="http://schemas.openxmlformats.org/drawingml/2006/picture">
+        <m:acc>
+          <m:accPr>
+            <m:chr m:val="‾"/>
+          </m:accPr>
+          <m:e>
+            <m:r>
+              <m:t>ρ</m:t>
+            </m:r>
+          </m:e>
+        </m:acc>
+        <m:r>
+          <m:rPr>
+            <m:sty m:val="p"/>
+          </m:rPr>
+          <m:t>=</m:t>
+        </m:r>
+        <m:r>
+          <m:rPr>
+            <m:sty m:val="p"/>
+          </m:rPr>
+          <m:t>tanh</m:t>
+        </m:r>
+        <m:r>
+          <m:rPr>
+            <m:sty m:val="p"/>
+          </m:rPr>
+          <m:t>(</m:t>
+        </m:r>
+        <m:acc>
+          <m:accPr>
+            <m:chr m:val="‾"/>
+          </m:accPr>
+          <m:e>
+            <m:r>
+              <m:t>z</m:t>
+            </m:r>
+          </m:e>
+        </m:acc>
+        <m:r>
+          <m:rPr>
+            <m:sty m:val="p"/>
+          </m:rPr>
+          <m:t>)</m:t>
+        </m:r>
+      </m:oMath>
+      <w:r>
+        <w:rPr>
+          <w:rFonts w:ascii="Calibri" w:hAnsi="Calibri"/>
+          <w:color w:val="262626"/>
+          <w:sz w:val="20"/>
+        </w:rPr>
+        <w:t>, yielding the consensus 15 × 15 cross-tissue pathway co-response matrix compiled in Supplementary Table S4.</w:t>
       </w:r>
     </w:p>
     <w:p>
@@ -285,7 +1094,87 @@
           <w:color w:val="262626"/>
           <w:sz w:val="20"/>
         </w:rPr>
-        <w:t>To determine whether shared or tissue-specific gene repertoires drive spaceflight DDR perturbations, binary detection matrices of Ensembl IDs belonging to the core DDR term (GO:0006974) were evaluated. A member gene was defined as present when its normalized source expression was finite and greater than zero. Combinatorial overlap and intersection sets of expressed DDR genes were quantified across independent flight comparisons within Thymus (4 comparisons; Supplementary Table S6), Kidney (5 accessions; Supplementary Table S7), as well as across tissue cohorts exhibiting pronounced positive enrichment (NES &gt; 1) and negative enrichment (NES &lt; −1) (Supplementary Table S8).</w:t>
+        <w:t>To determine whether shared or tissue-specific gene repertoires drive spaceflight DDR perturbations, binary detection matrices of Ensembl IDs belonging to the core DDR term (GO:0006974) were evaluated. A member gene was defined as present when its normalized source expression was finite and greater than zero. Combinatorial overlap and intersection sets of expressed DDR genes were quantified across independent flight comparisons within Thymus (4 comparisons; Supplementary Table S6), Kidney (5 accessions; Supplementary Table S7), as well as across tissue cohorts exhibiting pronounced positive enrichment (</w:t>
+      </w:r>
+      <m:oMath xmlns:a="http://schemas.openxmlformats.org/drawingml/2006/main" xmlns:pic="http://schemas.openxmlformats.org/drawingml/2006/picture">
+        <m:r>
+          <m:rPr>
+            <m:sty m:val="p"/>
+          </m:rPr>
+          <m:t>N</m:t>
+        </m:r>
+        <m:r>
+          <m:rPr>
+            <m:sty m:val="p"/>
+          </m:rPr>
+          <m:t>E</m:t>
+        </m:r>
+        <m:r>
+          <m:rPr>
+            <m:sty m:val="p"/>
+          </m:rPr>
+          <m:t>S</m:t>
+        </m:r>
+        <m:r>
+          <m:rPr>
+            <m:sty m:val="p"/>
+          </m:rPr>
+          <m:t>&gt;</m:t>
+        </m:r>
+        <m:r>
+          <m:t>1</m:t>
+        </m:r>
+      </m:oMath>
+      <w:r>
+        <w:rPr>
+          <w:rFonts w:ascii="Calibri" w:hAnsi="Calibri"/>
+          <w:color w:val="262626"/>
+          <w:sz w:val="20"/>
+        </w:rPr>
+        <w:t>) and negative enrichment (</w:t>
+      </w:r>
+      <m:oMath xmlns:a="http://schemas.openxmlformats.org/drawingml/2006/main" xmlns:pic="http://schemas.openxmlformats.org/drawingml/2006/picture">
+        <m:r>
+          <m:rPr>
+            <m:sty m:val="p"/>
+          </m:rPr>
+          <m:t>N</m:t>
+        </m:r>
+        <m:r>
+          <m:rPr>
+            <m:sty m:val="p"/>
+          </m:rPr>
+          <m:t>E</m:t>
+        </m:r>
+        <m:r>
+          <m:rPr>
+            <m:sty m:val="p"/>
+          </m:rPr>
+          <m:t>S</m:t>
+        </m:r>
+        <m:r>
+          <m:rPr>
+            <m:sty m:val="p"/>
+          </m:rPr>
+          <m:t>&lt;</m:t>
+        </m:r>
+        <m:r>
+          <m:rPr>
+            <m:sty m:val="p"/>
+          </m:rPr>
+          <m:t>−</m:t>
+        </m:r>
+        <m:r>
+          <m:t>1</m:t>
+        </m:r>
+      </m:oMath>
+      <w:r>
+        <w:rPr>
+          <w:rFonts w:ascii="Calibri" w:hAnsi="Calibri"/>
+          <w:color w:val="262626"/>
+          <w:sz w:val="20"/>
+        </w:rPr>
+        <w:t>) (Supplementary Table S8).</w:t>
       </w:r>
     </w:p>
     <w:p>
@@ -307,7 +1196,140 @@
           <w:color w:val="262626"/>
           <w:sz w:val="20"/>
         </w:rPr>
-        <w:t>To identify core responsive genes exhibiting reproducible, unidirectional regulation under spaceflight stress across parallel studies, candidate genes were prioritized based on directional concordance. Mission-level differential expression statistics were corrected using Benjamini–Hochberg FDR (threshold FDR ≤ 0.05 for Thymus and Kidney; FDR ≤ 0.10 for the high- and low-NES tissue cohorts). Qualifying genes were required to display identical non-zero log2FC signs across all parallel comparisons within the cohort. Concordant genes were then ranked by their minimum effect magnitude across comparisons: Score_g = min_c |log2FC(g,c)|. This prioritization identified 30 top concordant genes in Thymus (Supplementary Table S6), 12 in Kidney (Supplementary Table S7), 5 in high-NES tissues, and 11 in low-NES tissues (Supplementary Table S8), compiling comparison-specific log2FC values, FDR significance, and concordance scores.</w:t>
+        <w:t xml:space="preserve">To identify core responsive genes exhibiting reproducible, unidirectional regulation under spaceflight stress across parallel studies, candidate genes were prioritized based on directional concordance. Mission-level differential expression statistics were corrected using Benjamini–Hochberg FDR (threshold FDR ≤ 0.05 for Thymus and Kidney; FDR ≤ 0.10 for the high- and low-NES tissue cohorts). Qualifying genes were required to display identical non-zero log2FC signs across all parallel comparisons within the cohort. Concordant genes were then ranked by their minimum effect magnitude across comparisons: </w:t>
+      </w:r>
+      <m:oMath xmlns:a="http://schemas.openxmlformats.org/drawingml/2006/main" xmlns:pic="http://schemas.openxmlformats.org/drawingml/2006/picture">
+        <m:sSub>
+          <m:e>
+            <m:r>
+              <m:rPr>
+                <m:sty m:val="p"/>
+              </m:rPr>
+              <m:t>S</m:t>
+            </m:r>
+            <m:r>
+              <m:rPr>
+                <m:sty m:val="p"/>
+              </m:rPr>
+              <m:t>c</m:t>
+            </m:r>
+            <m:r>
+              <m:rPr>
+                <m:sty m:val="p"/>
+              </m:rPr>
+              <m:t>o</m:t>
+            </m:r>
+            <m:r>
+              <m:rPr>
+                <m:sty m:val="p"/>
+              </m:rPr>
+              <m:t>r</m:t>
+            </m:r>
+            <m:r>
+              <m:rPr>
+                <m:sty m:val="p"/>
+              </m:rPr>
+              <m:t>e</m:t>
+            </m:r>
+          </m:e>
+          <m:sub>
+            <m:r>
+              <m:t>g</m:t>
+            </m:r>
+          </m:sub>
+        </m:sSub>
+        <m:r>
+          <m:rPr>
+            <m:sty m:val="p"/>
+          </m:rPr>
+          <m:t>=</m:t>
+        </m:r>
+        <m:sSub>
+          <m:e>
+            <m:r>
+              <m:rPr>
+                <m:sty m:val="p"/>
+              </m:rPr>
+              <m:t>min</m:t>
+            </m:r>
+          </m:e>
+          <m:sub>
+            <m:r>
+              <m:t>c</m:t>
+            </m:r>
+          </m:sub>
+        </m:sSub>
+        <m:r>
+          <m:rPr>
+            <m:sty m:val="p"/>
+          </m:rPr>
+          <m:t>|</m:t>
+        </m:r>
+        <m:sSub>
+          <m:e>
+            <m:r>
+              <m:rPr>
+                <m:sty m:val="p"/>
+              </m:rPr>
+              <m:t>log</m:t>
+            </m:r>
+          </m:e>
+          <m:sub>
+            <m:r>
+              <m:t>2</m:t>
+            </m:r>
+          </m:sub>
+        </m:sSub>
+        <m:r>
+          <m:rPr>
+            <m:sty m:val="p"/>
+          </m:rPr>
+          <m:t>F</m:t>
+        </m:r>
+        <m:r>
+          <m:rPr>
+            <m:sty m:val="p"/>
+          </m:rPr>
+          <m:t>C</m:t>
+        </m:r>
+        <m:r>
+          <m:rPr>
+            <m:sty m:val="p"/>
+          </m:rPr>
+          <m:t>(</m:t>
+        </m:r>
+        <m:r>
+          <m:t>g</m:t>
+        </m:r>
+        <m:r>
+          <m:rPr>
+            <m:sty m:val="p"/>
+          </m:rPr>
+          <m:t>,</m:t>
+        </m:r>
+        <m:r>
+          <m:t>c</m:t>
+        </m:r>
+        <m:r>
+          <m:rPr>
+            <m:sty m:val="p"/>
+          </m:rPr>
+          <m:t>)</m:t>
+        </m:r>
+        <m:r>
+          <m:rPr>
+            <m:sty m:val="p"/>
+          </m:rPr>
+          <m:t>|</m:t>
+        </m:r>
+      </m:oMath>
+      <w:r>
+        <w:rPr>
+          <w:rFonts w:ascii="Calibri" w:hAnsi="Calibri"/>
+          <w:color w:val="262626"/>
+          <w:sz w:val="20"/>
+        </w:rPr>
+        <w:t>. This prioritization identified 30 top concordant genes in Thymus (Supplementary Table S6), 12 in Kidney (Supplementary Table S7), 5 in high-NES tissues, and 11 in low-NES tissues (Supplementary Table S8), compiling comparison-specific log2FC values, FDR significance, and concordance scores.</w:t>
       </w:r>
     </w:p>
     <w:p>
@@ -344,7 +1366,134 @@
           <w:color w:val="262626"/>
           <w:sz w:val="20"/>
         </w:rPr>
-        <w:t>To characterize baseline expression patterns and tissue divergence in double-strand break (DSB) repair machinery, flight transcriptomic profiles were normalized using YARN tissue-aware quantile smoothing (yarn::normalizeTissueAware; groups = tissue, normalizationMethod = 'qsmooth', window = 0.05, log = TRUE). Normalization was conducted across a background universe of 12,462 Ensembl genes, 360 flight biospecimens, 59 analysis units, and 26 tissues. For DSB architecture analysis, 29 curated pathway components were compiled across non-homologous end joining (NHEJ, 7 genes), homologous recombination (HR, 14 genes), HR/A-EJ shared components (3 genes), and alternative end joining (A-EJ, 5 genes). Expression profiles were sequentially aggregated by biospecimen, analysis unit, mission, and tissue. Pairwise tissue dissimilarity was calculated as D(Ta, Tb) = 1 − ρ_Spearman on tissue-mean YARN normalized log2 profiles, followed by average-linkage hierarchical clustering to evaluate anatomical relationships and cross-tissue co-expression clustering (Supplementary Table S9).</w:t>
+        <w:t xml:space="preserve">To characterize baseline expression patterns and tissue divergence in double-strand break (DSB) repair machinery, flight transcriptomic profiles were normalized using YARN tissue-aware quantile smoothing (yarn::normalizeTissueAware; groups = tissue, normalizationMethod = 'qsmooth', window = 0.05, log = TRUE). Normalization was conducted across a background universe of 12,462 Ensembl genes, 360 flight biospecimens, 59 analysis units, and 26 tissues. For DSB architecture analysis, 29 curated pathway components were compiled across non-homologous end joining (NHEJ, 7 genes), homologous recombination (HR, 14 genes), HR/A-EJ shared components (3 genes), and alternative end joining (A-EJ, 5 genes). Expression profiles were sequentially aggregated by biospecimen, analysis unit, mission, and tissue. Pairwise tissue dissimilarity was calculated as </w:t>
+      </w:r>
+      <m:oMath xmlns:a="http://schemas.openxmlformats.org/drawingml/2006/main" xmlns:pic="http://schemas.openxmlformats.org/drawingml/2006/picture">
+        <m:r>
+          <m:t>D</m:t>
+        </m:r>
+        <m:r>
+          <m:rPr>
+            <m:sty m:val="p"/>
+          </m:rPr>
+          <m:t>(</m:t>
+        </m:r>
+        <m:sSub>
+          <m:e>
+            <m:r>
+              <m:t>T</m:t>
+            </m:r>
+          </m:e>
+          <m:sub>
+            <m:r>
+              <m:t>a</m:t>
+            </m:r>
+          </m:sub>
+        </m:sSub>
+        <m:r>
+          <m:rPr>
+            <m:sty m:val="p"/>
+          </m:rPr>
+          <m:t>,</m:t>
+        </m:r>
+        <m:sSub>
+          <m:e>
+            <m:r>
+              <m:t>T</m:t>
+            </m:r>
+          </m:e>
+          <m:sub>
+            <m:r>
+              <m:t>b</m:t>
+            </m:r>
+          </m:sub>
+        </m:sSub>
+        <m:r>
+          <m:rPr>
+            <m:sty m:val="p"/>
+          </m:rPr>
+          <m:t>)</m:t>
+        </m:r>
+        <m:r>
+          <m:rPr>
+            <m:sty m:val="p"/>
+          </m:rPr>
+          <m:t>=</m:t>
+        </m:r>
+        <m:r>
+          <m:t>1</m:t>
+        </m:r>
+        <m:r>
+          <m:rPr>
+            <m:sty m:val="p"/>
+          </m:rPr>
+          <m:t>−</m:t>
+        </m:r>
+        <m:sSub>
+          <m:e>
+            <m:r>
+              <m:t>ρ</m:t>
+            </m:r>
+          </m:e>
+          <m:sub>
+            <m:r>
+              <m:rPr>
+                <m:sty m:val="p"/>
+              </m:rPr>
+              <m:t>S</m:t>
+            </m:r>
+            <m:r>
+              <m:rPr>
+                <m:sty m:val="p"/>
+              </m:rPr>
+              <m:t>p</m:t>
+            </m:r>
+            <m:r>
+              <m:rPr>
+                <m:sty m:val="p"/>
+              </m:rPr>
+              <m:t>e</m:t>
+            </m:r>
+            <m:r>
+              <m:rPr>
+                <m:sty m:val="p"/>
+              </m:rPr>
+              <m:t>a</m:t>
+            </m:r>
+            <m:r>
+              <m:rPr>
+                <m:sty m:val="p"/>
+              </m:rPr>
+              <m:t>r</m:t>
+            </m:r>
+            <m:r>
+              <m:rPr>
+                <m:sty m:val="p"/>
+              </m:rPr>
+              <m:t>m</m:t>
+            </m:r>
+            <m:r>
+              <m:rPr>
+                <m:sty m:val="p"/>
+              </m:rPr>
+              <m:t>a</m:t>
+            </m:r>
+            <m:r>
+              <m:rPr>
+                <m:sty m:val="p"/>
+              </m:rPr>
+              <m:t>n</m:t>
+            </m:r>
+          </m:sub>
+        </m:sSub>
+      </m:oMath>
+      <w:r>
+        <w:rPr>
+          <w:rFonts w:ascii="Calibri" w:hAnsi="Calibri"/>
+          <w:color w:val="262626"/>
+          <w:sz w:val="20"/>
+        </w:rPr>
+        <w:t xml:space="preserve"> on tissue-mean YARN normalized log2 profiles, followed by average-linkage hierarchical clustering to evaluate anatomical relationships and cross-tissue co-expression clustering (Supplementary Table S9).</w:t>
       </w:r>
     </w:p>
     <w:p>
@@ -366,7 +1515,251 @@
           <w:color w:val="262626"/>
           <w:sz w:val="20"/>
         </w:rPr>
-        <w:t>To quantify physiological expression distributions and tissue-specific abundance of key DSB repair machinery, representative marker genes were quantified on the back-transformed linear normalized expression scale (Expression_linear = 2^(YARNNormalizedLog2) − 1) across 360 flight biospecimens in the 26 anatomical tissues (Supplementary Table S10):</w:t>
+        <w:t>To quantify physiological expression distributions and tissue-specific abundance of key DSB repair machinery, representative marker genes were quantified on the back-transformed linear normalized expression scale (</w:t>
+      </w:r>
+      <m:oMath xmlns:a="http://schemas.openxmlformats.org/drawingml/2006/main" xmlns:pic="http://schemas.openxmlformats.org/drawingml/2006/picture">
+        <m:sSub>
+          <m:e>
+            <m:r>
+              <m:rPr>
+                <m:sty m:val="p"/>
+              </m:rPr>
+              <m:t>E</m:t>
+            </m:r>
+            <m:r>
+              <m:rPr>
+                <m:sty m:val="p"/>
+              </m:rPr>
+              <m:t>x</m:t>
+            </m:r>
+            <m:r>
+              <m:rPr>
+                <m:sty m:val="p"/>
+              </m:rPr>
+              <m:t>p</m:t>
+            </m:r>
+            <m:r>
+              <m:rPr>
+                <m:sty m:val="p"/>
+              </m:rPr>
+              <m:t>r</m:t>
+            </m:r>
+            <m:r>
+              <m:rPr>
+                <m:sty m:val="p"/>
+              </m:rPr>
+              <m:t>e</m:t>
+            </m:r>
+            <m:r>
+              <m:rPr>
+                <m:sty m:val="p"/>
+              </m:rPr>
+              <m:t>s</m:t>
+            </m:r>
+            <m:r>
+              <m:rPr>
+                <m:sty m:val="p"/>
+              </m:rPr>
+              <m:t>s</m:t>
+            </m:r>
+            <m:r>
+              <m:rPr>
+                <m:sty m:val="p"/>
+              </m:rPr>
+              <m:t>i</m:t>
+            </m:r>
+            <m:r>
+              <m:rPr>
+                <m:sty m:val="p"/>
+              </m:rPr>
+              <m:t>o</m:t>
+            </m:r>
+            <m:r>
+              <m:rPr>
+                <m:sty m:val="p"/>
+              </m:rPr>
+              <m:t>n</m:t>
+            </m:r>
+          </m:e>
+          <m:sub>
+            <m:r>
+              <m:rPr>
+                <m:sty m:val="p"/>
+              </m:rPr>
+              <m:t>l</m:t>
+            </m:r>
+            <m:r>
+              <m:rPr>
+                <m:sty m:val="p"/>
+              </m:rPr>
+              <m:t>i</m:t>
+            </m:r>
+            <m:r>
+              <m:rPr>
+                <m:sty m:val="p"/>
+              </m:rPr>
+              <m:t>n</m:t>
+            </m:r>
+            <m:r>
+              <m:rPr>
+                <m:sty m:val="p"/>
+              </m:rPr>
+              <m:t>e</m:t>
+            </m:r>
+            <m:r>
+              <m:rPr>
+                <m:sty m:val="p"/>
+              </m:rPr>
+              <m:t>a</m:t>
+            </m:r>
+            <m:r>
+              <m:rPr>
+                <m:sty m:val="p"/>
+              </m:rPr>
+              <m:t>r</m:t>
+            </m:r>
+          </m:sub>
+        </m:sSub>
+        <m:r>
+          <m:rPr>
+            <m:sty m:val="p"/>
+          </m:rPr>
+          <m:t>=</m:t>
+        </m:r>
+        <m:sSup>
+          <m:e>
+            <m:r>
+              <m:t>2</m:t>
+            </m:r>
+          </m:e>
+          <m:sup>
+            <m:r>
+              <m:rPr>
+                <m:sty m:val="p"/>
+              </m:rPr>
+              <m:t>Y</m:t>
+            </m:r>
+            <m:r>
+              <m:rPr>
+                <m:sty m:val="p"/>
+              </m:rPr>
+              <m:t>A</m:t>
+            </m:r>
+            <m:r>
+              <m:rPr>
+                <m:sty m:val="p"/>
+              </m:rPr>
+              <m:t>R</m:t>
+            </m:r>
+            <m:r>
+              <m:rPr>
+                <m:sty m:val="p"/>
+              </m:rPr>
+              <m:t>N</m:t>
+            </m:r>
+            <m:r>
+              <m:rPr>
+                <m:sty m:val="p"/>
+              </m:rPr>
+              <m:t>N</m:t>
+            </m:r>
+            <m:r>
+              <m:rPr>
+                <m:sty m:val="p"/>
+              </m:rPr>
+              <m:t>o</m:t>
+            </m:r>
+            <m:r>
+              <m:rPr>
+                <m:sty m:val="p"/>
+              </m:rPr>
+              <m:t>r</m:t>
+            </m:r>
+            <m:r>
+              <m:rPr>
+                <m:sty m:val="p"/>
+              </m:rPr>
+              <m:t>m</m:t>
+            </m:r>
+            <m:r>
+              <m:rPr>
+                <m:sty m:val="p"/>
+              </m:rPr>
+              <m:t>a</m:t>
+            </m:r>
+            <m:r>
+              <m:rPr>
+                <m:sty m:val="p"/>
+              </m:rPr>
+              <m:t>l</m:t>
+            </m:r>
+            <m:r>
+              <m:rPr>
+                <m:sty m:val="p"/>
+              </m:rPr>
+              <m:t>i</m:t>
+            </m:r>
+            <m:r>
+              <m:rPr>
+                <m:sty m:val="p"/>
+              </m:rPr>
+              <m:t>z</m:t>
+            </m:r>
+            <m:r>
+              <m:rPr>
+                <m:sty m:val="p"/>
+              </m:rPr>
+              <m:t>e</m:t>
+            </m:r>
+            <m:r>
+              <m:rPr>
+                <m:sty m:val="p"/>
+              </m:rPr>
+              <m:t>d</m:t>
+            </m:r>
+            <m:r>
+              <m:rPr>
+                <m:sty m:val="p"/>
+              </m:rPr>
+              <m:t>L</m:t>
+            </m:r>
+            <m:r>
+              <m:rPr>
+                <m:sty m:val="p"/>
+              </m:rPr>
+              <m:t>o</m:t>
+            </m:r>
+            <m:r>
+              <m:rPr>
+                <m:sty m:val="p"/>
+              </m:rPr>
+              <m:t>g</m:t>
+            </m:r>
+            <m:r>
+              <m:rPr>
+                <m:sty m:val="p"/>
+              </m:rPr>
+              <m:t>2</m:t>
+            </m:r>
+          </m:sup>
+        </m:sSup>
+        <m:r>
+          <m:rPr>
+            <m:sty m:val="p"/>
+          </m:rPr>
+          <m:t>−</m:t>
+        </m:r>
+        <m:r>
+          <m:t>1</m:t>
+        </m:r>
+      </m:oMath>
+      <w:r>
+        <w:rPr>
+          <w:rFonts w:ascii="Calibri" w:hAnsi="Calibri"/>
+          <w:color w:val="262626"/>
+          <w:sz w:val="20"/>
+        </w:rPr>
+        <w:t>) across 360 flight biospecimens in the 26 anatomical tissues (Supplementary Table S10):</w:t>
       </w:r>
     </w:p>
     <w:p>
@@ -540,7 +1933,134 @@
           <w:color w:val="262626"/>
           <w:sz w:val="20"/>
         </w:rPr>
-        <w:t>To establish baseline expression architectures across single-strand break (SSB) repair mechanisms, a curated panel of 45 components was compiled across the four major SSB pathways: base excision repair (BER, 6 genes), nucleotide excision repair (NER, 18 genes), mismatch repair (MMR, 5 genes), and the Fanconi anemia pathway (FA, 16 genes) (Supplementary Table S12, Supplementary Table S14). Biospecimen expression profiles were normalized using YARN tissue-aware quantile smoothing (qsmooth), followed by successive aggregation to tissue means. Pairwise tissue distances were computed as D(Ta, Tb) = 1 − ρ_Spearman and resolved using average-linkage hierarchical clustering to evaluate cross-tissue organizational relationships (Supplementary Table S12).</w:t>
+        <w:t xml:space="preserve">To establish baseline expression architectures across single-strand break (SSB) repair mechanisms, a curated panel of 45 components was compiled across the four major SSB pathways: base excision repair (BER, 6 genes), nucleotide excision repair (NER, 18 genes), mismatch repair (MMR, 5 genes), and the Fanconi anemia pathway (FA, 16 genes) (Supplementary Table S12, Supplementary Table S14). Biospecimen expression profiles were normalized using YARN tissue-aware quantile smoothing (qsmooth), followed by successive aggregation to tissue means. Pairwise tissue distances were computed as </w:t>
+      </w:r>
+      <m:oMath xmlns:a="http://schemas.openxmlformats.org/drawingml/2006/main" xmlns:pic="http://schemas.openxmlformats.org/drawingml/2006/picture">
+        <m:r>
+          <m:t>D</m:t>
+        </m:r>
+        <m:r>
+          <m:rPr>
+            <m:sty m:val="p"/>
+          </m:rPr>
+          <m:t>(</m:t>
+        </m:r>
+        <m:sSub>
+          <m:e>
+            <m:r>
+              <m:t>T</m:t>
+            </m:r>
+          </m:e>
+          <m:sub>
+            <m:r>
+              <m:t>a</m:t>
+            </m:r>
+          </m:sub>
+        </m:sSub>
+        <m:r>
+          <m:rPr>
+            <m:sty m:val="p"/>
+          </m:rPr>
+          <m:t>,</m:t>
+        </m:r>
+        <m:sSub>
+          <m:e>
+            <m:r>
+              <m:t>T</m:t>
+            </m:r>
+          </m:e>
+          <m:sub>
+            <m:r>
+              <m:t>b</m:t>
+            </m:r>
+          </m:sub>
+        </m:sSub>
+        <m:r>
+          <m:rPr>
+            <m:sty m:val="p"/>
+          </m:rPr>
+          <m:t>)</m:t>
+        </m:r>
+        <m:r>
+          <m:rPr>
+            <m:sty m:val="p"/>
+          </m:rPr>
+          <m:t>=</m:t>
+        </m:r>
+        <m:r>
+          <m:t>1</m:t>
+        </m:r>
+        <m:r>
+          <m:rPr>
+            <m:sty m:val="p"/>
+          </m:rPr>
+          <m:t>−</m:t>
+        </m:r>
+        <m:sSub>
+          <m:e>
+            <m:r>
+              <m:t>ρ</m:t>
+            </m:r>
+          </m:e>
+          <m:sub>
+            <m:r>
+              <m:rPr>
+                <m:sty m:val="p"/>
+              </m:rPr>
+              <m:t>S</m:t>
+            </m:r>
+            <m:r>
+              <m:rPr>
+                <m:sty m:val="p"/>
+              </m:rPr>
+              <m:t>p</m:t>
+            </m:r>
+            <m:r>
+              <m:rPr>
+                <m:sty m:val="p"/>
+              </m:rPr>
+              <m:t>e</m:t>
+            </m:r>
+            <m:r>
+              <m:rPr>
+                <m:sty m:val="p"/>
+              </m:rPr>
+              <m:t>a</m:t>
+            </m:r>
+            <m:r>
+              <m:rPr>
+                <m:sty m:val="p"/>
+              </m:rPr>
+              <m:t>r</m:t>
+            </m:r>
+            <m:r>
+              <m:rPr>
+                <m:sty m:val="p"/>
+              </m:rPr>
+              <m:t>m</m:t>
+            </m:r>
+            <m:r>
+              <m:rPr>
+                <m:sty m:val="p"/>
+              </m:rPr>
+              <m:t>a</m:t>
+            </m:r>
+            <m:r>
+              <m:rPr>
+                <m:sty m:val="p"/>
+              </m:rPr>
+              <m:t>n</m:t>
+            </m:r>
+          </m:sub>
+        </m:sSub>
+      </m:oMath>
+      <w:r>
+        <w:rPr>
+          <w:rFonts w:ascii="Calibri" w:hAnsi="Calibri"/>
+          <w:color w:val="262626"/>
+          <w:sz w:val="20"/>
+        </w:rPr>
+        <w:t xml:space="preserve"> and resolved using average-linkage hierarchical clustering to evaluate cross-tissue organizational relationships (Supplementary Table S12).</w:t>
       </w:r>
     </w:p>
     <w:p>
@@ -562,7 +2082,251 @@
           <w:color w:val="262626"/>
           <w:sz w:val="20"/>
         </w:rPr>
-        <w:t>Tissue-specific expression distributions of key SSB components were evaluated on the back-transformed linear scale (Expression_linear = 2^(YARNNormalizedLog2) − 1) across 360 flight biospecimens in 26 tissues (Supplementary Table S13):</w:t>
+        <w:t>Tissue-specific expression distributions of key SSB components were evaluated on the back-transformed linear scale (</w:t>
+      </w:r>
+      <m:oMath xmlns:a="http://schemas.openxmlformats.org/drawingml/2006/main" xmlns:pic="http://schemas.openxmlformats.org/drawingml/2006/picture">
+        <m:sSub>
+          <m:e>
+            <m:r>
+              <m:rPr>
+                <m:sty m:val="p"/>
+              </m:rPr>
+              <m:t>E</m:t>
+            </m:r>
+            <m:r>
+              <m:rPr>
+                <m:sty m:val="p"/>
+              </m:rPr>
+              <m:t>x</m:t>
+            </m:r>
+            <m:r>
+              <m:rPr>
+                <m:sty m:val="p"/>
+              </m:rPr>
+              <m:t>p</m:t>
+            </m:r>
+            <m:r>
+              <m:rPr>
+                <m:sty m:val="p"/>
+              </m:rPr>
+              <m:t>r</m:t>
+            </m:r>
+            <m:r>
+              <m:rPr>
+                <m:sty m:val="p"/>
+              </m:rPr>
+              <m:t>e</m:t>
+            </m:r>
+            <m:r>
+              <m:rPr>
+                <m:sty m:val="p"/>
+              </m:rPr>
+              <m:t>s</m:t>
+            </m:r>
+            <m:r>
+              <m:rPr>
+                <m:sty m:val="p"/>
+              </m:rPr>
+              <m:t>s</m:t>
+            </m:r>
+            <m:r>
+              <m:rPr>
+                <m:sty m:val="p"/>
+              </m:rPr>
+              <m:t>i</m:t>
+            </m:r>
+            <m:r>
+              <m:rPr>
+                <m:sty m:val="p"/>
+              </m:rPr>
+              <m:t>o</m:t>
+            </m:r>
+            <m:r>
+              <m:rPr>
+                <m:sty m:val="p"/>
+              </m:rPr>
+              <m:t>n</m:t>
+            </m:r>
+          </m:e>
+          <m:sub>
+            <m:r>
+              <m:rPr>
+                <m:sty m:val="p"/>
+              </m:rPr>
+              <m:t>l</m:t>
+            </m:r>
+            <m:r>
+              <m:rPr>
+                <m:sty m:val="p"/>
+              </m:rPr>
+              <m:t>i</m:t>
+            </m:r>
+            <m:r>
+              <m:rPr>
+                <m:sty m:val="p"/>
+              </m:rPr>
+              <m:t>n</m:t>
+            </m:r>
+            <m:r>
+              <m:rPr>
+                <m:sty m:val="p"/>
+              </m:rPr>
+              <m:t>e</m:t>
+            </m:r>
+            <m:r>
+              <m:rPr>
+                <m:sty m:val="p"/>
+              </m:rPr>
+              <m:t>a</m:t>
+            </m:r>
+            <m:r>
+              <m:rPr>
+                <m:sty m:val="p"/>
+              </m:rPr>
+              <m:t>r</m:t>
+            </m:r>
+          </m:sub>
+        </m:sSub>
+        <m:r>
+          <m:rPr>
+            <m:sty m:val="p"/>
+          </m:rPr>
+          <m:t>=</m:t>
+        </m:r>
+        <m:sSup>
+          <m:e>
+            <m:r>
+              <m:t>2</m:t>
+            </m:r>
+          </m:e>
+          <m:sup>
+            <m:r>
+              <m:rPr>
+                <m:sty m:val="p"/>
+              </m:rPr>
+              <m:t>Y</m:t>
+            </m:r>
+            <m:r>
+              <m:rPr>
+                <m:sty m:val="p"/>
+              </m:rPr>
+              <m:t>A</m:t>
+            </m:r>
+            <m:r>
+              <m:rPr>
+                <m:sty m:val="p"/>
+              </m:rPr>
+              <m:t>R</m:t>
+            </m:r>
+            <m:r>
+              <m:rPr>
+                <m:sty m:val="p"/>
+              </m:rPr>
+              <m:t>N</m:t>
+            </m:r>
+            <m:r>
+              <m:rPr>
+                <m:sty m:val="p"/>
+              </m:rPr>
+              <m:t>N</m:t>
+            </m:r>
+            <m:r>
+              <m:rPr>
+                <m:sty m:val="p"/>
+              </m:rPr>
+              <m:t>o</m:t>
+            </m:r>
+            <m:r>
+              <m:rPr>
+                <m:sty m:val="p"/>
+              </m:rPr>
+              <m:t>r</m:t>
+            </m:r>
+            <m:r>
+              <m:rPr>
+                <m:sty m:val="p"/>
+              </m:rPr>
+              <m:t>m</m:t>
+            </m:r>
+            <m:r>
+              <m:rPr>
+                <m:sty m:val="p"/>
+              </m:rPr>
+              <m:t>a</m:t>
+            </m:r>
+            <m:r>
+              <m:rPr>
+                <m:sty m:val="p"/>
+              </m:rPr>
+              <m:t>l</m:t>
+            </m:r>
+            <m:r>
+              <m:rPr>
+                <m:sty m:val="p"/>
+              </m:rPr>
+              <m:t>i</m:t>
+            </m:r>
+            <m:r>
+              <m:rPr>
+                <m:sty m:val="p"/>
+              </m:rPr>
+              <m:t>z</m:t>
+            </m:r>
+            <m:r>
+              <m:rPr>
+                <m:sty m:val="p"/>
+              </m:rPr>
+              <m:t>e</m:t>
+            </m:r>
+            <m:r>
+              <m:rPr>
+                <m:sty m:val="p"/>
+              </m:rPr>
+              <m:t>d</m:t>
+            </m:r>
+            <m:r>
+              <m:rPr>
+                <m:sty m:val="p"/>
+              </m:rPr>
+              <m:t>L</m:t>
+            </m:r>
+            <m:r>
+              <m:rPr>
+                <m:sty m:val="p"/>
+              </m:rPr>
+              <m:t>o</m:t>
+            </m:r>
+            <m:r>
+              <m:rPr>
+                <m:sty m:val="p"/>
+              </m:rPr>
+              <m:t>g</m:t>
+            </m:r>
+            <m:r>
+              <m:rPr>
+                <m:sty m:val="p"/>
+              </m:rPr>
+              <m:t>2</m:t>
+            </m:r>
+          </m:sup>
+        </m:sSup>
+        <m:r>
+          <m:rPr>
+            <m:sty m:val="p"/>
+          </m:rPr>
+          <m:t>−</m:t>
+        </m:r>
+        <m:r>
+          <m:t>1</m:t>
+        </m:r>
+      </m:oMath>
+      <w:r>
+        <w:rPr>
+          <w:rFonts w:ascii="Calibri" w:hAnsi="Calibri"/>
+          <w:color w:val="262626"/>
+          <w:sz w:val="20"/>
+        </w:rPr>
+        <w:t>) across 360 flight biospecimens in 26 tissues (Supplementary Table S13):</w:t>
       </w:r>
     </w:p>
     <w:p>

</xml_diff>

<commit_message>
feat(methods): align Supplementary Tables S1-S4 strictly with teacher manuscript citations
- Harmonize Table S1: Animal cohort metadata across 26 tissues, 49 cohorts, 13 missions (Fig. 1a-b)
- Harmonize Table S2: Spaceflight-induced co-directionally regulated DDR genes across Thymus, Kidney, Up-cohort, Down-cohort (Fig. 3a, Fig. S2a, Fig. S3ab, Fig. S4a)
- Harmonize Table S3: Seven DNA repair pathways repertoire sizes and multi-tissue detection audit (Fig. S5)
- Harmonize Table S4: Core repair genes expression profiles and ANOVA across 26 tissues (Fig. 4b-d, Fig. 5b-e)
- Renumber subsequent tables to S5-S10 (GO enrichment matrix, Hallmark GSEA, Fisher-z correlation, etc.)
- Export publication-grade Excel workbooks and CSVs to Desktop/Supplementary_Tables
- Update Methods docx with full Office Math equations and updated cross-reference table
</commit_message>
<xml_diff>
--- a/manuscript_methods_mouse_spaceflight_transcriptome.docx
+++ b/manuscript_methods_mouse_spaceflight_transcriptome.docx
@@ -64,7 +64,7 @@
           <w:color w:val="262626"/>
           <w:sz w:val="20"/>
         </w:rPr>
-        <w:t>To establish an organism-wide, multi-tissue transcriptomic atlas of spaceflight adaptations and DNA damage repair (DDR) alterations under environmental stressors, transcriptomic profiles and experimental metadata were curated from the NASA Open Science Data Repository (OSDR, https://osdr.nasa.gov/). The analytical cohort encompasses 48 transcriptomic accessions (OSD datasets) across 59 primary analysis units, comprising 761 accession-scoped biospecimen records spanning 26 anatomical tissues (Supplementary Table S1). Ensembl Gene IDs serve as stable, unique computational identifiers throughout all analytical workflows, with gene symbols retained for display and biological interpretation.</w:t>
+        <w:t>To establish an organism-wide, multi-tissue transcriptomic atlas of spaceflight adaptations and DNA damage repair (DDR) alterations under environmental stressors, transcriptomic profiles and experimental metadata were curated from the NASA Open Science Data Repository (OSDR, https://osdr.nasa.gov/). The analytical cohort encompasses 48 transcriptomic accessions (OSD datasets) across 59 primary analysis units, comprising 761 accession-scoped biospecimen records spanning 26 anatomical tissues (Supplementary Table S1). Ensembl Gene IDs serve as stable, unique computational identifiers throughout all analytical workflows, with gene symbols retained for biological annotation and cross-platform reference.</w:t>
       </w:r>
     </w:p>
     <w:p>
@@ -108,7 +108,7 @@
           <w:color w:val="262626"/>
           <w:sz w:val="20"/>
         </w:rPr>
-        <w:t>Animal cohort allocation and multi-parameter stratification across the 26 anatomical tissues are systematically organized across mission clusters, sex-stratified female and male cohorts, and discrete chronological age brackets (Supplementary Table S1). Anatomical tissues are ordered in accordance with cross-tissue DDR profiling panels, detailing accession-scoped unique donor counts and biospecimen distributions across spaceflight and ground control conditions to ensure robust cohort representation without confounding.</w:t>
+        <w:t>Animal cohort allocation and multi-parameter stratification across the 26 anatomical tissues are systematically organized across mission clusters, sex-stratified female and male cohorts, and discrete chronological age brackets (Figure 1b, Supplementary Table S1). Anatomical tissues are ordered in accordance with cross-tissue DDR profiling panels, detailing accession-scoped unique donor counts and biospecimen distributions across spaceflight and ground control conditions to ensure robust cohort representation without confounding.</w:t>
       </w:r>
     </w:p>
     <w:p>
@@ -317,7 +317,7 @@
           <w:color w:val="262626"/>
           <w:sz w:val="20"/>
         </w:rPr>
-        <w:t>Enrichment profiling focused on 15 predefined Gene Ontology (GO) terms spanning 12 Biological Process and 3 Cellular Component terms relevant to genomic integrity and cellular stress: response to DNA damage stimulus (GO:0006974), DNA repair (GO:0006281), signal transduction in response to DNA damage (GO:0042770), intrinsic apoptotic signaling pathway (GO:0008630), DNA damage tolerance (GO:0006301), telomere maintenance in response to DNA damage (GO:0043247), chromosome, telomeric region (GO:0000781), cell cycle (GO:0007049), DNA replication (GO:0006260), DNA-templated transcription (GO:0006351), translation (GO:0006412), mitochondrion (GO:0005739), sensory perception of mechanical stimulus (GO:0050954), cytoskeleton (GO:0005856), and cell death (GO:0008219). Term memberships were constructed from the MGI MOD-GAF and go-basic ontology using relation-closure mapped to Ensembl release-116. In parallel, global transcriptional shifts were evaluated using the native mouse MSigDB Hallmark collection (MSigDB 2026.1.Mm; Supplementary Table S3).</w:t>
+        <w:t>Enrichment profiling focused on 15 predefined Gene Ontology (GO) terms spanning 12 Biological Process and 3 Cellular Component terms relevant to genomic integrity and cellular stress: response to DNA damage stimulus (GO:0006974), DNA repair (GO:0006281), signal transduction in response to DNA damage (GO:0042770), intrinsic apoptotic signaling pathway (GO:0008630), DNA damage tolerance (GO:0006301), telomere maintenance in response to DNA damage (GO:0043247), chromosome, telomeric region (GO:0000781), cell cycle (GO:0007049), DNA replication (GO:0006260), DNA-templated transcription (GO:0006351), translation (GO:0006412), mitochondrion (GO:0005739), sensory perception of mechanical stimulus (GO:0050954), cytoskeleton (GO:0005856), and cell death (GO:0008219). Term memberships were constructed from the MGI MOD-GAF and go-basic ontology using relation-closure mapped to Ensembl release-116. In parallel, global transcriptional shifts were evaluated using the native mouse MSigDB Hallmark collection (MSigDB 2026.1.Mm; Figure S1, Supplementary Table S6).</w:t>
       </w:r>
     </w:p>
     <w:p>
@@ -339,7 +339,7 @@
           <w:color w:val="262626"/>
           <w:sz w:val="20"/>
         </w:rPr>
-        <w:t>To avoid dominance by missions with redundant sub-studies, unit-level normalized enrichment scores (NES) within each tissue were first aggregated within mission clusters and then averaged with equal mission weights. Statistical significance was evaluated using exact two-sided sign-flip permutation tests across mission-level NES values, complemented by signed Stouffer meta-Z P values. False discovery rates were controlled by applying the Benjamini–Hochberg procedure separately across the 390 tissue–term cells (26 tissues × 15 GO terms) for each P-value family. Supplementary Table S2 compiles the complete 26 × 15 mission-equal NES matrix along with exact sign-flip permutation and Stouffer meta-Z statistics across all tissue–term pairs. In parallel, Supplementary Table S3 documents the normalized enrichment scores and false discovery rates for MSigDB Hallmark pathways across missions with complete cohort coverage.</w:t>
+        <w:t>To avoid dominance by missions with redundant sub-studies, unit-level normalized enrichment scores (NES) within each tissue were first aggregated within mission clusters and then averaged with equal mission weights. Statistical significance was evaluated using exact two-sided sign-flip permutation tests across mission-level NES values, complemented by signed Stouffer meta-Z P values. False discovery rates were controlled by applying the Benjamini–Hochberg procedure separately across the 390 tissue–term cells (26 tissues × 15 GO terms) for each P-value family. Figure 1c presents the complete 26 × 15 mission-equal NES matrix (Supplementary Table S5). Supplementary Figure S1 displays the top 12 Hallmark pathways exhibiting the highest global positive and negative enrichment across missions with complete cohort coverage (Supplementary Table S6).</w:t>
       </w:r>
     </w:p>
     <w:p>
@@ -754,7 +754,7 @@
           <w:color w:val="262626"/>
           <w:sz w:val="20"/>
         </w:rPr>
-        <w:t xml:space="preserve">) were calculated among the 15 pathway scores across individual flight specimens (Supplementary Table S5). To synthesize a consensus cross-tissue co-response architecture, correlation coefficients were transformed using the Fisher-z transformation: </w:t>
+        <w:t xml:space="preserve">) were calculated among the 15 pathway scores across individual flight specimens (Supplementary Table S8). To synthesize a consensus cross-tissue co-response architecture, correlation coefficients were transformed using the Fisher-z transformation: </w:t>
       </w:r>
       <m:oMath xmlns:a="http://schemas.openxmlformats.org/drawingml/2006/main" xmlns:pic="http://schemas.openxmlformats.org/drawingml/2006/picture">
         <m:r>
@@ -1003,7 +1003,7 @@
           <w:color w:val="262626"/>
           <w:sz w:val="20"/>
         </w:rPr>
-        <w:t xml:space="preserve">). Three tissues with limited sample numbers—Colon (n = 4), Heart (n = 3), and Femoral skin (n = 2)—were evaluated in tissue-specific correlation profiles (Supplementary Table S5) and excluded from the cross-tissue pooled integration. The consensus correlation matrix was obtained by back-transformation: </w:t>
+        <w:t xml:space="preserve">). Three tissues with limited sample numbers—Colon (n = 4), Heart (n = 3), and Femoral skin (n = 2)—were evaluated in tissue-specific correlation profiles (Supplementary Table S8) and excluded from the cross-tissue pooled integration. The consensus correlation matrix was obtained by back-transformation: </w:t>
       </w:r>
       <m:oMath xmlns:a="http://schemas.openxmlformats.org/drawingml/2006/main" xmlns:pic="http://schemas.openxmlformats.org/drawingml/2006/picture">
         <m:acc>
@@ -1057,7 +1057,7 @@
           <w:color w:val="262626"/>
           <w:sz w:val="20"/>
         </w:rPr>
-        <w:t>, yielding the consensus 15 × 15 cross-tissue pathway co-response matrix compiled in Supplementary Table S4.</w:t>
+        <w:t>, yielding the consensus 15 × 15 cross-tissue pathway co-response matrix depicted in Figure 2 (Supplementary Table S7).</w:t>
       </w:r>
     </w:p>
     <w:p>
@@ -1094,7 +1094,7 @@
           <w:color w:val="262626"/>
           <w:sz w:val="20"/>
         </w:rPr>
-        <w:t>To determine whether shared or tissue-specific gene repertoires drive spaceflight DDR perturbations, binary detection matrices of Ensembl IDs belonging to the core DDR term (GO:0006974) were evaluated. A member gene was defined as present when its normalized source expression was finite and greater than zero. Combinatorial overlap and intersection sets of expressed DDR genes were quantified across independent flight comparisons within Thymus (4 comparisons; Supplementary Table S6), Kidney (5 accessions; Supplementary Table S7), as well as across tissue cohorts exhibiting pronounced positive enrichment (</w:t>
+        <w:t>To determine whether shared or tissue-specific gene repertoires drive spaceflight DDR perturbations, binary detection matrices of Ensembl IDs belonging to the core DDR term (GO:0006974) were evaluated. A member gene was defined as present when its normalized source expression was finite and greater than zero. Combinatorial overlap and intersection sets of expressed DDR genes were quantified across independent flight comparisons within Thymus (4 comparisons; Figure 3a, Supplementary Table S2), Kidney (5 accessions; Figure S2a, Supplementary Table S2), as well as across tissue cohorts exhibiting pronounced positive enrichment (</w:t>
       </w:r>
       <m:oMath xmlns:a="http://schemas.openxmlformats.org/drawingml/2006/main" xmlns:pic="http://schemas.openxmlformats.org/drawingml/2006/picture">
         <m:r>
@@ -1131,7 +1131,7 @@
           <w:color w:val="262626"/>
           <w:sz w:val="20"/>
         </w:rPr>
-        <w:t>) and negative enrichment (</w:t>
+        <w:t>; Figure S3a, Supplementary Table S2) and negative enrichment (</w:t>
       </w:r>
       <m:oMath xmlns:a="http://schemas.openxmlformats.org/drawingml/2006/main" xmlns:pic="http://schemas.openxmlformats.org/drawingml/2006/picture">
         <m:r>
@@ -1174,7 +1174,7 @@
           <w:color w:val="262626"/>
           <w:sz w:val="20"/>
         </w:rPr>
-        <w:t>) (Supplementary Table S8).</w:t>
+        <w:t>; Figure S4a, Supplementary Table S2).</w:t>
       </w:r>
     </w:p>
     <w:p>
@@ -1329,7 +1329,7 @@
           <w:color w:val="262626"/>
           <w:sz w:val="20"/>
         </w:rPr>
-        <w:t>. This prioritization identified 30 top concordant genes in Thymus (Supplementary Table S6), 12 in Kidney (Supplementary Table S7), 5 in high-NES tissues, and 11 in low-NES tissues (Supplementary Table S8), compiling comparison-specific log2FC values, FDR significance, and concordance scores.</w:t>
+        <w:t>. This prioritization identified 30 top concordant genes in Thymus (Figure 3b, Supplementary Table S2), 12 in Kidney (Figure S2b, Supplementary Table S2), 5 in high-NES tissues (Figure S3b, Supplementary Table S2), and 11 in low-NES tissues (Figure S4b, Supplementary Table S2), compiling comparison-specific log2FC values, FDR significance, and concordance scores.</w:t>
       </w:r>
     </w:p>
     <w:p>
@@ -1493,7 +1493,7 @@
           <w:color w:val="262626"/>
           <w:sz w:val="20"/>
         </w:rPr>
-        <w:t xml:space="preserve"> on tissue-mean YARN normalized log2 profiles, followed by average-linkage hierarchical clustering to evaluate anatomical relationships and cross-tissue co-expression clustering (Supplementary Table S9).</w:t>
+        <w:t xml:space="preserve"> on tissue-mean YARN normalized log2 profiles, followed by average-linkage hierarchical clustering to reconstruct anatomical relationships and evaluate cross-tissue co-expression clustering (Figure 4a).</w:t>
       </w:r>
     </w:p>
     <w:p>
@@ -1507,7 +1507,7 @@
           <w:color w:val="262626"/>
           <w:sz w:val="20"/>
         </w:rPr>
-        <w:t xml:space="preserve">Linear-scale baseline expression profiling of DSB machinery. </w:t>
+        <w:t xml:space="preserve">Baseline expression profiling of DSB machinery. </w:t>
       </w:r>
       <w:r>
         <w:rPr>
@@ -1515,7 +1515,7 @@
           <w:color w:val="262626"/>
           <w:sz w:val="20"/>
         </w:rPr>
-        <w:t>To quantify physiological expression distributions and tissue-specific abundance of key DSB repair machinery, representative marker genes were quantified on the back-transformed linear normalized expression scale (</w:t>
+        <w:t xml:space="preserve">To quantify physiological expression distributions and tissue-specific abundance of key DSB repair machinery, representative marker genes were quantified on normalized log2 scale (as well as back-transformed linear scale: </w:t>
       </w:r>
       <m:oMath xmlns:a="http://schemas.openxmlformats.org/drawingml/2006/main" xmlns:pic="http://schemas.openxmlformats.org/drawingml/2006/picture">
         <m:sSub>
@@ -1759,7 +1759,7 @@
           <w:color w:val="262626"/>
           <w:sz w:val="20"/>
         </w:rPr>
-        <w:t>) across 360 flight biospecimens in the 26 anatomical tissues (Supplementary Table S10):</w:t>
+        <w:t>) across 360 flight biospecimens in 26 anatomical tissues (Supplementary Table S4):</w:t>
       </w:r>
     </w:p>
     <w:p>
@@ -1782,7 +1782,7 @@
           <w:color w:val="262626"/>
           <w:sz w:val="20"/>
         </w:rPr>
-        <w:t xml:space="preserve">NHEJ (Supplementary Table S10, 4 genes): </w:t>
+        <w:t xml:space="preserve">NHEJ (Supplementary Table S4, 4 genes): </w:t>
       </w:r>
       <w:r>
         <w:rPr>
@@ -1813,7 +1813,7 @@
           <w:color w:val="262626"/>
           <w:sz w:val="20"/>
         </w:rPr>
-        <w:t xml:space="preserve">HR (Supplementary Table S10, 4 genes): </w:t>
+        <w:t xml:space="preserve">HR (Supplementary Table S4, 4 genes): </w:t>
       </w:r>
       <w:r>
         <w:rPr>
@@ -1844,7 +1844,7 @@
           <w:color w:val="262626"/>
           <w:sz w:val="20"/>
         </w:rPr>
-        <w:t xml:space="preserve">A-EJ (Supplementary Table S10, 4 genes): </w:t>
+        <w:t xml:space="preserve">A-EJ (Supplementary Table S4, 4 genes): </w:t>
       </w:r>
       <w:r>
         <w:rPr>
@@ -1866,7 +1866,7 @@
           <w:color w:val="262626"/>
           <w:sz w:val="20"/>
         </w:rPr>
-        <w:t xml:space="preserve">Expression distribution parameters and tissue variance. </w:t>
+        <w:t xml:space="preserve">Boxplot geometry and tissue variance. </w:t>
       </w:r>
       <w:r>
         <w:rPr>
@@ -1874,7 +1874,7 @@
           <w:color w:val="262626"/>
           <w:sz w:val="20"/>
         </w:rPr>
-        <w:t>Linear expression summaries across the 26 tissues were characterized by sample mean (μ), median, first quartile (Q1, 25%), third quartile (Q3, 75%), and interquartile range (IQR). Between-tissue expression heterogeneity for each repair gene across the 360 flight biospecimens was formally evaluated using one-way ANOVA across anatomical tissues, with summary statistics, F-test values, and P values compiled in Supplementary Table S10.</w:t>
+        <w:t>In the stratified boxplots (Figure 4b–d), the central solid line denotes the sample mean (μ), the lower and upper box hinges represent the first (Q1, 25%) and third (Q3, 75%) quartiles, and whiskers extend to the furthest observations within 1.5 × IQR. Individual flight biospecimens (360 samples) are overlaid as jittered points (dodge width = 0.80, jitter width = 0.11, seed = 25), with dashed lines connecting tissue means. Between-tissue expression heterogeneity for each repair gene across the 360 flight biospecimens was formally evaluated using ANOVA across anatomical tissues, with summary statistics, F-test values, and P values compiled in Supplementary Table S4.</w:t>
       </w:r>
     </w:p>
     <w:p>
@@ -1896,7 +1896,56 @@
           <w:color w:val="262626"/>
           <w:sz w:val="20"/>
         </w:rPr>
-        <w:t>To assess spaceflight transcriptional shifts across the complete 29-component DSB repertoire, multi-mission meta-analysis was performed across all 26 tissues (Supplementary Table S11). The overall spaceflight effect size was calculated as the median of mission-level median log2FC values. Meta-analytic significance across missions was determined using signed Stouffer's Z-trend tests. Multi-mission effect sizes (log2FC), standard errors, and nominal Stouffer P values were systematically tabulated across all 26 tissues and 29 DSB components (Supplementary Table S11).</w:t>
+        <w:t>To assess spaceflight transcriptional shifts across the complete 29-component DSB repertoire, multi-mission meta-analysis was performed across all 26 tissues (Figure 6a, Supplementary Table S9). The overall spaceflight effect size was calculated as the median of mission-level median log2FC values. Meta-analytic significance across missions was determined using signed Stouffer's Z-trend tests. Significant perturbations with nominal tissue-meta P &lt; 0.05 are presented as meta-dotplots, wherein dot color reflects the direction of regulation (red, spaceflight-upregulated; blue, spaceflight-downregulated) and dot area scales with effect magnitude (</w:t>
+      </w:r>
+      <m:oMath xmlns:a="http://schemas.openxmlformats.org/drawingml/2006/main" xmlns:pic="http://schemas.openxmlformats.org/drawingml/2006/picture">
+        <m:r>
+          <m:rPr>
+            <m:sty m:val="p"/>
+          </m:rPr>
+          <m:t>|</m:t>
+        </m:r>
+        <m:sSub>
+          <m:e>
+            <m:r>
+              <m:rPr>
+                <m:sty m:val="p"/>
+              </m:rPr>
+              <m:t>log</m:t>
+            </m:r>
+          </m:e>
+          <m:sub>
+            <m:r>
+              <m:t>2</m:t>
+            </m:r>
+          </m:sub>
+        </m:sSub>
+        <m:r>
+          <m:rPr>
+            <m:sty m:val="p"/>
+          </m:rPr>
+          <m:t>F</m:t>
+        </m:r>
+        <m:r>
+          <m:rPr>
+            <m:sty m:val="p"/>
+          </m:rPr>
+          <m:t>C</m:t>
+        </m:r>
+        <m:r>
+          <m:rPr>
+            <m:sty m:val="p"/>
+          </m:rPr>
+          <m:t>|</m:t>
+        </m:r>
+      </m:oMath>
+      <w:r>
+        <w:rPr>
+          <w:rFonts w:ascii="Calibri" w:hAnsi="Calibri"/>
+          <w:color w:val="262626"/>
+          <w:sz w:val="20"/>
+        </w:rPr>
+        <w:t>) (Figure 6a, Supplementary Table S9).</w:t>
       </w:r>
     </w:p>
     <w:p>
@@ -1933,7 +1982,7 @@
           <w:color w:val="262626"/>
           <w:sz w:val="20"/>
         </w:rPr>
-        <w:t xml:space="preserve">To establish baseline expression architectures across single-strand break (SSB) repair mechanisms, a curated panel of 45 components was compiled across the four major SSB pathways: base excision repair (BER, 6 genes), nucleotide excision repair (NER, 18 genes), mismatch repair (MMR, 5 genes), and the Fanconi anemia pathway (FA, 16 genes) (Supplementary Table S12, Supplementary Table S14). Biospecimen expression profiles were normalized using YARN tissue-aware quantile smoothing (qsmooth), followed by successive aggregation to tissue means. Pairwise tissue distances were computed as </w:t>
+        <w:t xml:space="preserve">To establish baseline expression architectures across single-strand break (SSB) repair mechanisms, a curated panel of 45 components was compiled across the four major SSB pathways: base excision repair (BER, 6 genes), nucleotide excision repair (NER, 18 genes), mismatch repair (MMR, 5 genes), and the Fanconi anemia pathway (FA, 16 genes). Biospecimen expression profiles were normalized using YARN tissue-aware quantile smoothing (qsmooth), followed by successive aggregation to tissue means. Pairwise tissue distances were computed as </w:t>
       </w:r>
       <m:oMath xmlns:a="http://schemas.openxmlformats.org/drawingml/2006/main" xmlns:pic="http://schemas.openxmlformats.org/drawingml/2006/picture">
         <m:r>
@@ -2060,7 +2109,7 @@
           <w:color w:val="262626"/>
           <w:sz w:val="20"/>
         </w:rPr>
-        <w:t xml:space="preserve"> and resolved using average-linkage hierarchical clustering to evaluate cross-tissue organizational relationships (Supplementary Table S12).</w:t>
+        <w:t xml:space="preserve"> and resolved using average-linkage hierarchical clustering to reveal cross-tissue organizational dendrograms (Figure 5a).</w:t>
       </w:r>
     </w:p>
     <w:p>
@@ -2074,7 +2123,7 @@
           <w:color w:val="262626"/>
           <w:sz w:val="20"/>
         </w:rPr>
-        <w:t xml:space="preserve">Linear-scale baseline expression profiling of SSB machinery. </w:t>
+        <w:t xml:space="preserve">Baseline expression profiling of SSB machinery. </w:t>
       </w:r>
       <w:r>
         <w:rPr>
@@ -2082,7 +2131,7 @@
           <w:color w:val="262626"/>
           <w:sz w:val="20"/>
         </w:rPr>
-        <w:t>Tissue-specific expression distributions of key SSB components were evaluated on the back-transformed linear scale (</w:t>
+        <w:t xml:space="preserve">Tissue-specific expression distributions of key SSB components were evaluated on normalized log2 scale (as well as back-transformed linear scale: </w:t>
       </w:r>
       <m:oMath xmlns:a="http://schemas.openxmlformats.org/drawingml/2006/main" xmlns:pic="http://schemas.openxmlformats.org/drawingml/2006/picture">
         <m:sSub>
@@ -2326,7 +2375,7 @@
           <w:color w:val="262626"/>
           <w:sz w:val="20"/>
         </w:rPr>
-        <w:t>) across 360 flight biospecimens in 26 tissues (Supplementary Table S13):</w:t>
+        <w:t>) across 360 flight biospecimens in 26 tissues (Supplementary Table S4):</w:t>
       </w:r>
     </w:p>
     <w:p>
@@ -2349,7 +2398,7 @@
           <w:color w:val="262626"/>
           <w:sz w:val="20"/>
         </w:rPr>
-        <w:t xml:space="preserve">BER (Supplementary Table S13, 3 genes): </w:t>
+        <w:t xml:space="preserve">BER (Supplementary Table S4, 3 genes): </w:t>
       </w:r>
       <w:r>
         <w:rPr>
@@ -2380,7 +2429,7 @@
           <w:color w:val="262626"/>
           <w:sz w:val="20"/>
         </w:rPr>
-        <w:t xml:space="preserve">NER (Supplementary Table S13, 7 genes): </w:t>
+        <w:t xml:space="preserve">NER (Supplementary Table S4, 7 genes): </w:t>
       </w:r>
       <w:r>
         <w:rPr>
@@ -2411,7 +2460,7 @@
           <w:color w:val="262626"/>
           <w:sz w:val="20"/>
         </w:rPr>
-        <w:t xml:space="preserve">MMR (Supplementary Table S13, 2 genes): </w:t>
+        <w:t xml:space="preserve">MMR (Supplementary Table S4, 2 genes): </w:t>
       </w:r>
       <w:r>
         <w:rPr>
@@ -2442,7 +2491,7 @@
           <w:color w:val="262626"/>
           <w:sz w:val="20"/>
         </w:rPr>
-        <w:t xml:space="preserve">FA (Supplementary Table S13, 2 genes): </w:t>
+        <w:t xml:space="preserve">FA (Supplementary Table S4, 2 genes): </w:t>
       </w:r>
       <w:r>
         <w:rPr>
@@ -2464,7 +2513,7 @@
           <w:color w:val="262626"/>
           <w:sz w:val="20"/>
         </w:rPr>
-        <w:t xml:space="preserve">Expression distribution parameters and tissue variance. </w:t>
+        <w:t xml:space="preserve">Boxplot geometry and tissue variance. </w:t>
       </w:r>
       <w:r>
         <w:rPr>
@@ -2472,7 +2521,7 @@
           <w:color w:val="262626"/>
           <w:sz w:val="20"/>
         </w:rPr>
-        <w:t>Tissue expression distributions, quartile parameters (Q1, mean, Q3, 1.5 × IQR), and between-tissue expression heterogeneity were evaluated by one-way ANOVA across anatomical tissues, with detailed statistics compiled in Supplementary Table S13.</w:t>
+        <w:t>Boxplot geometry, sample jittering (seed = 25), and tissue-mean connectors followed the DSB specifications (Figure 5b–e). Between-tissue expression heterogeneity for each SSB repair gene across the 360 flight biospecimens was formally evaluated using ANOVA across anatomical tissues, with detailed statistics compiled in Supplementary Table S4.</w:t>
       </w:r>
     </w:p>
     <w:p>
@@ -2494,7 +2543,56 @@
           <w:color w:val="262626"/>
           <w:sz w:val="20"/>
         </w:rPr>
-        <w:t>To determine transcriptional perturbations across the 45 SSB components in spaceflight, multi-mission meta-analysis was conducted across all 26 tissues (Supplementary Table S14). Meta-effect sizes were calculated as the median of mission-level median log2FC values, and statistical significance was evaluated using signed Stouffer's Z-trend tests. Multi-mission effect sizes (log2FC), standard errors, and nominal Stouffer P values were systematically tabulated across all 26 tissues and 45 SSB components (Supplementary Table S14).</w:t>
+        <w:t>To determine transcriptional perturbations across the 45 SSB components in spaceflight, multi-mission meta-analysis was conducted across all 26 tissues (Figure 6b, Supplementary Table S10). Meta-effect sizes were calculated as the median of mission-level median log2FC values, and statistical significance was evaluated using signed Stouffer's Z-trend tests. Associations meeting nominal tissue-meta P &lt; 0.05 are displayed as meta-dotplots (Figure 6b, Supplementary Table S10), with dot color indicating regulation direction and dot size encoding effect magnitude (</w:t>
+      </w:r>
+      <m:oMath xmlns:a="http://schemas.openxmlformats.org/drawingml/2006/main" xmlns:pic="http://schemas.openxmlformats.org/drawingml/2006/picture">
+        <m:r>
+          <m:rPr>
+            <m:sty m:val="p"/>
+          </m:rPr>
+          <m:t>|</m:t>
+        </m:r>
+        <m:sSub>
+          <m:e>
+            <m:r>
+              <m:rPr>
+                <m:sty m:val="p"/>
+              </m:rPr>
+              <m:t>log</m:t>
+            </m:r>
+          </m:e>
+          <m:sub>
+            <m:r>
+              <m:t>2</m:t>
+            </m:r>
+          </m:sub>
+        </m:sSub>
+        <m:r>
+          <m:rPr>
+            <m:sty m:val="p"/>
+          </m:rPr>
+          <m:t>F</m:t>
+        </m:r>
+        <m:r>
+          <m:rPr>
+            <m:sty m:val="p"/>
+          </m:rPr>
+          <m:t>C</m:t>
+        </m:r>
+        <m:r>
+          <m:rPr>
+            <m:sty m:val="p"/>
+          </m:rPr>
+          <m:t>|</m:t>
+        </m:r>
+      </m:oMath>
+      <w:r>
+        <w:rPr>
+          <w:rFonts w:ascii="Calibri" w:hAnsi="Calibri"/>
+          <w:color w:val="262626"/>
+          <w:sz w:val="20"/>
+        </w:rPr>
+        <w:t>).</w:t>
       </w:r>
     </w:p>
     <w:p>
@@ -2531,7 +2629,7 @@
           <w:color w:val="262626"/>
           <w:sz w:val="20"/>
         </w:rPr>
-        <w:t>To confirm the detection coverage and analytical integrity of the DNA damage repair machinery across the entire spaceflight dataset, expression detection was audited for 257 non-redundant Ensembl Gene IDs comprising 335 pathway memberships across the seven curated repair modules: BER (54 memberships), NER (53), MMR (27), FA (39), HR (135), A-EJ (9), and NHEJ (18). A gene was classified as detected in a given biospecimen when its normalized source expression value was finite and greater than zero. Detection counts were calculated for each of the 761 biospecimens across the 26 anatomical tissues, stratified by flight and ground conditions, to verify robust transcriptomic coverage across experimental groups (Supplementary Table S15).</w:t>
+        <w:t>To confirm the detection coverage and analytical integrity of the DNA damage repair machinery across the entire spaceflight dataset, expression detection was audited for 257 non-redundant Ensembl Gene IDs comprising 335 pathway memberships across the seven curated repair modules: BER (54 memberships), NER (53), MMR (27), FA (39), HR (135), A-EJ (9), and NHEJ (18). A gene was classified as detected in a given biospecimen when its normalized source expression value was finite and greater than zero. Detection counts were calculated for each of the 761 biospecimens across the 26 anatomical tissues, stratified by flight and ground conditions, to verify robust transcriptomic coverage across experimental groups (Figure S5, Supplementary Table S3).</w:t>
       </w:r>
     </w:p>
     <w:p>
@@ -2568,7 +2666,7 @@
           <w:color w:val="262626"/>
           <w:sz w:val="20"/>
         </w:rPr>
-        <w:t>All bioinformatics data processing, statistical meta-analyses, and visualization workflows were developed in R 4.4.3 and Python (v3.13/v3.14). Key pinned R packages include data.table (v1.18.2.1), ggplot2 (v4.0.2), patchwork (v1.3.2), scales (v1.4.0), and ggVennDiagram (v1.5.7). Python workflows utilized matplotlib (v3.10.8), numpy (v2.5.0), and pandas (v3.0.2). Multiple-testing adjustments throughout the study were performed using the Benjamini–Hochberg procedure to control the false discovery rate. Between-tissue expression heterogeneity for linear distributions was assessed via one-way ANOVA across anatomical tissues.</w:t>
+        <w:t>All bioinformatics data processing, statistical meta-analyses, and visualization workflows were developed in R 4.4.3 and Python (v3.13/v3.14). Key pinned R packages include data.table (v1.18.2.1), ggplot2 (v4.0.2), patchwork (v1.3.2), scales (v1.4.0), and ggVennDiagram (v1.5.7). Python workflows utilized matplotlib (v3.10.8), numpy (v2.5.0), and pandas (v3.0.2). Multiple-testing adjustments throughout the study were performed using the Benjamini–Hochberg procedure to control the false discovery rate. Between-tissue expression heterogeneity for linear and log2 distributions was assessed via ANOVA across anatomical tissues.</w:t>
       </w:r>
     </w:p>
     <w:p>
@@ -2590,7 +2688,7 @@
           <w:color w:val="262626"/>
           <w:sz w:val="20"/>
         </w:rPr>
-        <w:t>To ensure complete computational reproducibility, all stochastic algorithms, permutation routines, and point jittering were locked to random seed 25. All analytical code, statistical models, and visualization pipelines are version-controlled under Git and deposited in the study repository. Released analytical tables, numerical datasets, and input manifests are verified by cryptographic SHA-256 checksums (provenance/reference_sha256.csv), enabling end-to-end auditability from raw OSDR inputs to final analytical tables and publication outputs.</w:t>
+        <w:t>To ensure complete computational reproducibility, all stochastic algorithms, permutation routines, and point jittering were locked to random seed 25. All analytical code, statistical models, and visualization pipelines are version-controlled under Git and deposited in the study repository (https://github.com/gzy2520/mouse-spaceflight-transcriptome-publication). Released analytical tables, numerical datasets, and input manifests are verified by cryptographic SHA-256 checksums (provenance/reference_sha256.csv), enabling end-to-end auditability from raw OSDR inputs to final analytical tables and publication outputs.</w:t>
       </w:r>
     </w:p>
     <w:p>
@@ -2627,7 +2725,7 @@
           <w:color w:val="262626"/>
           <w:sz w:val="20"/>
         </w:rPr>
-        <w:t>The following reference matrix systematically connects each Supplementary Table and primary analytical module to its analytical scope, input dataset, mathematical model, and reproducible source script or data contract in sequential order:</w:t>
+        <w:t>The following reference matrix systematically connects each Supplementary Table and primary analytical module to its analytical scope, input dataset, mathematical model, and reproducible source script or data contract in sequential order, strictly harmonized with the manuscript figure citations:</w:t>
       </w:r>
     </w:p>
     <w:tbl>
@@ -2858,7 +2956,7 @@
                 <w:color w:val="262626"/>
                 <w:sz w:val="16"/>
               </w:rPr>
-              <w:t>Experimental Design and Multidimensional Metadata Atlas</w:t>
+              <w:t>Animal Cohort Compilation and Multidimensional Metadata Atlas</w:t>
             </w:r>
           </w:p>
         </w:tc>
@@ -2884,7 +2982,7 @@
                 <w:color w:val="262626"/>
                 <w:sz w:val="16"/>
               </w:rPr>
-              <w:t>761 samples, 48 accessions, 26 tissues (360 flight, 401 ground)</w:t>
+              <w:t>761 samples, 48 accessions, 49 cohorts, 26 tissues (360 flight, 401 ground)</w:t>
             </w:r>
           </w:p>
         </w:tc>
@@ -2936,7 +3034,7 @@
                 <w:color w:val="262626"/>
                 <w:sz w:val="16"/>
               </w:rPr>
-              <w:t>results/tables/Fig_6_mouse_sample_metadata_complete_audit.csv; R/final_figures/02_fig1b_metadata_bubble.R</w:t>
+              <w:t>provenance/Fig_1b_mouse_metadata_grouped.csv; Fig_6_mouse_sample_metadata_complete_audit.csv; R/final_figures/02_fig1b_metadata_bubble.R</w:t>
             </w:r>
           </w:p>
         </w:tc>
@@ -2991,7 +3089,7 @@
                 <w:color w:val="262626"/>
                 <w:sz w:val="16"/>
               </w:rPr>
-              <w:t>Cross-Tissue Gene Ontology Enrichment Profiling Matrix</w:t>
+              <w:t>Spaceflight-Induced Co-Directionally Regulated DDR Genes and Repertoire Overlap</w:t>
             </w:r>
           </w:p>
         </w:tc>
@@ -3016,7 +3114,7 @@
                 <w:color w:val="262626"/>
                 <w:sz w:val="16"/>
               </w:rPr>
-              <w:t>26 tissues × 15 GO terms (12 BP, 3 CC)</w:t>
+              <w:t>Thymus (4 cohorts), Kidney (5 accessions), Up-cohort (9 tissues), Down-cohort (6 tissues)</w:t>
             </w:r>
           </w:p>
         </w:tc>
@@ -3041,7 +3139,7 @@
                 <w:color w:val="262626"/>
                 <w:sz w:val="16"/>
               </w:rPr>
-              <w:t>Mission-equal mean NES; exact sign-flip and secondary Stouffer P, BH FDR</w:t>
+              <w:t>GO:0006974 member Ensembl-ID overlap (&gt;94% core); BH-FDR and concordant-direction ranking (Thymus 30 DEGs, Kidney 12 DEGs, Up 5 DEGs, Down 11 DEGs)</w:t>
             </w:r>
           </w:p>
         </w:tc>
@@ -3066,7 +3164,7 @@
                 <w:color w:val="262626"/>
                 <w:sz w:val="16"/>
               </w:rPr>
-              <w:t>data/publication_input/go/04_tissue_statistics_concrete_terms_and_context.csv; R/final_figures/03_fig1c_fig2_go.R</w:t>
+              <w:t>data/publication_input/common_direction/ (A, B, C, D); data/publication_input/venn/; results/tables/04_membership_matrix_...</w:t>
             </w:r>
           </w:p>
         </w:tc>
@@ -3123,7 +3221,7 @@
                 <w:color w:val="262626"/>
                 <w:sz w:val="16"/>
               </w:rPr>
-              <w:t>MSigDB Hallmark Pathway GSEA Overview Across Missions</w:t>
+              <w:t>Seven DNA Damage Repair Pathways Gene Repertoire Sizes and Multi-Tissue Detection Audit</w:t>
             </w:r>
           </w:p>
         </w:tc>
@@ -3149,7 +3247,7 @@
                 <w:color w:val="262626"/>
                 <w:sz w:val="16"/>
               </w:rPr>
-              <w:t>13 missions with complete cohort coverage</w:t>
+              <w:t>761 biospecimens across 26 tissues × 7 repair pathways (BER, NER, MMR, FA, HR, A-EJ, NHEJ)</w:t>
             </w:r>
           </w:p>
         </w:tc>
@@ -3175,7 +3273,7 @@
                 <w:color w:val="262626"/>
                 <w:sz w:val="16"/>
               </w:rPr>
-              <w:t>Pre-ranked fgseaMultilevel; top 12 global Hallmark terms (6 positive, 6 negative NES)</w:t>
+              <w:t>Curated repertoire sizes (HR 135, BER 54, NER 53, FA 39, MMR 27, NHEJ 18, A-EJ 9); finite normalized source-expression detection audits</w:t>
             </w:r>
           </w:p>
         </w:tc>
@@ -3201,7 +3299,7 @@
                 <w:color w:val="262626"/>
                 <w:sz w:val="16"/>
               </w:rPr>
-              <w:t>data/publication_input/hallmark/01_global_top_term_figure_selection.csv; R/figures/02_hallmark_gsea.R</w:t>
+              <w:t>release/tables/08_Table_S3_pathway_repertoire_sizes.csv; 09_Table_S3_per_tissue_sample_summary.csv; 01_seven_pathway_member_gene_counts_per_source_sample_wide.csv</w:t>
             </w:r>
           </w:p>
         </w:tc>
@@ -3256,7 +3354,7 @@
                 <w:color w:val="262626"/>
                 <w:sz w:val="16"/>
               </w:rPr>
-              <w:t>Cross-Tissue Consensus Pathway Association Matrix</w:t>
+              <w:t>Baseline Expression Profiles and ANOVA Heterogeneity of Core Repair Genes Across Tissues</w:t>
             </w:r>
           </w:p>
         </w:tc>
@@ -3281,7 +3379,7 @@
                 <w:color w:val="262626"/>
                 <w:sz w:val="16"/>
               </w:rPr>
-              <w:t>23 eligible tissues (n_flight ≥ 5; 351 samples)</w:t>
+              <w:t>360 Flight samples across 26 tissues × 26 core repair genes (NHEJ, HR, A-EJ, BER, NER, MMR, FA)</w:t>
             </w:r>
           </w:p>
         </w:tc>
@@ -3306,7 +3404,7 @@
                 <w:color w:val="262626"/>
                 <w:sz w:val="16"/>
               </w:rPr>
-              <w:t>Ground-referenced sample log2FC, intra-tissue Spearman ρ, equal-weight Fisher-z pooling</w:t>
+              <w:t>Normalized log2 (and linear) expression distributions, tissue means, and one-way/two-way ANOVA across anatomical tissues</w:t>
             </w:r>
           </w:p>
         </w:tc>
@@ -3331,7 +3429,7 @@
                 <w:color w:val="262626"/>
                 <w:sz w:val="16"/>
               </w:rPr>
-              <w:t>data/publication_input/go/log2fc_spearman_20260902/04_overall_fisher_z_spearman_rho_matrix.csv; python/plot_log2fc_per_tissue_pathway_spearman_20260902.py</w:t>
+              <w:t>release/tables/log/02_gene_one_way_anova_log_summary.csv; 03_tissue_gene_mean_log_qsmooth_summary.csv; R/final_figures/09_pathway_gene_tissue_boxplots_log.R</w:t>
             </w:r>
           </w:p>
         </w:tc>
@@ -3388,7 +3486,7 @@
                 <w:color w:val="262626"/>
                 <w:sz w:val="16"/>
               </w:rPr>
-              <w:t>Per-Tissue Sample-Level Pathway Spearman Correlation Profiles</w:t>
+              <w:t>Cross-Tissue Gene Ontology Enrichment Profiling Matrix</w:t>
             </w:r>
           </w:p>
         </w:tc>
@@ -3414,7 +3512,7 @@
                 <w:color w:val="262626"/>
                 <w:sz w:val="16"/>
               </w:rPr>
-              <w:t>26 individual tissue matrices across flight samples</w:t>
+              <w:t>26 tissues × 15 GO terms (12 BP, 3 CC)</w:t>
             </w:r>
           </w:p>
         </w:tc>
@@ -3440,7 +3538,7 @@
                 <w:color w:val="262626"/>
                 <w:sz w:val="16"/>
               </w:rPr>
-              <w:t>Pairwise 15 × 15 Spearman rank correlation matrices across flight specimens per tissue</w:t>
+              <w:t>Mission-equal mean NES; exact sign-flip permutation and secondary Stouffer meta-Z statistics, BH FDR</w:t>
             </w:r>
           </w:p>
         </w:tc>
@@ -3466,7 +3564,7 @@
                 <w:color w:val="262626"/>
                 <w:sz w:val="16"/>
               </w:rPr>
-              <w:t>data/publication_input/go/log2fc_spearman_20260902/03_tissue_pairwise_spearman_log2fc_long.csv; python/build_log2fc_per_tissue_pathway_spearman_20260902.py</w:t>
+              <w:t>data/publication_input/go/04_tissue_statistics_concrete_terms_and_context.csv; R/final_figures/03_fig1c_fig2_go.R</w:t>
             </w:r>
           </w:p>
         </w:tc>
@@ -3521,7 +3619,7 @@
                 <w:color w:val="262626"/>
                 <w:sz w:val="16"/>
               </w:rPr>
-              <w:t>Thymus DDR Member Overlap and Common-Direction Regulation</w:t>
+              <w:t>MSigDB Hallmark Pathway GSEA Overview Across Missions</w:t>
             </w:r>
           </w:p>
         </w:tc>
@@ -3546,7 +3644,7 @@
                 <w:color w:val="262626"/>
                 <w:sz w:val="16"/>
               </w:rPr>
-              <w:t>Thymus (4 flight comparisons)</w:t>
+              <w:t>13 missions with complete cohort coverage</w:t>
             </w:r>
           </w:p>
         </w:tc>
@@ -3571,7 +3669,7 @@
                 <w:color w:val="262626"/>
                 <w:sz w:val="16"/>
               </w:rPr>
-              <w:t>GO:0006974 member Ensembl-ID overlap (884 union, 855 core); BH-FDR and concordant ranking (top 30 genes)</w:t>
+              <w:t>Pre-ranked fgseaMultilevel; top 12 global Hallmark pathways (6 positive, 6 negative NES)</w:t>
             </w:r>
           </w:p>
         </w:tc>
@@ -3596,7 +3694,7 @@
                 <w:color w:val="262626"/>
                 <w:sz w:val="16"/>
               </w:rPr>
-              <w:t>data/publication_input/venn/04_membership_matrix_thymus_four_comparisons.csv; data/publication_input/common_direction/B_thymus_DDR_common_direction_top30_...csv</w:t>
+              <w:t>data/publication_input/hallmark/01_global_top_term_figure_selection.csv; R/figures/02_hallmark_gsea.R</w:t>
             </w:r>
           </w:p>
         </w:tc>
@@ -3653,7 +3751,7 @@
                 <w:color w:val="262626"/>
                 <w:sz w:val="16"/>
               </w:rPr>
-              <w:t>Kidney DDR Member Overlap and Common-Direction Regulation</w:t>
+              <w:t>Cross-Tissue Consensus Pathway Association Matrix</w:t>
             </w:r>
           </w:p>
         </w:tc>
@@ -3679,7 +3777,7 @@
                 <w:color w:val="262626"/>
                 <w:sz w:val="16"/>
               </w:rPr>
-              <w:t>Kidney (5 OSDR accessions)</w:t>
+              <w:t>23 eligible tissues (n_flight ≥ 5; 351 flight samples)</w:t>
             </w:r>
           </w:p>
         </w:tc>
@@ -3705,7 +3803,7 @@
                 <w:color w:val="262626"/>
                 <w:sz w:val="16"/>
               </w:rPr>
-              <w:t>GO:0006974 member Ensembl-ID overlap; BH-FDR and concordant-direction ranking (12 qualifying genes)</w:t>
+              <w:t>Ground-referenced sample log2FC, intra-tissue Spearman rank correlation, equal-weight Fisher-z pooling</w:t>
             </w:r>
           </w:p>
         </w:tc>
@@ -3731,7 +3829,7 @@
                 <w:color w:val="262626"/>
                 <w:sz w:val="16"/>
               </w:rPr>
-              <w:t>data/publication_input/venn/04_membership_matrix_kidney_five_datasets.csv; data/publication_input/common_direction/A_kidney_DDR_common_direction_top30_...csv</w:t>
+              <w:t>data/publication_input/go/log2fc_spearman_20260902/04_overall_fisher_z_spearman_rho_matrix.csv; python/plot_log2fc_per_tissue_pathway_spearman_20260902.py</w:t>
             </w:r>
           </w:p>
         </w:tc>
@@ -3786,7 +3884,7 @@
                 <w:color w:val="262626"/>
                 <w:sz w:val="16"/>
               </w:rPr>
-              <w:t>High- and Low-NES Cohorts DDR Overlap and Common-Direction</w:t>
+              <w:t>Per-Tissue Sample-Level Pathway Spearman Correlation Profiles</w:t>
             </w:r>
           </w:p>
         </w:tc>
@@ -3811,7 +3909,7 @@
                 <w:color w:val="262626"/>
                 <w:sz w:val="16"/>
               </w:rPr>
-              <w:t>NES &gt; 1 tissues (5 genes) and NES &lt; −1 tissues (11 genes)</w:t>
+              <w:t>26 individual tissue matrices across flight samples</w:t>
             </w:r>
           </w:p>
         </w:tc>
@@ -3836,7 +3934,7 @@
                 <w:color w:val="262626"/>
                 <w:sz w:val="16"/>
               </w:rPr>
-              <w:t>GO:0006974 member Ensembl-ID overlap; BH-FDR and concordant-direction ranking</w:t>
+              <w:t>Pairwise 15 × 15 Spearman rank correlation matrices across flight specimens per tissue</w:t>
             </w:r>
           </w:p>
         </w:tc>
@@ -3861,7 +3959,7 @@
                 <w:color w:val="262626"/>
                 <w:sz w:val="16"/>
               </w:rPr>
-              <w:t>results/tables/04_membership_matrix_up/down_tissues.csv; tables C and D</w:t>
+              <w:t>data/publication_input/go/log2fc_spearman_20260902/03_tissue_pairwise_spearman_log2fc_long.csv; python/build_log2fc_per_tissue_pathway_spearman_20260902.py</w:t>
             </w:r>
           </w:p>
         </w:tc>
@@ -3918,272 +4016,7 @@
                 <w:color w:val="262626"/>
                 <w:sz w:val="16"/>
               </w:rPr>
-              <w:t>DSB Repair Baseline Expression Profiles and Tissue Tree</w:t>
-            </w:r>
-          </w:p>
-        </w:tc>
-        <w:tc>
-          <w:tcPr>
-            <w:tcW w:type="dxa" w:w="1872"/>
-            <w:shd w:val="clear" w:fill="FAFCFD"/>
-            <w:tcMar>
-              <w:top w:w="55" w:type="dxa"/>
-              <w:start w:w="70" w:type="dxa"/>
-              <w:bottom w:w="55" w:type="dxa"/>
-              <w:end w:w="70" w:type="dxa"/>
-            </w:tcMar>
-            <w:vAlign w:val="center"/>
-          </w:tcPr>
-          <w:p>
-            <w:pPr>
-              <w:spacing w:line="276" w:lineRule="auto" w:before="0" w:after="0"/>
-            </w:pPr>
-            <w:r>
-              <w:rPr>
-                <w:rFonts w:ascii="Calibri" w:hAnsi="Calibri"/>
-                <w:color w:val="262626"/>
-                <w:sz w:val="16"/>
-              </w:rPr>
-              <w:t>360 Flight samples, 59 units, 26 tissues, 29 components</w:t>
-            </w:r>
-          </w:p>
-        </w:tc>
-        <w:tc>
-          <w:tcPr>
-            <w:tcW w:type="dxa" w:w="2160"/>
-            <w:shd w:val="clear" w:fill="FAFCFD"/>
-            <w:tcMar>
-              <w:top w:w="55" w:type="dxa"/>
-              <w:start w:w="70" w:type="dxa"/>
-              <w:bottom w:w="55" w:type="dxa"/>
-              <w:end w:w="70" w:type="dxa"/>
-            </w:tcMar>
-            <w:vAlign w:val="center"/>
-          </w:tcPr>
-          <w:p>
-            <w:pPr>
-              <w:spacing w:line="276" w:lineRule="auto" w:before="0" w:after="0"/>
-            </w:pPr>
-            <w:r>
-              <w:rPr>
-                <w:rFonts w:ascii="Calibri" w:hAnsi="Calibri"/>
-                <w:color w:val="262626"/>
-                <w:sz w:val="16"/>
-              </w:rPr>
-              <w:t>YARN tissue-aware qsmooth; tissue-mean log2 profiles; 1 − Spearman ρ dissimilarity, average linkage</w:t>
-            </w:r>
-          </w:p>
-        </w:tc>
-        <w:tc>
-          <w:tcPr>
-            <w:tcW w:type="dxa" w:w="1728"/>
-            <w:shd w:val="clear" w:fill="FAFCFD"/>
-            <w:tcMar>
-              <w:top w:w="55" w:type="dxa"/>
-              <w:start w:w="70" w:type="dxa"/>
-              <w:bottom w:w="55" w:type="dxa"/>
-              <w:end w:w="70" w:type="dxa"/>
-            </w:tcMar>
-            <w:vAlign w:val="center"/>
-          </w:tcPr>
-          <w:p>
-            <w:pPr>
-              <w:spacing w:line="276" w:lineRule="auto" w:before="0" w:after="0"/>
-            </w:pPr>
-            <w:r>
-              <w:rPr>
-                <w:rFonts w:ascii="Calibri" w:hAnsi="Calibri"/>
-                <w:color w:val="262626"/>
-                <w:sz w:val="16"/>
-              </w:rPr>
-              <w:t>data/publication_input/qsmooth/05_component_tissue_yarn_qsmooth_log2_matrix.csv; R/final_figures/05_expression_tree_heatmaps.R</w:t>
-            </w:r>
-          </w:p>
-        </w:tc>
-      </w:tr>
-      <w:tr>
-        <w:trPr>
-          <w:cantSplit/>
-        </w:trPr>
-        <w:tc>
-          <w:tcPr>
-            <w:tcW w:type="dxa" w:w="1728"/>
-            <w:tcMar>
-              <w:top w:w="55" w:type="dxa"/>
-              <w:start w:w="70" w:type="dxa"/>
-              <w:bottom w:w="55" w:type="dxa"/>
-              <w:end w:w="70" w:type="dxa"/>
-            </w:tcMar>
-            <w:vAlign w:val="center"/>
-          </w:tcPr>
-          <w:p>
-            <w:pPr>
-              <w:spacing w:line="276" w:lineRule="auto" w:before="0" w:after="0"/>
-            </w:pPr>
-            <w:r>
-              <w:rPr>
-                <w:rFonts w:ascii="Calibri" w:hAnsi="Calibri"/>
-                <w:color w:val="262626"/>
-                <w:sz w:val="16"/>
-              </w:rPr>
-              <w:t>Supplementary Table S10</w:t>
-            </w:r>
-          </w:p>
-        </w:tc>
-        <w:tc>
-          <w:tcPr>
-            <w:tcW w:type="dxa" w:w="1872"/>
-            <w:tcMar>
-              <w:top w:w="55" w:type="dxa"/>
-              <w:start w:w="70" w:type="dxa"/>
-              <w:bottom w:w="55" w:type="dxa"/>
-              <w:end w:w="70" w:type="dxa"/>
-            </w:tcMar>
-            <w:vAlign w:val="center"/>
-          </w:tcPr>
-          <w:p>
-            <w:pPr>
-              <w:spacing w:line="276" w:lineRule="auto" w:before="0" w:after="0"/>
-            </w:pPr>
-            <w:r>
-              <w:rPr>
-                <w:rFonts w:ascii="Calibri" w:hAnsi="Calibri"/>
-                <w:color w:val="262626"/>
-                <w:sz w:val="16"/>
-              </w:rPr>
-              <w:t>DSB Repair Linear-Scale Baseline Expression and ANOVA Heterogeneity</w:t>
-            </w:r>
-          </w:p>
-        </w:tc>
-        <w:tc>
-          <w:tcPr>
-            <w:tcW w:type="dxa" w:w="1872"/>
-            <w:tcMar>
-              <w:top w:w="55" w:type="dxa"/>
-              <w:start w:w="70" w:type="dxa"/>
-              <w:bottom w:w="55" w:type="dxa"/>
-              <w:end w:w="70" w:type="dxa"/>
-            </w:tcMar>
-            <w:vAlign w:val="center"/>
-          </w:tcPr>
-          <w:p>
-            <w:pPr>
-              <w:spacing w:line="276" w:lineRule="auto" w:before="0" w:after="0"/>
-            </w:pPr>
-            <w:r>
-              <w:rPr>
-                <w:rFonts w:ascii="Calibri" w:hAnsi="Calibri"/>
-                <w:color w:val="262626"/>
-                <w:sz w:val="16"/>
-              </w:rPr>
-              <w:t>360 Flight samples × key genes across 26 tissues (NHEJ, HR, A-EJ)</w:t>
-            </w:r>
-          </w:p>
-        </w:tc>
-        <w:tc>
-          <w:tcPr>
-            <w:tcW w:type="dxa" w:w="2160"/>
-            <w:tcMar>
-              <w:top w:w="55" w:type="dxa"/>
-              <w:start w:w="70" w:type="dxa"/>
-              <w:bottom w:w="55" w:type="dxa"/>
-              <w:end w:w="70" w:type="dxa"/>
-            </w:tcMar>
-            <w:vAlign w:val="center"/>
-          </w:tcPr>
-          <w:p>
-            <w:pPr>
-              <w:spacing w:line="276" w:lineRule="auto" w:before="0" w:after="0"/>
-            </w:pPr>
-            <w:r>
-              <w:rPr>
-                <w:rFonts w:ascii="Calibri" w:hAnsi="Calibri"/>
-                <w:color w:val="262626"/>
-                <w:sz w:val="16"/>
-              </w:rPr>
-              <w:t>Back-transformed linear normalized expression (2^log2 − 1), Q1/mean/Q3 summaries, one-way ANOVA</w:t>
-            </w:r>
-          </w:p>
-        </w:tc>
-        <w:tc>
-          <w:tcPr>
-            <w:tcW w:type="dxa" w:w="1728"/>
-            <w:tcMar>
-              <w:top w:w="55" w:type="dxa"/>
-              <w:start w:w="70" w:type="dxa"/>
-              <w:bottom w:w="55" w:type="dxa"/>
-              <w:end w:w="70" w:type="dxa"/>
-            </w:tcMar>
-            <w:vAlign w:val="center"/>
-          </w:tcPr>
-          <w:p>
-            <w:pPr>
-              <w:spacing w:line="276" w:lineRule="auto" w:before="0" w:after="0"/>
-            </w:pPr>
-            <w:r>
-              <w:rPr>
-                <w:rFonts w:ascii="Calibri" w:hAnsi="Calibri"/>
-                <w:color w:val="262626"/>
-                <w:sz w:val="16"/>
-              </w:rPr>
-              <w:t>results/tables/linear/03_tissue_gene_mean_linear_qsmooth_summary.csv; 02_gene_one_way_anova_linear_summary.csv; R/figures/10_pathway_gene_tissue_boxplots_linear.R</w:t>
-            </w:r>
-          </w:p>
-        </w:tc>
-      </w:tr>
-      <w:tr>
-        <w:trPr>
-          <w:cantSplit/>
-        </w:trPr>
-        <w:tc>
-          <w:tcPr>
-            <w:tcW w:type="dxa" w:w="1728"/>
-            <w:shd w:val="clear" w:fill="FAFCFD"/>
-            <w:tcMar>
-              <w:top w:w="55" w:type="dxa"/>
-              <w:start w:w="70" w:type="dxa"/>
-              <w:bottom w:w="55" w:type="dxa"/>
-              <w:end w:w="70" w:type="dxa"/>
-            </w:tcMar>
-            <w:vAlign w:val="center"/>
-          </w:tcPr>
-          <w:p>
-            <w:pPr>
-              <w:spacing w:line="276" w:lineRule="auto" w:before="0" w:after="0"/>
-            </w:pPr>
-            <w:r>
-              <w:rPr>
-                <w:rFonts w:ascii="Calibri" w:hAnsi="Calibri"/>
-                <w:color w:val="262626"/>
-                <w:sz w:val="16"/>
-              </w:rPr>
-              <w:t>Supplementary Table S11</w:t>
-            </w:r>
-          </w:p>
-        </w:tc>
-        <w:tc>
-          <w:tcPr>
-            <w:tcW w:type="dxa" w:w="1872"/>
-            <w:shd w:val="clear" w:fill="FAFCFD"/>
-            <w:tcMar>
-              <w:top w:w="55" w:type="dxa"/>
-              <w:start w:w="70" w:type="dxa"/>
-              <w:bottom w:w="55" w:type="dxa"/>
-              <w:end w:w="70" w:type="dxa"/>
-            </w:tcMar>
-            <w:vAlign w:val="center"/>
-          </w:tcPr>
-          <w:p>
-            <w:pPr>
-              <w:spacing w:line="276" w:lineRule="auto" w:before="0" w:after="0"/>
-            </w:pPr>
-            <w:r>
-              <w:rPr>
-                <w:rFonts w:ascii="Calibri" w:hAnsi="Calibri"/>
-                <w:color w:val="262626"/>
-                <w:sz w:val="16"/>
-              </w:rPr>
-              <w:t>DSB Repair Multi-Mission Spaceflight Meta-Analysis Matrix</w:t>
+              <w:t>Double-Strand Break (DSB) Repair Multi-Mission Spaceflight Meta-Analysis Matrix</w:t>
             </w:r>
           </w:p>
         </w:tc>
@@ -4235,7 +4068,7 @@
                 <w:color w:val="262626"/>
                 <w:sz w:val="16"/>
               </w:rPr>
-              <w:t>Median of mission medians log2FC; signed Stouffer P; nominal P &lt; 0.05 indicators</w:t>
+              <w:t>Median of mission medians log2FC; signed Stouffer meta-Z P values; nominal P &lt; 0.05 indicators</w:t>
             </w:r>
           </w:p>
         </w:tc>
@@ -4291,7 +4124,7 @@
                 <w:color w:val="262626"/>
                 <w:sz w:val="16"/>
               </w:rPr>
-              <w:t>Supplementary Table S12</w:t>
+              <w:t>Supplementary Table S10</w:t>
             </w:r>
           </w:p>
         </w:tc>
@@ -4316,272 +4149,7 @@
                 <w:color w:val="262626"/>
                 <w:sz w:val="16"/>
               </w:rPr>
-              <w:t>SSB Repair Baseline Expression Profiles and Tissue Tree</w:t>
-            </w:r>
-          </w:p>
-        </w:tc>
-        <w:tc>
-          <w:tcPr>
-            <w:tcW w:type="dxa" w:w="1872"/>
-            <w:tcMar>
-              <w:top w:w="55" w:type="dxa"/>
-              <w:start w:w="70" w:type="dxa"/>
-              <w:bottom w:w="55" w:type="dxa"/>
-              <w:end w:w="70" w:type="dxa"/>
-            </w:tcMar>
-            <w:vAlign w:val="center"/>
-          </w:tcPr>
-          <w:p>
-            <w:pPr>
-              <w:spacing w:line="276" w:lineRule="auto" w:before="0" w:after="0"/>
-            </w:pPr>
-            <w:r>
-              <w:rPr>
-                <w:rFonts w:ascii="Calibri" w:hAnsi="Calibri"/>
-                <w:color w:val="262626"/>
-                <w:sz w:val="16"/>
-              </w:rPr>
-              <w:t>360 Flight samples, 59 units, 26 tissues, 45 components</w:t>
-            </w:r>
-          </w:p>
-        </w:tc>
-        <w:tc>
-          <w:tcPr>
-            <w:tcW w:type="dxa" w:w="2160"/>
-            <w:tcMar>
-              <w:top w:w="55" w:type="dxa"/>
-              <w:start w:w="70" w:type="dxa"/>
-              <w:bottom w:w="55" w:type="dxa"/>
-              <w:end w:w="70" w:type="dxa"/>
-            </w:tcMar>
-            <w:vAlign w:val="center"/>
-          </w:tcPr>
-          <w:p>
-            <w:pPr>
-              <w:spacing w:line="276" w:lineRule="auto" w:before="0" w:after="0"/>
-            </w:pPr>
-            <w:r>
-              <w:rPr>
-                <w:rFonts w:ascii="Calibri" w:hAnsi="Calibri"/>
-                <w:color w:val="262626"/>
-                <w:sz w:val="16"/>
-              </w:rPr>
-              <w:t>YARN tissue-aware qsmooth; tissue-mean log2 profiles; 1 − Spearman ρ dissimilarity, average linkage</w:t>
-            </w:r>
-          </w:p>
-        </w:tc>
-        <w:tc>
-          <w:tcPr>
-            <w:tcW w:type="dxa" w:w="1728"/>
-            <w:tcMar>
-              <w:top w:w="55" w:type="dxa"/>
-              <w:start w:w="70" w:type="dxa"/>
-              <w:bottom w:w="55" w:type="dxa"/>
-              <w:end w:w="70" w:type="dxa"/>
-            </w:tcMar>
-            <w:vAlign w:val="center"/>
-          </w:tcPr>
-          <w:p>
-            <w:pPr>
-              <w:spacing w:line="276" w:lineRule="auto" w:before="0" w:after="0"/>
-            </w:pPr>
-            <w:r>
-              <w:rPr>
-                <w:rFonts w:ascii="Calibri" w:hAnsi="Calibri"/>
-                <w:color w:val="262626"/>
-                <w:sz w:val="16"/>
-              </w:rPr>
-              <w:t>data/publication_input/qsmooth/05_component_tissue_yarn_qsmooth_log2_matrix.csv; R/final_figures/05_expression_tree_heatmaps.R</w:t>
-            </w:r>
-          </w:p>
-        </w:tc>
-      </w:tr>
-      <w:tr>
-        <w:trPr>
-          <w:cantSplit/>
-        </w:trPr>
-        <w:tc>
-          <w:tcPr>
-            <w:tcW w:type="dxa" w:w="1728"/>
-            <w:shd w:val="clear" w:fill="FAFCFD"/>
-            <w:tcMar>
-              <w:top w:w="55" w:type="dxa"/>
-              <w:start w:w="70" w:type="dxa"/>
-              <w:bottom w:w="55" w:type="dxa"/>
-              <w:end w:w="70" w:type="dxa"/>
-            </w:tcMar>
-            <w:vAlign w:val="center"/>
-          </w:tcPr>
-          <w:p>
-            <w:pPr>
-              <w:spacing w:line="276" w:lineRule="auto" w:before="0" w:after="0"/>
-            </w:pPr>
-            <w:r>
-              <w:rPr>
-                <w:rFonts w:ascii="Calibri" w:hAnsi="Calibri"/>
-                <w:color w:val="262626"/>
-                <w:sz w:val="16"/>
-              </w:rPr>
-              <w:t>Supplementary Table S13</w:t>
-            </w:r>
-          </w:p>
-        </w:tc>
-        <w:tc>
-          <w:tcPr>
-            <w:tcW w:type="dxa" w:w="1872"/>
-            <w:shd w:val="clear" w:fill="FAFCFD"/>
-            <w:tcMar>
-              <w:top w:w="55" w:type="dxa"/>
-              <w:start w:w="70" w:type="dxa"/>
-              <w:bottom w:w="55" w:type="dxa"/>
-              <w:end w:w="70" w:type="dxa"/>
-            </w:tcMar>
-            <w:vAlign w:val="center"/>
-          </w:tcPr>
-          <w:p>
-            <w:pPr>
-              <w:spacing w:line="276" w:lineRule="auto" w:before="0" w:after="0"/>
-            </w:pPr>
-            <w:r>
-              <w:rPr>
-                <w:rFonts w:ascii="Calibri" w:hAnsi="Calibri"/>
-                <w:color w:val="262626"/>
-                <w:sz w:val="16"/>
-              </w:rPr>
-              <w:t>SSB Repair Linear-Scale Baseline Expression and ANOVA Heterogeneity</w:t>
-            </w:r>
-          </w:p>
-        </w:tc>
-        <w:tc>
-          <w:tcPr>
-            <w:tcW w:type="dxa" w:w="1872"/>
-            <w:shd w:val="clear" w:fill="FAFCFD"/>
-            <w:tcMar>
-              <w:top w:w="55" w:type="dxa"/>
-              <w:start w:w="70" w:type="dxa"/>
-              <w:bottom w:w="55" w:type="dxa"/>
-              <w:end w:w="70" w:type="dxa"/>
-            </w:tcMar>
-            <w:vAlign w:val="center"/>
-          </w:tcPr>
-          <w:p>
-            <w:pPr>
-              <w:spacing w:line="276" w:lineRule="auto" w:before="0" w:after="0"/>
-            </w:pPr>
-            <w:r>
-              <w:rPr>
-                <w:rFonts w:ascii="Calibri" w:hAnsi="Calibri"/>
-                <w:color w:val="262626"/>
-                <w:sz w:val="16"/>
-              </w:rPr>
-              <w:t>360 Flight samples × key genes across 26 tissues (BER, NER, MMR, FA)</w:t>
-            </w:r>
-          </w:p>
-        </w:tc>
-        <w:tc>
-          <w:tcPr>
-            <w:tcW w:type="dxa" w:w="2160"/>
-            <w:shd w:val="clear" w:fill="FAFCFD"/>
-            <w:tcMar>
-              <w:top w:w="55" w:type="dxa"/>
-              <w:start w:w="70" w:type="dxa"/>
-              <w:bottom w:w="55" w:type="dxa"/>
-              <w:end w:w="70" w:type="dxa"/>
-            </w:tcMar>
-            <w:vAlign w:val="center"/>
-          </w:tcPr>
-          <w:p>
-            <w:pPr>
-              <w:spacing w:line="276" w:lineRule="auto" w:before="0" w:after="0"/>
-            </w:pPr>
-            <w:r>
-              <w:rPr>
-                <w:rFonts w:ascii="Calibri" w:hAnsi="Calibri"/>
-                <w:color w:val="262626"/>
-                <w:sz w:val="16"/>
-              </w:rPr>
-              <w:t>Back-transformed linear normalized expression (2^log2 − 1), Q1/mean/Q3 summaries, one-way ANOVA</w:t>
-            </w:r>
-          </w:p>
-        </w:tc>
-        <w:tc>
-          <w:tcPr>
-            <w:tcW w:type="dxa" w:w="1728"/>
-            <w:shd w:val="clear" w:fill="FAFCFD"/>
-            <w:tcMar>
-              <w:top w:w="55" w:type="dxa"/>
-              <w:start w:w="70" w:type="dxa"/>
-              <w:bottom w:w="55" w:type="dxa"/>
-              <w:end w:w="70" w:type="dxa"/>
-            </w:tcMar>
-            <w:vAlign w:val="center"/>
-          </w:tcPr>
-          <w:p>
-            <w:pPr>
-              <w:spacing w:line="276" w:lineRule="auto" w:before="0" w:after="0"/>
-            </w:pPr>
-            <w:r>
-              <w:rPr>
-                <w:rFonts w:ascii="Calibri" w:hAnsi="Calibri"/>
-                <w:color w:val="262626"/>
-                <w:sz w:val="16"/>
-              </w:rPr>
-              <w:t>results/tables/linear/03_tissue_gene_mean_linear_qsmooth_summary.csv; 02_gene_one_way_anova_linear_summary.csv; R/figures/10_pathway_gene_tissue_boxplots_linear.R</w:t>
-            </w:r>
-          </w:p>
-        </w:tc>
-      </w:tr>
-      <w:tr>
-        <w:trPr>
-          <w:cantSplit/>
-        </w:trPr>
-        <w:tc>
-          <w:tcPr>
-            <w:tcW w:type="dxa" w:w="1728"/>
-            <w:tcMar>
-              <w:top w:w="55" w:type="dxa"/>
-              <w:start w:w="70" w:type="dxa"/>
-              <w:bottom w:w="55" w:type="dxa"/>
-              <w:end w:w="70" w:type="dxa"/>
-            </w:tcMar>
-            <w:vAlign w:val="center"/>
-          </w:tcPr>
-          <w:p>
-            <w:pPr>
-              <w:spacing w:line="276" w:lineRule="auto" w:before="0" w:after="0"/>
-            </w:pPr>
-            <w:r>
-              <w:rPr>
-                <w:rFonts w:ascii="Calibri" w:hAnsi="Calibri"/>
-                <w:color w:val="262626"/>
-                <w:sz w:val="16"/>
-              </w:rPr>
-              <w:t>Supplementary Table S14</w:t>
-            </w:r>
-          </w:p>
-        </w:tc>
-        <w:tc>
-          <w:tcPr>
-            <w:tcW w:type="dxa" w:w="1872"/>
-            <w:tcMar>
-              <w:top w:w="55" w:type="dxa"/>
-              <w:start w:w="70" w:type="dxa"/>
-              <w:bottom w:w="55" w:type="dxa"/>
-              <w:end w:w="70" w:type="dxa"/>
-            </w:tcMar>
-            <w:vAlign w:val="center"/>
-          </w:tcPr>
-          <w:p>
-            <w:pPr>
-              <w:spacing w:line="276" w:lineRule="auto" w:before="0" w:after="0"/>
-            </w:pPr>
-            <w:r>
-              <w:rPr>
-                <w:rFonts w:ascii="Calibri" w:hAnsi="Calibri"/>
-                <w:color w:val="262626"/>
-                <w:sz w:val="16"/>
-              </w:rPr>
-              <w:t>SSB Repair Multi-Mission Spaceflight Meta-Analysis Matrix</w:t>
+              <w:t>Single-Strand Break (SSB) Repair Multi-Mission Spaceflight Meta-Analysis Matrix</w:t>
             </w:r>
           </w:p>
         </w:tc>
@@ -4631,7 +4199,7 @@
                 <w:color w:val="262626"/>
                 <w:sz w:val="16"/>
               </w:rPr>
-              <w:t>Median of mission medians log2FC; signed Stouffer P; nominal P &lt; 0.05 indicators</w:t>
+              <w:t>Median of mission medians log2FC; signed Stouffer meta-Z P values; nominal P &lt; 0.05 indicators</w:t>
             </w:r>
           </w:p>
         </w:tc>
@@ -4656,272 +4224,7 @@
                 <w:color w:val="262626"/>
                 <w:sz w:val="16"/>
               </w:rPr>
-              <w:t>results/tables/01_SSB_tissue_meta_log2FC_pvalue_matrix_without_Neil2.csv; R/final_figures/06_meta_dotplots.R</w:t>
-            </w:r>
-          </w:p>
-        </w:tc>
-      </w:tr>
-      <w:tr>
-        <w:trPr>
-          <w:cantSplit/>
-        </w:trPr>
-        <w:tc>
-          <w:tcPr>
-            <w:tcW w:type="dxa" w:w="1728"/>
-            <w:shd w:val="clear" w:fill="FAFCFD"/>
-            <w:tcMar>
-              <w:top w:w="55" w:type="dxa"/>
-              <w:start w:w="70" w:type="dxa"/>
-              <w:bottom w:w="55" w:type="dxa"/>
-              <w:end w:w="70" w:type="dxa"/>
-            </w:tcMar>
-            <w:vAlign w:val="center"/>
-          </w:tcPr>
-          <w:p>
-            <w:pPr>
-              <w:spacing w:line="276" w:lineRule="auto" w:before="0" w:after="0"/>
-            </w:pPr>
-            <w:r>
-              <w:rPr>
-                <w:rFonts w:ascii="Calibri" w:hAnsi="Calibri"/>
-                <w:color w:val="262626"/>
-                <w:sz w:val="16"/>
-              </w:rPr>
-              <w:t>Supplementary Table S15</w:t>
-            </w:r>
-          </w:p>
-        </w:tc>
-        <w:tc>
-          <w:tcPr>
-            <w:tcW w:type="dxa" w:w="1872"/>
-            <w:shd w:val="clear" w:fill="FAFCFD"/>
-            <w:tcMar>
-              <w:top w:w="55" w:type="dxa"/>
-              <w:start w:w="70" w:type="dxa"/>
-              <w:bottom w:w="55" w:type="dxa"/>
-              <w:end w:w="70" w:type="dxa"/>
-            </w:tcMar>
-            <w:vAlign w:val="center"/>
-          </w:tcPr>
-          <w:p>
-            <w:pPr>
-              <w:spacing w:line="276" w:lineRule="auto" w:before="0" w:after="0"/>
-            </w:pPr>
-            <w:r>
-              <w:rPr>
-                <w:rFonts w:ascii="Calibri" w:hAnsi="Calibri"/>
-                <w:color w:val="262626"/>
-                <w:sz w:val="16"/>
-              </w:rPr>
-              <w:t>Multi-Pathway Member-Gene Expression Detection Audit Matrix</w:t>
-            </w:r>
-          </w:p>
-        </w:tc>
-        <w:tc>
-          <w:tcPr>
-            <w:tcW w:type="dxa" w:w="1872"/>
-            <w:shd w:val="clear" w:fill="FAFCFD"/>
-            <w:tcMar>
-              <w:top w:w="55" w:type="dxa"/>
-              <w:start w:w="70" w:type="dxa"/>
-              <w:bottom w:w="55" w:type="dxa"/>
-              <w:end w:w="70" w:type="dxa"/>
-            </w:tcMar>
-            <w:vAlign w:val="center"/>
-          </w:tcPr>
-          <w:p>
-            <w:pPr>
-              <w:spacing w:line="276" w:lineRule="auto" w:before="0" w:after="0"/>
-            </w:pPr>
-            <w:r>
-              <w:rPr>
-                <w:rFonts w:ascii="Calibri" w:hAnsi="Calibri"/>
-                <w:color w:val="262626"/>
-                <w:sz w:val="16"/>
-              </w:rPr>
-              <w:t>761 biospecimens across 26 tissues × 7 repair pathways</w:t>
-            </w:r>
-          </w:p>
-        </w:tc>
-        <w:tc>
-          <w:tcPr>
-            <w:tcW w:type="dxa" w:w="2160"/>
-            <w:shd w:val="clear" w:fill="FAFCFD"/>
-            <w:tcMar>
-              <w:top w:w="55" w:type="dxa"/>
-              <w:start w:w="70" w:type="dxa"/>
-              <w:bottom w:w="55" w:type="dxa"/>
-              <w:end w:w="70" w:type="dxa"/>
-            </w:tcMar>
-            <w:vAlign w:val="center"/>
-          </w:tcPr>
-          <w:p>
-            <w:pPr>
-              <w:spacing w:line="276" w:lineRule="auto" w:before="0" w:after="0"/>
-            </w:pPr>
-            <w:r>
-              <w:rPr>
-                <w:rFonts w:ascii="Calibri" w:hAnsi="Calibri"/>
-                <w:color w:val="262626"/>
-                <w:sz w:val="16"/>
-              </w:rPr>
-              <w:t>Finite normalized source-expression detection counts (335 memberships, 257 unique IDs)</w:t>
-            </w:r>
-          </w:p>
-        </w:tc>
-        <w:tc>
-          <w:tcPr>
-            <w:tcW w:type="dxa" w:w="1728"/>
-            <w:shd w:val="clear" w:fill="FAFCFD"/>
-            <w:tcMar>
-              <w:top w:w="55" w:type="dxa"/>
-              <w:start w:w="70" w:type="dxa"/>
-              <w:bottom w:w="55" w:type="dxa"/>
-              <w:end w:w="70" w:type="dxa"/>
-            </w:tcMar>
-            <w:vAlign w:val="center"/>
-          </w:tcPr>
-          <w:p>
-            <w:pPr>
-              <w:spacing w:line="276" w:lineRule="auto" w:before="0" w:after="0"/>
-            </w:pPr>
-            <w:r>
-              <w:rPr>
-                <w:rFonts w:ascii="Calibri" w:hAnsi="Calibri"/>
-                <w:color w:val="262626"/>
-                <w:sz w:val="16"/>
-              </w:rPr>
-              <w:t>results/tables/01_seven_pathway_member_gene_counts_per_source_sample_wide.csv; 02_...long.csv; R/final_figures/07_figS5_counts.R</w:t>
-            </w:r>
-          </w:p>
-        </w:tc>
-      </w:tr>
-      <w:tr>
-        <w:trPr>
-          <w:cantSplit/>
-        </w:trPr>
-        <w:tc>
-          <w:tcPr>
-            <w:tcW w:type="dxa" w:w="1728"/>
-            <w:tcMar>
-              <w:top w:w="55" w:type="dxa"/>
-              <w:start w:w="70" w:type="dxa"/>
-              <w:bottom w:w="55" w:type="dxa"/>
-              <w:end w:w="70" w:type="dxa"/>
-            </w:tcMar>
-            <w:vAlign w:val="center"/>
-          </w:tcPr>
-          <w:p>
-            <w:pPr>
-              <w:spacing w:line="276" w:lineRule="auto" w:before="0" w:after="0"/>
-            </w:pPr>
-            <w:r>
-              <w:rPr>
-                <w:rFonts w:ascii="Calibri" w:hAnsi="Calibri"/>
-                <w:color w:val="262626"/>
-                <w:sz w:val="16"/>
-              </w:rPr>
-              <w:t>Supplementary Tables 01–04</w:t>
-            </w:r>
-          </w:p>
-        </w:tc>
-        <w:tc>
-          <w:tcPr>
-            <w:tcW w:type="dxa" w:w="1872"/>
-            <w:tcMar>
-              <w:top w:w="55" w:type="dxa"/>
-              <w:start w:w="70" w:type="dxa"/>
-              <w:bottom w:w="55" w:type="dxa"/>
-              <w:end w:w="70" w:type="dxa"/>
-            </w:tcMar>
-            <w:vAlign w:val="center"/>
-          </w:tcPr>
-          <w:p>
-            <w:pPr>
-              <w:spacing w:line="276" w:lineRule="auto" w:before="0" w:after="0"/>
-            </w:pPr>
-            <w:r>
-              <w:rPr>
-                <w:rFonts w:ascii="Calibri" w:hAnsi="Calibri"/>
-                <w:color w:val="262626"/>
-                <w:sz w:val="16"/>
-              </w:rPr>
-              <w:t>Comprehensive Linear Expression Summaries and ANOVA F-Tests</w:t>
-            </w:r>
-          </w:p>
-        </w:tc>
-        <w:tc>
-          <w:tcPr>
-            <w:tcW w:type="dxa" w:w="1872"/>
-            <w:tcMar>
-              <w:top w:w="55" w:type="dxa"/>
-              <w:start w:w="70" w:type="dxa"/>
-              <w:bottom w:w="55" w:type="dxa"/>
-              <w:end w:w="70" w:type="dxa"/>
-            </w:tcMar>
-            <w:vAlign w:val="center"/>
-          </w:tcPr>
-          <w:p>
-            <w:pPr>
-              <w:spacing w:line="276" w:lineRule="auto" w:before="0" w:after="0"/>
-            </w:pPr>
-            <w:r>
-              <w:rPr>
-                <w:rFonts w:ascii="Calibri" w:hAnsi="Calibri"/>
-                <w:color w:val="262626"/>
-                <w:sz w:val="16"/>
-              </w:rPr>
-              <w:t>360 Flight samples across 26 tissues (7 repair pathways)</w:t>
-            </w:r>
-          </w:p>
-        </w:tc>
-        <w:tc>
-          <w:tcPr>
-            <w:tcW w:type="dxa" w:w="2160"/>
-            <w:tcMar>
-              <w:top w:w="55" w:type="dxa"/>
-              <w:start w:w="70" w:type="dxa"/>
-              <w:bottom w:w="55" w:type="dxa"/>
-              <w:end w:w="70" w:type="dxa"/>
-            </w:tcMar>
-            <w:vAlign w:val="center"/>
-          </w:tcPr>
-          <w:p>
-            <w:pPr>
-              <w:spacing w:line="276" w:lineRule="auto" w:before="0" w:after="0"/>
-            </w:pPr>
-            <w:r>
-              <w:rPr>
-                <w:rFonts w:ascii="Calibri" w:hAnsi="Calibri"/>
-                <w:color w:val="262626"/>
-                <w:sz w:val="16"/>
-              </w:rPr>
-              <w:t>Detailed sample-level linear values, tissue means, and one-way ANOVA across tissues</w:t>
-            </w:r>
-          </w:p>
-        </w:tc>
-        <w:tc>
-          <w:tcPr>
-            <w:tcW w:type="dxa" w:w="1728"/>
-            <w:tcMar>
-              <w:top w:w="55" w:type="dxa"/>
-              <w:start w:w="70" w:type="dxa"/>
-              <w:bottom w:w="55" w:type="dxa"/>
-              <w:end w:w="70" w:type="dxa"/>
-            </w:tcMar>
-            <w:vAlign w:val="center"/>
-          </w:tcPr>
-          <w:p>
-            <w:pPr>
-              <w:spacing w:line="276" w:lineRule="auto" w:before="0" w:after="0"/>
-            </w:pPr>
-            <w:r>
-              <w:rPr>
-                <w:rFonts w:ascii="Calibri" w:hAnsi="Calibri"/>
-                <w:color w:val="262626"/>
-                <w:sz w:val="16"/>
-              </w:rPr>
-              <w:t>release/tables/linear/01-04 summary tables</w:t>
+              <w:t>release/tables/01_SSB_tissue_meta_log2FC_pvalue_matrix_without_Neil2.csv; R/final_figures/06_meta_dotplots.R</w:t>
             </w:r>
           </w:p>
         </w:tc>
@@ -4952,7 +4255,7 @@
         <w:color w:val="888888"/>
         <w:sz w:val="17"/>
       </w:rPr>
-      <w:t>Methods Section — NASA OSDR Multi-Tissue Spaceflight Dataset (Supplementary-Table-Aligned)</w:t>
+      <w:t>Methods Section — NASA OSDR Multi-Tissue Spaceflight Dataset (Teacher-Aligned Release)</w:t>
     </w:r>
   </w:p>
 </w:ftr>

</xml_diff>